<commit_message>
TTS - Updating README and the SDD
</commit_message>
<xml_diff>
--- a/audio-ML/Custom_TTS_Model/docs/TTS_Agent_Solution_Design.docx
+++ b/audio-ML/Custom_TTS_Model/docs/TTS_Agent_Solution_Design.docx
@@ -6772,6 +6772,208 @@
         </w:rPr>
         <w:t>macOS note: Docker on Mac does not support GPU passthrough. Run natively with 'make run' to use MPS on Apple Silicon.</w:t>
       </w:r>
+    </w:p>
+    <w:p>
+      <w:pPr>
+        <w:spacing w:after="40" w:before="80"/>
+      </w:pPr>
+      <w:r>
+        <w:rPr>
+          <w:sz w:val="23"/>
+          <w:b/>
+          <w:color w:val="44546E"/>
+        </w:rPr>
+        <w:t>11.4  HuggingFace Token (Required for Model Downloads)</w:t>
+      </w:r>
+    </w:p>
+    <w:tbl>
+      <w:tblPr>
+        <w:tblStyle w:val="TableGrid"/>
+        <w:tblW w:w="9360" w:type="dxa"/>
+      </w:tblPr>
+      <w:tr>
+        <w:tc>
+          <w:tcPr>
+            <w:shd w:val="clear" w:color="auto" w:fill="FEF9E7"/>
+            <w:tcBorders>
+              <w:top w:val="none" w:sz="0" w:color="FFFFFF"/>
+              <w:left w:val="none" w:sz="0" w:color="FFFFFF"/>
+              <w:bottom w:val="none" w:sz="0" w:color="FFFFFF"/>
+              <w:right w:val="none" w:sz="0" w:color="FFFFFF"/>
+            </w:tcBorders>
+          </w:tcPr>
+          <w:p>
+            <w:pPr>
+              <w:spacing w:after="24" w:before="0"/>
+              <w:ind w:left="160"/>
+            </w:pPr>
+            <w:r>
+              <w:rPr>
+                <w:sz w:val="18"/>
+                <w:szCs w:val="18"/>
+              </w:rPr>
+              <w:t xml:space="preserve">Kokoro-82M and F5-TTS weights are hosted on HuggingFace Hub. Without a token, downloads are rate-limited and may be slow or interrupted. A free read-only token removes all limits.</w:t>
+            </w:r>
+          </w:p>
+          <w:p>
+            <w:pPr>
+              <w:spacing w:after="24" w:before="0"/>
+              <w:ind w:left="160"/>
+            </w:pPr>
+            <w:r>
+              <w:rPr>
+                <w:sz w:val="18"/>
+                <w:szCs w:val="18"/>
+              </w:rPr>
+              <w:t xml:space="preserve"> </w:t>
+            </w:r>
+          </w:p>
+          <w:p>
+            <w:pPr>
+              <w:spacing w:after="24" w:before="0"/>
+              <w:ind w:left="160"/>
+            </w:pPr>
+            <w:r>
+              <w:rPr>
+                <w:sz w:val="18"/>
+                <w:szCs w:val="18"/>
+                <w:b/>
+              </w:rPr>
+              <w:t xml:space="preserve">Step 1  —  Get a token</w:t>
+            </w:r>
+          </w:p>
+          <w:p>
+            <w:pPr>
+              <w:spacing w:after="24" w:before="0"/>
+              <w:ind w:left="160"/>
+            </w:pPr>
+            <w:r>
+              <w:rPr>
+                <w:sz w:val="18"/>
+                <w:szCs w:val="18"/>
+                <w:rFonts w:ascii="Courier New" w:hAnsi="Courier New"/>
+                <w:color w:val="2D3A4A"/>
+              </w:rPr>
+              <w:t xml:space="preserve">Visit  https://huggingface.co/settings/tokens  →  New token  →  Role: Read  →  Create</w:t>
+            </w:r>
+          </w:p>
+          <w:p>
+            <w:pPr>
+              <w:spacing w:after="24" w:before="0"/>
+              <w:ind w:left="160"/>
+            </w:pPr>
+            <w:r>
+              <w:rPr>
+                <w:sz w:val="18"/>
+                <w:szCs w:val="18"/>
+              </w:rPr>
+              <w:t xml:space="preserve"> </w:t>
+            </w:r>
+          </w:p>
+          <w:p>
+            <w:pPr>
+              <w:spacing w:after="24" w:before="0"/>
+              <w:ind w:left="160"/>
+            </w:pPr>
+            <w:r>
+              <w:rPr>
+                <w:sz w:val="18"/>
+                <w:szCs w:val="18"/>
+                <w:b/>
+              </w:rPr>
+              <w:t xml:space="preserve">Step 2  —  Add to .env</w:t>
+            </w:r>
+          </w:p>
+          <w:p>
+            <w:pPr>
+              <w:spacing w:after="24" w:before="0"/>
+              <w:ind w:left="160"/>
+            </w:pPr>
+            <w:r>
+              <w:rPr>
+                <w:sz w:val="18"/>
+                <w:szCs w:val="18"/>
+                <w:rFonts w:ascii="Courier New" w:hAnsi="Courier New"/>
+                <w:color w:val="2D3A4A"/>
+              </w:rPr>
+              <w:t xml:space="preserve">HF_TOKEN=hf_xxxxxxxxxxxxxxxxxxxxxxxxxxxxxxxxxxxx</w:t>
+            </w:r>
+          </w:p>
+          <w:p>
+            <w:pPr>
+              <w:spacing w:after="24" w:before="0"/>
+              <w:ind w:left="160"/>
+            </w:pPr>
+            <w:r>
+              <w:rPr>
+                <w:sz w:val="18"/>
+                <w:szCs w:val="18"/>
+              </w:rPr>
+              <w:t xml:space="preserve"> </w:t>
+            </w:r>
+          </w:p>
+          <w:p>
+            <w:pPr>
+              <w:spacing w:after="24" w:before="0"/>
+              <w:ind w:left="160"/>
+            </w:pPr>
+            <w:r>
+              <w:rPr>
+                <w:sz w:val="18"/>
+                <w:szCs w:val="18"/>
+                <w:b/>
+              </w:rPr>
+              <w:t xml:space="preserve">Step 3  —  Run the download script</w:t>
+            </w:r>
+          </w:p>
+          <w:p>
+            <w:pPr>
+              <w:spacing w:after="24" w:before="0"/>
+              <w:ind w:left="160"/>
+            </w:pPr>
+            <w:r>
+              <w:rPr>
+                <w:sz w:val="18"/>
+                <w:szCs w:val="18"/>
+                <w:rFonts w:ascii="Courier New" w:hAnsi="Courier New"/>
+                <w:color w:val="2D3A4A"/>
+              </w:rPr>
+              <w:t xml:space="preserve">python scripts/download_models.py</w:t>
+            </w:r>
+          </w:p>
+          <w:p>
+            <w:pPr>
+              <w:spacing w:after="24" w:before="0"/>
+              <w:ind w:left="160"/>
+            </w:pPr>
+            <w:r>
+              <w:rPr>
+                <w:sz w:val="18"/>
+                <w:szCs w:val="18"/>
+              </w:rPr>
+              <w:t xml:space="preserve"> </w:t>
+            </w:r>
+          </w:p>
+          <w:p>
+            <w:pPr>
+              <w:spacing w:after="24" w:before="0"/>
+              <w:ind w:left="160"/>
+            </w:pPr>
+            <w:r>
+              <w:rPr>
+                <w:sz w:val="18"/>
+                <w:szCs w:val="18"/>
+              </w:rPr>
+              <w:t xml:space="preserve">The token is read automatically by configs/settings.py (Pydantic Settings) before any HuggingFace Hub call. It is never logged or transmitted elsewhere. A read-only token is sufficient.</w:t>
+            </w:r>
+          </w:p>
+        </w:tc>
+      </w:tr>
+    </w:tbl>
+    <w:p>
+      <w:pPr>
+        <w:spacing w:after="60" w:before="0"/>
+      </w:pPr>
     </w:p>
     <w:p>
       <w:pPr>

</xml_diff>

<commit_message>
First working TTS solution with updated Solution Design.
</commit_message>
<xml_diff>
--- a/audio-ML/Custom_TTS_Model/docs/TTS_Agent_Solution_Design.docx
+++ b/audio-ML/Custom_TTS_Model/docs/TTS_Agent_Solution_Design.docx
@@ -82,10 +82,10 @@
         <w:tblLook w:val="04A0" w:firstRow="1" w:lastRow="0" w:firstColumn="1" w:lastColumn="0" w:noHBand="0" w:noVBand="1"/>
       </w:tblPr>
       <w:tblGrid>
-        <w:gridCol w:w="1816"/>
-        <w:gridCol w:w="1756"/>
-        <w:gridCol w:w="1816"/>
-        <w:gridCol w:w="3900"/>
+        <w:gridCol w:w="1799"/>
+        <w:gridCol w:w="1737"/>
+        <w:gridCol w:w="1798"/>
+        <w:gridCol w:w="3954"/>
       </w:tblGrid>
       <w:tr>
         <w:tc>
@@ -387,6 +387,80 @@
           </w:p>
         </w:tc>
       </w:tr>
+      <w:tr>
+        <w:tc>
+          <w:tcPr>
+            <w:tcW w:w="2268" w:type="dxa"/>
+            <w:shd w:val="clear" w:color="auto" w:fill="F2F4F8"/>
+          </w:tcPr>
+          <w:p>
+            <w:pPr>
+              <w:spacing w:before="40" w:after="40"/>
+            </w:pPr>
+            <w:r>
+              <w:rPr>
+                <w:color w:val="1E202C"/>
+                <w:sz w:val="18"/>
+              </w:rPr>
+              <w:t>2.1</w:t>
+            </w:r>
+          </w:p>
+        </w:tc>
+        <w:tc>
+          <w:tcPr>
+            <w:tcW w:w="2268" w:type="dxa"/>
+            <w:shd w:val="clear" w:color="auto" w:fill="F2F4F8"/>
+          </w:tcPr>
+          <w:p>
+            <w:pPr>
+              <w:spacing w:before="40" w:after="40"/>
+            </w:pPr>
+            <w:r>
+              <w:rPr>
+                <w:color w:val="1E202C"/>
+                <w:sz w:val="18"/>
+              </w:rPr>
+              <w:t>2026-05-18</w:t>
+            </w:r>
+          </w:p>
+        </w:tc>
+        <w:tc>
+          <w:tcPr>
+            <w:tcW w:w="2268" w:type="dxa"/>
+            <w:shd w:val="clear" w:color="auto" w:fill="F2F4F8"/>
+          </w:tcPr>
+          <w:p>
+            <w:pPr>
+              <w:spacing w:before="40" w:after="40"/>
+            </w:pPr>
+            <w:r>
+              <w:rPr>
+                <w:color w:val="1E202C"/>
+                <w:sz w:val="18"/>
+              </w:rPr>
+              <w:t>Rommel Sharma</w:t>
+            </w:r>
+          </w:p>
+        </w:tc>
+        <w:tc>
+          <w:tcPr>
+            <w:tcW w:w="2268" w:type="dxa"/>
+            <w:shd w:val="clear" w:color="auto" w:fill="F2F4F8"/>
+          </w:tcPr>
+          <w:p>
+            <w:pPr>
+              <w:spacing w:before="40" w:after="40"/>
+            </w:pPr>
+            <w:r>
+              <w:rPr>
+                <w:color w:val="1E202C"/>
+                <w:sz w:val="18"/>
+              </w:rPr>
+              <w:t>espeak-ng system prerequisite (macOS), use_ssml API flag, UI Input Format dropdown, Troubleshooting section</w:t>
+            </w:r>
+          </w:p>
+        </w:tc>
+      </w:tr>
     </w:tbl>
     <w:p/>
     <w:p>
@@ -644,7 +718,6 @@
           <w:color w:val="3C559A"/>
           <w:sz w:val="26"/>
         </w:rPr>
-        <w:lastRenderedPageBreak/>
         <w:t>2. INTRODUCTION</w:t>
       </w:r>
     </w:p>
@@ -1413,7 +1486,6 @@
           <w:color w:val="3C559A"/>
           <w:sz w:val="26"/>
         </w:rPr>
-        <w:lastRenderedPageBreak/>
         <w:t>4. SYSTEM CAPABILITIES (V2.0)</w:t>
       </w:r>
     </w:p>
@@ -1785,7 +1857,6 @@
           <w:color w:val="1E202C"/>
           <w:sz w:val="20"/>
         </w:rPr>
-        <w:lastRenderedPageBreak/>
         <w:t>Key implementation details:</w:t>
       </w:r>
     </w:p>
@@ -2218,6 +2289,7 @@
           <w:color w:val="3C559A"/>
           <w:sz w:val="20"/>
         </w:rPr>
+        <w:lastRenderedPageBreak/>
         <w:t xml:space="preserve">Testability: </w:t>
       </w:r>
       <w:r>
@@ -3616,6 +3688,7 @@
           <w:color w:val="2D3A4A"/>
           <w:sz w:val="17"/>
         </w:rPr>
+        <w:lastRenderedPageBreak/>
         <w:t>└──────────┬───────────────┘       └──────────────────┬───────────────────┘</w:t>
       </w:r>
     </w:p>
@@ -3661,7 +3734,6 @@
           <w:color w:val="2D3A4A"/>
           <w:sz w:val="17"/>
         </w:rPr>
-        <w:lastRenderedPageBreak/>
         <w:t xml:space="preserve">                            ▼</w:t>
       </w:r>
     </w:p>
@@ -4353,13 +4425,6 @@
         </w:rPr>
         <w:lastRenderedPageBreak/>
         <w:br/>
-      </w:r>
-      <w:r>
-        <w:rPr>
-          <w:b/>
-          <w:color w:val="3C559A"/>
-          <w:sz w:val="26"/>
-        </w:rPr>
         <w:t>8. AUDIO POST-PROCESSING PIPELINE DETAIL</w:t>
       </w:r>
       <w:r>
@@ -5234,6 +5299,48 @@
           <w:sz w:val="26"/>
         </w:rPr>
         <w:t>9. SSML MARKUP REFERENCE</w:t>
+      </w:r>
+    </w:p>
+    <w:p>
+      <w:pPr>
+        <w:spacing w:after="80"/>
+      </w:pPr>
+      <w:r>
+        <w:rPr>
+          <w:color w:val="1E202C"/>
+          <w:sz w:val="18"/>
+        </w:rPr>
+        <w:t xml:space="preserve">SSML processing is opt-in via the </w:t>
+      </w:r>
+      <w:r>
+        <w:rPr>
+          <w:rFonts w:ascii="Courier New" w:hAnsi="Courier New"/>
+          <w:color w:val="2D3A4A"/>
+          <w:sz w:val="17"/>
+        </w:rPr>
+        <w:t>use_ssml</w:t>
+      </w:r>
+      <w:r>
+        <w:rPr>
+          <w:color w:val="1E202C"/>
+          <w:sz w:val="18"/>
+        </w:rPr>
+        <w:t xml:space="preserve"> boolean field on the </w:t>
+      </w:r>
+      <w:r>
+        <w:rPr>
+          <w:rFonts w:ascii="Courier New" w:hAnsi="Courier New"/>
+          <w:color w:val="2D3A4A"/>
+          <w:sz w:val="17"/>
+        </w:rPr>
+        <w:t>SynthesizeRequest</w:t>
+      </w:r>
+      <w:r>
+        <w:rPr>
+          <w:color w:val="1E202C"/>
+          <w:sz w:val="18"/>
+        </w:rPr>
+        <w:t xml:space="preserve"> Pydantic model (default false). When false, text is passed directly to the engine without tag parsing — this prevents errors when input contains angle brackets that are not SSML. In the browser UI, an “Input Format” dropdown switches between “Plain Text” and “SSML Markup” modes; selecting SSML reveals a reference hint bar and an “Insert example” button that fills the textarea with a documentary narration sample (tests/sample_ssml.txt).</w:t>
       </w:r>
     </w:p>
     <w:tbl>
@@ -6056,6 +6163,7 @@
           <w:color w:val="2D3A4A"/>
           <w:sz w:val="17"/>
         </w:rPr>
+        <w:lastRenderedPageBreak/>
         <w:t>│       ├── device.py             # CUDA / MPS / CPU auto-detection</w:t>
       </w:r>
     </w:p>
@@ -6146,7 +6254,6 @@
           <w:color w:val="2D3A4A"/>
           <w:sz w:val="17"/>
         </w:rPr>
-        <w:lastRenderedPageBreak/>
         <w:t>│   └── settings.py               # Pydantic Settings from .env</w:t>
       </w:r>
     </w:p>
@@ -6511,6 +6618,18 @@
     </w:p>
     <w:p>
       <w:pPr>
+        <w:spacing w:after="40"/>
+      </w:pPr>
+      <w:r>
+        <w:rPr>
+          <w:color w:val="1E202C"/>
+          <w:sz w:val="18"/>
+        </w:rPr>
+        <w:t>Prerequisite: install system espeak-ng (required by Kokoro’s phonemizer backend). The bundled espeakng_loader path exceeds an internal 160-char C buffer on typical macOS project paths — system espeak-ng at /opt/homebrew avoids this entirely. setup.sh handles this automatically; if running steps manually:</w:t>
+      </w:r>
+    </w:p>
+    <w:p>
+      <w:pPr>
         <w:shd w:val="clear" w:color="auto" w:fill="F0F1F5"/>
         <w:spacing w:after="0"/>
         <w:ind w:left="288" w:right="288"/>
@@ -6521,7 +6640,7 @@
           <w:color w:val="2D3A4A"/>
           <w:sz w:val="17"/>
         </w:rPr>
-        <w:t>cd tts-agent</w:t>
+        <w:t>brew install espeak-ng</w:t>
       </w:r>
     </w:p>
     <w:p>
@@ -6536,7 +6655,7 @@
           <w:color w:val="2D3A4A"/>
           <w:sz w:val="17"/>
         </w:rPr>
-        <w:t>bash scripts/setup.sh           # creates venv, installs deps, copies .env</w:t>
+        <w:t>cd tts-agent</w:t>
       </w:r>
     </w:p>
     <w:p>
@@ -6551,7 +6670,7 @@
           <w:color w:val="2D3A4A"/>
           <w:sz w:val="17"/>
         </w:rPr>
-        <w:t>source venv/bin/activate</w:t>
+        <w:t>bash scripts/setup.sh   # installs espeak-ng + venv + deps + .env</w:t>
       </w:r>
     </w:p>
     <w:p>
@@ -6566,7 +6685,7 @@
           <w:color w:val="2D3A4A"/>
           <w:sz w:val="17"/>
         </w:rPr>
-        <w:t>python scripts/download_models.py</w:t>
+        <w:t>source venv/bin/activate</w:t>
       </w:r>
     </w:p>
     <w:p>
@@ -6581,6 +6700,21 @@
           <w:color w:val="2D3A4A"/>
           <w:sz w:val="17"/>
         </w:rPr>
+        <w:t>python scripts/download_models.py</w:t>
+      </w:r>
+    </w:p>
+    <w:p>
+      <w:pPr>
+        <w:shd w:val="clear" w:color="auto" w:fill="F0F1F5"/>
+        <w:spacing w:after="0"/>
+        <w:ind w:left="288" w:right="288"/>
+      </w:pPr>
+      <w:r>
+        <w:rPr>
+          <w:rFonts w:ascii="Courier New" w:hAnsi="Courier New"/>
+          <w:color w:val="2D3A4A"/>
+          <w:sz w:val="17"/>
+        </w:rPr>
         <w:t>uvicorn backend.app:app --host 0.0.0.0 --port 8000 --reload</w:t>
       </w:r>
     </w:p>
@@ -6707,6 +6841,7 @@
           <w:color w:val="44546E"/>
           <w:sz w:val="23"/>
         </w:rPr>
+        <w:lastRenderedPageBreak/>
         <w:t>11.3 Docker (GPU — Linux / WSL2)</w:t>
       </w:r>
     </w:p>
@@ -6775,13 +6910,13 @@
     </w:p>
     <w:p>
       <w:pPr>
-        <w:spacing w:after="40" w:before="80"/>
-      </w:pPr>
-      <w:r>
-        <w:rPr>
-          <w:sz w:val="23"/>
+        <w:spacing w:before="80" w:after="40"/>
+      </w:pPr>
+      <w:r>
+        <w:rPr>
           <w:b/>
           <w:color w:val="44546E"/>
+          <w:sz w:val="23"/>
         </w:rPr>
         <w:t>11.4  HuggingFace Token (Required for Model Downloads)</w:t>
       </w:r>
@@ -6790,21 +6925,26 @@
       <w:tblPr>
         <w:tblStyle w:val="TableGrid"/>
         <w:tblW w:w="9360" w:type="dxa"/>
+        <w:tblLook w:val="04A0" w:firstRow="1" w:lastRow="0" w:firstColumn="1" w:lastColumn="0" w:noHBand="0" w:noVBand="1"/>
       </w:tblPr>
+      <w:tblGrid>
+        <w:gridCol w:w="9360"/>
+      </w:tblGrid>
       <w:tr>
         <w:tc>
           <w:tcPr>
+            <w:tcW w:w="0" w:type="auto"/>
+            <w:tcBorders>
+              <w:top w:val="none" w:sz="0" w:space="0" w:color="FFFFFF"/>
+              <w:left w:val="none" w:sz="0" w:space="0" w:color="FFFFFF"/>
+              <w:bottom w:val="none" w:sz="0" w:space="0" w:color="FFFFFF"/>
+              <w:right w:val="none" w:sz="0" w:space="0" w:color="FFFFFF"/>
+            </w:tcBorders>
             <w:shd w:val="clear" w:color="auto" w:fill="FEF9E7"/>
-            <w:tcBorders>
-              <w:top w:val="none" w:sz="0" w:color="FFFFFF"/>
-              <w:left w:val="none" w:sz="0" w:color="FFFFFF"/>
-              <w:bottom w:val="none" w:sz="0" w:color="FFFFFF"/>
-              <w:right w:val="none" w:sz="0" w:color="FFFFFF"/>
-            </w:tcBorders>
           </w:tcPr>
           <w:p>
             <w:pPr>
-              <w:spacing w:after="24" w:before="0"/>
+              <w:spacing w:after="24"/>
               <w:ind w:left="160"/>
             </w:pPr>
             <w:r>
@@ -6812,12 +6952,12 @@
                 <w:sz w:val="18"/>
                 <w:szCs w:val="18"/>
               </w:rPr>
-              <w:t xml:space="preserve">Kokoro-82M and F5-TTS weights are hosted on HuggingFace Hub. Without a token, downloads are rate-limited and may be slow or interrupted. A free read-only token removes all limits.</w:t>
+              <w:t>Kokoro-82M and F5-TTS weights are hosted on HuggingFace Hub. Without a token, downloads are rate-limited and may be slow or interrupted. A free read-only token removes all limits.</w:t>
             </w:r>
           </w:p>
           <w:p>
             <w:pPr>
-              <w:spacing w:after="24" w:before="0"/>
+              <w:spacing w:after="24"/>
               <w:ind w:left="160"/>
             </w:pPr>
             <w:r>
@@ -6830,36 +6970,36 @@
           </w:p>
           <w:p>
             <w:pPr>
-              <w:spacing w:after="24" w:before="0"/>
+              <w:spacing w:after="24"/>
               <w:ind w:left="160"/>
             </w:pPr>
             <w:r>
               <w:rPr>
+                <w:b/>
                 <w:sz w:val="18"/>
                 <w:szCs w:val="18"/>
-                <w:b/>
               </w:rPr>
-              <w:t xml:space="preserve">Step 1  —  Get a token</w:t>
+              <w:t>Step 1  —  Get a token</w:t>
             </w:r>
           </w:p>
           <w:p>
             <w:pPr>
-              <w:spacing w:after="24" w:before="0"/>
+              <w:spacing w:after="24"/>
               <w:ind w:left="160"/>
             </w:pPr>
             <w:r>
               <w:rPr>
+                <w:rFonts w:ascii="Courier New" w:hAnsi="Courier New"/>
+                <w:color w:val="2D3A4A"/>
                 <w:sz w:val="18"/>
                 <w:szCs w:val="18"/>
-                <w:rFonts w:ascii="Courier New" w:hAnsi="Courier New"/>
-                <w:color w:val="2D3A4A"/>
               </w:rPr>
-              <w:t xml:space="preserve">Visit  https://huggingface.co/settings/tokens  →  New token  →  Role: Read  →  Create</w:t>
+              <w:t>Visit  https://huggingface.co/settings/tokens  →  New token  →  Role: Read  →  Create</w:t>
             </w:r>
           </w:p>
           <w:p>
             <w:pPr>
-              <w:spacing w:after="24" w:before="0"/>
+              <w:spacing w:after="24"/>
               <w:ind w:left="160"/>
             </w:pPr>
             <w:r>
@@ -6872,36 +7012,36 @@
           </w:p>
           <w:p>
             <w:pPr>
-              <w:spacing w:after="24" w:before="0"/>
+              <w:spacing w:after="24"/>
               <w:ind w:left="160"/>
             </w:pPr>
             <w:r>
               <w:rPr>
+                <w:b/>
                 <w:sz w:val="18"/>
                 <w:szCs w:val="18"/>
-                <w:b/>
               </w:rPr>
-              <w:t xml:space="preserve">Step 2  —  Add to .env</w:t>
+              <w:t>Step 2  —  Add to .env</w:t>
             </w:r>
           </w:p>
           <w:p>
             <w:pPr>
-              <w:spacing w:after="24" w:before="0"/>
+              <w:spacing w:after="24"/>
               <w:ind w:left="160"/>
             </w:pPr>
             <w:r>
               <w:rPr>
+                <w:rFonts w:ascii="Courier New" w:hAnsi="Courier New"/>
+                <w:color w:val="2D3A4A"/>
                 <w:sz w:val="18"/>
                 <w:szCs w:val="18"/>
-                <w:rFonts w:ascii="Courier New" w:hAnsi="Courier New"/>
-                <w:color w:val="2D3A4A"/>
               </w:rPr>
-              <w:t xml:space="preserve">HF_TOKEN=hf_xxxxxxxxxxxxxxxxxxxxxxxxxxxxxxxxxxxx</w:t>
+              <w:t>HF_TOKEN=hf_xxxxxxxxxxxxxxxxxxxxxxxxxxxxxxxxxxxx</w:t>
             </w:r>
           </w:p>
           <w:p>
             <w:pPr>
-              <w:spacing w:after="24" w:before="0"/>
+              <w:spacing w:after="24"/>
               <w:ind w:left="160"/>
             </w:pPr>
             <w:r>
@@ -6914,36 +7054,36 @@
           </w:p>
           <w:p>
             <w:pPr>
-              <w:spacing w:after="24" w:before="0"/>
+              <w:spacing w:after="24"/>
               <w:ind w:left="160"/>
             </w:pPr>
             <w:r>
               <w:rPr>
+                <w:b/>
                 <w:sz w:val="18"/>
                 <w:szCs w:val="18"/>
-                <w:b/>
               </w:rPr>
-              <w:t xml:space="preserve">Step 3  —  Run the download script</w:t>
+              <w:t>Step 3  —  Run the download script</w:t>
             </w:r>
           </w:p>
           <w:p>
             <w:pPr>
-              <w:spacing w:after="24" w:before="0"/>
+              <w:spacing w:after="24"/>
               <w:ind w:left="160"/>
             </w:pPr>
             <w:r>
               <w:rPr>
+                <w:rFonts w:ascii="Courier New" w:hAnsi="Courier New"/>
+                <w:color w:val="2D3A4A"/>
                 <w:sz w:val="18"/>
                 <w:szCs w:val="18"/>
-                <w:rFonts w:ascii="Courier New" w:hAnsi="Courier New"/>
-                <w:color w:val="2D3A4A"/>
               </w:rPr>
-              <w:t xml:space="preserve">python scripts/download_models.py</w:t>
+              <w:t>python scripts/download_models.py</w:t>
             </w:r>
           </w:p>
           <w:p>
             <w:pPr>
-              <w:spacing w:after="24" w:before="0"/>
+              <w:spacing w:after="24"/>
               <w:ind w:left="160"/>
             </w:pPr>
             <w:r>
@@ -6956,7 +7096,7 @@
           </w:p>
           <w:p>
             <w:pPr>
-              <w:spacing w:after="24" w:before="0"/>
+              <w:spacing w:after="24"/>
               <w:ind w:left="160"/>
             </w:pPr>
             <w:r>
@@ -6964,7 +7104,34 @@
                 <w:sz w:val="18"/>
                 <w:szCs w:val="18"/>
               </w:rPr>
-              <w:t xml:space="preserve">The token is read automatically by configs/settings.py (Pydantic Settings) before any HuggingFace Hub call. It is never logged or transmitted elsewhere. A read-only token is sufficient.</w:t>
+              <w:t>The token is read automatically by configs/settings.py (Pydantic Settings) before any HuggingFace Hub call. It is never logged or transmitted elsewhere. A read-only token is sufficient.</w:t>
+            </w:r>
+          </w:p>
+          <w:p>
+            <w:pPr>
+              <w:spacing w:before="12" w:after="24"/>
+              <w:ind w:left="160"/>
+            </w:pPr>
+            <w:r>
+              <w:rPr>
+                <w:b/>
+                <w:sz w:val="18"/>
+                <w:szCs w:val="18"/>
+              </w:rPr>
+              <w:t>Expected informational message</w:t>
+            </w:r>
+          </w:p>
+          <w:p>
+            <w:pPr>
+              <w:spacing w:after="24"/>
+              <w:ind w:left="160"/>
+            </w:pPr>
+            <w:r>
+              <w:rPr>
+                <w:sz w:val="18"/>
+                <w:szCs w:val="18"/>
+              </w:rPr>
+              <w:t>When the download script runs you will see: “Note: Environment variable HF_TOKEN is set and is the current active token independently from the token you’ve just configured.” This is a normal confirmation from huggingface_hub that authentication is active — it is not a warning or error.</w:t>
             </w:r>
           </w:p>
         </w:tc>
@@ -6972,7 +7139,134 @@
     </w:tbl>
     <w:p>
       <w:pPr>
-        <w:spacing w:after="60" w:before="0"/>
+        <w:spacing w:after="60"/>
+      </w:pPr>
+    </w:p>
+    <w:p>
+      <w:pPr>
+        <w:pBdr>
+          <w:bottom w:val="single" w:sz="8" w:space="2" w:color="3C559A"/>
+        </w:pBdr>
+        <w:spacing w:before="320" w:after="80"/>
+      </w:pPr>
+      <w:r>
+        <w:rPr>
+          <w:b/>
+          <w:color w:val="3C559A"/>
+          <w:sz w:val="26"/>
+        </w:rPr>
+        <w:t>11.5 TROUBLESHOOTING: espeak-ng on macOS</w:t>
+      </w:r>
+    </w:p>
+    <w:p>
+      <w:pPr>
+        <w:spacing w:before="80" w:after="60"/>
+      </w:pPr>
+      <w:r>
+        <w:rPr>
+          <w:b/>
+          <w:color w:val="1E202C"/>
+          <w:sz w:val="20"/>
+        </w:rPr>
+        <w:t>Symptom</w:t>
+      </w:r>
+    </w:p>
+    <w:p>
+      <w:pPr>
+        <w:shd w:val="clear" w:color="auto" w:fill="F0F1F5"/>
+        <w:spacing w:after="0"/>
+        <w:ind w:left="288" w:right="288"/>
+      </w:pPr>
+      <w:r>
+        <w:rPr>
+          <w:rFonts w:ascii="Courier New" w:hAnsi="Courier New"/>
+          <w:color w:val="C0392B"/>
+          <w:sz w:val="17"/>
+        </w:rPr>
+        <w:t>Error processing file ‘.../espeakng_loader//phontab’: No such file or directory.</w:t>
+      </w:r>
+    </w:p>
+    <w:p>
+      <w:pPr>
+        <w:spacing w:before="80" w:after="60"/>
+      </w:pPr>
+      <w:r>
+        <w:rPr>
+          <w:b/>
+          <w:color w:val="1E202C"/>
+          <w:sz w:val="20"/>
+        </w:rPr>
+        <w:t>Root cause</w:t>
+      </w:r>
+    </w:p>
+    <w:p>
+      <w:pPr>
+        <w:spacing w:after="80"/>
+      </w:pPr>
+      <w:r>
+        <w:rPr>
+          <w:color w:val="1E202C"/>
+          <w:sz w:val="18"/>
+        </w:rPr>
+        <w:t>espeak_ng_InitializePath() in the C library has an internal snprintf(buf, 160, ...) buffer. A typical macOS venv path (/Users/name/project/.../venv/lib/.../espeakng_loader/) is ~173 chars, which silently truncates in this buffer. Both internal directory checks then fail, and the library falls through to its compiled-in CI build path (/Users/runner/work/...) which does not exist on the end-user’s machine. The double slash (//) in the error message is the telltale sign of path truncation.</w:t>
+      </w:r>
+    </w:p>
+    <w:p>
+      <w:pPr>
+        <w:spacing w:before="80" w:after="60"/>
+      </w:pPr>
+      <w:r>
+        <w:rPr>
+          <w:b/>
+          <w:color w:val="1E202C"/>
+          <w:sz w:val="20"/>
+        </w:rPr>
+        <w:t>Fix</w:t>
+      </w:r>
+    </w:p>
+    <w:p>
+      <w:pPr>
+        <w:shd w:val="clear" w:color="auto" w:fill="F0F1F5"/>
+        <w:spacing w:after="0"/>
+        <w:ind w:left="288" w:right="288"/>
+      </w:pPr>
+      <w:r>
+        <w:rPr>
+          <w:rFonts w:ascii="Courier New" w:hAnsi="Courier New"/>
+          <w:color w:val="2D3A4A"/>
+          <w:sz w:val="17"/>
+        </w:rPr>
+        <w:t>brew install espeak-ng</w:t>
+      </w:r>
+    </w:p>
+    <w:p>
+      <w:pPr>
+        <w:spacing w:after="80"/>
+      </w:pPr>
+      <w:r>
+        <w:rPr>
+          <w:color w:val="1E202C"/>
+          <w:sz w:val="18"/>
+        </w:rPr>
+        <w:t>This installs espeak-ng data to /opt/homebrew/lib/espeak-ng-data (34 chars — well within the 160-char limit). The updated _configure_espeak() in kokoro_engine.py checks this location first before falling back to espeakng_loader. setup.sh runs brew install espeak-ng automatically on macOS.</w:t>
+      </w:r>
+    </w:p>
+    <w:p>
+      <w:pPr>
+        <w:spacing w:after="60"/>
+      </w:pPr>
+    </w:p>
+    <w:p>
+      <w:pPr>
+        <w:pBdr>
+          <w:bottom w:val="single" w:sz="8" w:space="2" w:color="3C559A"/>
+        </w:pBdr>
+        <w:spacing w:before="320" w:after="80"/>
+        <w:rPr>
+          <w:b/>
+          <w:color w:val="3C559A"/>
+          <w:sz w:val="26"/>
+        </w:rPr>
       </w:pPr>
     </w:p>
     <w:p>

</xml_diff>

<commit_message>
Additional language support added. Updated design doc with cross platform deployment requirements.
</commit_message>
<xml_diff>
--- a/audio-ML/Custom_TTS_Model/docs/TTS_Agent_Solution_Design.docx
+++ b/audio-ML/Custom_TTS_Model/docs/TTS_Agent_Solution_Design.docx
@@ -461,6 +461,96 @@
           </w:p>
         </w:tc>
       </w:tr>
+      <w:tr>
+        <w:tc>
+          <w:tcPr>
+            <w:tcBorders>
+              <w:top w:val="single" w:sz="4" w:color="CCCCCC"/>
+              <w:left w:val="single" w:sz="4" w:color="CCCCCC"/>
+              <w:bottom w:val="single" w:sz="4" w:color="CCCCCC"/>
+              <w:right w:val="single" w:sz="4" w:color="CCCCCC"/>
+            </w:tcBorders>
+            <w:shd w:val="clear" w:color="auto" w:fill="F8F9FA"/>
+          </w:tcPr>
+          <w:p>
+            <w:pPr>
+              <w:spacing w:after="60"/>
+            </w:pPr>
+            <w:r>
+              <w:rPr>
+                <w:sz w:val="18"/>
+              </w:rPr>
+              <w:t>2.2</w:t>
+            </w:r>
+          </w:p>
+        </w:tc>
+        <w:tc>
+          <w:tcPr>
+            <w:tcBorders>
+              <w:top w:val="single" w:sz="4" w:color="CCCCCC"/>
+              <w:left w:val="single" w:sz="4" w:color="CCCCCC"/>
+              <w:bottom w:val="single" w:sz="4" w:color="CCCCCC"/>
+              <w:right w:val="single" w:sz="4" w:color="CCCCCC"/>
+            </w:tcBorders>
+            <w:shd w:val="clear" w:color="auto" w:fill="F8F9FA"/>
+          </w:tcPr>
+          <w:p>
+            <w:pPr>
+              <w:spacing w:after="60"/>
+            </w:pPr>
+            <w:r>
+              <w:rPr>
+                <w:sz w:val="18"/>
+              </w:rPr>
+              <w:t>2026-05-19</w:t>
+            </w:r>
+          </w:p>
+        </w:tc>
+        <w:tc>
+          <w:tcPr>
+            <w:tcBorders>
+              <w:top w:val="single" w:sz="4" w:color="CCCCCC"/>
+              <w:left w:val="single" w:sz="4" w:color="CCCCCC"/>
+              <w:bottom w:val="single" w:sz="4" w:color="CCCCCC"/>
+              <w:right w:val="single" w:sz="4" w:color="CCCCCC"/>
+            </w:tcBorders>
+            <w:shd w:val="clear" w:color="auto" w:fill="F8F9FA"/>
+          </w:tcPr>
+          <w:p>
+            <w:pPr>
+              <w:spacing w:after="60"/>
+            </w:pPr>
+            <w:r>
+              <w:rPr>
+                <w:sz w:val="18"/>
+              </w:rPr>
+              <w:t>Rommel Sharma</w:t>
+            </w:r>
+          </w:p>
+        </w:tc>
+        <w:tc>
+          <w:tcPr>
+            <w:tcBorders>
+              <w:top w:val="single" w:sz="4" w:color="CCCCCC"/>
+              <w:left w:val="single" w:sz="4" w:color="CCCCCC"/>
+              <w:bottom w:val="single" w:sz="4" w:color="CCCCCC"/>
+              <w:right w:val="single" w:sz="4" w:color="CCCCCC"/>
+            </w:tcBorders>
+            <w:shd w:val="clear" w:color="auto" w:fill="F8F9FA"/>
+          </w:tcPr>
+          <w:p>
+            <w:pPr>
+              <w:spacing w:after="60"/>
+            </w:pPr>
+            <w:r>
+              <w:rPr>
+                <w:sz w:val="18"/>
+              </w:rPr>
+              <w:t>Windows WSL2 deployment guide, full Kokoro voice library (54 voices / 9 languages), voice quality reference, cross-platform deployment strategy</w:t>
+            </w:r>
+          </w:p>
+        </w:tc>
+      </w:tr>
     </w:tbl>
     <w:p/>
     <w:p>
@@ -675,7 +765,7 @@
           <w:color w:val="1E202C"/>
           <w:sz w:val="20"/>
         </w:rPr>
-        <w:t>This document describes the architecture and implementation of TTS Agent — a production-oriented, locally deployed text-to-speech system designed for documentary narration, training material, and professional media workflows. The system combines two commercially licensed open-source models: Kokoro-82M for high-quality built-in English and Hindi voices, and F5-TTS for zero-shot voice cloning. Both operate behind a FastAPI service with a lightweight browser UI and are packaged for GPU-accelerated local deployment via Docker.</w:t>
+        <w:t>This document describes the architecture and implementation of TTS Agent — a production-oriented, locally deployed text-to-speech system designed for documentary narration, training material, and professional media workflows. The system combines two commercially licensed open-source models: Kokoro-82M for high-quality built-in voices spanning 9 languages (54 voices covering American English, British English, Hindi, Spanish, French, Italian, Brazilian Portuguese, Japanese, and Mandarin Chinese), and F5-TTS for zero-shot voice cloning. Both operate behind a FastAPI service with a lightweight browser UI and are packaged for GPU-accelerated local deployment, with native support for macOS Apple Silicon (MPS) and Windows WSL2 (CUDA).</w:t>
       </w:r>
     </w:p>
     <w:p>
@@ -2106,6 +2196,1167 @@
           <w:b/>
           <w:color w:val="3C559A"/>
           <w:sz w:val="26"/>
+        </w:rPr>
+        <w:t>4.5 Kokoro Voice Library and Language Coverage</w:t>
+      </w:r>
+    </w:p>
+    <w:p>
+      <w:pPr>
+        <w:spacing w:after="80"/>
+      </w:pPr>
+      <w:r>
+        <w:rPr>
+          <w:color w:val="1E202C"/>
+          <w:sz w:val="20"/>
+        </w:rPr>
+        <w:t>Kokoro-82M ships with 54 ready-to-use voices across 9 languages in a single 82M-parameter model. Each voice is tied to its language pipeline — an English voice cannot render Hindi text and vice versa. For multilingual productions, run separate synthesis passes per language and concatenate the resulting WAV files. Japanese and Mandarin require an additional package: pip install misaki[ja] or misaki[zh].</w:t>
+      </w:r>
+    </w:p>
+    <w:tbl>
+      <w:tblPr>
+        <w:tblStyle w:val="TableGrid"/>
+        <w:tblW w:w="0" w:type="auto"/>
+        <w:tblLook w:val="04A0"/>
+      </w:tblPr>
+      <w:tblGrid>
+        <w:gridCol w:w="1400"/>
+        <w:gridCol w:w="1200"/>
+        <w:gridCol w:w="1000"/>
+        <w:gridCol w:w="2000"/>
+        <w:gridCol w:w="3760"/>
+      </w:tblGrid>
+      <w:tr>
+        <w:trPr>
+          <w:tblHeader/>
+        </w:trPr>
+        <w:tc>
+          <w:tcPr>
+            <w:tcBorders>
+              <w:top w:val="single" w:sz="4" w:color="3C559A"/>
+              <w:left w:val="single" w:sz="4" w:color="3C559A"/>
+              <w:bottom w:val="single" w:sz="4" w:color="3C559A"/>
+              <w:right w:val="single" w:sz="4" w:color="3C559A"/>
+            </w:tcBorders>
+            <w:shd w:val="clear" w:color="auto" w:fill="3C559A"/>
+          </w:tcPr>
+          <w:p>
+            <w:pPr>
+              <w:spacing w:after="60"/>
+            </w:pPr>
+            <w:r>
+              <w:rPr>
+                <w:b/>
+                <w:color w:val="FFFFFF"/>
+                <w:sz w:val="18"/>
+              </w:rPr>
+              <w:t>Language</w:t>
+            </w:r>
+          </w:p>
+        </w:tc>
+        <w:tc>
+          <w:tcPr>
+            <w:tcBorders>
+              <w:top w:val="single" w:sz="4" w:color="3C559A"/>
+              <w:left w:val="single" w:sz="4" w:color="3C559A"/>
+              <w:bottom w:val="single" w:sz="4" w:color="3C559A"/>
+              <w:right w:val="single" w:sz="4" w:color="3C559A"/>
+            </w:tcBorders>
+            <w:shd w:val="clear" w:color="auto" w:fill="3C559A"/>
+          </w:tcPr>
+          <w:p>
+            <w:pPr>
+              <w:spacing w:after="60"/>
+            </w:pPr>
+            <w:r>
+              <w:rPr>
+                <w:b/>
+                <w:color w:val="FFFFFF"/>
+                <w:sz w:val="18"/>
+              </w:rPr>
+              <w:t>Voices (F+M)</w:t>
+            </w:r>
+          </w:p>
+        </w:tc>
+        <w:tc>
+          <w:tcPr>
+            <w:tcBorders>
+              <w:top w:val="single" w:sz="4" w:color="3C559A"/>
+              <w:left w:val="single" w:sz="4" w:color="3C559A"/>
+              <w:bottom w:val="single" w:sz="4" w:color="3C559A"/>
+              <w:right w:val="single" w:sz="4" w:color="3C559A"/>
+            </w:tcBorders>
+            <w:shd w:val="clear" w:color="auto" w:fill="3C559A"/>
+          </w:tcPr>
+          <w:p>
+            <w:pPr>
+              <w:spacing w:after="60"/>
+            </w:pPr>
+            <w:r>
+              <w:rPr>
+                <w:b/>
+                <w:color w:val="FFFFFF"/>
+                <w:sz w:val="18"/>
+              </w:rPr>
+              <w:t>Top Quality</w:t>
+            </w:r>
+          </w:p>
+        </w:tc>
+        <w:tc>
+          <w:tcPr>
+            <w:tcBorders>
+              <w:top w:val="single" w:sz="4" w:color="3C559A"/>
+              <w:left w:val="single" w:sz="4" w:color="3C559A"/>
+              <w:bottom w:val="single" w:sz="4" w:color="3C559A"/>
+              <w:right w:val="single" w:sz="4" w:color="3C559A"/>
+            </w:tcBorders>
+            <w:shd w:val="clear" w:color="auto" w:fill="3C559A"/>
+          </w:tcPr>
+          <w:p>
+            <w:pPr>
+              <w:spacing w:after="60"/>
+            </w:pPr>
+            <w:r>
+              <w:rPr>
+                <w:b/>
+                <w:color w:val="FFFFFF"/>
+                <w:sz w:val="18"/>
+              </w:rPr>
+              <w:t>Recommended Voices</w:t>
+            </w:r>
+          </w:p>
+        </w:tc>
+        <w:tc>
+          <w:tcPr>
+            <w:tcBorders>
+              <w:top w:val="single" w:sz="4" w:color="3C559A"/>
+              <w:left w:val="single" w:sz="4" w:color="3C559A"/>
+              <w:bottom w:val="single" w:sz="4" w:color="3C559A"/>
+              <w:right w:val="single" w:sz="4" w:color="3C559A"/>
+            </w:tcBorders>
+            <w:shd w:val="clear" w:color="auto" w:fill="3C559A"/>
+          </w:tcPr>
+          <w:p>
+            <w:pPr>
+              <w:spacing w:after="60"/>
+            </w:pPr>
+            <w:r>
+              <w:rPr>
+                <w:b/>
+                <w:color w:val="FFFFFF"/>
+                <w:sz w:val="18"/>
+              </w:rPr>
+              <w:t>Notes</w:t>
+            </w:r>
+          </w:p>
+        </w:tc>
+      </w:tr>
+      <w:tr>
+        <w:tc>
+          <w:tcPr>
+            <w:tcBorders>
+              <w:top w:val="single" w:sz="4" w:color="CCCCCC"/>
+              <w:left w:val="single" w:sz="4" w:color="CCCCCC"/>
+              <w:bottom w:val="single" w:sz="4" w:color="CCCCCC"/>
+              <w:right w:val="single" w:sz="4" w:color="CCCCCC"/>
+            </w:tcBorders>
+            <w:shd w:val="clear" w:color="auto" w:fill="F0F4FF"/>
+          </w:tcPr>
+          <w:p>
+            <w:pPr>
+              <w:spacing w:after="60"/>
+            </w:pPr>
+            <w:r>
+              <w:rPr>
+                <w:b/>
+                <w:sz w:val="18"/>
+              </w:rPr>
+              <w:t>American English</w:t>
+            </w:r>
+          </w:p>
+        </w:tc>
+        <w:tc>
+          <w:tcPr>
+            <w:tcBorders>
+              <w:top w:val="single" w:sz="4" w:color="CCCCCC"/>
+              <w:left w:val="single" w:sz="4" w:color="CCCCCC"/>
+              <w:bottom w:val="single" w:sz="4" w:color="CCCCCC"/>
+              <w:right w:val="single" w:sz="4" w:color="CCCCCC"/>
+            </w:tcBorders>
+            <w:shd w:val="clear" w:color="auto" w:fill="F0F4FF"/>
+          </w:tcPr>
+          <w:p>
+            <w:pPr>
+              <w:spacing w:after="60"/>
+            </w:pPr>
+            <w:r>
+              <w:rPr>
+                <w:sz w:val="18"/>
+              </w:rPr>
+              <w:t>20 (11F + 9M)</w:t>
+            </w:r>
+          </w:p>
+        </w:tc>
+        <w:tc>
+          <w:tcPr>
+            <w:tcBorders>
+              <w:top w:val="single" w:sz="4" w:color="CCCCCC"/>
+              <w:left w:val="single" w:sz="4" w:color="CCCCCC"/>
+              <w:bottom w:val="single" w:sz="4" w:color="CCCCCC"/>
+              <w:right w:val="single" w:sz="4" w:color="CCCCCC"/>
+            </w:tcBorders>
+            <w:shd w:val="clear" w:color="auto" w:fill="F0F4FF"/>
+          </w:tcPr>
+          <w:p>
+            <w:pPr>
+              <w:spacing w:after="60"/>
+            </w:pPr>
+            <w:r>
+              <w:rPr>
+                <w:sz w:val="18"/>
+              </w:rPr>
+              <w:t>A / A-</w:t>
+            </w:r>
+          </w:p>
+        </w:tc>
+        <w:tc>
+          <w:tcPr>
+            <w:tcBorders>
+              <w:top w:val="single" w:sz="4" w:color="CCCCCC"/>
+              <w:left w:val="single" w:sz="4" w:color="CCCCCC"/>
+              <w:bottom w:val="single" w:sz="4" w:color="CCCCCC"/>
+              <w:right w:val="single" w:sz="4" w:color="CCCCCC"/>
+            </w:tcBorders>
+            <w:shd w:val="clear" w:color="auto" w:fill="F0F4FF"/>
+          </w:tcPr>
+          <w:p>
+            <w:pPr>
+              <w:spacing w:after="60"/>
+            </w:pPr>
+            <w:r>
+              <w:rPr>
+                <w:sz w:val="18"/>
+              </w:rPr>
+              <w:t>af_heart (A), af_bella (A-), am_fenrir / am_michael / am_puck (C+)</w:t>
+            </w:r>
+          </w:p>
+        </w:tc>
+        <w:tc>
+          <w:tcPr>
+            <w:tcBorders>
+              <w:top w:val="single" w:sz="4" w:color="CCCCCC"/>
+              <w:left w:val="single" w:sz="4" w:color="CCCCCC"/>
+              <w:bottom w:val="single" w:sz="4" w:color="CCCCCC"/>
+              <w:right w:val="single" w:sz="4" w:color="CCCCCC"/>
+            </w:tcBorders>
+            <w:shd w:val="clear" w:color="auto" w:fill="F0F4FF"/>
+          </w:tcPr>
+          <w:p>
+            <w:pPr>
+              <w:spacing w:after="60"/>
+            </w:pPr>
+            <w:r>
+              <w:rPr>
+                <w:sz w:val="18"/>
+              </w:rPr>
+              <w:t>Best overall quality. af_heart and af_bella backed by HH hours of training data. Primary recommendation for English narration.</w:t>
+            </w:r>
+          </w:p>
+        </w:tc>
+      </w:tr>
+      <w:tr>
+        <w:tc>
+          <w:tcPr>
+            <w:tcBorders>
+              <w:top w:val="single" w:sz="4" w:color="CCCCCC"/>
+              <w:left w:val="single" w:sz="4" w:color="CCCCCC"/>
+              <w:bottom w:val="single" w:sz="4" w:color="CCCCCC"/>
+              <w:right w:val="single" w:sz="4" w:color="CCCCCC"/>
+            </w:tcBorders>
+          </w:tcPr>
+          <w:p>
+            <w:pPr>
+              <w:spacing w:after="60"/>
+            </w:pPr>
+            <w:r>
+              <w:rPr>
+                <w:b/>
+                <w:sz w:val="18"/>
+              </w:rPr>
+              <w:t>British English</w:t>
+            </w:r>
+          </w:p>
+        </w:tc>
+        <w:tc>
+          <w:tcPr>
+            <w:tcBorders>
+              <w:top w:val="single" w:sz="4" w:color="CCCCCC"/>
+              <w:left w:val="single" w:sz="4" w:color="CCCCCC"/>
+              <w:bottom w:val="single" w:sz="4" w:color="CCCCCC"/>
+              <w:right w:val="single" w:sz="4" w:color="CCCCCC"/>
+            </w:tcBorders>
+          </w:tcPr>
+          <w:p>
+            <w:pPr>
+              <w:spacing w:after="60"/>
+            </w:pPr>
+            <w:r>
+              <w:rPr>
+                <w:sz w:val="18"/>
+              </w:rPr>
+              <w:t>8 (4F + 4M)</w:t>
+            </w:r>
+          </w:p>
+        </w:tc>
+        <w:tc>
+          <w:tcPr>
+            <w:tcBorders>
+              <w:top w:val="single" w:sz="4" w:color="CCCCCC"/>
+              <w:left w:val="single" w:sz="4" w:color="CCCCCC"/>
+              <w:bottom w:val="single" w:sz="4" w:color="CCCCCC"/>
+              <w:right w:val="single" w:sz="4" w:color="CCCCCC"/>
+            </w:tcBorders>
+          </w:tcPr>
+          <w:p>
+            <w:pPr>
+              <w:spacing w:after="60"/>
+            </w:pPr>
+            <w:r>
+              <w:rPr>
+                <w:sz w:val="18"/>
+              </w:rPr>
+              <w:t>B-</w:t>
+            </w:r>
+          </w:p>
+        </w:tc>
+        <w:tc>
+          <w:tcPr>
+            <w:tcBorders>
+              <w:top w:val="single" w:sz="4" w:color="CCCCCC"/>
+              <w:left w:val="single" w:sz="4" w:color="CCCCCC"/>
+              <w:bottom w:val="single" w:sz="4" w:color="CCCCCC"/>
+              <w:right w:val="single" w:sz="4" w:color="CCCCCC"/>
+            </w:tcBorders>
+          </w:tcPr>
+          <w:p>
+            <w:pPr>
+              <w:spacing w:after="60"/>
+            </w:pPr>
+            <w:r>
+              <w:rPr>
+                <w:sz w:val="18"/>
+              </w:rPr>
+              <w:t>bf_emma (B-), bm_george / bm_fable (C)</w:t>
+            </w:r>
+          </w:p>
+        </w:tc>
+        <w:tc>
+          <w:tcPr>
+            <w:tcBorders>
+              <w:top w:val="single" w:sz="4" w:color="CCCCCC"/>
+              <w:left w:val="single" w:sz="4" w:color="CCCCCC"/>
+              <w:bottom w:val="single" w:sz="4" w:color="CCCCCC"/>
+              <w:right w:val="single" w:sz="4" w:color="CCCCCC"/>
+            </w:tcBorders>
+          </w:tcPr>
+          <w:p>
+            <w:pPr>
+              <w:spacing w:after="60"/>
+            </w:pPr>
+            <w:r>
+              <w:rPr>
+                <w:sz w:val="18"/>
+              </w:rPr>
+              <w:t>bf_emma backed by HH hours of training. Good for documentary and BBC-style narration.</w:t>
+            </w:r>
+          </w:p>
+        </w:tc>
+      </w:tr>
+      <w:tr>
+        <w:tc>
+          <w:tcPr>
+            <w:tcBorders>
+              <w:top w:val="single" w:sz="4" w:color="CCCCCC"/>
+              <w:left w:val="single" w:sz="4" w:color="CCCCCC"/>
+              <w:bottom w:val="single" w:sz="4" w:color="CCCCCC"/>
+              <w:right w:val="single" w:sz="4" w:color="CCCCCC"/>
+            </w:tcBorders>
+            <w:shd w:val="clear" w:color="auto" w:fill="F0F4FF"/>
+          </w:tcPr>
+          <w:p>
+            <w:pPr>
+              <w:spacing w:after="60"/>
+            </w:pPr>
+            <w:r>
+              <w:rPr>
+                <w:b/>
+                <w:sz w:val="18"/>
+              </w:rPr>
+              <w:t>Hindi</w:t>
+            </w:r>
+          </w:p>
+        </w:tc>
+        <w:tc>
+          <w:tcPr>
+            <w:tcBorders>
+              <w:top w:val="single" w:sz="4" w:color="CCCCCC"/>
+              <w:left w:val="single" w:sz="4" w:color="CCCCCC"/>
+              <w:bottom w:val="single" w:sz="4" w:color="CCCCCC"/>
+              <w:right w:val="single" w:sz="4" w:color="CCCCCC"/>
+            </w:tcBorders>
+            <w:shd w:val="clear" w:color="auto" w:fill="F0F4FF"/>
+          </w:tcPr>
+          <w:p>
+            <w:pPr>
+              <w:spacing w:after="60"/>
+            </w:pPr>
+            <w:r>
+              <w:rPr>
+                <w:sz w:val="18"/>
+              </w:rPr>
+              <w:t>4 (2F + 2M)</w:t>
+            </w:r>
+          </w:p>
+        </w:tc>
+        <w:tc>
+          <w:tcPr>
+            <w:tcBorders>
+              <w:top w:val="single" w:sz="4" w:color="CCCCCC"/>
+              <w:left w:val="single" w:sz="4" w:color="CCCCCC"/>
+              <w:bottom w:val="single" w:sz="4" w:color="CCCCCC"/>
+              <w:right w:val="single" w:sz="4" w:color="CCCCCC"/>
+            </w:tcBorders>
+            <w:shd w:val="clear" w:color="auto" w:fill="F0F4FF"/>
+          </w:tcPr>
+          <w:p>
+            <w:pPr>
+              <w:spacing w:after="60"/>
+            </w:pPr>
+            <w:r>
+              <w:rPr>
+                <w:sz w:val="18"/>
+              </w:rPr>
+              <w:t>C</w:t>
+            </w:r>
+          </w:p>
+        </w:tc>
+        <w:tc>
+          <w:tcPr>
+            <w:tcBorders>
+              <w:top w:val="single" w:sz="4" w:color="CCCCCC"/>
+              <w:left w:val="single" w:sz="4" w:color="CCCCCC"/>
+              <w:bottom w:val="single" w:sz="4" w:color="CCCCCC"/>
+              <w:right w:val="single" w:sz="4" w:color="CCCCCC"/>
+            </w:tcBorders>
+            <w:shd w:val="clear" w:color="auto" w:fill="F0F4FF"/>
+          </w:tcPr>
+          <w:p>
+            <w:pPr>
+              <w:spacing w:after="60"/>
+            </w:pPr>
+            <w:r>
+              <w:rPr>
+                <w:sz w:val="18"/>
+              </w:rPr>
+              <w:t>hf_alpha, hf_beta (F); hm_omega, hm_psi (M)</w:t>
+            </w:r>
+          </w:p>
+        </w:tc>
+        <w:tc>
+          <w:tcPr>
+            <w:tcBorders>
+              <w:top w:val="single" w:sz="4" w:color="CCCCCC"/>
+              <w:left w:val="single" w:sz="4" w:color="CCCCCC"/>
+              <w:bottom w:val="single" w:sz="4" w:color="CCCCCC"/>
+              <w:right w:val="single" w:sz="4" w:color="CCCCCC"/>
+            </w:tcBorders>
+            <w:shd w:val="clear" w:color="auto" w:fill="F0F4FF"/>
+          </w:tcPr>
+          <w:p>
+            <w:pPr>
+              <w:spacing w:after="60"/>
+            </w:pPr>
+            <w:r>
+              <w:rPr>
+                <w:sz w:val="18"/>
+              </w:rPr>
+              <w:t>Intelligible for narration; H hours training (1–10 h). Uses espeak-ng hi G2P fallback.</w:t>
+            </w:r>
+          </w:p>
+        </w:tc>
+      </w:tr>
+      <w:tr>
+        <w:tc>
+          <w:tcPr>
+            <w:tcBorders>
+              <w:top w:val="single" w:sz="4" w:color="CCCCCC"/>
+              <w:left w:val="single" w:sz="4" w:color="CCCCCC"/>
+              <w:bottom w:val="single" w:sz="4" w:color="CCCCCC"/>
+              <w:right w:val="single" w:sz="4" w:color="CCCCCC"/>
+            </w:tcBorders>
+          </w:tcPr>
+          <w:p>
+            <w:pPr>
+              <w:spacing w:after="60"/>
+            </w:pPr>
+            <w:r>
+              <w:rPr>
+                <w:b/>
+                <w:sz w:val="18"/>
+              </w:rPr>
+              <w:t>Spanish</w:t>
+            </w:r>
+          </w:p>
+        </w:tc>
+        <w:tc>
+          <w:tcPr>
+            <w:tcBorders>
+              <w:top w:val="single" w:sz="4" w:color="CCCCCC"/>
+              <w:left w:val="single" w:sz="4" w:color="CCCCCC"/>
+              <w:bottom w:val="single" w:sz="4" w:color="CCCCCC"/>
+              <w:right w:val="single" w:sz="4" w:color="CCCCCC"/>
+            </w:tcBorders>
+          </w:tcPr>
+          <w:p>
+            <w:pPr>
+              <w:spacing w:after="60"/>
+            </w:pPr>
+            <w:r>
+              <w:rPr>
+                <w:sz w:val="18"/>
+              </w:rPr>
+              <w:t>3 (1F + 2M)</w:t>
+            </w:r>
+          </w:p>
+        </w:tc>
+        <w:tc>
+          <w:tcPr>
+            <w:tcBorders>
+              <w:top w:val="single" w:sz="4" w:color="CCCCCC"/>
+              <w:left w:val="single" w:sz="4" w:color="CCCCCC"/>
+              <w:bottom w:val="single" w:sz="4" w:color="CCCCCC"/>
+              <w:right w:val="single" w:sz="4" w:color="CCCCCC"/>
+            </w:tcBorders>
+          </w:tcPr>
+          <w:p>
+            <w:pPr>
+              <w:spacing w:after="60"/>
+            </w:pPr>
+            <w:r>
+              <w:rPr>
+                <w:sz w:val="18"/>
+              </w:rPr>
+              <w:t>—</w:t>
+            </w:r>
+          </w:p>
+        </w:tc>
+        <w:tc>
+          <w:tcPr>
+            <w:tcBorders>
+              <w:top w:val="single" w:sz="4" w:color="CCCCCC"/>
+              <w:left w:val="single" w:sz="4" w:color="CCCCCC"/>
+              <w:bottom w:val="single" w:sz="4" w:color="CCCCCC"/>
+              <w:right w:val="single" w:sz="4" w:color="CCCCCC"/>
+            </w:tcBorders>
+          </w:tcPr>
+          <w:p>
+            <w:pPr>
+              <w:spacing w:after="60"/>
+            </w:pPr>
+            <w:r>
+              <w:rPr>
+                <w:sz w:val="18"/>
+              </w:rPr>
+              <w:t>ef_dora, em_alex, em_santa</w:t>
+            </w:r>
+          </w:p>
+        </w:tc>
+        <w:tc>
+          <w:tcPr>
+            <w:tcBorders>
+              <w:top w:val="single" w:sz="4" w:color="CCCCCC"/>
+              <w:left w:val="single" w:sz="4" w:color="CCCCCC"/>
+              <w:bottom w:val="single" w:sz="4" w:color="CCCCCC"/>
+              <w:right w:val="single" w:sz="4" w:color="CCCCCC"/>
+            </w:tcBorders>
+          </w:tcPr>
+          <w:p>
+            <w:pPr>
+              <w:spacing w:after="60"/>
+            </w:pPr>
+            <w:r>
+              <w:rPr>
+                <w:sz w:val="18"/>
+              </w:rPr>
+              <w:t>espeak-ng es fallback.</w:t>
+            </w:r>
+          </w:p>
+        </w:tc>
+      </w:tr>
+      <w:tr>
+        <w:tc>
+          <w:tcPr>
+            <w:tcBorders>
+              <w:top w:val="single" w:sz="4" w:color="CCCCCC"/>
+              <w:left w:val="single" w:sz="4" w:color="CCCCCC"/>
+              <w:bottom w:val="single" w:sz="4" w:color="CCCCCC"/>
+              <w:right w:val="single" w:sz="4" w:color="CCCCCC"/>
+            </w:tcBorders>
+            <w:shd w:val="clear" w:color="auto" w:fill="F0F4FF"/>
+          </w:tcPr>
+          <w:p>
+            <w:pPr>
+              <w:spacing w:after="60"/>
+            </w:pPr>
+            <w:r>
+              <w:rPr>
+                <w:b/>
+                <w:sz w:val="18"/>
+              </w:rPr>
+              <w:t>French</w:t>
+            </w:r>
+          </w:p>
+        </w:tc>
+        <w:tc>
+          <w:tcPr>
+            <w:tcBorders>
+              <w:top w:val="single" w:sz="4" w:color="CCCCCC"/>
+              <w:left w:val="single" w:sz="4" w:color="CCCCCC"/>
+              <w:bottom w:val="single" w:sz="4" w:color="CCCCCC"/>
+              <w:right w:val="single" w:sz="4" w:color="CCCCCC"/>
+            </w:tcBorders>
+            <w:shd w:val="clear" w:color="auto" w:fill="F0F4FF"/>
+          </w:tcPr>
+          <w:p>
+            <w:pPr>
+              <w:spacing w:after="60"/>
+            </w:pPr>
+            <w:r>
+              <w:rPr>
+                <w:sz w:val="18"/>
+              </w:rPr>
+              <w:t>1 (1F)</w:t>
+            </w:r>
+          </w:p>
+        </w:tc>
+        <w:tc>
+          <w:tcPr>
+            <w:tcBorders>
+              <w:top w:val="single" w:sz="4" w:color="CCCCCC"/>
+              <w:left w:val="single" w:sz="4" w:color="CCCCCC"/>
+              <w:bottom w:val="single" w:sz="4" w:color="CCCCCC"/>
+              <w:right w:val="single" w:sz="4" w:color="CCCCCC"/>
+            </w:tcBorders>
+            <w:shd w:val="clear" w:color="auto" w:fill="F0F4FF"/>
+          </w:tcPr>
+          <w:p>
+            <w:pPr>
+              <w:spacing w:after="60"/>
+            </w:pPr>
+            <w:r>
+              <w:rPr>
+                <w:sz w:val="18"/>
+              </w:rPr>
+              <w:t>B-</w:t>
+            </w:r>
+          </w:p>
+        </w:tc>
+        <w:tc>
+          <w:tcPr>
+            <w:tcBorders>
+              <w:top w:val="single" w:sz="4" w:color="CCCCCC"/>
+              <w:left w:val="single" w:sz="4" w:color="CCCCCC"/>
+              <w:bottom w:val="single" w:sz="4" w:color="CCCCCC"/>
+              <w:right w:val="single" w:sz="4" w:color="CCCCCC"/>
+            </w:tcBorders>
+            <w:shd w:val="clear" w:color="auto" w:fill="F0F4FF"/>
+          </w:tcPr>
+          <w:p>
+            <w:pPr>
+              <w:spacing w:after="60"/>
+            </w:pPr>
+            <w:r>
+              <w:rPr>
+                <w:sz w:val="18"/>
+              </w:rPr>
+              <w:t>ff_siwis (B-)</w:t>
+            </w:r>
+          </w:p>
+        </w:tc>
+        <w:tc>
+          <w:tcPr>
+            <w:tcBorders>
+              <w:top w:val="single" w:sz="4" w:color="CCCCCC"/>
+              <w:left w:val="single" w:sz="4" w:color="CCCCCC"/>
+              <w:bottom w:val="single" w:sz="4" w:color="CCCCCC"/>
+              <w:right w:val="single" w:sz="4" w:color="CCCCCC"/>
+            </w:tcBorders>
+            <w:shd w:val="clear" w:color="auto" w:fill="F0F4FF"/>
+          </w:tcPr>
+          <w:p>
+            <w:pPr>
+              <w:spacing w:after="60"/>
+            </w:pPr>
+            <w:r>
+              <w:rPr>
+                <w:sz w:val="18"/>
+              </w:rPr>
+              <w:t>Best non-English quality. SIWIS dataset (&lt;11 h training). Strong for professional French narration.</w:t>
+            </w:r>
+          </w:p>
+        </w:tc>
+      </w:tr>
+      <w:tr>
+        <w:tc>
+          <w:tcPr>
+            <w:tcBorders>
+              <w:top w:val="single" w:sz="4" w:color="CCCCCC"/>
+              <w:left w:val="single" w:sz="4" w:color="CCCCCC"/>
+              <w:bottom w:val="single" w:sz="4" w:color="CCCCCC"/>
+              <w:right w:val="single" w:sz="4" w:color="CCCCCC"/>
+            </w:tcBorders>
+          </w:tcPr>
+          <w:p>
+            <w:pPr>
+              <w:spacing w:after="60"/>
+            </w:pPr>
+            <w:r>
+              <w:rPr>
+                <w:b/>
+                <w:sz w:val="18"/>
+              </w:rPr>
+              <w:t>Italian</w:t>
+            </w:r>
+          </w:p>
+        </w:tc>
+        <w:tc>
+          <w:tcPr>
+            <w:tcBorders>
+              <w:top w:val="single" w:sz="4" w:color="CCCCCC"/>
+              <w:left w:val="single" w:sz="4" w:color="CCCCCC"/>
+              <w:bottom w:val="single" w:sz="4" w:color="CCCCCC"/>
+              <w:right w:val="single" w:sz="4" w:color="CCCCCC"/>
+            </w:tcBorders>
+          </w:tcPr>
+          <w:p>
+            <w:pPr>
+              <w:spacing w:after="60"/>
+            </w:pPr>
+            <w:r>
+              <w:rPr>
+                <w:sz w:val="18"/>
+              </w:rPr>
+              <w:t>2 (1F + 1M)</w:t>
+            </w:r>
+          </w:p>
+        </w:tc>
+        <w:tc>
+          <w:tcPr>
+            <w:tcBorders>
+              <w:top w:val="single" w:sz="4" w:color="CCCCCC"/>
+              <w:left w:val="single" w:sz="4" w:color="CCCCCC"/>
+              <w:bottom w:val="single" w:sz="4" w:color="CCCCCC"/>
+              <w:right w:val="single" w:sz="4" w:color="CCCCCC"/>
+            </w:tcBorders>
+          </w:tcPr>
+          <w:p>
+            <w:pPr>
+              <w:spacing w:after="60"/>
+            </w:pPr>
+            <w:r>
+              <w:rPr>
+                <w:sz w:val="18"/>
+              </w:rPr>
+              <w:t>C</w:t>
+            </w:r>
+          </w:p>
+        </w:tc>
+        <w:tc>
+          <w:tcPr>
+            <w:tcBorders>
+              <w:top w:val="single" w:sz="4" w:color="CCCCCC"/>
+              <w:left w:val="single" w:sz="4" w:color="CCCCCC"/>
+              <w:bottom w:val="single" w:sz="4" w:color="CCCCCC"/>
+              <w:right w:val="single" w:sz="4" w:color="CCCCCC"/>
+            </w:tcBorders>
+          </w:tcPr>
+          <w:p>
+            <w:pPr>
+              <w:spacing w:after="60"/>
+            </w:pPr>
+            <w:r>
+              <w:rPr>
+                <w:sz w:val="18"/>
+              </w:rPr>
+              <w:t>if_sara (F), im_nicola (M)</w:t>
+            </w:r>
+          </w:p>
+        </w:tc>
+        <w:tc>
+          <w:tcPr>
+            <w:tcBorders>
+              <w:top w:val="single" w:sz="4" w:color="CCCCCC"/>
+              <w:left w:val="single" w:sz="4" w:color="CCCCCC"/>
+              <w:bottom w:val="single" w:sz="4" w:color="CCCCCC"/>
+              <w:right w:val="single" w:sz="4" w:color="CCCCCC"/>
+            </w:tcBorders>
+          </w:tcPr>
+          <w:p>
+            <w:pPr>
+              <w:spacing w:after="60"/>
+            </w:pPr>
+            <w:r>
+              <w:rPr>
+                <w:sz w:val="18"/>
+              </w:rPr>
+              <w:t>H hours training. espeak-ng it fallback.</w:t>
+            </w:r>
+          </w:p>
+        </w:tc>
+      </w:tr>
+      <w:tr>
+        <w:tc>
+          <w:tcPr>
+            <w:tcBorders>
+              <w:top w:val="single" w:sz="4" w:color="CCCCCC"/>
+              <w:left w:val="single" w:sz="4" w:color="CCCCCC"/>
+              <w:bottom w:val="single" w:sz="4" w:color="CCCCCC"/>
+              <w:right w:val="single" w:sz="4" w:color="CCCCCC"/>
+            </w:tcBorders>
+            <w:shd w:val="clear" w:color="auto" w:fill="F0F4FF"/>
+          </w:tcPr>
+          <w:p>
+            <w:pPr>
+              <w:spacing w:after="60"/>
+            </w:pPr>
+            <w:r>
+              <w:rPr>
+                <w:b/>
+                <w:sz w:val="18"/>
+              </w:rPr>
+              <w:t>Brazilian Portuguese</w:t>
+            </w:r>
+          </w:p>
+        </w:tc>
+        <w:tc>
+          <w:tcPr>
+            <w:tcBorders>
+              <w:top w:val="single" w:sz="4" w:color="CCCCCC"/>
+              <w:left w:val="single" w:sz="4" w:color="CCCCCC"/>
+              <w:bottom w:val="single" w:sz="4" w:color="CCCCCC"/>
+              <w:right w:val="single" w:sz="4" w:color="CCCCCC"/>
+            </w:tcBorders>
+            <w:shd w:val="clear" w:color="auto" w:fill="F0F4FF"/>
+          </w:tcPr>
+          <w:p>
+            <w:pPr>
+              <w:spacing w:after="60"/>
+            </w:pPr>
+            <w:r>
+              <w:rPr>
+                <w:sz w:val="18"/>
+              </w:rPr>
+              <w:t>3 (1F + 2M)</w:t>
+            </w:r>
+          </w:p>
+        </w:tc>
+        <w:tc>
+          <w:tcPr>
+            <w:tcBorders>
+              <w:top w:val="single" w:sz="4" w:color="CCCCCC"/>
+              <w:left w:val="single" w:sz="4" w:color="CCCCCC"/>
+              <w:bottom w:val="single" w:sz="4" w:color="CCCCCC"/>
+              <w:right w:val="single" w:sz="4" w:color="CCCCCC"/>
+            </w:tcBorders>
+            <w:shd w:val="clear" w:color="auto" w:fill="F0F4FF"/>
+          </w:tcPr>
+          <w:p>
+            <w:pPr>
+              <w:spacing w:after="60"/>
+            </w:pPr>
+            <w:r>
+              <w:rPr>
+                <w:sz w:val="18"/>
+              </w:rPr>
+              <w:t>—</w:t>
+            </w:r>
+          </w:p>
+        </w:tc>
+        <w:tc>
+          <w:tcPr>
+            <w:tcBorders>
+              <w:top w:val="single" w:sz="4" w:color="CCCCCC"/>
+              <w:left w:val="single" w:sz="4" w:color="CCCCCC"/>
+              <w:bottom w:val="single" w:sz="4" w:color="CCCCCC"/>
+              <w:right w:val="single" w:sz="4" w:color="CCCCCC"/>
+            </w:tcBorders>
+            <w:shd w:val="clear" w:color="auto" w:fill="F0F4FF"/>
+          </w:tcPr>
+          <w:p>
+            <w:pPr>
+              <w:spacing w:after="60"/>
+            </w:pPr>
+            <w:r>
+              <w:rPr>
+                <w:sz w:val="18"/>
+              </w:rPr>
+              <w:t>pf_dora, pm_alex, pm_santa</w:t>
+            </w:r>
+          </w:p>
+        </w:tc>
+        <w:tc>
+          <w:tcPr>
+            <w:tcBorders>
+              <w:top w:val="single" w:sz="4" w:color="CCCCCC"/>
+              <w:left w:val="single" w:sz="4" w:color="CCCCCC"/>
+              <w:bottom w:val="single" w:sz="4" w:color="CCCCCC"/>
+              <w:right w:val="single" w:sz="4" w:color="CCCCCC"/>
+            </w:tcBorders>
+            <w:shd w:val="clear" w:color="auto" w:fill="F0F4FF"/>
+          </w:tcPr>
+          <w:p>
+            <w:pPr>
+              <w:spacing w:after="60"/>
+            </w:pPr>
+            <w:r>
+              <w:rPr>
+                <w:sz w:val="18"/>
+              </w:rPr>
+              <w:t>espeak-ng pt-br fallback.</w:t>
+            </w:r>
+          </w:p>
+        </w:tc>
+      </w:tr>
+      <w:tr>
+        <w:tc>
+          <w:tcPr>
+            <w:tcBorders>
+              <w:top w:val="single" w:sz="4" w:color="CCCCCC"/>
+              <w:left w:val="single" w:sz="4" w:color="CCCCCC"/>
+              <w:bottom w:val="single" w:sz="4" w:color="CCCCCC"/>
+              <w:right w:val="single" w:sz="4" w:color="CCCCCC"/>
+            </w:tcBorders>
+          </w:tcPr>
+          <w:p>
+            <w:pPr>
+              <w:spacing w:after="60"/>
+            </w:pPr>
+            <w:r>
+              <w:rPr>
+                <w:b/>
+                <w:sz w:val="18"/>
+              </w:rPr>
+              <w:t>Japanese</w:t>
+            </w:r>
+          </w:p>
+        </w:tc>
+        <w:tc>
+          <w:tcPr>
+            <w:tcBorders>
+              <w:top w:val="single" w:sz="4" w:color="CCCCCC"/>
+              <w:left w:val="single" w:sz="4" w:color="CCCCCC"/>
+              <w:bottom w:val="single" w:sz="4" w:color="CCCCCC"/>
+              <w:right w:val="single" w:sz="4" w:color="CCCCCC"/>
+            </w:tcBorders>
+          </w:tcPr>
+          <w:p>
+            <w:pPr>
+              <w:spacing w:after="60"/>
+            </w:pPr>
+            <w:r>
+              <w:rPr>
+                <w:sz w:val="18"/>
+              </w:rPr>
+              <w:t>5 (4F + 1M)</w:t>
+            </w:r>
+          </w:p>
+        </w:tc>
+        <w:tc>
+          <w:tcPr>
+            <w:tcBorders>
+              <w:top w:val="single" w:sz="4" w:color="CCCCCC"/>
+              <w:left w:val="single" w:sz="4" w:color="CCCCCC"/>
+              <w:bottom w:val="single" w:sz="4" w:color="CCCCCC"/>
+              <w:right w:val="single" w:sz="4" w:color="CCCCCC"/>
+            </w:tcBorders>
+          </w:tcPr>
+          <w:p>
+            <w:pPr>
+              <w:spacing w:after="60"/>
+            </w:pPr>
+            <w:r>
+              <w:rPr>
+                <w:sz w:val="18"/>
+              </w:rPr>
+              <w:t>C+</w:t>
+            </w:r>
+          </w:p>
+        </w:tc>
+        <w:tc>
+          <w:tcPr>
+            <w:tcBorders>
+              <w:top w:val="single" w:sz="4" w:color="CCCCCC"/>
+              <w:left w:val="single" w:sz="4" w:color="CCCCCC"/>
+              <w:bottom w:val="single" w:sz="4" w:color="CCCCCC"/>
+              <w:right w:val="single" w:sz="4" w:color="CCCCCC"/>
+            </w:tcBorders>
+          </w:tcPr>
+          <w:p>
+            <w:pPr>
+              <w:spacing w:after="60"/>
+            </w:pPr>
+            <w:r>
+              <w:rPr>
+                <w:sz w:val="18"/>
+              </w:rPr>
+              <w:t>jf_alpha (C+), jf_gongitsune (C)</w:t>
+            </w:r>
+          </w:p>
+        </w:tc>
+        <w:tc>
+          <w:tcPr>
+            <w:tcBorders>
+              <w:top w:val="single" w:sz="4" w:color="CCCCCC"/>
+              <w:left w:val="single" w:sz="4" w:color="CCCCCC"/>
+              <w:bottom w:val="single" w:sz="4" w:color="CCCCCC"/>
+              <w:right w:val="single" w:sz="4" w:color="CCCCCC"/>
+            </w:tcBorders>
+          </w:tcPr>
+          <w:p>
+            <w:pPr>
+              <w:spacing w:after="60"/>
+            </w:pPr>
+            <w:r>
+              <w:rPr>
+                <w:sz w:val="18"/>
+              </w:rPr>
+              <w:t>Requires: pip install misaki[ja]. H hours total training data.</w:t>
+            </w:r>
+          </w:p>
+        </w:tc>
+      </w:tr>
+      <w:tr>
+        <w:tc>
+          <w:tcPr>
+            <w:tcBorders>
+              <w:top w:val="single" w:sz="4" w:color="CCCCCC"/>
+              <w:left w:val="single" w:sz="4" w:color="CCCCCC"/>
+              <w:bottom w:val="single" w:sz="4" w:color="CCCCCC"/>
+              <w:right w:val="single" w:sz="4" w:color="CCCCCC"/>
+            </w:tcBorders>
+            <w:shd w:val="clear" w:color="auto" w:fill="F0F4FF"/>
+          </w:tcPr>
+          <w:p>
+            <w:pPr>
+              <w:spacing w:after="60"/>
+            </w:pPr>
+            <w:r>
+              <w:rPr>
+                <w:b/>
+                <w:sz w:val="18"/>
+              </w:rPr>
+              <w:t>Mandarin Chinese</w:t>
+            </w:r>
+          </w:p>
+        </w:tc>
+        <w:tc>
+          <w:tcPr>
+            <w:tcBorders>
+              <w:top w:val="single" w:sz="4" w:color="CCCCCC"/>
+              <w:left w:val="single" w:sz="4" w:color="CCCCCC"/>
+              <w:bottom w:val="single" w:sz="4" w:color="CCCCCC"/>
+              <w:right w:val="single" w:sz="4" w:color="CCCCCC"/>
+            </w:tcBorders>
+            <w:shd w:val="clear" w:color="auto" w:fill="F0F4FF"/>
+          </w:tcPr>
+          <w:p>
+            <w:pPr>
+              <w:spacing w:after="60"/>
+            </w:pPr>
+            <w:r>
+              <w:rPr>
+                <w:sz w:val="18"/>
+              </w:rPr>
+              <w:t>8 (4F + 4M)</w:t>
+            </w:r>
+          </w:p>
+        </w:tc>
+        <w:tc>
+          <w:tcPr>
+            <w:tcBorders>
+              <w:top w:val="single" w:sz="4" w:color="CCCCCC"/>
+              <w:left w:val="single" w:sz="4" w:color="CCCCCC"/>
+              <w:bottom w:val="single" w:sz="4" w:color="CCCCCC"/>
+              <w:right w:val="single" w:sz="4" w:color="CCCCCC"/>
+            </w:tcBorders>
+            <w:shd w:val="clear" w:color="auto" w:fill="F0F4FF"/>
+          </w:tcPr>
+          <w:p>
+            <w:pPr>
+              <w:spacing w:after="60"/>
+            </w:pPr>
+            <w:r>
+              <w:rPr>
+                <w:sz w:val="18"/>
+              </w:rPr>
+              <w:t>D</w:t>
+            </w:r>
+          </w:p>
+        </w:tc>
+        <w:tc>
+          <w:tcPr>
+            <w:tcBorders>
+              <w:top w:val="single" w:sz="4" w:color="CCCCCC"/>
+              <w:left w:val="single" w:sz="4" w:color="CCCCCC"/>
+              <w:bottom w:val="single" w:sz="4" w:color="CCCCCC"/>
+              <w:right w:val="single" w:sz="4" w:color="CCCCCC"/>
+            </w:tcBorders>
+            <w:shd w:val="clear" w:color="auto" w:fill="F0F4FF"/>
+          </w:tcPr>
+          <w:p>
+            <w:pPr>
+              <w:spacing w:after="60"/>
+            </w:pPr>
+            <w:r>
+              <w:rPr>
+                <w:sz w:val="18"/>
+              </w:rPr>
+              <w:t>zf_xiaoxiao, zm_yunyang</w:t>
+            </w:r>
+          </w:p>
+        </w:tc>
+        <w:tc>
+          <w:tcPr>
+            <w:tcBorders>
+              <w:top w:val="single" w:sz="4" w:color="CCCCCC"/>
+              <w:left w:val="single" w:sz="4" w:color="CCCCCC"/>
+              <w:bottom w:val="single" w:sz="4" w:color="CCCCCC"/>
+              <w:right w:val="single" w:sz="4" w:color="CCCCCC"/>
+            </w:tcBorders>
+            <w:shd w:val="clear" w:color="auto" w:fill="F0F4FF"/>
+          </w:tcPr>
+          <w:p>
+            <w:pPr>
+              <w:spacing w:after="60"/>
+            </w:pPr>
+            <w:r>
+              <w:rPr>
+                <w:sz w:val="18"/>
+              </w:rPr>
+              <w:t>Requires: pip install misaki[zh]. Limited training data; functional but not broadcast grade.</w:t>
+            </w:r>
+          </w:p>
+        </w:tc>
+      </w:tr>
+    </w:tbl>
+    <w:p>
+      <w:pPr>
+        <w:spacing w:before="200" w:after="80"/>
+      </w:pPr>
+      <w:r>
+        <w:rPr>
+          <w:b/>
+          <w:color w:val="44546E"/>
+          <w:sz w:val="23"/>
         </w:rPr>
         <w:t>5. DESIGN PRINCIPLES</w:t>
       </w:r>
@@ -2521,7 +3772,7 @@
                 <w:color w:val="1E202C"/>
                 <w:sz w:val="18"/>
               </w:rPr>
-              <w:t>English &amp; Hindi voice synthesis</w:t>
+              <w:t>54 built-in voices across 9 languages: EN-US (20), EN-GB (8), Hindi (4), Spanish (3), French (1), Italian (2), Portuguese-BR (3), Japanese (5), Mandarin (8)</w:t>
             </w:r>
           </w:p>
         </w:tc>
@@ -3282,6 +4533,880 @@
       </w:tr>
     </w:tbl>
     <w:p/>
+    <w:p>
+      <w:pPr>
+        <w:spacing w:before="200" w:after="80"/>
+      </w:pPr>
+      <w:r>
+        <w:rPr>
+          <w:b/>
+          <w:color w:val="44546E"/>
+          <w:sz w:val="23"/>
+        </w:rPr>
+        <w:t>6.1  Fundamentals of Backend: FastAPI + Uvicorn</w:t>
+      </w:r>
+    </w:p>
+    <w:p>
+      <w:pPr>
+        <w:spacing w:after="80"/>
+      </w:pPr>
+      <w:r>
+        <w:rPr>
+          <w:color w:val="1E202C"/>
+          <w:sz w:val="20"/>
+        </w:rPr>
+        <w:t xml:space="preserve">TTS Agent’s HTTP layer is built on two tightly coupled components: FastAPI, which defines the API contract and handles request/response logic, and Uvicorn, which serves the application to the network. Understanding both is essential to extending the system or deploying it to a new environment.</w:t>
+      </w:r>
+    </w:p>
+    <w:p>
+      <w:pPr>
+        <w:spacing w:before="140" w:after="40"/>
+      </w:pPr>
+      <w:r>
+        <w:rPr>
+          <w:b/>
+          <w:color w:val="2E74B5"/>
+          <w:sz w:val="21"/>
+        </w:rPr>
+        <w:t>FastAPI</w:t>
+      </w:r>
+    </w:p>
+    <w:p>
+      <w:pPr>
+        <w:spacing w:after="60"/>
+      </w:pPr>
+      <w:r>
+        <w:rPr>
+          <w:color w:val="1E202C"/>
+          <w:sz w:val="20"/>
+        </w:rPr>
+        <w:t xml:space="preserve">FastAPI is a modern Python web framework for building HTTP APIs. It is built on top of Starlette (the underlying ASGI toolkit) and Pydantic (for data validation and serialisation). Every endpoint is a plain Python function or coroutine annotated with type hints that FastAPI reads at startup to: validate incoming request bodies, coerce path and query parameters to the declared types, and generate a fully interactive OpenAPI (Swagger) specification at </w:t>
+      </w:r>
+      <w:r>
+        <w:rPr>
+          <w:rFonts w:ascii="Courier New" w:hAnsi="Courier New"/>
+          <w:color w:val="2D3A4A"/>
+          <w:sz w:val="18"/>
+        </w:rPr>
+        <w:t>/docs</w:t>
+      </w:r>
+      <w:r>
+        <w:rPr>
+          <w:color w:val="1E202C"/>
+          <w:sz w:val="20"/>
+        </w:rPr>
+        <w:t xml:space="preserve"> with zero extra configuration.</w:t>
+      </w:r>
+    </w:p>
+    <w:tbl>
+      <w:tblPr>
+        <w:tblStyle w:val="TableGrid"/>
+        <w:tblW w:w="9072" w:type="dxa"/>
+        <w:tblBorders>
+          <w:top w:val="single" w:sz="4" w:space="0" w:color="CCCCCC"/>
+          <w:left w:val="single" w:sz="4" w:space="0" w:color="CCCCCC"/>
+          <w:bottom w:val="single" w:sz="4" w:space="0" w:color="CCCCCC"/>
+          <w:right w:val="single" w:sz="4" w:space="0" w:color="CCCCCC"/>
+          <w:insideH w:val="single" w:sz="4" w:space="0" w:color="CCCCCC"/>
+          <w:insideV w:val="single" w:sz="4" w:space="0" w:color="CCCCCC"/>
+        </w:tblBorders>
+        <w:tblCellMar>
+          <w:top w:w="80" w:type="dxa"/>
+          <w:left w:w="120" w:type="dxa"/>
+          <w:bottom w:w="80" w:type="dxa"/>
+          <w:right w:w="120" w:type="dxa"/>
+        </w:tblCellMar>
+      </w:tblPr>
+      <w:tblGrid>
+        <w:gridCol w:w="1800"/>
+        <w:gridCol w:w="7272"/>
+      </w:tblGrid>
+      <w:tr>
+        <w:tc>
+          <w:tcPr>
+            <w:tcW w:w="1800" w:type="dxa"/>
+            <w:shd w:val="clear" w:color="auto" w:fill="EBF3FB"/>
+          </w:tcPr>
+          <w:p>
+            <w:pPr>
+              <w:spacing w:after="0"/>
+            </w:pPr>
+            <w:r>
+              <w:rPr>
+                <w:b/>
+                <w:sz w:val="18"/>
+              </w:rPr>
+              <w:t>Purpose</w:t>
+            </w:r>
+          </w:p>
+        </w:tc>
+        <w:tc>
+          <w:tcPr>
+            <w:tcW w:w="7272" w:type="dxa"/>
+          </w:tcPr>
+          <w:p>
+            <w:pPr>
+              <w:spacing w:after="0"/>
+            </w:pPr>
+            <w:r>
+              <w:rPr>
+                <w:sz w:val="18"/>
+              </w:rPr>
+              <w:t>Declare and serve HTTP endpoints with automatic input validation, OpenAPI documentation, and async request handling.</w:t>
+            </w:r>
+          </w:p>
+        </w:tc>
+      </w:tr>
+      <w:tr>
+        <w:tc>
+          <w:tcPr>
+            <w:tcW w:w="1800" w:type="dxa"/>
+            <w:shd w:val="clear" w:color="auto" w:fill="EBF3FB"/>
+          </w:tcPr>
+          <w:p>
+            <w:pPr>
+              <w:spacing w:after="0"/>
+            </w:pPr>
+            <w:r>
+              <w:rPr>
+                <w:b/>
+                <w:sz w:val="18"/>
+              </w:rPr>
+              <w:t>When to use</w:t>
+            </w:r>
+          </w:p>
+        </w:tc>
+        <w:tc>
+          <w:tcPr>
+            <w:tcW w:w="7272" w:type="dxa"/>
+          </w:tcPr>
+          <w:p>
+            <w:pPr>
+              <w:spacing w:after="0"/>
+            </w:pPr>
+            <w:r>
+              <w:rPr>
+                <w:sz w:val="18"/>
+              </w:rPr>
+              <w:t>REST APIs, ML model-serving backends, microservices, and file-upload endpoints. Preferred over Flask when async I/O, type safety, or auto-generated API docs are priorities.</w:t>
+            </w:r>
+          </w:p>
+        </w:tc>
+      </w:tr>
+      <w:tr>
+        <w:tc>
+          <w:tcPr>
+            <w:tcW w:w="1800" w:type="dxa"/>
+            <w:shd w:val="clear" w:color="auto" w:fill="EBF3FB"/>
+          </w:tcPr>
+          <w:p>
+            <w:pPr>
+              <w:spacing w:after="0"/>
+            </w:pPr>
+            <w:r>
+              <w:rPr>
+                <w:b/>
+                <w:sz w:val="18"/>
+              </w:rPr>
+              <w:t>Key capabilities</w:t>
+            </w:r>
+          </w:p>
+        </w:tc>
+        <w:tc>
+          <w:tcPr>
+            <w:tcW w:w="7272" w:type="dxa"/>
+          </w:tcPr>
+          <w:p>
+            <w:pPr>
+              <w:spacing w:after="0"/>
+            </w:pPr>
+            <w:r>
+              <w:rPr>
+                <w:sz w:val="18"/>
+              </w:rPr>
+              <w:t>Path / query / body parameter parsing · Pydantic model validation · Dependency injection · Background tasks · File uploads (UploadFile) · StreamingResponse for large payloads · Auto OpenAPI + ReDoc at /docs and /redoc</w:t>
+            </w:r>
+          </w:p>
+        </w:tc>
+      </w:tr>
+      <w:tr>
+        <w:tc>
+          <w:tcPr>
+            <w:tcW w:w="1800" w:type="dxa"/>
+            <w:shd w:val="clear" w:color="auto" w:fill="EBF3FB"/>
+          </w:tcPr>
+          <w:p>
+            <w:pPr>
+              <w:spacing w:after="0"/>
+            </w:pPr>
+            <w:r>
+              <w:rPr>
+                <w:b/>
+                <w:sz w:val="18"/>
+              </w:rPr>
+              <w:t>In TTS Agent</w:t>
+            </w:r>
+          </w:p>
+        </w:tc>
+        <w:tc>
+          <w:tcPr>
+            <w:tcW w:w="7272" w:type="dxa"/>
+          </w:tcPr>
+          <w:p>
+            <w:pPr>
+              <w:spacing w:after="0"/>
+            </w:pPr>
+            <w:r>
+              <w:rPr>
+                <w:sz w:val="18"/>
+              </w:rPr>
+              <w:t xml:space="preserve">Defines five REST endpoints: POST /synthesize (text → WAV bytes), GET /voices (voice catalogue), POST /upload-voice-sample (reference audio upload), GET /voice-samples (sample listing with duration), GET /health (device status). Also mounts the browser UI as static files via app.mount("/static", ...).</w:t>
+            </w:r>
+          </w:p>
+        </w:tc>
+      </w:tr>
+    </w:tbl>
+    <w:p>
+      <w:pPr>
+        <w:spacing w:before="80" w:after="40"/>
+      </w:pPr>
+      <w:r>
+        <w:rPr>
+          <w:b/>
+          <w:color w:val="1E202C"/>
+          <w:sz w:val="18"/>
+        </w:rPr>
+        <w:t>Minimal working example</w:t>
+      </w:r>
+    </w:p>
+    <w:p>
+      <w:pPr>
+        <w:shd w:val="clear" w:color="auto" w:fill="F0F1F5"/>
+        <w:spacing w:after="0"/>
+        <w:ind w:left="288" w:right="288"/>
+      </w:pPr>
+      <w:r>
+        <w:rPr>
+          <w:rFonts w:ascii="Courier New" w:hAnsi="Courier New"/>
+          <w:color w:val="2D3A4A"/>
+          <w:sz w:val="17"/>
+        </w:rPr>
+        <w:t>from fastapi import FastAPI</w:t>
+      </w:r>
+    </w:p>
+    <w:p>
+      <w:pPr>
+        <w:shd w:val="clear" w:color="auto" w:fill="F0F1F5"/>
+        <w:spacing w:after="0"/>
+        <w:ind w:left="288" w:right="288"/>
+      </w:pPr>
+      <w:r>
+        <w:rPr>
+          <w:rFonts w:ascii="Courier New" w:hAnsi="Courier New"/>
+          <w:color w:val="2D3A4A"/>
+          <w:sz w:val="17"/>
+        </w:rPr>
+        <w:t>from pydantic import BaseModel</w:t>
+      </w:r>
+    </w:p>
+    <w:p>
+      <w:pPr>
+        <w:shd w:val="clear" w:color="auto" w:fill="F0F1F5"/>
+        <w:spacing w:after="0"/>
+        <w:ind w:left="288" w:right="288"/>
+      </w:pPr>
+      <w:r>
+        <w:rPr>
+          <w:rFonts w:ascii="Courier New" w:hAnsi="Courier New"/>
+          <w:color w:val="2D3A4A"/>
+          <w:sz w:val="17"/>
+        </w:rPr>
+        <w:t xml:space="preserve"> </w:t>
+      </w:r>
+    </w:p>
+    <w:p>
+      <w:pPr>
+        <w:shd w:val="clear" w:color="auto" w:fill="F0F1F5"/>
+        <w:spacing w:after="0"/>
+        <w:ind w:left="288" w:right="288"/>
+      </w:pPr>
+      <w:r>
+        <w:rPr>
+          <w:rFonts w:ascii="Courier New" w:hAnsi="Courier New"/>
+          <w:color w:val="2D3A4A"/>
+          <w:sz w:val="17"/>
+        </w:rPr>
+        <w:t>app = FastAPI(title="TTS Agent", version="2.2")</w:t>
+      </w:r>
+    </w:p>
+    <w:p>
+      <w:pPr>
+        <w:shd w:val="clear" w:color="auto" w:fill="F0F1F5"/>
+        <w:spacing w:after="0"/>
+        <w:ind w:left="288" w:right="288"/>
+      </w:pPr>
+      <w:r>
+        <w:rPr>
+          <w:rFonts w:ascii="Courier New" w:hAnsi="Courier New"/>
+          <w:color w:val="2D3A4A"/>
+          <w:sz w:val="17"/>
+        </w:rPr>
+        <w:t xml:space="preserve"> </w:t>
+      </w:r>
+    </w:p>
+    <w:p>
+      <w:pPr>
+        <w:shd w:val="clear" w:color="auto" w:fill="F0F1F5"/>
+        <w:spacing w:after="0"/>
+        <w:ind w:left="288" w:right="288"/>
+      </w:pPr>
+      <w:r>
+        <w:rPr>
+          <w:rFonts w:ascii="Courier New" w:hAnsi="Courier New"/>
+          <w:color w:val="2D3A4A"/>
+          <w:sz w:val="17"/>
+        </w:rPr>
+        <w:t>class SynthRequest(BaseModel):</w:t>
+      </w:r>
+    </w:p>
+    <w:p>
+      <w:pPr>
+        <w:shd w:val="clear" w:color="auto" w:fill="F0F1F5"/>
+        <w:spacing w:after="0"/>
+        <w:ind w:left="288" w:right="288"/>
+      </w:pPr>
+      <w:r>
+        <w:rPr>
+          <w:rFonts w:ascii="Courier New" w:hAnsi="Courier New"/>
+          <w:color w:val="2D3A4A"/>
+          <w:sz w:val="17"/>
+        </w:rPr>
+        <w:t xml:space="preserve">    text: str</w:t>
+      </w:r>
+    </w:p>
+    <w:p>
+      <w:pPr>
+        <w:shd w:val="clear" w:color="auto" w:fill="F0F1F5"/>
+        <w:spacing w:after="0"/>
+        <w:ind w:left="288" w:right="288"/>
+      </w:pPr>
+      <w:r>
+        <w:rPr>
+          <w:rFonts w:ascii="Courier New" w:hAnsi="Courier New"/>
+          <w:color w:val="2D3A4A"/>
+          <w:sz w:val="17"/>
+        </w:rPr>
+        <w:t xml:space="preserve">    voice: str = "af_heart"</w:t>
+      </w:r>
+    </w:p>
+    <w:p>
+      <w:pPr>
+        <w:shd w:val="clear" w:color="auto" w:fill="F0F1F5"/>
+        <w:spacing w:after="0"/>
+        <w:ind w:left="288" w:right="288"/>
+      </w:pPr>
+      <w:r>
+        <w:rPr>
+          <w:rFonts w:ascii="Courier New" w:hAnsi="Courier New"/>
+          <w:color w:val="2D3A4A"/>
+          <w:sz w:val="17"/>
+        </w:rPr>
+        <w:t xml:space="preserve">    speed: float = 1.0</w:t>
+      </w:r>
+    </w:p>
+    <w:p>
+      <w:pPr>
+        <w:shd w:val="clear" w:color="auto" w:fill="F0F1F5"/>
+        <w:spacing w:after="0"/>
+        <w:ind w:left="288" w:right="288"/>
+      </w:pPr>
+      <w:r>
+        <w:rPr>
+          <w:rFonts w:ascii="Courier New" w:hAnsi="Courier New"/>
+          <w:color w:val="2D3A4A"/>
+          <w:sz w:val="17"/>
+        </w:rPr>
+        <w:t xml:space="preserve"> </w:t>
+      </w:r>
+    </w:p>
+    <w:p>
+      <w:pPr>
+        <w:shd w:val="clear" w:color="auto" w:fill="F0F1F5"/>
+        <w:spacing w:after="0"/>
+        <w:ind w:left="288" w:right="288"/>
+      </w:pPr>
+      <w:r>
+        <w:rPr>
+          <w:rFonts w:ascii="Courier New" w:hAnsi="Courier New"/>
+          <w:color w:val="2D3A4A"/>
+          <w:sz w:val="17"/>
+        </w:rPr>
+        <w:t>@app.post("/synthesize")</w:t>
+      </w:r>
+    </w:p>
+    <w:p>
+      <w:pPr>
+        <w:shd w:val="clear" w:color="auto" w:fill="F0F1F5"/>
+        <w:spacing w:after="0"/>
+        <w:ind w:left="288" w:right="288"/>
+      </w:pPr>
+      <w:r>
+        <w:rPr>
+          <w:rFonts w:ascii="Courier New" w:hAnsi="Courier New"/>
+          <w:color w:val="2D3A4A"/>
+          <w:sz w:val="17"/>
+        </w:rPr>
+        <w:t>async def synthesize(req: SynthRequest):</w:t>
+      </w:r>
+    </w:p>
+    <w:p>
+      <w:pPr>
+        <w:shd w:val="clear" w:color="auto" w:fill="F0F1F5"/>
+        <w:spacing w:after="8"/>
+        <w:ind w:left="288" w:right="288"/>
+      </w:pPr>
+      <w:r>
+        <w:rPr>
+          <w:rFonts w:ascii="Courier New" w:hAnsi="Courier New"/>
+          <w:color w:val="2D3A4A"/>
+          <w:sz w:val="17"/>
+        </w:rPr>
+        <w:t xml:space="preserve">    ...  # FastAPI validates req automatically before this line runs</w:t>
+      </w:r>
+    </w:p>
+    <w:p>
+      <w:pPr>
+        <w:spacing w:before="140" w:after="40"/>
+      </w:pPr>
+      <w:r>
+        <w:rPr>
+          <w:b/>
+          <w:color w:val="2E74B5"/>
+          <w:sz w:val="21"/>
+        </w:rPr>
+        <w:t>Uvicorn</w:t>
+      </w:r>
+    </w:p>
+    <w:p>
+      <w:pPr>
+        <w:spacing w:after="60"/>
+      </w:pPr>
+      <w:r>
+        <w:rPr>
+          <w:color w:val="1E202C"/>
+          <w:sz w:val="20"/>
+        </w:rPr>
+        <w:t xml:space="preserve">Uvicorn is a lightning-fast ASGI (Asynchronous Server Gateway Interface) server for Python. ASGI is the successor to WSGI: where WSGI handles one request at a time per worker, ASGI handles thousands of concurrent connections within a single process using Python’s async/await event loop. Uvicorn listens on a TCP port, accepts HTTP connections, and calls the FastAPI application for each request.</w:t>
+      </w:r>
+    </w:p>
+    <w:tbl>
+      <w:tblPr>
+        <w:tblStyle w:val="TableGrid"/>
+        <w:tblW w:w="9072" w:type="dxa"/>
+        <w:tblBorders>
+          <w:top w:val="single" w:sz="4" w:space="0" w:color="CCCCCC"/>
+          <w:left w:val="single" w:sz="4" w:space="0" w:color="CCCCCC"/>
+          <w:bottom w:val="single" w:sz="4" w:space="0" w:color="CCCCCC"/>
+          <w:right w:val="single" w:sz="4" w:space="0" w:color="CCCCCC"/>
+          <w:insideH w:val="single" w:sz="4" w:space="0" w:color="CCCCCC"/>
+          <w:insideV w:val="single" w:sz="4" w:space="0" w:color="CCCCCC"/>
+        </w:tblBorders>
+        <w:tblCellMar>
+          <w:top w:w="80" w:type="dxa"/>
+          <w:left w:w="120" w:type="dxa"/>
+          <w:bottom w:w="80" w:type="dxa"/>
+          <w:right w:w="120" w:type="dxa"/>
+        </w:tblCellMar>
+      </w:tblPr>
+      <w:tblGrid>
+        <w:gridCol w:w="1800"/>
+        <w:gridCol w:w="7272"/>
+      </w:tblGrid>
+      <w:tr>
+        <w:tc>
+          <w:tcPr>
+            <w:tcW w:w="1800" w:type="dxa"/>
+            <w:shd w:val="clear" w:color="auto" w:fill="EBF3FB"/>
+          </w:tcPr>
+          <w:p>
+            <w:pPr>
+              <w:spacing w:after="0"/>
+            </w:pPr>
+            <w:r>
+              <w:rPr>
+                <w:b/>
+                <w:sz w:val="18"/>
+              </w:rPr>
+              <w:t>Purpose</w:t>
+            </w:r>
+          </w:p>
+        </w:tc>
+        <w:tc>
+          <w:tcPr>
+            <w:tcW w:w="7272" w:type="dxa"/>
+          </w:tcPr>
+          <w:p>
+            <w:pPr>
+              <w:spacing w:after="0"/>
+            </w:pPr>
+            <w:r>
+              <w:rPr>
+                <w:sz w:val="18"/>
+              </w:rPr>
+              <w:t>Accept TCP connections, parse HTTP requests, and bridge them to the FastAPI (ASGI) application.</w:t>
+            </w:r>
+          </w:p>
+        </w:tc>
+      </w:tr>
+      <w:tr>
+        <w:tc>
+          <w:tcPr>
+            <w:tcW w:w="1800" w:type="dxa"/>
+            <w:shd w:val="clear" w:color="auto" w:fill="EBF3FB"/>
+          </w:tcPr>
+          <w:p>
+            <w:pPr>
+              <w:spacing w:after="0"/>
+            </w:pPr>
+            <w:r>
+              <w:rPr>
+                <w:b/>
+                <w:sz w:val="18"/>
+              </w:rPr>
+              <w:t>When to use</w:t>
+            </w:r>
+          </w:p>
+        </w:tc>
+        <w:tc>
+          <w:tcPr>
+            <w:tcW w:w="7272" w:type="dxa"/>
+          </w:tcPr>
+          <w:p>
+            <w:pPr>
+              <w:spacing w:after="0"/>
+            </w:pPr>
+            <w:r>
+              <w:rPr>
+                <w:sz w:val="18"/>
+              </w:rPr>
+              <w:t xml:space="preserve">Any ASGI application (FastAPI, Starlette, Django Channels). Use --reload in development for hot-restart on code changes. Use --workers N in production to fork multiple processes and saturate all CPU cores.</w:t>
+            </w:r>
+          </w:p>
+        </w:tc>
+      </w:tr>
+      <w:tr>
+        <w:tc>
+          <w:tcPr>
+            <w:tcW w:w="1800" w:type="dxa"/>
+            <w:shd w:val="clear" w:color="auto" w:fill="EBF3FB"/>
+          </w:tcPr>
+          <w:p>
+            <w:pPr>
+              <w:spacing w:after="0"/>
+            </w:pPr>
+            <w:r>
+              <w:rPr>
+                <w:b/>
+                <w:sz w:val="18"/>
+              </w:rPr>
+              <w:t>Key flags</w:t>
+            </w:r>
+          </w:p>
+        </w:tc>
+        <w:tc>
+          <w:tcPr>
+            <w:tcW w:w="7272" w:type="dxa"/>
+          </w:tcPr>
+          <w:p>
+            <w:pPr>
+              <w:spacing w:after="0"/>
+            </w:pPr>
+            <w:r>
+              <w:rPr>
+                <w:rFonts w:ascii="Courier New" w:hAnsi="Courier New"/>
+                <w:sz w:val="17"/>
+              </w:rPr>
+              <w:t>--host 0.0.0.0</w:t>
+            </w:r>
+            <w:r>
+              <w:rPr>
+                <w:sz w:val="18"/>
+              </w:rPr>
+              <w:t xml:space="preserve"> bind all interfaces · </w:t>
+            </w:r>
+            <w:r>
+              <w:rPr>
+                <w:rFonts w:ascii="Courier New" w:hAnsi="Courier New"/>
+                <w:sz w:val="17"/>
+              </w:rPr>
+              <w:t>--port 8000</w:t>
+            </w:r>
+            <w:r>
+              <w:rPr>
+                <w:sz w:val="18"/>
+              </w:rPr>
+              <w:t xml:space="preserve"> · </w:t>
+            </w:r>
+            <w:r>
+              <w:rPr>
+                <w:rFonts w:ascii="Courier New" w:hAnsi="Courier New"/>
+                <w:sz w:val="17"/>
+              </w:rPr>
+              <w:t>--reload</w:t>
+            </w:r>
+            <w:r>
+              <w:rPr>
+                <w:sz w:val="18"/>
+              </w:rPr>
+              <w:t xml:space="preserve"> hot-reload (dev) · </w:t>
+            </w:r>
+            <w:r>
+              <w:rPr>
+                <w:rFonts w:ascii="Courier New" w:hAnsi="Courier New"/>
+                <w:sz w:val="17"/>
+              </w:rPr>
+              <w:t>--workers N</w:t>
+            </w:r>
+            <w:r>
+              <w:rPr>
+                <w:sz w:val="18"/>
+              </w:rPr>
+              <w:t xml:space="preserve"> multi-process (production)</w:t>
+            </w:r>
+          </w:p>
+        </w:tc>
+      </w:tr>
+      <w:tr>
+        <w:tc>
+          <w:tcPr>
+            <w:tcW w:w="1800" w:type="dxa"/>
+            <w:shd w:val="clear" w:color="auto" w:fill="EBF3FB"/>
+          </w:tcPr>
+          <w:p>
+            <w:pPr>
+              <w:spacing w:after="0"/>
+            </w:pPr>
+            <w:r>
+              <w:rPr>
+                <w:b/>
+                <w:sz w:val="18"/>
+              </w:rPr>
+              <w:t>In TTS Agent</w:t>
+            </w:r>
+          </w:p>
+        </w:tc>
+        <w:tc>
+          <w:tcPr>
+            <w:tcW w:w="7272" w:type="dxa"/>
+          </w:tcPr>
+          <w:p>
+            <w:pPr>
+              <w:spacing w:after="0"/>
+            </w:pPr>
+            <w:r>
+              <w:rPr>
+                <w:sz w:val="18"/>
+              </w:rPr>
+              <w:t xml:space="preserve">Started with --reload during local development. Synthesis is CPU-bound and runs in a thread-pool executor (asyncio run_in_executor) so it never blocks the event loop — Uvicorn stays responsive to concurrent requests (health checks, voice listing) while a long synthesis job runs in the background.</w:t>
+            </w:r>
+          </w:p>
+        </w:tc>
+      </w:tr>
+    </w:tbl>
+    <w:p>
+      <w:pPr>
+        <w:spacing w:before="80" w:after="40"/>
+      </w:pPr>
+      <w:r>
+        <w:rPr>
+          <w:b/>
+          <w:color w:val="1E202C"/>
+          <w:sz w:val="18"/>
+        </w:rPr>
+        <w:t>How to start the server</w:t>
+      </w:r>
+    </w:p>
+    <w:p>
+      <w:pPr>
+        <w:shd w:val="clear" w:color="auto" w:fill="F0F1F5"/>
+        <w:spacing w:after="0"/>
+        <w:ind w:left="288" w:right="288"/>
+      </w:pPr>
+      <w:r>
+        <w:rPr>
+          <w:rFonts w:ascii="Courier New" w:hAnsi="Courier New"/>
+          <w:color w:val="2D3A4A"/>
+          <w:sz w:val="17"/>
+        </w:rPr>
+        <w:t xml:space="preserve"># Development (hot-reload)</w:t>
+      </w:r>
+    </w:p>
+    <w:p>
+      <w:pPr>
+        <w:shd w:val="clear" w:color="auto" w:fill="F0F1F5"/>
+        <w:spacing w:after="0"/>
+        <w:ind w:left="288" w:right="288"/>
+      </w:pPr>
+      <w:r>
+        <w:rPr>
+          <w:rFonts w:ascii="Courier New" w:hAnsi="Courier New"/>
+          <w:color w:val="2D3A4A"/>
+          <w:sz w:val="17"/>
+        </w:rPr>
+        <w:t>uvicorn backend.app:app --host 0.0.0.0 --port 8000 --reload</w:t>
+      </w:r>
+    </w:p>
+    <w:p>
+      <w:pPr>
+        <w:shd w:val="clear" w:color="auto" w:fill="F0F1F5"/>
+        <w:spacing w:after="0"/>
+        <w:ind w:left="288" w:right="288"/>
+      </w:pPr>
+      <w:r>
+        <w:rPr>
+          <w:rFonts w:ascii="Courier New" w:hAnsi="Courier New"/>
+          <w:color w:val="2D3A4A"/>
+          <w:sz w:val="17"/>
+        </w:rPr>
+        <w:t xml:space="preserve"> </w:t>
+      </w:r>
+    </w:p>
+    <w:p>
+      <w:pPr>
+        <w:shd w:val="clear" w:color="auto" w:fill="F0F1F5"/>
+        <w:spacing w:after="0"/>
+        <w:ind w:left="288" w:right="288"/>
+      </w:pPr>
+      <w:r>
+        <w:rPr>
+          <w:rFonts w:ascii="Courier New" w:hAnsi="Courier New"/>
+          <w:color w:val="2D3A4A"/>
+          <w:sz w:val="17"/>
+        </w:rPr>
+        <w:t xml:space="preserve"># Production (4 worker processes)</w:t>
+      </w:r>
+    </w:p>
+    <w:p>
+      <w:pPr>
+        <w:shd w:val="clear" w:color="auto" w:fill="F0F1F5"/>
+        <w:spacing w:after="0"/>
+        <w:ind w:left="288" w:right="288"/>
+      </w:pPr>
+      <w:r>
+        <w:rPr>
+          <w:rFonts w:ascii="Courier New" w:hAnsi="Courier New"/>
+          <w:color w:val="2D3A4A"/>
+          <w:sz w:val="17"/>
+        </w:rPr>
+        <w:t>uvicorn backend.app:app --host 0.0.0.0 --port 8000 --workers 4</w:t>
+      </w:r>
+    </w:p>
+    <w:p>
+      <w:pPr>
+        <w:shd w:val="clear" w:color="auto" w:fill="F0F1F5"/>
+        <w:spacing w:after="0"/>
+        <w:ind w:left="288" w:right="288"/>
+      </w:pPr>
+      <w:r>
+        <w:rPr>
+          <w:rFonts w:ascii="Courier New" w:hAnsi="Courier New"/>
+          <w:color w:val="2D3A4A"/>
+          <w:sz w:val="17"/>
+        </w:rPr>
+        <w:t xml:space="preserve"> </w:t>
+      </w:r>
+    </w:p>
+    <w:p>
+      <w:pPr>
+        <w:shd w:val="clear" w:color="auto" w:fill="F0F1F5"/>
+        <w:spacing w:after="0"/>
+        <w:ind w:left="288" w:right="288"/>
+      </w:pPr>
+      <w:r>
+        <w:rPr>
+          <w:rFonts w:ascii="Courier New" w:hAnsi="Courier New"/>
+          <w:color w:val="2D3A4A"/>
+          <w:sz w:val="17"/>
+        </w:rPr>
+        <w:t xml:space="preserve"># Programmatic (embed in a Python script)</w:t>
+      </w:r>
+    </w:p>
+    <w:p>
+      <w:pPr>
+        <w:shd w:val="clear" w:color="auto" w:fill="F0F1F5"/>
+        <w:spacing w:after="0"/>
+        <w:ind w:left="288" w:right="288"/>
+      </w:pPr>
+      <w:r>
+        <w:rPr>
+          <w:rFonts w:ascii="Courier New" w:hAnsi="Courier New"/>
+          <w:color w:val="2D3A4A"/>
+          <w:sz w:val="17"/>
+        </w:rPr>
+        <w:t>import uvicorn</w:t>
+      </w:r>
+    </w:p>
+    <w:p>
+      <w:pPr>
+        <w:shd w:val="clear" w:color="auto" w:fill="F0F1F5"/>
+        <w:spacing w:after="8"/>
+        <w:ind w:left="288" w:right="288"/>
+      </w:pPr>
+      <w:r>
+        <w:rPr>
+          <w:rFonts w:ascii="Courier New" w:hAnsi="Courier New"/>
+          <w:color w:val="2D3A4A"/>
+          <w:sz w:val="17"/>
+        </w:rPr>
+        <w:t>uvicorn.run("backend.app:app", host="0.0.0.0", port=8000, reload=True)</w:t>
+      </w:r>
+    </w:p>
+    <w:p>
+      <w:pPr>
+        <w:spacing w:before="140" w:after="40"/>
+      </w:pPr>
+      <w:r>
+        <w:rPr>
+          <w:b/>
+          <w:color w:val="2E74B5"/>
+          <w:sz w:val="21"/>
+        </w:rPr>
+        <w:t>How FastAPI and Uvicorn work together</w:t>
+      </w:r>
+    </w:p>
+    <w:p>
+      <w:pPr>
+        <w:spacing w:after="80"/>
+      </w:pPr>
+      <w:r>
+        <w:rPr>
+          <w:color w:val="1E202C"/>
+          <w:sz w:val="20"/>
+        </w:rPr>
+        <w:t xml:space="preserve">Uvicorn is the transport layer; FastAPI is the application layer. A browser request travels through: </w:t>
+      </w:r>
+      <w:r>
+        <w:rPr>
+          <w:b/>
+          <w:rFonts w:ascii="Courier New" w:hAnsi="Courier New"/>
+          <w:color w:val="2D3A4A"/>
+          <w:sz w:val="18"/>
+        </w:rPr>
+        <w:t xml:space="preserve">TCP socket → Uvicorn HTTP parser → ASGI interface → FastAPI router → endpoint function → TTS engine → response bytes → Uvicorn → client</w:t>
+      </w:r>
+      <w:r>
+        <w:rPr>
+          <w:color w:val="1E202C"/>
+          <w:sz w:val="20"/>
+        </w:rPr>
+        <w:t xml:space="preserve">. FastAPI never touches the socket directly; Uvicorn never interprets routes or validates payloads. This clean separation means the application can be unit-tested without a running server (using FastAPI’s built-in TestClient) and can be fronted by a reverse proxy (Nginx, Caddy) in production without any code changes.</w:t>
+      </w:r>
+    </w:p>
+    <w:p>
+      <w:pPr>
+        <w:spacing w:after="40"/>
+      </w:pPr>
+    </w:p>
     <w:p>
       <w:pPr>
         <w:pBdr>
@@ -6738,6 +8863,31 @@
     </w:p>
     <w:p>
       <w:pPr>
+        <w:spacing w:after="80"/>
+      </w:pPr>
+      <w:r>
+        <w:rPr>
+          <w:color w:val="1E202C"/>
+          <w:sz w:val="20"/>
+        </w:rPr>
+        <w:t xml:space="preserve">The following eight phases take a freshly installed Windows machine from zero to a fully GPU-accelerated TTS Agent instance. All commands run inside an Ubuntu 22.04 WSL2 terminal unless noted otherwise. The NVIDIA Windows driver provides CUDA passthrough to WSL2 automatically — no separate Linux CUDA toolkit installation is needed; PyTorch bundles its own CUDA runtime.</w:t>
+      </w:r>
+    </w:p>
+    <w:p>
+      <w:pPr>
+        <w:spacing w:before="120" w:after="40"/>
+      </w:pPr>
+      <w:r>
+        <w:rPr>
+          <w:b/>
+          <w:color w:val="2E74B5"/>
+          <w:sz w:val="20"/>
+        </w:rPr>
+        <w:t>Phase 1 — Windows prerequisites (run in Windows PowerShell as Administrator)</w:t>
+      </w:r>
+    </w:p>
+    <w:p>
+      <w:pPr>
         <w:shd w:val="clear" w:color="auto" w:fill="F0F1F5"/>
         <w:spacing w:after="0"/>
         <w:ind w:left="288" w:right="288"/>
@@ -6748,7 +8898,7 @@
           <w:color w:val="2D3A4A"/>
           <w:sz w:val="17"/>
         </w:rPr>
-        <w:t># Prerequisite: NVIDIA driver + CUDA toolkit visible via nvidia-smi</w:t>
+        <w:t># Install WSL2 and Ubuntu 22.04 (reboot if prompted)</w:t>
       </w:r>
     </w:p>
     <w:p>
@@ -6763,7 +8913,7 @@
           <w:color w:val="2D3A4A"/>
           <w:sz w:val="17"/>
         </w:rPr>
-        <w:t>cd tts-agent</w:t>
+        <w:t>wsl --install -d Ubuntu-22.04</w:t>
       </w:r>
     </w:p>
     <w:p>
@@ -6778,7 +8928,7 @@
           <w:color w:val="2D3A4A"/>
           <w:sz w:val="17"/>
         </w:rPr>
-        <w:t>bash scripts/setup.sh           # auto-detects GPU and installs CUDA PyTorch</w:t>
+        <w:t xml:space="preserve"># Verify WSL2 (not WSL1)</w:t>
       </w:r>
     </w:p>
     <w:p>
@@ -6793,6 +8943,279 @@
           <w:color w:val="2D3A4A"/>
           <w:sz w:val="17"/>
         </w:rPr>
+        <w:t>wsl --list --verbose   # VERSION column must show 2</w:t>
+      </w:r>
+    </w:p>
+    <w:p>
+      <w:pPr>
+        <w:shd w:val="clear" w:color="auto" w:fill="F0F1F5"/>
+        <w:spacing w:after="8"/>
+        <w:ind w:left="288" w:right="288"/>
+      </w:pPr>
+      <w:r>
+        <w:rPr>
+          <w:rFonts w:ascii="Courier New" w:hAnsi="Courier New"/>
+          <w:color w:val="2D3A4A"/>
+          <w:sz w:val="17"/>
+        </w:rPr>
+        <w:t xml:space="preserve"># Install NVIDIA driver for Windows (560+): https://www.nvidia.com/drivers</w:t>
+      </w:r>
+    </w:p>
+    <w:p>
+      <w:pPr>
+        <w:spacing w:before="120" w:after="40"/>
+      </w:pPr>
+      <w:r>
+        <w:rPr>
+          <w:b/>
+          <w:color w:val="2E74B5"/>
+          <w:sz w:val="20"/>
+        </w:rPr>
+        <w:t>Phase 2 — Open Ubuntu WSL2 terminal and update system packages</w:t>
+      </w:r>
+    </w:p>
+    <w:p>
+      <w:pPr>
+        <w:shd w:val="clear" w:color="auto" w:fill="F0F1F5"/>
+        <w:spacing w:after="0"/>
+        <w:ind w:left="288" w:right="288"/>
+      </w:pPr>
+      <w:r>
+        <w:rPr>
+          <w:rFonts w:ascii="Courier New" w:hAnsi="Courier New"/>
+          <w:color w:val="2D3A4A"/>
+          <w:sz w:val="17"/>
+        </w:rPr>
+        <w:t>sudo apt-get update &amp;&amp; sudo apt-get upgrade -y</w:t>
+      </w:r>
+    </w:p>
+    <w:p>
+      <w:pPr>
+        <w:shd w:val="clear" w:color="auto" w:fill="F0F1F5"/>
+        <w:spacing w:after="0"/>
+        <w:ind w:left="288" w:right="288"/>
+      </w:pPr>
+      <w:r>
+        <w:rPr>
+          <w:rFonts w:ascii="Courier New" w:hAnsi="Courier New"/>
+          <w:color w:val="2D3A4A"/>
+          <w:sz w:val="17"/>
+        </w:rPr>
+        <w:t>sudo apt-get install -y git python3 python3-pip python3-venv espeak-ng build-essential</w:t>
+      </w:r>
+    </w:p>
+    <w:p>
+      <w:pPr>
+        <w:shd w:val="clear" w:color="auto" w:fill="F0F1F5"/>
+        <w:spacing w:after="8"/>
+        <w:ind w:left="288" w:right="288"/>
+      </w:pPr>
+      <w:r>
+        <w:rPr>
+          <w:rFonts w:ascii="Courier New" w:hAnsi="Courier New"/>
+          <w:color w:val="2D3A4A"/>
+          <w:sz w:val="17"/>
+        </w:rPr>
+        <w:t xml:space="preserve"># Verify GPU passthrough — should show RTX 4080</w:t>
+      </w:r>
+    </w:p>
+    <w:p>
+      <w:pPr>
+        <w:shd w:val="clear" w:color="auto" w:fill="F0F1F5"/>
+        <w:spacing w:after="8"/>
+        <w:ind w:left="288" w:right="288"/>
+      </w:pPr>
+      <w:r>
+        <w:rPr>
+          <w:rFonts w:ascii="Courier New" w:hAnsi="Courier New"/>
+          <w:color w:val="2D3A4A"/>
+          <w:sz w:val="17"/>
+        </w:rPr>
+        <w:t>nvidia-smi</w:t>
+      </w:r>
+    </w:p>
+    <w:p>
+      <w:pPr>
+        <w:spacing w:before="120" w:after="40"/>
+      </w:pPr>
+      <w:r>
+        <w:rPr>
+          <w:b/>
+          <w:color w:val="2E74B5"/>
+          <w:sz w:val="20"/>
+        </w:rPr>
+        <w:t>Phase 3 — Clone the repository into the WSL2 filesystem</w:t>
+      </w:r>
+    </w:p>
+    <w:p>
+      <w:pPr>
+        <w:spacing w:after="60"/>
+      </w:pPr>
+      <w:r>
+        <w:rPr>
+          <w:i/>
+          <w:color w:val="1E202C"/>
+          <w:sz w:val="20"/>
+        </w:rPr>
+        <w:t xml:space="preserve">Important: clone into the WSL2 Linux filesystem (~/...) not the Windows mount (/mnt/c/...). The Windows mount uses Plan 9 filesystem protocol and delivers approximately 10× slower I/O for Python venv operations and model file reads.</w:t>
+      </w:r>
+    </w:p>
+    <w:p>
+      <w:pPr>
+        <w:shd w:val="clear" w:color="auto" w:fill="F0F1F5"/>
+        <w:spacing w:after="0"/>
+        <w:ind w:left="288" w:right="288"/>
+      </w:pPr>
+      <w:r>
+        <w:rPr>
+          <w:rFonts w:ascii="Courier New" w:hAnsi="Courier New"/>
+          <w:color w:val="2D3A4A"/>
+          <w:sz w:val="17"/>
+        </w:rPr>
+        <w:t>cd ~</w:t>
+      </w:r>
+    </w:p>
+    <w:p>
+      <w:pPr>
+        <w:shd w:val="clear" w:color="auto" w:fill="F0F1F5"/>
+        <w:spacing w:after="0"/>
+        <w:ind w:left="288" w:right="288"/>
+      </w:pPr>
+      <w:r>
+        <w:rPr>
+          <w:rFonts w:ascii="Courier New" w:hAnsi="Courier New"/>
+          <w:color w:val="2D3A4A"/>
+          <w:sz w:val="17"/>
+        </w:rPr>
+        <w:t>git clone https://github.com/&lt;your-org&gt;/Applied-AI-for-Societal-Impact.git</w:t>
+      </w:r>
+    </w:p>
+    <w:p>
+      <w:pPr>
+        <w:shd w:val="clear" w:color="auto" w:fill="F0F1F5"/>
+        <w:spacing w:after="8"/>
+        <w:ind w:left="288" w:right="288"/>
+      </w:pPr>
+      <w:r>
+        <w:rPr>
+          <w:rFonts w:ascii="Courier New" w:hAnsi="Courier New"/>
+          <w:color w:val="2D3A4A"/>
+          <w:sz w:val="17"/>
+        </w:rPr>
+        <w:t>cd Applied-AI-for-Societal-Impact/audio-ML/Custom_TTS_Model/tts-agent</w:t>
+      </w:r>
+    </w:p>
+    <w:p>
+      <w:pPr>
+        <w:spacing w:before="120" w:after="40"/>
+      </w:pPr>
+      <w:r>
+        <w:rPr>
+          <w:b/>
+          <w:color w:val="2E74B5"/>
+          <w:sz w:val="20"/>
+        </w:rPr>
+        <w:t>Phase 4 — Run the automated setup script</w:t>
+      </w:r>
+    </w:p>
+    <w:p>
+      <w:pPr>
+        <w:shd w:val="clear" w:color="auto" w:fill="F0F1F5"/>
+        <w:spacing w:after="0"/>
+        <w:ind w:left="288" w:right="288"/>
+      </w:pPr>
+      <w:r>
+        <w:rPr>
+          <w:rFonts w:ascii="Courier New" w:hAnsi="Courier New"/>
+          <w:color w:val="2D3A4A"/>
+          <w:sz w:val="17"/>
+        </w:rPr>
+        <w:t xml:space="preserve"># setup.sh auto-detects nvidia-smi and installs CUDA 12.1 PyTorch</w:t>
+      </w:r>
+    </w:p>
+    <w:p>
+      <w:pPr>
+        <w:shd w:val="clear" w:color="auto" w:fill="F0F1F5"/>
+        <w:spacing w:after="8"/>
+        <w:ind w:left="288" w:right="288"/>
+      </w:pPr>
+      <w:r>
+        <w:rPr>
+          <w:rFonts w:ascii="Courier New" w:hAnsi="Courier New"/>
+          <w:color w:val="2D3A4A"/>
+          <w:sz w:val="17"/>
+        </w:rPr>
+        <w:t>bash scripts/setup.sh</w:t>
+      </w:r>
+    </w:p>
+    <w:p>
+      <w:pPr>
+        <w:spacing w:before="120" w:after="40"/>
+      </w:pPr>
+      <w:r>
+        <w:rPr>
+          <w:b/>
+          <w:color w:val="2E74B5"/>
+          <w:sz w:val="20"/>
+        </w:rPr>
+        <w:t>Phase 5 — Configure HuggingFace token and environment</w:t>
+      </w:r>
+    </w:p>
+    <w:p>
+      <w:pPr>
+        <w:shd w:val="clear" w:color="auto" w:fill="F0F1F5"/>
+        <w:spacing w:after="0"/>
+        <w:ind w:left="288" w:right="288"/>
+      </w:pPr>
+      <w:r>
+        <w:rPr>
+          <w:rFonts w:ascii="Courier New" w:hAnsi="Courier New"/>
+          <w:color w:val="2D3A4A"/>
+          <w:sz w:val="17"/>
+        </w:rPr>
+        <w:t>cp .env.example .env</w:t>
+      </w:r>
+    </w:p>
+    <w:p>
+      <w:pPr>
+        <w:shd w:val="clear" w:color="auto" w:fill="F0F1F5"/>
+        <w:spacing w:after="8"/>
+        <w:ind w:left="288" w:right="288"/>
+      </w:pPr>
+      <w:r>
+        <w:rPr>
+          <w:rFonts w:ascii="Courier New" w:hAnsi="Courier New"/>
+          <w:color w:val="2D3A4A"/>
+          <w:sz w:val="17"/>
+        </w:rPr>
+        <w:t xml:space="preserve">nano .env   # set HF_TOKEN=hf_... (get token from huggingface.co/settings/tokens)</w:t>
+      </w:r>
+    </w:p>
+    <w:p>
+      <w:pPr>
+        <w:spacing w:before="120" w:after="40"/>
+      </w:pPr>
+      <w:r>
+        <w:rPr>
+          <w:b/>
+          <w:color w:val="2E74B5"/>
+          <w:sz w:val="20"/>
+        </w:rPr>
+        <w:t>Phase 6 — Activate venv and download model weights</w:t>
+      </w:r>
+    </w:p>
+    <w:p>
+      <w:pPr>
+        <w:shd w:val="clear" w:color="auto" w:fill="F0F1F5"/>
+        <w:spacing w:after="0"/>
+        <w:ind w:left="288" w:right="288"/>
+      </w:pPr>
+      <w:r>
+        <w:rPr>
+          <w:rFonts w:ascii="Courier New" w:hAnsi="Courier New"/>
+          <w:color w:val="2D3A4A"/>
+          <w:sz w:val="17"/>
+        </w:rPr>
         <w:t>source venv/bin/activate</w:t>
       </w:r>
     </w:p>
@@ -6808,11 +9231,39 @@
           <w:color w:val="2D3A4A"/>
           <w:sz w:val="17"/>
         </w:rPr>
+        <w:t xml:space="preserve"># Download Kokoro (all 9 language pipelines) and F5-TTS weights (~4 GB total)</w:t>
+      </w:r>
+    </w:p>
+    <w:p>
+      <w:pPr>
+        <w:shd w:val="clear" w:color="auto" w:fill="F0F1F5"/>
+        <w:spacing w:after="8"/>
+        <w:ind w:left="288" w:right="288"/>
+      </w:pPr>
+      <w:r>
+        <w:rPr>
+          <w:rFonts w:ascii="Courier New" w:hAnsi="Courier New"/>
+          <w:color w:val="2D3A4A"/>
+          <w:sz w:val="17"/>
+        </w:rPr>
         <w:t>python scripts/download_models.py</w:t>
       </w:r>
     </w:p>
     <w:p>
       <w:pPr>
+        <w:spacing w:before="120" w:after="40"/>
+      </w:pPr>
+      <w:r>
+        <w:rPr>
+          <w:b/>
+          <w:color w:val="2E74B5"/>
+          <w:sz w:val="20"/>
+        </w:rPr>
+        <w:t>Phase 7 — Verify CUDA is active inside Python</w:t>
+      </w:r>
+    </w:p>
+    <w:p>
+      <w:pPr>
         <w:shd w:val="clear" w:color="auto" w:fill="F0F1F5"/>
         <w:spacing w:after="0"/>
         <w:ind w:left="288" w:right="288"/>
@@ -6823,7 +9274,110 @@
           <w:color w:val="2D3A4A"/>
           <w:sz w:val="17"/>
         </w:rPr>
+        <w:t>python - &lt;&lt;'EOF'</w:t>
+      </w:r>
+    </w:p>
+    <w:p>
+      <w:pPr>
+        <w:shd w:val="clear" w:color="auto" w:fill="F0F1F5"/>
+        <w:spacing w:after="0"/>
+        <w:ind w:left="288" w:right="288"/>
+      </w:pPr>
+      <w:r>
+        <w:rPr>
+          <w:rFonts w:ascii="Courier New" w:hAnsi="Courier New"/>
+          <w:color w:val="2D3A4A"/>
+          <w:sz w:val="17"/>
+        </w:rPr>
+        <w:t>import torch</w:t>
+      </w:r>
+    </w:p>
+    <w:p>
+      <w:pPr>
+        <w:shd w:val="clear" w:color="auto" w:fill="F0F1F5"/>
+        <w:spacing w:after="0"/>
+        <w:ind w:left="288" w:right="288"/>
+      </w:pPr>
+      <w:r>
+        <w:rPr>
+          <w:rFonts w:ascii="Courier New" w:hAnsi="Courier New"/>
+          <w:color w:val="2D3A4A"/>
+          <w:sz w:val="17"/>
+        </w:rPr>
+        <w:t>print(torch.cuda.is_available(), torch.cuda.get_device_name(0))</w:t>
+      </w:r>
+    </w:p>
+    <w:p>
+      <w:pPr>
+        <w:shd w:val="clear" w:color="auto" w:fill="F0F1F5"/>
+        <w:spacing w:after="8"/>
+        <w:ind w:left="288" w:right="288"/>
+      </w:pPr>
+      <w:r>
+        <w:rPr>
+          <w:rFonts w:ascii="Courier New" w:hAnsi="Courier New"/>
+          <w:color w:val="2D3A4A"/>
+          <w:sz w:val="17"/>
+        </w:rPr>
+        <w:t>EOF   # expected: True  NVIDIA GeForce RTX 4080</w:t>
+      </w:r>
+    </w:p>
+    <w:p>
+      <w:pPr>
+        <w:spacing w:before="120" w:after="40"/>
+      </w:pPr>
+      <w:r>
+        <w:rPr>
+          <w:b/>
+          <w:color w:val="2E74B5"/>
+          <w:sz w:val="20"/>
+        </w:rPr>
+        <w:t>Phase 8 — Start the server and open the browser</w:t>
+      </w:r>
+    </w:p>
+    <w:p>
+      <w:pPr>
+        <w:shd w:val="clear" w:color="auto" w:fill="F0F1F5"/>
+        <w:spacing w:after="0"/>
+        <w:ind w:left="288" w:right="288"/>
+      </w:pPr>
+      <w:r>
+        <w:rPr>
+          <w:rFonts w:ascii="Courier New" w:hAnsi="Courier New"/>
+          <w:color w:val="2D3A4A"/>
+          <w:sz w:val="17"/>
+        </w:rPr>
         <w:t>uvicorn backend.app:app --host 0.0.0.0 --port 8000 --reload</w:t>
+      </w:r>
+    </w:p>
+    <w:p>
+      <w:pPr>
+        <w:shd w:val="clear" w:color="auto" w:fill="F0F1F5"/>
+        <w:spacing w:after="8"/>
+        <w:ind w:left="288" w:right="288"/>
+      </w:pPr>
+      <w:r>
+        <w:rPr>
+          <w:rFonts w:ascii="Courier New" w:hAnsi="Courier New"/>
+          <w:color w:val="2D3A4A"/>
+          <w:sz w:val="17"/>
+        </w:rPr>
+        <w:t xml:space="preserve"># Open in Windows browser (WSL2 localhost bridges to Windows)</w:t>
+      </w:r>
+    </w:p>
+    <w:p>
+      <w:pPr>
+        <w:shd w:val="clear" w:color="auto" w:fill="F0F1F5"/>
+        <w:spacing w:after="8"/>
+        <w:ind w:left="288" w:right="288"/>
+      </w:pPr>
+      <w:r>
+        <w:rPr>
+          <w:rFonts w:ascii="Courier New" w:hAnsi="Courier New"/>
+          <w:color w:val="2D3A4A"/>
+          <w:sz w:val="17"/>
+        </w:rPr>
+        <w:t>explorer.exe http://localhost:8000</w:t>
       </w:r>
     </w:p>
     <w:p>
@@ -6842,58 +9396,8 @@
           <w:sz w:val="23"/>
         </w:rPr>
         <w:lastRenderedPageBreak/>
-        <w:t>11.3 Docker (GPU — Linux / WSL2)</w:t>
-      </w:r>
-    </w:p>
-    <w:p>
-      <w:pPr>
-        <w:shd w:val="clear" w:color="auto" w:fill="F0F1F5"/>
-        <w:spacing w:after="0"/>
-        <w:ind w:left="288" w:right="288"/>
-      </w:pPr>
-      <w:r>
-        <w:rPr>
-          <w:rFonts w:ascii="Courier New" w:hAnsi="Courier New"/>
-          <w:color w:val="2D3A4A"/>
-          <w:sz w:val="17"/>
-        </w:rPr>
-        <w:t># Requires NVIDIA Container Toolkit</w:t>
-      </w:r>
-    </w:p>
-    <w:p>
-      <w:pPr>
-        <w:shd w:val="clear" w:color="auto" w:fill="F0F1F5"/>
-        <w:spacing w:after="0"/>
-        <w:ind w:left="288" w:right="288"/>
-      </w:pPr>
-      <w:r>
-        <w:rPr>
-          <w:rFonts w:ascii="Courier New" w:hAnsi="Courier New"/>
-          <w:color w:val="2D3A4A"/>
-          <w:sz w:val="17"/>
-        </w:rPr>
-        <w:t>make docker-build</w:t>
-      </w:r>
-    </w:p>
-    <w:p>
-      <w:pPr>
-        <w:shd w:val="clear" w:color="auto" w:fill="F0F1F5"/>
-        <w:spacing w:after="0"/>
-        <w:ind w:left="288" w:right="288"/>
-      </w:pPr>
-      <w:r>
-        <w:rPr>
-          <w:rFonts w:ascii="Courier New" w:hAnsi="Courier New"/>
-          <w:color w:val="2D3A4A"/>
-          <w:sz w:val="17"/>
-        </w:rPr>
-        <w:t>make docker-compose              # or: make docker-run</w:t>
-      </w:r>
-    </w:p>
-    <w:p>
-      <w:pPr>
-        <w:spacing w:after="40"/>
-      </w:pPr>
+        <w:t>11.3 Docker — Recommendation and Limitations</w:t>
+      </w:r>
     </w:p>
     <w:p>
       <w:pPr>
@@ -6901,12 +9405,283 @@
       </w:pPr>
       <w:r>
         <w:rPr>
-          <w:i/>
           <w:color w:val="1E202C"/>
           <w:sz w:val="20"/>
         </w:rPr>
-        <w:t>macOS note: Docker on Mac does not support GPU passthrough. Run natively with 'make run' to use MPS on Apple Silicon.</w:t>
-      </w:r>
+        <w:t xml:space="preserve">Docker is not the recommended deployment method for local developer machines in this project. The primary reason is GPU access: Docker Desktop on macOS runs a Linux VM that cannot expose the host’s Apple Silicon GPU (MPS), so synthesis falls back to CPU and takes 10–30× longer. On Windows the RTX 4080 is accessible via the NVIDIA Container Toolkit, but this adds installation complexity with no benefit over WSL2 native Python, which already provides full CUDA passthrough with zero containerisation overhead.</w:t>
+      </w:r>
+    </w:p>
+    <w:p>
+      <w:pPr>
+        <w:spacing w:after="80"/>
+      </w:pPr>
+      <w:r>
+        <w:rPr>
+          <w:b/>
+          <w:color w:val="1E202C"/>
+          <w:sz w:val="20"/>
+        </w:rPr>
+        <w:t xml:space="preserve">Recommendation: </w:t>
+      </w:r>
+      <w:r>
+        <w:rPr>
+          <w:color w:val="1E202C"/>
+          <w:sz w:val="20"/>
+        </w:rPr>
+        <w:t>Use native Python + setup.sh on all local machines (macOS and Windows WSL2). The Dockerfile and docker-compose.yml are retained in the repository for future CI/CD pipelines or server deployments where a Linux host with CUDA is available and GPU passthrough limitations do not apply.</w:t>
+      </w:r>
+    </w:p>
+    <w:tbl>
+      <w:tblPr>
+        <w:tblStyle w:val="TableGrid"/>
+        <w:tblW w:w="9072" w:type="dxa"/>
+        <w:tblBorders>
+          <w:top w:val="single" w:sz="4" w:space="0" w:color="CCCCCC"/>
+          <w:left w:val="single" w:sz="4" w:space="0" w:color="CCCCCC"/>
+          <w:bottom w:val="single" w:sz="4" w:space="0" w:color="CCCCCC"/>
+          <w:right w:val="single" w:sz="4" w:space="0" w:color="CCCCCC"/>
+          <w:insideH w:val="single" w:sz="4" w:space="0" w:color="CCCCCC"/>
+          <w:insideV w:val="single" w:sz="4" w:space="0" w:color="CCCCCC"/>
+        </w:tblBorders>
+        <w:tblCellMar>
+          <w:top w:w="80" w:type="dxa"/>
+          <w:left w:w="120" w:type="dxa"/>
+          <w:bottom w:w="80" w:type="dxa"/>
+          <w:right w:w="120" w:type="dxa"/>
+        </w:tblCellMar>
+      </w:tblPr>
+      <w:tblGrid>
+        <w:gridCol w:w="2268"/>
+        <w:gridCol w:w="3402"/>
+        <w:gridCol w:w="3402"/>
+      </w:tblGrid>
+      <w:tr>
+        <w:trPr>
+          <w:tblHeader/>
+        </w:trPr>
+        <w:tc>
+          <w:tcPr>
+            <w:tcW w:w="2268" w:type="dxa"/>
+            <w:shd w:val="clear" w:color="auto" w:fill="2E74B5"/>
+          </w:tcPr>
+          <w:p>
+            <w:pPr>
+              <w:spacing w:after="0"/>
+            </w:pPr>
+            <w:r>
+              <w:rPr>
+                <w:b/>
+                <w:color w:val="FFFFFF"/>
+                <w:sz w:val="18"/>
+              </w:rPr>
+              <w:t>Deployment</w:t>
+            </w:r>
+          </w:p>
+        </w:tc>
+        <w:tc>
+          <w:tcPr>
+            <w:tcW w:w="3402" w:type="dxa"/>
+            <w:shd w:val="clear" w:color="auto" w:fill="2E74B5"/>
+          </w:tcPr>
+          <w:p>
+            <w:pPr>
+              <w:spacing w:after="0"/>
+            </w:pPr>
+            <w:r>
+              <w:rPr>
+                <w:b/>
+                <w:color w:val="FFFFFF"/>
+                <w:sz w:val="18"/>
+              </w:rPr>
+              <w:t>macOS Apple Silicon</w:t>
+            </w:r>
+          </w:p>
+        </w:tc>
+        <w:tc>
+          <w:tcPr>
+            <w:tcW w:w="3402" w:type="dxa"/>
+            <w:shd w:val="clear" w:color="auto" w:fill="2E74B5"/>
+          </w:tcPr>
+          <w:p>
+            <w:pPr>
+              <w:spacing w:after="0"/>
+            </w:pPr>
+            <w:r>
+              <w:rPr>
+                <w:b/>
+                <w:color w:val="FFFFFF"/>
+                <w:sz w:val="18"/>
+              </w:rPr>
+              <w:t>Windows RTX GPU</w:t>
+            </w:r>
+          </w:p>
+        </w:tc>
+      </w:tr>
+      <w:tr>
+        <w:tc>
+          <w:tcPr>
+            <w:tcW w:w="2268" w:type="dxa"/>
+            <w:shd w:val="clear" w:color="auto" w:fill="EBF3FB"/>
+          </w:tcPr>
+          <w:p>
+            <w:pPr>
+              <w:spacing w:after="0"/>
+            </w:pPr>
+            <w:r>
+              <w:rPr>
+                <w:b/>
+                <w:sz w:val="18"/>
+              </w:rPr>
+              <w:t>Native Python (recommended)</w:t>
+            </w:r>
+          </w:p>
+        </w:tc>
+        <w:tc>
+          <w:tcPr>
+            <w:tcW w:w="3402" w:type="dxa"/>
+            <w:shd w:val="clear" w:color="auto" w:fill="EBF3FB"/>
+          </w:tcPr>
+          <w:p>
+            <w:pPr>
+              <w:spacing w:after="0"/>
+            </w:pPr>
+            <w:r>
+              <w:rPr>
+                <w:sz w:val="18"/>
+              </w:rPr>
+              <w:t xml:space="preserve">Full MPS GPU ✓ · brew espeak-ng ✓ · setup.sh</w:t>
+            </w:r>
+          </w:p>
+        </w:tc>
+        <w:tc>
+          <w:tcPr>
+            <w:tcW w:w="3402" w:type="dxa"/>
+            <w:shd w:val="clear" w:color="auto" w:fill="EBF3FB"/>
+          </w:tcPr>
+          <w:p>
+            <w:pPr>
+              <w:spacing w:after="0"/>
+            </w:pPr>
+            <w:r>
+              <w:rPr>
+                <w:sz w:val="18"/>
+              </w:rPr>
+              <w:t xml:space="preserve">Full CUDA ✓ · WSL2 Ubuntu · setup.sh</w:t>
+            </w:r>
+          </w:p>
+        </w:tc>
+      </w:tr>
+      <w:tr>
+        <w:tc>
+          <w:tcPr>
+            <w:tcW w:w="2268" w:type="dxa"/>
+          </w:tcPr>
+          <w:p>
+            <w:pPr>
+              <w:spacing w:after="0"/>
+            </w:pPr>
+            <w:r>
+              <w:rPr>
+                <w:b/>
+                <w:sz w:val="18"/>
+              </w:rPr>
+              <w:t>Docker Desktop</w:t>
+            </w:r>
+          </w:p>
+        </w:tc>
+        <w:tc>
+          <w:tcPr>
+            <w:tcW w:w="3402" w:type="dxa"/>
+          </w:tcPr>
+          <w:p>
+            <w:pPr>
+              <w:spacing w:after="0"/>
+            </w:pPr>
+            <w:r>
+              <w:rPr>
+                <w:color w:val="C00000"/>
+                <w:sz w:val="18"/>
+              </w:rPr>
+              <w:t>No MPS ✗ · CPU only · not recommended</w:t>
+            </w:r>
+          </w:p>
+        </w:tc>
+        <w:tc>
+          <w:tcPr>
+            <w:tcW w:w="3402" w:type="dxa"/>
+          </w:tcPr>
+          <w:p>
+            <w:pPr>
+              <w:spacing w:after="0"/>
+            </w:pPr>
+            <w:r>
+              <w:rPr>
+                <w:sz w:val="18"/>
+              </w:rPr>
+              <w:t>CUDA via NVIDIA Container Toolkit (extra setup, not recommended for local dev)</w:t>
+            </w:r>
+          </w:p>
+        </w:tc>
+      </w:tr>
+      <w:tr>
+        <w:tc>
+          <w:tcPr>
+            <w:tcW w:w="2268" w:type="dxa"/>
+            <w:shd w:val="clear" w:color="auto" w:fill="EBF3FB"/>
+          </w:tcPr>
+          <w:p>
+            <w:pPr>
+              <w:spacing w:after="0"/>
+            </w:pPr>
+            <w:r>
+              <w:rPr>
+                <w:b/>
+                <w:sz w:val="18"/>
+              </w:rPr>
+              <w:t>Docker (Linux server)</w:t>
+            </w:r>
+          </w:p>
+        </w:tc>
+        <w:tc>
+          <w:tcPr>
+            <w:tcW w:w="3402" w:type="dxa"/>
+            <w:shd w:val="clear" w:color="auto" w:fill="EBF3FB"/>
+          </w:tcPr>
+          <w:p>
+            <w:pPr>
+              <w:spacing w:after="0"/>
+            </w:pPr>
+            <w:r>
+              <w:rPr>
+                <w:sz w:val="18"/>
+              </w:rPr>
+              <w:t>N/A</w:t>
+            </w:r>
+          </w:p>
+        </w:tc>
+        <w:tc>
+          <w:tcPr>
+            <w:tcW w:w="3402" w:type="dxa"/>
+            <w:shd w:val="clear" w:color="auto" w:fill="EBF3FB"/>
+          </w:tcPr>
+          <w:p>
+            <w:pPr>
+              <w:spacing w:after="0"/>
+            </w:pPr>
+            <w:r>
+              <w:rPr>
+                <w:sz w:val="18"/>
+              </w:rPr>
+              <w:t>Suitable for CI/CD or shared Linux GPU servers · make docker-build &amp;&amp; make docker-compose</w:t>
+            </w:r>
+          </w:p>
+        </w:tc>
+      </w:tr>
+    </w:tbl>
+    <w:p>
+      <w:pPr>
+        <w:spacing w:after="40"/>
+      </w:pPr>
     </w:p>
     <w:p>
       <w:pPr>
@@ -7255,6 +10030,513 @@
       <w:pPr>
         <w:spacing w:after="60"/>
       </w:pPr>
+    </w:p>
+    <w:p>
+      <w:pPr>
+        <w:spacing w:before="200" w:after="80"/>
+      </w:pPr>
+      <w:r>
+        <w:rPr>
+          <w:b/>
+          <w:color w:val="44546E"/>
+          <w:sz w:val="23"/>
+        </w:rPr>
+        <w:t>11.6  Cross-Platform Deployment Strategy</w:t>
+      </w:r>
+    </w:p>
+    <w:p>
+      <w:pPr>
+        <w:spacing w:after="80"/>
+      </w:pPr>
+      <w:r>
+        <w:rPr>
+          <w:color w:val="1E202C"/>
+          <w:sz w:val="20"/>
+        </w:rPr>
+        <w:t>TTS Agent is designed to run natively on any GPU-equipped machine using a single shared codebase. The same Git repository is cloned on each machine; platform differences are handled entirely by setup.sh and PyTorch’s device auto-detection. No cross-platform container layer is required. The table below summarises the recommended approach for each machine type currently in use.</w:t>
+      </w:r>
+    </w:p>
+    <w:tbl>
+      <w:tblPr>
+        <w:tblStyle w:val="TableGrid"/>
+        <w:tblW w:w="9072" w:type="dxa"/>
+        <w:tblBorders>
+          <w:top w:val="single" w:sz="4" w:space="0" w:color="CCCCCC"/>
+          <w:left w:val="single" w:sz="4" w:space="0" w:color="CCCCCC"/>
+          <w:bottom w:val="single" w:sz="4" w:space="0" w:color="CCCCCC"/>
+          <w:right w:val="single" w:sz="4" w:space="0" w:color="CCCCCC"/>
+          <w:insideH w:val="single" w:sz="4" w:space="0" w:color="CCCCCC"/>
+          <w:insideV w:val="single" w:sz="4" w:space="0" w:color="CCCCCC"/>
+        </w:tblBorders>
+        <w:tblCellMar>
+          <w:top w:w="80" w:type="dxa"/>
+          <w:left w:w="120" w:type="dxa"/>
+          <w:bottom w:w="80" w:type="dxa"/>
+          <w:right w:w="120" w:type="dxa"/>
+        </w:tblCellMar>
+      </w:tblPr>
+      <w:tblGrid>
+        <w:gridCol w:w="2016"/>
+        <w:gridCol w:w="1512"/>
+        <w:gridCol w:w="1512"/>
+        <w:gridCol w:w="1512"/>
+        <w:gridCol w:w="2520"/>
+      </w:tblGrid>
+      <w:tr>
+        <w:trPr>
+          <w:tblHeader/>
+        </w:trPr>
+        <w:tc>
+          <w:tcPr>
+            <w:tcW w:w="2016" w:type="dxa"/>
+            <w:shd w:val="clear" w:color="auto" w:fill="2E74B5"/>
+          </w:tcPr>
+          <w:p>
+            <w:pPr>
+              <w:spacing w:after="0"/>
+            </w:pPr>
+            <w:r>
+              <w:rPr>
+                <w:b/>
+                <w:color w:val="FFFFFF"/>
+                <w:sz w:val="18"/>
+              </w:rPr>
+              <w:t>Machine</w:t>
+            </w:r>
+          </w:p>
+        </w:tc>
+        <w:tc>
+          <w:tcPr>
+            <w:tcW w:w="1512" w:type="dxa"/>
+            <w:shd w:val="clear" w:color="auto" w:fill="2E74B5"/>
+          </w:tcPr>
+          <w:p>
+            <w:pPr>
+              <w:spacing w:after="0"/>
+            </w:pPr>
+            <w:r>
+              <w:rPr>
+                <w:b/>
+                <w:color w:val="FFFFFF"/>
+                <w:sz w:val="18"/>
+              </w:rPr>
+              <w:t>OS / Runtime</w:t>
+            </w:r>
+          </w:p>
+        </w:tc>
+        <w:tc>
+          <w:tcPr>
+            <w:tcW w:w="1512" w:type="dxa"/>
+            <w:shd w:val="clear" w:color="auto" w:fill="2E74B5"/>
+          </w:tcPr>
+          <w:p>
+            <w:pPr>
+              <w:spacing w:after="0"/>
+            </w:pPr>
+            <w:r>
+              <w:rPr>
+                <w:b/>
+                <w:color w:val="FFFFFF"/>
+                <w:sz w:val="18"/>
+              </w:rPr>
+              <w:t>GPU Accelerator</w:t>
+            </w:r>
+          </w:p>
+        </w:tc>
+        <w:tc>
+          <w:tcPr>
+            <w:tcW w:w="1512" w:type="dxa"/>
+            <w:shd w:val="clear" w:color="auto" w:fill="2E74B5"/>
+          </w:tcPr>
+          <w:p>
+            <w:pPr>
+              <w:spacing w:after="0"/>
+            </w:pPr>
+            <w:r>
+              <w:rPr>
+                <w:b/>
+                <w:color w:val="FFFFFF"/>
+                <w:sz w:val="18"/>
+              </w:rPr>
+              <w:t>PyTorch Device</w:t>
+            </w:r>
+          </w:p>
+        </w:tc>
+        <w:tc>
+          <w:tcPr>
+            <w:tcW w:w="2520" w:type="dxa"/>
+            <w:shd w:val="clear" w:color="auto" w:fill="2E74B5"/>
+          </w:tcPr>
+          <w:p>
+            <w:pPr>
+              <w:spacing w:after="0"/>
+            </w:pPr>
+            <w:r>
+              <w:rPr>
+                <w:b/>
+                <w:color w:val="FFFFFF"/>
+                <w:sz w:val="18"/>
+              </w:rPr>
+              <w:t>Setup Command</w:t>
+            </w:r>
+          </w:p>
+        </w:tc>
+      </w:tr>
+      <w:tr>
+        <w:tc>
+          <w:tcPr>
+            <w:tcW w:w="2016" w:type="dxa"/>
+            <w:shd w:val="clear" w:color="auto" w:fill="EBF3FB"/>
+          </w:tcPr>
+          <w:p>
+            <w:pPr>
+              <w:spacing w:after="0"/>
+            </w:pPr>
+            <w:r>
+              <w:rPr>
+                <w:sz w:val="18"/>
+              </w:rPr>
+              <w:t>MacBook Pro M3 Max</w:t>
+            </w:r>
+          </w:p>
+        </w:tc>
+        <w:tc>
+          <w:tcPr>
+            <w:tcW w:w="1512" w:type="dxa"/>
+            <w:shd w:val="clear" w:color="auto" w:fill="EBF3FB"/>
+          </w:tcPr>
+          <w:p>
+            <w:pPr>
+              <w:spacing w:after="0"/>
+            </w:pPr>
+            <w:r>
+              <w:rPr>
+                <w:sz w:val="18"/>
+              </w:rPr>
+              <w:t>macOS · Native Python</w:t>
+            </w:r>
+          </w:p>
+        </w:tc>
+        <w:tc>
+          <w:tcPr>
+            <w:tcW w:w="1512" w:type="dxa"/>
+            <w:shd w:val="clear" w:color="auto" w:fill="EBF3FB"/>
+          </w:tcPr>
+          <w:p>
+            <w:pPr>
+              <w:spacing w:after="0"/>
+            </w:pPr>
+            <w:r>
+              <w:rPr>
+                <w:sz w:val="18"/>
+              </w:rPr>
+              <w:t>Apple M3 Max</w:t>
+            </w:r>
+          </w:p>
+        </w:tc>
+        <w:tc>
+          <w:tcPr>
+            <w:tcW w:w="1512" w:type="dxa"/>
+            <w:shd w:val="clear" w:color="auto" w:fill="EBF3FB"/>
+          </w:tcPr>
+          <w:p>
+            <w:pPr>
+              <w:spacing w:after="0"/>
+            </w:pPr>
+            <w:r>
+              <w:rPr>
+                <w:sz w:val="18"/>
+              </w:rPr>
+              <w:t>mps</w:t>
+            </w:r>
+          </w:p>
+        </w:tc>
+        <w:tc>
+          <w:tcPr>
+            <w:tcW w:w="2520" w:type="dxa"/>
+            <w:shd w:val="clear" w:color="auto" w:fill="EBF3FB"/>
+          </w:tcPr>
+          <w:p>
+            <w:pPr>
+              <w:spacing w:after="0"/>
+            </w:pPr>
+            <w:r>
+              <w:rPr>
+                <w:rFonts w:ascii="Courier New" w:hAnsi="Courier New"/>
+                <w:sz w:val="16"/>
+              </w:rPr>
+              <w:t>bash scripts/setup.sh</w:t>
+            </w:r>
+          </w:p>
+        </w:tc>
+      </w:tr>
+      <w:tr>
+        <w:tc>
+          <w:tcPr>
+            <w:tcW w:w="2016" w:type="dxa"/>
+          </w:tcPr>
+          <w:p>
+            <w:pPr>
+              <w:spacing w:after="0"/>
+            </w:pPr>
+            <w:r>
+              <w:rPr>
+                <w:sz w:val="18"/>
+              </w:rPr>
+              <w:t>Windows RTX 4080</w:t>
+            </w:r>
+          </w:p>
+        </w:tc>
+        <w:tc>
+          <w:tcPr>
+            <w:tcW w:w="1512" w:type="dxa"/>
+          </w:tcPr>
+          <w:p>
+            <w:pPr>
+              <w:spacing w:after="0"/>
+            </w:pPr>
+            <w:r>
+              <w:rPr>
+                <w:sz w:val="18"/>
+              </w:rPr>
+              <w:t>WSL2 Ubuntu 22.04</w:t>
+            </w:r>
+          </w:p>
+        </w:tc>
+        <w:tc>
+          <w:tcPr>
+            <w:tcW w:w="1512" w:type="dxa"/>
+          </w:tcPr>
+          <w:p>
+            <w:pPr>
+              <w:spacing w:after="0"/>
+            </w:pPr>
+            <w:r>
+              <w:rPr>
+                <w:sz w:val="18"/>
+              </w:rPr>
+              <w:t>RTX 4080 (CUDA)</w:t>
+            </w:r>
+          </w:p>
+        </w:tc>
+        <w:tc>
+          <w:tcPr>
+            <w:tcW w:w="1512" w:type="dxa"/>
+          </w:tcPr>
+          <w:p>
+            <w:pPr>
+              <w:spacing w:after="0"/>
+            </w:pPr>
+            <w:r>
+              <w:rPr>
+                <w:sz w:val="18"/>
+              </w:rPr>
+              <w:t>cuda</w:t>
+            </w:r>
+          </w:p>
+        </w:tc>
+        <w:tc>
+          <w:tcPr>
+            <w:tcW w:w="2520" w:type="dxa"/>
+          </w:tcPr>
+          <w:p>
+            <w:pPr>
+              <w:spacing w:after="0"/>
+            </w:pPr>
+            <w:r>
+              <w:rPr>
+                <w:rFonts w:ascii="Courier New" w:hAnsi="Courier New"/>
+                <w:sz w:val="16"/>
+              </w:rPr>
+              <w:t>bash scripts/setup.sh</w:t>
+            </w:r>
+          </w:p>
+        </w:tc>
+      </w:tr>
+      <w:tr>
+        <w:tc>
+          <w:tcPr>
+            <w:tcW w:w="2016" w:type="dxa"/>
+            <w:shd w:val="clear" w:color="auto" w:fill="EBF3FB"/>
+          </w:tcPr>
+          <w:p>
+            <w:pPr>
+              <w:spacing w:after="0"/>
+            </w:pPr>
+            <w:r>
+              <w:rPr>
+                <w:sz w:val="18"/>
+              </w:rPr>
+              <w:t>Additional macOS (any)</w:t>
+            </w:r>
+          </w:p>
+        </w:tc>
+        <w:tc>
+          <w:tcPr>
+            <w:tcW w:w="1512" w:type="dxa"/>
+            <w:shd w:val="clear" w:color="auto" w:fill="EBF3FB"/>
+          </w:tcPr>
+          <w:p>
+            <w:pPr>
+              <w:spacing w:after="0"/>
+            </w:pPr>
+            <w:r>
+              <w:rPr>
+                <w:sz w:val="18"/>
+              </w:rPr>
+              <w:t>macOS · Native Python</w:t>
+            </w:r>
+          </w:p>
+        </w:tc>
+        <w:tc>
+          <w:tcPr>
+            <w:tcW w:w="1512" w:type="dxa"/>
+            <w:shd w:val="clear" w:color="auto" w:fill="EBF3FB"/>
+          </w:tcPr>
+          <w:p>
+            <w:pPr>
+              <w:spacing w:after="0"/>
+            </w:pPr>
+            <w:r>
+              <w:rPr>
+                <w:sz w:val="18"/>
+              </w:rPr>
+              <w:t>Apple Silicon or Intel</w:t>
+            </w:r>
+          </w:p>
+        </w:tc>
+        <w:tc>
+          <w:tcPr>
+            <w:tcW w:w="1512" w:type="dxa"/>
+            <w:shd w:val="clear" w:color="auto" w:fill="EBF3FB"/>
+          </w:tcPr>
+          <w:p>
+            <w:pPr>
+              <w:spacing w:after="0"/>
+            </w:pPr>
+            <w:r>
+              <w:rPr>
+                <w:sz w:val="18"/>
+              </w:rPr>
+              <w:t>mps / cpu</w:t>
+            </w:r>
+          </w:p>
+        </w:tc>
+        <w:tc>
+          <w:tcPr>
+            <w:tcW w:w="2520" w:type="dxa"/>
+            <w:shd w:val="clear" w:color="auto" w:fill="EBF3FB"/>
+          </w:tcPr>
+          <w:p>
+            <w:pPr>
+              <w:spacing w:after="0"/>
+            </w:pPr>
+            <w:r>
+              <w:rPr>
+                <w:rFonts w:ascii="Courier New" w:hAnsi="Courier New"/>
+                <w:sz w:val="16"/>
+              </w:rPr>
+              <w:t>bash scripts/setup.sh</w:t>
+            </w:r>
+          </w:p>
+        </w:tc>
+      </w:tr>
+      <w:tr>
+        <w:tc>
+          <w:tcPr>
+            <w:tcW w:w="2016" w:type="dxa"/>
+          </w:tcPr>
+          <w:p>
+            <w:pPr>
+              <w:spacing w:after="0"/>
+            </w:pPr>
+            <w:r>
+              <w:rPr>
+                <w:sz w:val="18"/>
+              </w:rPr>
+              <w:t>Additional Windows GPU</w:t>
+            </w:r>
+          </w:p>
+        </w:tc>
+        <w:tc>
+          <w:tcPr>
+            <w:tcW w:w="1512" w:type="dxa"/>
+          </w:tcPr>
+          <w:p>
+            <w:pPr>
+              <w:spacing w:after="0"/>
+            </w:pPr>
+            <w:r>
+              <w:rPr>
+                <w:sz w:val="18"/>
+              </w:rPr>
+              <w:t>WSL2 Ubuntu 22.04</w:t>
+            </w:r>
+          </w:p>
+        </w:tc>
+        <w:tc>
+          <w:tcPr>
+            <w:tcW w:w="1512" w:type="dxa"/>
+          </w:tcPr>
+          <w:p>
+            <w:pPr>
+              <w:spacing w:after="0"/>
+            </w:pPr>
+            <w:r>
+              <w:rPr>
+                <w:sz w:val="18"/>
+              </w:rPr>
+              <w:t>Any NVIDIA GPU</w:t>
+            </w:r>
+          </w:p>
+        </w:tc>
+        <w:tc>
+          <w:tcPr>
+            <w:tcW w:w="1512" w:type="dxa"/>
+          </w:tcPr>
+          <w:p>
+            <w:pPr>
+              <w:spacing w:after="0"/>
+            </w:pPr>
+            <w:r>
+              <w:rPr>
+                <w:sz w:val="18"/>
+              </w:rPr>
+              <w:t>cuda</w:t>
+            </w:r>
+          </w:p>
+        </w:tc>
+        <w:tc>
+          <w:tcPr>
+            <w:tcW w:w="2520" w:type="dxa"/>
+          </w:tcPr>
+          <w:p>
+            <w:pPr>
+              <w:spacing w:after="0"/>
+            </w:pPr>
+            <w:r>
+              <w:rPr>
+                <w:rFonts w:ascii="Courier New" w:hAnsi="Courier New"/>
+                <w:sz w:val="16"/>
+              </w:rPr>
+              <w:t>bash scripts/setup.sh</w:t>
+            </w:r>
+          </w:p>
+        </w:tc>
+      </w:tr>
+    </w:tbl>
+    <w:p>
+      <w:pPr>
+        <w:spacing w:after="60"/>
+      </w:pPr>
+      <w:r>
+        <w:rPr>
+          <w:i/>
+          <w:color w:val="1E202C"/>
+          <w:sz w:val="20"/>
+        </w:rPr>
+        <w:t>setup.sh selects the correct PyTorch index URL automatically: CUDA 12.1 when nvidia-smi is present in WSL2/Linux, standard PyPI build (MPS-capable) on macOS. No manual configuration is required when adding a new machine — git pull and re-run setup.sh.</w:t>
+      </w:r>
     </w:p>
     <w:p>
       <w:pPr>
@@ -8293,7 +11575,7 @@
           <w:color w:val="1E202C"/>
           <w:sz w:val="20"/>
         </w:rPr>
-        <w:t>TTS Agent v2.0 is a production-grade, commercially oriented local TTS system designed for high-quality English and Hindi narration, custom voice cloning, broadcast-compliant audio delivery, and full documentary script processing. The v2.0 additions — 44.1 kHz export, SSML narration control, batch synthesis, and EBU R128 post-processing — close the gap between a local TTS prototype and a professional audio production tool suitable for direct delivery to broadcast ingest, non-linear editing, and streaming mastering workflows.</w:t>
+        <w:t>TTS Agent v2.2 is a production-grade, commercially oriented local TTS system designed for professional narration, custom voice cloning, broadcast-compliant audio delivery, and full documentary script processing. The system provides 54 built-in voices spanning 9 languages (American English, British English, Hindi, Spanish, French, Italian, Brazilian Portuguese, Japanese, and Mandarin Chinese) through Kokoro-82M, plus zero-shot voice cloning through F5-TTS. The v2.2 additions — Windows WSL2 deployment support, full Kokoro voice library exposure, and cross-platform deployment automation — extend the system to mixed macOS/Windows production environments without requiring Docker or any platform-specific code changes.</w:t>
       </w:r>
     </w:p>
     <w:p>
@@ -8310,7 +11592,7 @@
           <w:color w:val="1E202C"/>
           <w:sz w:val="20"/>
         </w:rPr>
-        <w:t>The architecture remains locally deployed, GPU-accelerated, and privacy-preserving, with all voice samples and generated audio staying on the host machine. Portability is maintained through Docker Compose with host-mounted volumes, and the design is extensible to additional model backends without changes to the API contract.</w:t>
+        <w:t>The architecture remains locally deployed, GPU-accelerated, and privacy-preserving, with all voice samples and generated audio staying on the host machine. Portability across machines is achieved through a single setup.sh that auto-detects the platform and configures the correct PyTorch backend (MPS on Apple Silicon, CUDA on Windows WSL2). The design is extensible to additional model backends and languages without changes to the API contract, and scales to any number of macOS or Windows machines simply by cloning the repository and running setup.sh.</w:t>
       </w:r>
     </w:p>
     <w:sectPr>

</xml_diff>

<commit_message>
Updated solution design document with windows deployment instructions
</commit_message>
<xml_diff>
--- a/audio-ML/Custom_TTS_Model/docs/TTS_Agent_Solution_Design.docx
+++ b/audio-ML/Custom_TTS_Model/docs/TTS_Agent_Solution_Design.docx
@@ -1,6 +1,6 @@
 
 <file path=word/document.xml><?xml version="1.0" encoding="utf-8"?>
-<w:document xmlns:wpc="http://schemas.microsoft.com/office/word/2010/wordprocessingCanvas" xmlns:cx="http://schemas.microsoft.com/office/drawing/2014/chartex" xmlns:cx1="http://schemas.microsoft.com/office/drawing/2015/9/8/chartex" xmlns:cx2="http://schemas.microsoft.com/office/drawing/2015/10/21/chartex" xmlns:cx3="http://schemas.microsoft.com/office/drawing/2016/5/9/chartex" xmlns:cx4="http://schemas.microsoft.com/office/drawing/2016/5/10/chartex" xmlns:cx5="http://schemas.microsoft.com/office/drawing/2016/5/11/chartex" xmlns:cx6="http://schemas.microsoft.com/office/drawing/2016/5/12/chartex" xmlns:cx7="http://schemas.microsoft.com/office/drawing/2016/5/13/chartex" xmlns:cx8="http://schemas.microsoft.com/office/drawing/2016/5/14/chartex" xmlns:mc="http://schemas.openxmlformats.org/markup-compatibility/2006" xmlns:aink="http://schemas.microsoft.com/office/drawing/2016/ink" xmlns:am3d="http://schemas.microsoft.com/office/drawing/2017/model3d" xmlns:o="urn:schemas-microsoft-com:office:office" xmlns:oel="http://schemas.microsoft.com/office/2019/extlst" xmlns:r="http://schemas.openxmlformats.org/officeDocument/2006/relationships" xmlns:m="http://schemas.openxmlformats.org/officeDocument/2006/math" xmlns:v="urn:schemas-microsoft-com:vml" xmlns:wp14="http://schemas.microsoft.com/office/word/2010/wordprocessingDrawing" xmlns:wp="http://schemas.openxmlformats.org/drawingml/2006/wordprocessingDrawing" xmlns:w10="urn:schemas-microsoft-com:office:word" xmlns:w="http://schemas.openxmlformats.org/wordprocessingml/2006/main" xmlns:w14="http://schemas.microsoft.com/office/word/2010/wordml" xmlns:w15="http://schemas.microsoft.com/office/word/2012/wordml" xmlns:w16cex="http://schemas.microsoft.com/office/word/2018/wordml/cex" xmlns:w16cid="http://schemas.microsoft.com/office/word/2016/wordml/cid" xmlns:w16="http://schemas.microsoft.com/office/word/2018/wordml" xmlns:w16du="http://schemas.microsoft.com/office/word/2023/wordml/word16du" xmlns:w16sdtdh="http://schemas.microsoft.com/office/word/2020/wordml/sdtdatahash" xmlns:w16sdtfl="http://schemas.microsoft.com/office/word/2024/wordml/sdtformatlock" xmlns:w16se="http://schemas.microsoft.com/office/word/2015/wordml/symex" xmlns:wpg="http://schemas.microsoft.com/office/word/2010/wordprocessingGroup" xmlns:wpi="http://schemas.microsoft.com/office/word/2010/wordprocessingInk" xmlns:wne="http://schemas.microsoft.com/office/word/2006/wordml" xmlns:wps="http://schemas.microsoft.com/office/word/2010/wordprocessingShape" mc:Ignorable="w14 w15 w16se w16cid w16 w16cex w16sdtdh w16sdtfl w16du wp14">
+<w:document xmlns:wpc="http://schemas.microsoft.com/office/word/2010/wordprocessingCanvas" xmlns:cx="http://schemas.microsoft.com/office/drawing/2014/chartex" xmlns:cx1="http://schemas.microsoft.com/office/drawing/2015/9/8/chartex" xmlns:cx2="http://schemas.microsoft.com/office/drawing/2015/10/21/chartex" xmlns:cx3="http://schemas.microsoft.com/office/drawing/2016/5/9/chartex" xmlns:cx4="http://schemas.microsoft.com/office/drawing/2016/5/10/chartex" xmlns:cx5="http://schemas.microsoft.com/office/drawing/2016/5/11/chartex" xmlns:cx6="http://schemas.microsoft.com/office/drawing/2016/5/12/chartex" xmlns:cx7="http://schemas.microsoft.com/office/drawing/2016/5/13/chartex" xmlns:cx8="http://schemas.microsoft.com/office/drawing/2016/5/14/chartex" xmlns:mc="http://schemas.openxmlformats.org/markup-compatibility/2006" xmlns:aink="http://schemas.microsoft.com/office/drawing/2016/ink" xmlns:am3d="http://schemas.microsoft.com/office/drawing/2017/model3d" xmlns:o="urn:schemas-microsoft-com:office:office" xmlns:oel="http://schemas.microsoft.com/office/2019/extlst" xmlns:r="http://schemas.openxmlformats.org/officeDocument/2006/relationships" xmlns:m="http://schemas.openxmlformats.org/officeDocument/2006/math" xmlns:v="urn:schemas-microsoft-com:vml" xmlns:wp14="http://schemas.microsoft.com/office/word/2010/wordprocessingDrawing" xmlns:wp="http://schemas.openxmlformats.org/drawingml/2006/wordprocessingDrawing" xmlns:w10="urn:schemas-microsoft-com:office:word" xmlns:w="http://schemas.openxmlformats.org/wordprocessingml/2006/main" xmlns:w14="http://schemas.microsoft.com/office/word/2010/wordml" xmlns:w15="http://schemas.microsoft.com/office/word/2012/wordml" xmlns:w16cex="http://schemas.microsoft.com/office/word/2018/wordml/cex" xmlns:w16cid="http://schemas.microsoft.com/office/word/2016/wordml/cid" xmlns:w16="http://schemas.microsoft.com/office/word/2018/wordml" xmlns:w16sdtdh="http://schemas.microsoft.com/office/word/2020/wordml/sdtdatahash" xmlns:w16se="http://schemas.microsoft.com/office/word/2015/wordml/symex" xmlns:wpg="http://schemas.microsoft.com/office/word/2010/wordprocessingGroup" xmlns:wpi="http://schemas.microsoft.com/office/word/2010/wordprocessingInk" xmlns:wne="http://schemas.microsoft.com/office/word/2006/wordml" xmlns:wps="http://schemas.microsoft.com/office/word/2010/wordprocessingShape" mc:Ignorable="w14 w15 w16se w16cid w16 w16cex w16sdtdh wp14">
   <w:body>
     <w:tbl>
       <w:tblPr>
@@ -53,7 +53,6 @@
         </w:tc>
       </w:tr>
     </w:tbl>
-    <w:p/>
     <w:p>
       <w:pPr>
         <w:pBdr>
@@ -82,10 +81,10 @@
         <w:tblLook w:val="04A0" w:firstRow="1" w:lastRow="0" w:firstColumn="1" w:lastColumn="0" w:noHBand="0" w:noVBand="1"/>
       </w:tblPr>
       <w:tblGrid>
-        <w:gridCol w:w="1799"/>
-        <w:gridCol w:w="1737"/>
-        <w:gridCol w:w="1798"/>
-        <w:gridCol w:w="3954"/>
+        <w:gridCol w:w="1389"/>
+        <w:gridCol w:w="1274"/>
+        <w:gridCol w:w="1389"/>
+        <w:gridCol w:w="5236"/>
       </w:tblGrid>
       <w:tr>
         <w:tc>
@@ -464,11 +463,12 @@
       <w:tr>
         <w:tc>
           <w:tcPr>
+            <w:tcW w:w="0" w:type="auto"/>
             <w:tcBorders>
-              <w:top w:val="single" w:sz="4" w:color="CCCCCC"/>
-              <w:left w:val="single" w:sz="4" w:color="CCCCCC"/>
-              <w:bottom w:val="single" w:sz="4" w:color="CCCCCC"/>
-              <w:right w:val="single" w:sz="4" w:color="CCCCCC"/>
+              <w:top w:val="single" w:sz="4" w:space="0" w:color="CCCCCC"/>
+              <w:left w:val="single" w:sz="4" w:space="0" w:color="CCCCCC"/>
+              <w:bottom w:val="single" w:sz="4" w:space="0" w:color="CCCCCC"/>
+              <w:right w:val="single" w:sz="4" w:space="0" w:color="CCCCCC"/>
             </w:tcBorders>
             <w:shd w:val="clear" w:color="auto" w:fill="F8F9FA"/>
           </w:tcPr>
@@ -486,11 +486,12 @@
         </w:tc>
         <w:tc>
           <w:tcPr>
+            <w:tcW w:w="0" w:type="auto"/>
             <w:tcBorders>
-              <w:top w:val="single" w:sz="4" w:color="CCCCCC"/>
-              <w:left w:val="single" w:sz="4" w:color="CCCCCC"/>
-              <w:bottom w:val="single" w:sz="4" w:color="CCCCCC"/>
-              <w:right w:val="single" w:sz="4" w:color="CCCCCC"/>
+              <w:top w:val="single" w:sz="4" w:space="0" w:color="CCCCCC"/>
+              <w:left w:val="single" w:sz="4" w:space="0" w:color="CCCCCC"/>
+              <w:bottom w:val="single" w:sz="4" w:space="0" w:color="CCCCCC"/>
+              <w:right w:val="single" w:sz="4" w:space="0" w:color="CCCCCC"/>
             </w:tcBorders>
             <w:shd w:val="clear" w:color="auto" w:fill="F8F9FA"/>
           </w:tcPr>
@@ -508,11 +509,12 @@
         </w:tc>
         <w:tc>
           <w:tcPr>
+            <w:tcW w:w="0" w:type="auto"/>
             <w:tcBorders>
-              <w:top w:val="single" w:sz="4" w:color="CCCCCC"/>
-              <w:left w:val="single" w:sz="4" w:color="CCCCCC"/>
-              <w:bottom w:val="single" w:sz="4" w:color="CCCCCC"/>
-              <w:right w:val="single" w:sz="4" w:color="CCCCCC"/>
+              <w:top w:val="single" w:sz="4" w:space="0" w:color="CCCCCC"/>
+              <w:left w:val="single" w:sz="4" w:space="0" w:color="CCCCCC"/>
+              <w:bottom w:val="single" w:sz="4" w:space="0" w:color="CCCCCC"/>
+              <w:right w:val="single" w:sz="4" w:space="0" w:color="CCCCCC"/>
             </w:tcBorders>
             <w:shd w:val="clear" w:color="auto" w:fill="F8F9FA"/>
           </w:tcPr>
@@ -530,11 +532,12 @@
         </w:tc>
         <w:tc>
           <w:tcPr>
+            <w:tcW w:w="0" w:type="auto"/>
             <w:tcBorders>
-              <w:top w:val="single" w:sz="4" w:color="CCCCCC"/>
-              <w:left w:val="single" w:sz="4" w:color="CCCCCC"/>
-              <w:bottom w:val="single" w:sz="4" w:color="CCCCCC"/>
-              <w:right w:val="single" w:sz="4" w:color="CCCCCC"/>
+              <w:top w:val="single" w:sz="4" w:space="0" w:color="CCCCCC"/>
+              <w:left w:val="single" w:sz="4" w:space="0" w:color="CCCCCC"/>
+              <w:bottom w:val="single" w:sz="4" w:space="0" w:color="CCCCCC"/>
+              <w:right w:val="single" w:sz="4" w:space="0" w:color="CCCCCC"/>
             </w:tcBorders>
             <w:shd w:val="clear" w:color="auto" w:fill="F8F9FA"/>
           </w:tcPr>
@@ -739,7 +742,6 @@
         </w:tc>
       </w:tr>
     </w:tbl>
-    <w:p/>
     <w:p>
       <w:pPr>
         <w:pBdr>
@@ -770,11 +772,6 @@
     </w:p>
     <w:p>
       <w:pPr>
-        <w:spacing w:after="40"/>
-      </w:pPr>
-    </w:p>
-    <w:p>
-      <w:pPr>
         <w:spacing w:after="80"/>
       </w:pPr>
       <w:r>
@@ -784,16 +781,6 @@
         </w:rPr>
         <w:t>Version 2.0 extends the system with four broadcast-grade capabilities: 44.1 kHz stereo export for professional delivery, SSML-style pause and emphasis controls for narration scripting, batch synthesis for full documentary scripts, and EBU R128 loudness normalization with noise reduction for broadcast-compliant audio post-processing.</w:t>
       </w:r>
-    </w:p>
-    <w:p>
-      <w:pPr>
-        <w:spacing w:after="120"/>
-      </w:pPr>
-    </w:p>
-    <w:p>
-      <w:pPr>
-        <w:spacing w:after="120"/>
-      </w:pPr>
     </w:p>
     <w:p>
       <w:pPr>
@@ -808,6 +795,7 @@
           <w:color w:val="3C559A"/>
           <w:sz w:val="26"/>
         </w:rPr>
+        <w:lastRenderedPageBreak/>
         <w:t>2. INTRODUCTION</w:t>
       </w:r>
     </w:p>
@@ -839,11 +827,6 @@
         </w:rPr>
         <w:t>A production TTS application is built around several linked stages: text normalisation, grapheme-to-phoneme conversion, acoustic generation, waveform synthesis, post-processing, packaging, and serving through an application layer. The exact implementation differs by model family, but the foundation remains the same: transform language into a structured intermediate representation, then synthesise an audio waveform while preserving timing, tone, and speaker character.</w:t>
       </w:r>
-    </w:p>
-    <w:p>
-      <w:pPr>
-        <w:spacing w:after="120"/>
-      </w:pPr>
     </w:p>
     <w:p>
       <w:pPr>
@@ -990,11 +973,6 @@
         </w:rPr>
         <w:t>resample, normalise loudness, trim silence, and package into export formats</w:t>
       </w:r>
-    </w:p>
-    <w:p>
-      <w:pPr>
-        <w:spacing w:after="120"/>
-      </w:pPr>
     </w:p>
     <w:p>
       <w:pPr>
@@ -1563,6 +1541,7 @@
     </w:tbl>
     <w:p/>
     <w:p/>
+    <w:p/>
     <w:p>
       <w:pPr>
         <w:pBdr>
@@ -1576,6 +1555,7 @@
           <w:color w:val="3C559A"/>
           <w:sz w:val="26"/>
         </w:rPr>
+        <w:lastRenderedPageBreak/>
         <w:t>4. SYSTEM CAPABILITIES (V2.0)</w:t>
       </w:r>
     </w:p>
@@ -1947,6 +1927,7 @@
           <w:color w:val="1E202C"/>
           <w:sz w:val="20"/>
         </w:rPr>
+        <w:lastRenderedPageBreak/>
         <w:t>Key implementation details:</w:t>
       </w:r>
     </w:p>
@@ -2027,11 +2008,6 @@
         </w:rPr>
         <w:t>Long-running jobs return a job_id; status polled via GET /batch-status/{job_id}</w:t>
       </w:r>
-    </w:p>
-    <w:p>
-      <w:pPr>
-        <w:spacing w:after="160"/>
-      </w:pPr>
     </w:p>
     <w:p>
       <w:pPr>
@@ -2181,11 +2157,6 @@
     </w:p>
     <w:p>
       <w:pPr>
-        <w:spacing w:after="160"/>
-      </w:pPr>
-    </w:p>
-    <w:p>
-      <w:pPr>
         <w:pBdr>
           <w:bottom w:val="single" w:sz="8" w:space="2" w:color="3C559A"/>
         </w:pBdr>
@@ -2216,14 +2187,14 @@
       <w:tblPr>
         <w:tblStyle w:val="TableGrid"/>
         <w:tblW w:w="0" w:type="auto"/>
-        <w:tblLook w:val="04A0"/>
+        <w:tblLook w:val="04A0" w:firstRow="1" w:lastRow="0" w:firstColumn="1" w:lastColumn="0" w:noHBand="0" w:noVBand="1"/>
       </w:tblPr>
       <w:tblGrid>
-        <w:gridCol w:w="1400"/>
-        <w:gridCol w:w="1200"/>
-        <w:gridCol w:w="1000"/>
-        <w:gridCol w:w="2000"/>
-        <w:gridCol w:w="3760"/>
+        <w:gridCol w:w="1365"/>
+        <w:gridCol w:w="896"/>
+        <w:gridCol w:w="913"/>
+        <w:gridCol w:w="2429"/>
+        <w:gridCol w:w="3685"/>
       </w:tblGrid>
       <w:tr>
         <w:trPr>
@@ -2231,11 +2202,12 @@
         </w:trPr>
         <w:tc>
           <w:tcPr>
+            <w:tcW w:w="0" w:type="auto"/>
             <w:tcBorders>
-              <w:top w:val="single" w:sz="4" w:color="3C559A"/>
-              <w:left w:val="single" w:sz="4" w:color="3C559A"/>
-              <w:bottom w:val="single" w:sz="4" w:color="3C559A"/>
-              <w:right w:val="single" w:sz="4" w:color="3C559A"/>
+              <w:top w:val="single" w:sz="4" w:space="0" w:color="3C559A"/>
+              <w:left w:val="single" w:sz="4" w:space="0" w:color="3C559A"/>
+              <w:bottom w:val="single" w:sz="4" w:space="0" w:color="3C559A"/>
+              <w:right w:val="single" w:sz="4" w:space="0" w:color="3C559A"/>
             </w:tcBorders>
             <w:shd w:val="clear" w:color="auto" w:fill="3C559A"/>
           </w:tcPr>
@@ -2255,11 +2227,12 @@
         </w:tc>
         <w:tc>
           <w:tcPr>
+            <w:tcW w:w="0" w:type="auto"/>
             <w:tcBorders>
-              <w:top w:val="single" w:sz="4" w:color="3C559A"/>
-              <w:left w:val="single" w:sz="4" w:color="3C559A"/>
-              <w:bottom w:val="single" w:sz="4" w:color="3C559A"/>
-              <w:right w:val="single" w:sz="4" w:color="3C559A"/>
+              <w:top w:val="single" w:sz="4" w:space="0" w:color="3C559A"/>
+              <w:left w:val="single" w:sz="4" w:space="0" w:color="3C559A"/>
+              <w:bottom w:val="single" w:sz="4" w:space="0" w:color="3C559A"/>
+              <w:right w:val="single" w:sz="4" w:space="0" w:color="3C559A"/>
             </w:tcBorders>
             <w:shd w:val="clear" w:color="auto" w:fill="3C559A"/>
           </w:tcPr>
@@ -2279,11 +2252,12 @@
         </w:tc>
         <w:tc>
           <w:tcPr>
+            <w:tcW w:w="0" w:type="auto"/>
             <w:tcBorders>
-              <w:top w:val="single" w:sz="4" w:color="3C559A"/>
-              <w:left w:val="single" w:sz="4" w:color="3C559A"/>
-              <w:bottom w:val="single" w:sz="4" w:color="3C559A"/>
-              <w:right w:val="single" w:sz="4" w:color="3C559A"/>
+              <w:top w:val="single" w:sz="4" w:space="0" w:color="3C559A"/>
+              <w:left w:val="single" w:sz="4" w:space="0" w:color="3C559A"/>
+              <w:bottom w:val="single" w:sz="4" w:space="0" w:color="3C559A"/>
+              <w:right w:val="single" w:sz="4" w:space="0" w:color="3C559A"/>
             </w:tcBorders>
             <w:shd w:val="clear" w:color="auto" w:fill="3C559A"/>
           </w:tcPr>
@@ -2303,11 +2277,12 @@
         </w:tc>
         <w:tc>
           <w:tcPr>
+            <w:tcW w:w="0" w:type="auto"/>
             <w:tcBorders>
-              <w:top w:val="single" w:sz="4" w:color="3C559A"/>
-              <w:left w:val="single" w:sz="4" w:color="3C559A"/>
-              <w:bottom w:val="single" w:sz="4" w:color="3C559A"/>
-              <w:right w:val="single" w:sz="4" w:color="3C559A"/>
+              <w:top w:val="single" w:sz="4" w:space="0" w:color="3C559A"/>
+              <w:left w:val="single" w:sz="4" w:space="0" w:color="3C559A"/>
+              <w:bottom w:val="single" w:sz="4" w:space="0" w:color="3C559A"/>
+              <w:right w:val="single" w:sz="4" w:space="0" w:color="3C559A"/>
             </w:tcBorders>
             <w:shd w:val="clear" w:color="auto" w:fill="3C559A"/>
           </w:tcPr>
@@ -2327,11 +2302,12 @@
         </w:tc>
         <w:tc>
           <w:tcPr>
+            <w:tcW w:w="0" w:type="auto"/>
             <w:tcBorders>
-              <w:top w:val="single" w:sz="4" w:color="3C559A"/>
-              <w:left w:val="single" w:sz="4" w:color="3C559A"/>
-              <w:bottom w:val="single" w:sz="4" w:color="3C559A"/>
-              <w:right w:val="single" w:sz="4" w:color="3C559A"/>
+              <w:top w:val="single" w:sz="4" w:space="0" w:color="3C559A"/>
+              <w:left w:val="single" w:sz="4" w:space="0" w:color="3C559A"/>
+              <w:bottom w:val="single" w:sz="4" w:space="0" w:color="3C559A"/>
+              <w:right w:val="single" w:sz="4" w:space="0" w:color="3C559A"/>
             </w:tcBorders>
             <w:shd w:val="clear" w:color="auto" w:fill="3C559A"/>
           </w:tcPr>
@@ -2353,11 +2329,12 @@
       <w:tr>
         <w:tc>
           <w:tcPr>
+            <w:tcW w:w="0" w:type="auto"/>
             <w:tcBorders>
-              <w:top w:val="single" w:sz="4" w:color="CCCCCC"/>
-              <w:left w:val="single" w:sz="4" w:color="CCCCCC"/>
-              <w:bottom w:val="single" w:sz="4" w:color="CCCCCC"/>
-              <w:right w:val="single" w:sz="4" w:color="CCCCCC"/>
+              <w:top w:val="single" w:sz="4" w:space="0" w:color="CCCCCC"/>
+              <w:left w:val="single" w:sz="4" w:space="0" w:color="CCCCCC"/>
+              <w:bottom w:val="single" w:sz="4" w:space="0" w:color="CCCCCC"/>
+              <w:right w:val="single" w:sz="4" w:space="0" w:color="CCCCCC"/>
             </w:tcBorders>
             <w:shd w:val="clear" w:color="auto" w:fill="F0F4FF"/>
           </w:tcPr>
@@ -2376,11 +2353,12 @@
         </w:tc>
         <w:tc>
           <w:tcPr>
+            <w:tcW w:w="0" w:type="auto"/>
             <w:tcBorders>
-              <w:top w:val="single" w:sz="4" w:color="CCCCCC"/>
-              <w:left w:val="single" w:sz="4" w:color="CCCCCC"/>
-              <w:bottom w:val="single" w:sz="4" w:color="CCCCCC"/>
-              <w:right w:val="single" w:sz="4" w:color="CCCCCC"/>
+              <w:top w:val="single" w:sz="4" w:space="0" w:color="CCCCCC"/>
+              <w:left w:val="single" w:sz="4" w:space="0" w:color="CCCCCC"/>
+              <w:bottom w:val="single" w:sz="4" w:space="0" w:color="CCCCCC"/>
+              <w:right w:val="single" w:sz="4" w:space="0" w:color="CCCCCC"/>
             </w:tcBorders>
             <w:shd w:val="clear" w:color="auto" w:fill="F0F4FF"/>
           </w:tcPr>
@@ -2398,11 +2376,12 @@
         </w:tc>
         <w:tc>
           <w:tcPr>
+            <w:tcW w:w="0" w:type="auto"/>
             <w:tcBorders>
-              <w:top w:val="single" w:sz="4" w:color="CCCCCC"/>
-              <w:left w:val="single" w:sz="4" w:color="CCCCCC"/>
-              <w:bottom w:val="single" w:sz="4" w:color="CCCCCC"/>
-              <w:right w:val="single" w:sz="4" w:color="CCCCCC"/>
+              <w:top w:val="single" w:sz="4" w:space="0" w:color="CCCCCC"/>
+              <w:left w:val="single" w:sz="4" w:space="0" w:color="CCCCCC"/>
+              <w:bottom w:val="single" w:sz="4" w:space="0" w:color="CCCCCC"/>
+              <w:right w:val="single" w:sz="4" w:space="0" w:color="CCCCCC"/>
             </w:tcBorders>
             <w:shd w:val="clear" w:color="auto" w:fill="F0F4FF"/>
           </w:tcPr>
@@ -2420,11 +2399,12 @@
         </w:tc>
         <w:tc>
           <w:tcPr>
+            <w:tcW w:w="0" w:type="auto"/>
             <w:tcBorders>
-              <w:top w:val="single" w:sz="4" w:color="CCCCCC"/>
-              <w:left w:val="single" w:sz="4" w:color="CCCCCC"/>
-              <w:bottom w:val="single" w:sz="4" w:color="CCCCCC"/>
-              <w:right w:val="single" w:sz="4" w:color="CCCCCC"/>
+              <w:top w:val="single" w:sz="4" w:space="0" w:color="CCCCCC"/>
+              <w:left w:val="single" w:sz="4" w:space="0" w:color="CCCCCC"/>
+              <w:bottom w:val="single" w:sz="4" w:space="0" w:color="CCCCCC"/>
+              <w:right w:val="single" w:sz="4" w:space="0" w:color="CCCCCC"/>
             </w:tcBorders>
             <w:shd w:val="clear" w:color="auto" w:fill="F0F4FF"/>
           </w:tcPr>
@@ -2442,11 +2422,12 @@
         </w:tc>
         <w:tc>
           <w:tcPr>
+            <w:tcW w:w="0" w:type="auto"/>
             <w:tcBorders>
-              <w:top w:val="single" w:sz="4" w:color="CCCCCC"/>
-              <w:left w:val="single" w:sz="4" w:color="CCCCCC"/>
-              <w:bottom w:val="single" w:sz="4" w:color="CCCCCC"/>
-              <w:right w:val="single" w:sz="4" w:color="CCCCCC"/>
+              <w:top w:val="single" w:sz="4" w:space="0" w:color="CCCCCC"/>
+              <w:left w:val="single" w:sz="4" w:space="0" w:color="CCCCCC"/>
+              <w:bottom w:val="single" w:sz="4" w:space="0" w:color="CCCCCC"/>
+              <w:right w:val="single" w:sz="4" w:space="0" w:color="CCCCCC"/>
             </w:tcBorders>
             <w:shd w:val="clear" w:color="auto" w:fill="F0F4FF"/>
           </w:tcPr>
@@ -2466,11 +2447,12 @@
       <w:tr>
         <w:tc>
           <w:tcPr>
+            <w:tcW w:w="0" w:type="auto"/>
             <w:tcBorders>
-              <w:top w:val="single" w:sz="4" w:color="CCCCCC"/>
-              <w:left w:val="single" w:sz="4" w:color="CCCCCC"/>
-              <w:bottom w:val="single" w:sz="4" w:color="CCCCCC"/>
-              <w:right w:val="single" w:sz="4" w:color="CCCCCC"/>
+              <w:top w:val="single" w:sz="4" w:space="0" w:color="CCCCCC"/>
+              <w:left w:val="single" w:sz="4" w:space="0" w:color="CCCCCC"/>
+              <w:bottom w:val="single" w:sz="4" w:space="0" w:color="CCCCCC"/>
+              <w:right w:val="single" w:sz="4" w:space="0" w:color="CCCCCC"/>
             </w:tcBorders>
           </w:tcPr>
           <w:p>
@@ -2488,11 +2470,12 @@
         </w:tc>
         <w:tc>
           <w:tcPr>
+            <w:tcW w:w="0" w:type="auto"/>
             <w:tcBorders>
-              <w:top w:val="single" w:sz="4" w:color="CCCCCC"/>
-              <w:left w:val="single" w:sz="4" w:color="CCCCCC"/>
-              <w:bottom w:val="single" w:sz="4" w:color="CCCCCC"/>
-              <w:right w:val="single" w:sz="4" w:color="CCCCCC"/>
+              <w:top w:val="single" w:sz="4" w:space="0" w:color="CCCCCC"/>
+              <w:left w:val="single" w:sz="4" w:space="0" w:color="CCCCCC"/>
+              <w:bottom w:val="single" w:sz="4" w:space="0" w:color="CCCCCC"/>
+              <w:right w:val="single" w:sz="4" w:space="0" w:color="CCCCCC"/>
             </w:tcBorders>
           </w:tcPr>
           <w:p>
@@ -2509,11 +2492,12 @@
         </w:tc>
         <w:tc>
           <w:tcPr>
+            <w:tcW w:w="0" w:type="auto"/>
             <w:tcBorders>
-              <w:top w:val="single" w:sz="4" w:color="CCCCCC"/>
-              <w:left w:val="single" w:sz="4" w:color="CCCCCC"/>
-              <w:bottom w:val="single" w:sz="4" w:color="CCCCCC"/>
-              <w:right w:val="single" w:sz="4" w:color="CCCCCC"/>
+              <w:top w:val="single" w:sz="4" w:space="0" w:color="CCCCCC"/>
+              <w:left w:val="single" w:sz="4" w:space="0" w:color="CCCCCC"/>
+              <w:bottom w:val="single" w:sz="4" w:space="0" w:color="CCCCCC"/>
+              <w:right w:val="single" w:sz="4" w:space="0" w:color="CCCCCC"/>
             </w:tcBorders>
           </w:tcPr>
           <w:p>
@@ -2530,11 +2514,12 @@
         </w:tc>
         <w:tc>
           <w:tcPr>
+            <w:tcW w:w="0" w:type="auto"/>
             <w:tcBorders>
-              <w:top w:val="single" w:sz="4" w:color="CCCCCC"/>
-              <w:left w:val="single" w:sz="4" w:color="CCCCCC"/>
-              <w:bottom w:val="single" w:sz="4" w:color="CCCCCC"/>
-              <w:right w:val="single" w:sz="4" w:color="CCCCCC"/>
+              <w:top w:val="single" w:sz="4" w:space="0" w:color="CCCCCC"/>
+              <w:left w:val="single" w:sz="4" w:space="0" w:color="CCCCCC"/>
+              <w:bottom w:val="single" w:sz="4" w:space="0" w:color="CCCCCC"/>
+              <w:right w:val="single" w:sz="4" w:space="0" w:color="CCCCCC"/>
             </w:tcBorders>
           </w:tcPr>
           <w:p>
@@ -2551,11 +2536,12 @@
         </w:tc>
         <w:tc>
           <w:tcPr>
+            <w:tcW w:w="0" w:type="auto"/>
             <w:tcBorders>
-              <w:top w:val="single" w:sz="4" w:color="CCCCCC"/>
-              <w:left w:val="single" w:sz="4" w:color="CCCCCC"/>
-              <w:bottom w:val="single" w:sz="4" w:color="CCCCCC"/>
-              <w:right w:val="single" w:sz="4" w:color="CCCCCC"/>
+              <w:top w:val="single" w:sz="4" w:space="0" w:color="CCCCCC"/>
+              <w:left w:val="single" w:sz="4" w:space="0" w:color="CCCCCC"/>
+              <w:bottom w:val="single" w:sz="4" w:space="0" w:color="CCCCCC"/>
+              <w:right w:val="single" w:sz="4" w:space="0" w:color="CCCCCC"/>
             </w:tcBorders>
           </w:tcPr>
           <w:p>
@@ -2574,11 +2560,12 @@
       <w:tr>
         <w:tc>
           <w:tcPr>
+            <w:tcW w:w="0" w:type="auto"/>
             <w:tcBorders>
-              <w:top w:val="single" w:sz="4" w:color="CCCCCC"/>
-              <w:left w:val="single" w:sz="4" w:color="CCCCCC"/>
-              <w:bottom w:val="single" w:sz="4" w:color="CCCCCC"/>
-              <w:right w:val="single" w:sz="4" w:color="CCCCCC"/>
+              <w:top w:val="single" w:sz="4" w:space="0" w:color="CCCCCC"/>
+              <w:left w:val="single" w:sz="4" w:space="0" w:color="CCCCCC"/>
+              <w:bottom w:val="single" w:sz="4" w:space="0" w:color="CCCCCC"/>
+              <w:right w:val="single" w:sz="4" w:space="0" w:color="CCCCCC"/>
             </w:tcBorders>
             <w:shd w:val="clear" w:color="auto" w:fill="F0F4FF"/>
           </w:tcPr>
@@ -2597,11 +2584,12 @@
         </w:tc>
         <w:tc>
           <w:tcPr>
+            <w:tcW w:w="0" w:type="auto"/>
             <w:tcBorders>
-              <w:top w:val="single" w:sz="4" w:color="CCCCCC"/>
-              <w:left w:val="single" w:sz="4" w:color="CCCCCC"/>
-              <w:bottom w:val="single" w:sz="4" w:color="CCCCCC"/>
-              <w:right w:val="single" w:sz="4" w:color="CCCCCC"/>
+              <w:top w:val="single" w:sz="4" w:space="0" w:color="CCCCCC"/>
+              <w:left w:val="single" w:sz="4" w:space="0" w:color="CCCCCC"/>
+              <w:bottom w:val="single" w:sz="4" w:space="0" w:color="CCCCCC"/>
+              <w:right w:val="single" w:sz="4" w:space="0" w:color="CCCCCC"/>
             </w:tcBorders>
             <w:shd w:val="clear" w:color="auto" w:fill="F0F4FF"/>
           </w:tcPr>
@@ -2619,11 +2607,12 @@
         </w:tc>
         <w:tc>
           <w:tcPr>
+            <w:tcW w:w="0" w:type="auto"/>
             <w:tcBorders>
-              <w:top w:val="single" w:sz="4" w:color="CCCCCC"/>
-              <w:left w:val="single" w:sz="4" w:color="CCCCCC"/>
-              <w:bottom w:val="single" w:sz="4" w:color="CCCCCC"/>
-              <w:right w:val="single" w:sz="4" w:color="CCCCCC"/>
+              <w:top w:val="single" w:sz="4" w:space="0" w:color="CCCCCC"/>
+              <w:left w:val="single" w:sz="4" w:space="0" w:color="CCCCCC"/>
+              <w:bottom w:val="single" w:sz="4" w:space="0" w:color="CCCCCC"/>
+              <w:right w:val="single" w:sz="4" w:space="0" w:color="CCCCCC"/>
             </w:tcBorders>
             <w:shd w:val="clear" w:color="auto" w:fill="F0F4FF"/>
           </w:tcPr>
@@ -2641,11 +2630,12 @@
         </w:tc>
         <w:tc>
           <w:tcPr>
+            <w:tcW w:w="0" w:type="auto"/>
             <w:tcBorders>
-              <w:top w:val="single" w:sz="4" w:color="CCCCCC"/>
-              <w:left w:val="single" w:sz="4" w:color="CCCCCC"/>
-              <w:bottom w:val="single" w:sz="4" w:color="CCCCCC"/>
-              <w:right w:val="single" w:sz="4" w:color="CCCCCC"/>
+              <w:top w:val="single" w:sz="4" w:space="0" w:color="CCCCCC"/>
+              <w:left w:val="single" w:sz="4" w:space="0" w:color="CCCCCC"/>
+              <w:bottom w:val="single" w:sz="4" w:space="0" w:color="CCCCCC"/>
+              <w:right w:val="single" w:sz="4" w:space="0" w:color="CCCCCC"/>
             </w:tcBorders>
             <w:shd w:val="clear" w:color="auto" w:fill="F0F4FF"/>
           </w:tcPr>
@@ -2663,11 +2653,12 @@
         </w:tc>
         <w:tc>
           <w:tcPr>
+            <w:tcW w:w="0" w:type="auto"/>
             <w:tcBorders>
-              <w:top w:val="single" w:sz="4" w:color="CCCCCC"/>
-              <w:left w:val="single" w:sz="4" w:color="CCCCCC"/>
-              <w:bottom w:val="single" w:sz="4" w:color="CCCCCC"/>
-              <w:right w:val="single" w:sz="4" w:color="CCCCCC"/>
+              <w:top w:val="single" w:sz="4" w:space="0" w:color="CCCCCC"/>
+              <w:left w:val="single" w:sz="4" w:space="0" w:color="CCCCCC"/>
+              <w:bottom w:val="single" w:sz="4" w:space="0" w:color="CCCCCC"/>
+              <w:right w:val="single" w:sz="4" w:space="0" w:color="CCCCCC"/>
             </w:tcBorders>
             <w:shd w:val="clear" w:color="auto" w:fill="F0F4FF"/>
           </w:tcPr>
@@ -2687,11 +2678,12 @@
       <w:tr>
         <w:tc>
           <w:tcPr>
+            <w:tcW w:w="0" w:type="auto"/>
             <w:tcBorders>
-              <w:top w:val="single" w:sz="4" w:color="CCCCCC"/>
-              <w:left w:val="single" w:sz="4" w:color="CCCCCC"/>
-              <w:bottom w:val="single" w:sz="4" w:color="CCCCCC"/>
-              <w:right w:val="single" w:sz="4" w:color="CCCCCC"/>
+              <w:top w:val="single" w:sz="4" w:space="0" w:color="CCCCCC"/>
+              <w:left w:val="single" w:sz="4" w:space="0" w:color="CCCCCC"/>
+              <w:bottom w:val="single" w:sz="4" w:space="0" w:color="CCCCCC"/>
+              <w:right w:val="single" w:sz="4" w:space="0" w:color="CCCCCC"/>
             </w:tcBorders>
           </w:tcPr>
           <w:p>
@@ -2709,11 +2701,12 @@
         </w:tc>
         <w:tc>
           <w:tcPr>
+            <w:tcW w:w="0" w:type="auto"/>
             <w:tcBorders>
-              <w:top w:val="single" w:sz="4" w:color="CCCCCC"/>
-              <w:left w:val="single" w:sz="4" w:color="CCCCCC"/>
-              <w:bottom w:val="single" w:sz="4" w:color="CCCCCC"/>
-              <w:right w:val="single" w:sz="4" w:color="CCCCCC"/>
+              <w:top w:val="single" w:sz="4" w:space="0" w:color="CCCCCC"/>
+              <w:left w:val="single" w:sz="4" w:space="0" w:color="CCCCCC"/>
+              <w:bottom w:val="single" w:sz="4" w:space="0" w:color="CCCCCC"/>
+              <w:right w:val="single" w:sz="4" w:space="0" w:color="CCCCCC"/>
             </w:tcBorders>
           </w:tcPr>
           <w:p>
@@ -2730,11 +2723,12 @@
         </w:tc>
         <w:tc>
           <w:tcPr>
+            <w:tcW w:w="0" w:type="auto"/>
             <w:tcBorders>
-              <w:top w:val="single" w:sz="4" w:color="CCCCCC"/>
-              <w:left w:val="single" w:sz="4" w:color="CCCCCC"/>
-              <w:bottom w:val="single" w:sz="4" w:color="CCCCCC"/>
-              <w:right w:val="single" w:sz="4" w:color="CCCCCC"/>
+              <w:top w:val="single" w:sz="4" w:space="0" w:color="CCCCCC"/>
+              <w:left w:val="single" w:sz="4" w:space="0" w:color="CCCCCC"/>
+              <w:bottom w:val="single" w:sz="4" w:space="0" w:color="CCCCCC"/>
+              <w:right w:val="single" w:sz="4" w:space="0" w:color="CCCCCC"/>
             </w:tcBorders>
           </w:tcPr>
           <w:p>
@@ -2751,11 +2745,12 @@
         </w:tc>
         <w:tc>
           <w:tcPr>
+            <w:tcW w:w="0" w:type="auto"/>
             <w:tcBorders>
-              <w:top w:val="single" w:sz="4" w:color="CCCCCC"/>
-              <w:left w:val="single" w:sz="4" w:color="CCCCCC"/>
-              <w:bottom w:val="single" w:sz="4" w:color="CCCCCC"/>
-              <w:right w:val="single" w:sz="4" w:color="CCCCCC"/>
+              <w:top w:val="single" w:sz="4" w:space="0" w:color="CCCCCC"/>
+              <w:left w:val="single" w:sz="4" w:space="0" w:color="CCCCCC"/>
+              <w:bottom w:val="single" w:sz="4" w:space="0" w:color="CCCCCC"/>
+              <w:right w:val="single" w:sz="4" w:space="0" w:color="CCCCCC"/>
             </w:tcBorders>
           </w:tcPr>
           <w:p>
@@ -2772,11 +2767,12 @@
         </w:tc>
         <w:tc>
           <w:tcPr>
+            <w:tcW w:w="0" w:type="auto"/>
             <w:tcBorders>
-              <w:top w:val="single" w:sz="4" w:color="CCCCCC"/>
-              <w:left w:val="single" w:sz="4" w:color="CCCCCC"/>
-              <w:bottom w:val="single" w:sz="4" w:color="CCCCCC"/>
-              <w:right w:val="single" w:sz="4" w:color="CCCCCC"/>
+              <w:top w:val="single" w:sz="4" w:space="0" w:color="CCCCCC"/>
+              <w:left w:val="single" w:sz="4" w:space="0" w:color="CCCCCC"/>
+              <w:bottom w:val="single" w:sz="4" w:space="0" w:color="CCCCCC"/>
+              <w:right w:val="single" w:sz="4" w:space="0" w:color="CCCCCC"/>
             </w:tcBorders>
           </w:tcPr>
           <w:p>
@@ -2795,11 +2791,12 @@
       <w:tr>
         <w:tc>
           <w:tcPr>
+            <w:tcW w:w="0" w:type="auto"/>
             <w:tcBorders>
-              <w:top w:val="single" w:sz="4" w:color="CCCCCC"/>
-              <w:left w:val="single" w:sz="4" w:color="CCCCCC"/>
-              <w:bottom w:val="single" w:sz="4" w:color="CCCCCC"/>
-              <w:right w:val="single" w:sz="4" w:color="CCCCCC"/>
+              <w:top w:val="single" w:sz="4" w:space="0" w:color="CCCCCC"/>
+              <w:left w:val="single" w:sz="4" w:space="0" w:color="CCCCCC"/>
+              <w:bottom w:val="single" w:sz="4" w:space="0" w:color="CCCCCC"/>
+              <w:right w:val="single" w:sz="4" w:space="0" w:color="CCCCCC"/>
             </w:tcBorders>
             <w:shd w:val="clear" w:color="auto" w:fill="F0F4FF"/>
           </w:tcPr>
@@ -2818,11 +2815,12 @@
         </w:tc>
         <w:tc>
           <w:tcPr>
+            <w:tcW w:w="0" w:type="auto"/>
             <w:tcBorders>
-              <w:top w:val="single" w:sz="4" w:color="CCCCCC"/>
-              <w:left w:val="single" w:sz="4" w:color="CCCCCC"/>
-              <w:bottom w:val="single" w:sz="4" w:color="CCCCCC"/>
-              <w:right w:val="single" w:sz="4" w:color="CCCCCC"/>
+              <w:top w:val="single" w:sz="4" w:space="0" w:color="CCCCCC"/>
+              <w:left w:val="single" w:sz="4" w:space="0" w:color="CCCCCC"/>
+              <w:bottom w:val="single" w:sz="4" w:space="0" w:color="CCCCCC"/>
+              <w:right w:val="single" w:sz="4" w:space="0" w:color="CCCCCC"/>
             </w:tcBorders>
             <w:shd w:val="clear" w:color="auto" w:fill="F0F4FF"/>
           </w:tcPr>
@@ -2840,11 +2838,12 @@
         </w:tc>
         <w:tc>
           <w:tcPr>
+            <w:tcW w:w="0" w:type="auto"/>
             <w:tcBorders>
-              <w:top w:val="single" w:sz="4" w:color="CCCCCC"/>
-              <w:left w:val="single" w:sz="4" w:color="CCCCCC"/>
-              <w:bottom w:val="single" w:sz="4" w:color="CCCCCC"/>
-              <w:right w:val="single" w:sz="4" w:color="CCCCCC"/>
+              <w:top w:val="single" w:sz="4" w:space="0" w:color="CCCCCC"/>
+              <w:left w:val="single" w:sz="4" w:space="0" w:color="CCCCCC"/>
+              <w:bottom w:val="single" w:sz="4" w:space="0" w:color="CCCCCC"/>
+              <w:right w:val="single" w:sz="4" w:space="0" w:color="CCCCCC"/>
             </w:tcBorders>
             <w:shd w:val="clear" w:color="auto" w:fill="F0F4FF"/>
           </w:tcPr>
@@ -2862,11 +2861,12 @@
         </w:tc>
         <w:tc>
           <w:tcPr>
+            <w:tcW w:w="0" w:type="auto"/>
             <w:tcBorders>
-              <w:top w:val="single" w:sz="4" w:color="CCCCCC"/>
-              <w:left w:val="single" w:sz="4" w:color="CCCCCC"/>
-              <w:bottom w:val="single" w:sz="4" w:color="CCCCCC"/>
-              <w:right w:val="single" w:sz="4" w:color="CCCCCC"/>
+              <w:top w:val="single" w:sz="4" w:space="0" w:color="CCCCCC"/>
+              <w:left w:val="single" w:sz="4" w:space="0" w:color="CCCCCC"/>
+              <w:bottom w:val="single" w:sz="4" w:space="0" w:color="CCCCCC"/>
+              <w:right w:val="single" w:sz="4" w:space="0" w:color="CCCCCC"/>
             </w:tcBorders>
             <w:shd w:val="clear" w:color="auto" w:fill="F0F4FF"/>
           </w:tcPr>
@@ -2884,11 +2884,12 @@
         </w:tc>
         <w:tc>
           <w:tcPr>
+            <w:tcW w:w="0" w:type="auto"/>
             <w:tcBorders>
-              <w:top w:val="single" w:sz="4" w:color="CCCCCC"/>
-              <w:left w:val="single" w:sz="4" w:color="CCCCCC"/>
-              <w:bottom w:val="single" w:sz="4" w:color="CCCCCC"/>
-              <w:right w:val="single" w:sz="4" w:color="CCCCCC"/>
+              <w:top w:val="single" w:sz="4" w:space="0" w:color="CCCCCC"/>
+              <w:left w:val="single" w:sz="4" w:space="0" w:color="CCCCCC"/>
+              <w:bottom w:val="single" w:sz="4" w:space="0" w:color="CCCCCC"/>
+              <w:right w:val="single" w:sz="4" w:space="0" w:color="CCCCCC"/>
             </w:tcBorders>
             <w:shd w:val="clear" w:color="auto" w:fill="F0F4FF"/>
           </w:tcPr>
@@ -2908,11 +2909,12 @@
       <w:tr>
         <w:tc>
           <w:tcPr>
+            <w:tcW w:w="0" w:type="auto"/>
             <w:tcBorders>
-              <w:top w:val="single" w:sz="4" w:color="CCCCCC"/>
-              <w:left w:val="single" w:sz="4" w:color="CCCCCC"/>
-              <w:bottom w:val="single" w:sz="4" w:color="CCCCCC"/>
-              <w:right w:val="single" w:sz="4" w:color="CCCCCC"/>
+              <w:top w:val="single" w:sz="4" w:space="0" w:color="CCCCCC"/>
+              <w:left w:val="single" w:sz="4" w:space="0" w:color="CCCCCC"/>
+              <w:bottom w:val="single" w:sz="4" w:space="0" w:color="CCCCCC"/>
+              <w:right w:val="single" w:sz="4" w:space="0" w:color="CCCCCC"/>
             </w:tcBorders>
           </w:tcPr>
           <w:p>
@@ -2930,11 +2932,12 @@
         </w:tc>
         <w:tc>
           <w:tcPr>
+            <w:tcW w:w="0" w:type="auto"/>
             <w:tcBorders>
-              <w:top w:val="single" w:sz="4" w:color="CCCCCC"/>
-              <w:left w:val="single" w:sz="4" w:color="CCCCCC"/>
-              <w:bottom w:val="single" w:sz="4" w:color="CCCCCC"/>
-              <w:right w:val="single" w:sz="4" w:color="CCCCCC"/>
+              <w:top w:val="single" w:sz="4" w:space="0" w:color="CCCCCC"/>
+              <w:left w:val="single" w:sz="4" w:space="0" w:color="CCCCCC"/>
+              <w:bottom w:val="single" w:sz="4" w:space="0" w:color="CCCCCC"/>
+              <w:right w:val="single" w:sz="4" w:space="0" w:color="CCCCCC"/>
             </w:tcBorders>
           </w:tcPr>
           <w:p>
@@ -2945,17 +2948,25 @@
               <w:rPr>
                 <w:sz w:val="18"/>
               </w:rPr>
-              <w:t>2 (1F + 1M)</w:t>
-            </w:r>
-          </w:p>
-        </w:tc>
-        <w:tc>
-          <w:tcPr>
+              <w:t xml:space="preserve">2 (1F + </w:t>
+            </w:r>
+            <w:r>
+              <w:rPr>
+                <w:sz w:val="18"/>
+              </w:rPr>
+              <w:lastRenderedPageBreak/>
+              <w:t>1M)</w:t>
+            </w:r>
+          </w:p>
+        </w:tc>
+        <w:tc>
+          <w:tcPr>
+            <w:tcW w:w="0" w:type="auto"/>
             <w:tcBorders>
-              <w:top w:val="single" w:sz="4" w:color="CCCCCC"/>
-              <w:left w:val="single" w:sz="4" w:color="CCCCCC"/>
-              <w:bottom w:val="single" w:sz="4" w:color="CCCCCC"/>
-              <w:right w:val="single" w:sz="4" w:color="CCCCCC"/>
+              <w:top w:val="single" w:sz="4" w:space="0" w:color="CCCCCC"/>
+              <w:left w:val="single" w:sz="4" w:space="0" w:color="CCCCCC"/>
+              <w:bottom w:val="single" w:sz="4" w:space="0" w:color="CCCCCC"/>
+              <w:right w:val="single" w:sz="4" w:space="0" w:color="CCCCCC"/>
             </w:tcBorders>
           </w:tcPr>
           <w:p>
@@ -2966,17 +2977,19 @@
               <w:rPr>
                 <w:sz w:val="18"/>
               </w:rPr>
+              <w:lastRenderedPageBreak/>
               <w:t>C</w:t>
             </w:r>
           </w:p>
         </w:tc>
         <w:tc>
           <w:tcPr>
+            <w:tcW w:w="0" w:type="auto"/>
             <w:tcBorders>
-              <w:top w:val="single" w:sz="4" w:color="CCCCCC"/>
-              <w:left w:val="single" w:sz="4" w:color="CCCCCC"/>
-              <w:bottom w:val="single" w:sz="4" w:color="CCCCCC"/>
-              <w:right w:val="single" w:sz="4" w:color="CCCCCC"/>
+              <w:top w:val="single" w:sz="4" w:space="0" w:color="CCCCCC"/>
+              <w:left w:val="single" w:sz="4" w:space="0" w:color="CCCCCC"/>
+              <w:bottom w:val="single" w:sz="4" w:space="0" w:color="CCCCCC"/>
+              <w:right w:val="single" w:sz="4" w:space="0" w:color="CCCCCC"/>
             </w:tcBorders>
           </w:tcPr>
           <w:p>
@@ -2993,11 +3006,12 @@
         </w:tc>
         <w:tc>
           <w:tcPr>
+            <w:tcW w:w="0" w:type="auto"/>
             <w:tcBorders>
-              <w:top w:val="single" w:sz="4" w:color="CCCCCC"/>
-              <w:left w:val="single" w:sz="4" w:color="CCCCCC"/>
-              <w:bottom w:val="single" w:sz="4" w:color="CCCCCC"/>
-              <w:right w:val="single" w:sz="4" w:color="CCCCCC"/>
+              <w:top w:val="single" w:sz="4" w:space="0" w:color="CCCCCC"/>
+              <w:left w:val="single" w:sz="4" w:space="0" w:color="CCCCCC"/>
+              <w:bottom w:val="single" w:sz="4" w:space="0" w:color="CCCCCC"/>
+              <w:right w:val="single" w:sz="4" w:space="0" w:color="CCCCCC"/>
             </w:tcBorders>
           </w:tcPr>
           <w:p>
@@ -3016,11 +3030,12 @@
       <w:tr>
         <w:tc>
           <w:tcPr>
+            <w:tcW w:w="0" w:type="auto"/>
             <w:tcBorders>
-              <w:top w:val="single" w:sz="4" w:color="CCCCCC"/>
-              <w:left w:val="single" w:sz="4" w:color="CCCCCC"/>
-              <w:bottom w:val="single" w:sz="4" w:color="CCCCCC"/>
-              <w:right w:val="single" w:sz="4" w:color="CCCCCC"/>
+              <w:top w:val="single" w:sz="4" w:space="0" w:color="CCCCCC"/>
+              <w:left w:val="single" w:sz="4" w:space="0" w:color="CCCCCC"/>
+              <w:bottom w:val="single" w:sz="4" w:space="0" w:color="CCCCCC"/>
+              <w:right w:val="single" w:sz="4" w:space="0" w:color="CCCCCC"/>
             </w:tcBorders>
             <w:shd w:val="clear" w:color="auto" w:fill="F0F4FF"/>
           </w:tcPr>
@@ -3039,11 +3054,12 @@
         </w:tc>
         <w:tc>
           <w:tcPr>
+            <w:tcW w:w="0" w:type="auto"/>
             <w:tcBorders>
-              <w:top w:val="single" w:sz="4" w:color="CCCCCC"/>
-              <w:left w:val="single" w:sz="4" w:color="CCCCCC"/>
-              <w:bottom w:val="single" w:sz="4" w:color="CCCCCC"/>
-              <w:right w:val="single" w:sz="4" w:color="CCCCCC"/>
+              <w:top w:val="single" w:sz="4" w:space="0" w:color="CCCCCC"/>
+              <w:left w:val="single" w:sz="4" w:space="0" w:color="CCCCCC"/>
+              <w:bottom w:val="single" w:sz="4" w:space="0" w:color="CCCCCC"/>
+              <w:right w:val="single" w:sz="4" w:space="0" w:color="CCCCCC"/>
             </w:tcBorders>
             <w:shd w:val="clear" w:color="auto" w:fill="F0F4FF"/>
           </w:tcPr>
@@ -3061,11 +3077,12 @@
         </w:tc>
         <w:tc>
           <w:tcPr>
+            <w:tcW w:w="0" w:type="auto"/>
             <w:tcBorders>
-              <w:top w:val="single" w:sz="4" w:color="CCCCCC"/>
-              <w:left w:val="single" w:sz="4" w:color="CCCCCC"/>
-              <w:bottom w:val="single" w:sz="4" w:color="CCCCCC"/>
-              <w:right w:val="single" w:sz="4" w:color="CCCCCC"/>
+              <w:top w:val="single" w:sz="4" w:space="0" w:color="CCCCCC"/>
+              <w:left w:val="single" w:sz="4" w:space="0" w:color="CCCCCC"/>
+              <w:bottom w:val="single" w:sz="4" w:space="0" w:color="CCCCCC"/>
+              <w:right w:val="single" w:sz="4" w:space="0" w:color="CCCCCC"/>
             </w:tcBorders>
             <w:shd w:val="clear" w:color="auto" w:fill="F0F4FF"/>
           </w:tcPr>
@@ -3083,11 +3100,12 @@
         </w:tc>
         <w:tc>
           <w:tcPr>
+            <w:tcW w:w="0" w:type="auto"/>
             <w:tcBorders>
-              <w:top w:val="single" w:sz="4" w:color="CCCCCC"/>
-              <w:left w:val="single" w:sz="4" w:color="CCCCCC"/>
-              <w:bottom w:val="single" w:sz="4" w:color="CCCCCC"/>
-              <w:right w:val="single" w:sz="4" w:color="CCCCCC"/>
+              <w:top w:val="single" w:sz="4" w:space="0" w:color="CCCCCC"/>
+              <w:left w:val="single" w:sz="4" w:space="0" w:color="CCCCCC"/>
+              <w:bottom w:val="single" w:sz="4" w:space="0" w:color="CCCCCC"/>
+              <w:right w:val="single" w:sz="4" w:space="0" w:color="CCCCCC"/>
             </w:tcBorders>
             <w:shd w:val="clear" w:color="auto" w:fill="F0F4FF"/>
           </w:tcPr>
@@ -3105,11 +3123,12 @@
         </w:tc>
         <w:tc>
           <w:tcPr>
+            <w:tcW w:w="0" w:type="auto"/>
             <w:tcBorders>
-              <w:top w:val="single" w:sz="4" w:color="CCCCCC"/>
-              <w:left w:val="single" w:sz="4" w:color="CCCCCC"/>
-              <w:bottom w:val="single" w:sz="4" w:color="CCCCCC"/>
-              <w:right w:val="single" w:sz="4" w:color="CCCCCC"/>
+              <w:top w:val="single" w:sz="4" w:space="0" w:color="CCCCCC"/>
+              <w:left w:val="single" w:sz="4" w:space="0" w:color="CCCCCC"/>
+              <w:bottom w:val="single" w:sz="4" w:space="0" w:color="CCCCCC"/>
+              <w:right w:val="single" w:sz="4" w:space="0" w:color="CCCCCC"/>
             </w:tcBorders>
             <w:shd w:val="clear" w:color="auto" w:fill="F0F4FF"/>
           </w:tcPr>
@@ -3129,11 +3148,12 @@
       <w:tr>
         <w:tc>
           <w:tcPr>
+            <w:tcW w:w="0" w:type="auto"/>
             <w:tcBorders>
-              <w:top w:val="single" w:sz="4" w:color="CCCCCC"/>
-              <w:left w:val="single" w:sz="4" w:color="CCCCCC"/>
-              <w:bottom w:val="single" w:sz="4" w:color="CCCCCC"/>
-              <w:right w:val="single" w:sz="4" w:color="CCCCCC"/>
+              <w:top w:val="single" w:sz="4" w:space="0" w:color="CCCCCC"/>
+              <w:left w:val="single" w:sz="4" w:space="0" w:color="CCCCCC"/>
+              <w:bottom w:val="single" w:sz="4" w:space="0" w:color="CCCCCC"/>
+              <w:right w:val="single" w:sz="4" w:space="0" w:color="CCCCCC"/>
             </w:tcBorders>
           </w:tcPr>
           <w:p>
@@ -3151,11 +3171,12 @@
         </w:tc>
         <w:tc>
           <w:tcPr>
+            <w:tcW w:w="0" w:type="auto"/>
             <w:tcBorders>
-              <w:top w:val="single" w:sz="4" w:color="CCCCCC"/>
-              <w:left w:val="single" w:sz="4" w:color="CCCCCC"/>
-              <w:bottom w:val="single" w:sz="4" w:color="CCCCCC"/>
-              <w:right w:val="single" w:sz="4" w:color="CCCCCC"/>
+              <w:top w:val="single" w:sz="4" w:space="0" w:color="CCCCCC"/>
+              <w:left w:val="single" w:sz="4" w:space="0" w:color="CCCCCC"/>
+              <w:bottom w:val="single" w:sz="4" w:space="0" w:color="CCCCCC"/>
+              <w:right w:val="single" w:sz="4" w:space="0" w:color="CCCCCC"/>
             </w:tcBorders>
           </w:tcPr>
           <w:p>
@@ -3172,11 +3193,12 @@
         </w:tc>
         <w:tc>
           <w:tcPr>
+            <w:tcW w:w="0" w:type="auto"/>
             <w:tcBorders>
-              <w:top w:val="single" w:sz="4" w:color="CCCCCC"/>
-              <w:left w:val="single" w:sz="4" w:color="CCCCCC"/>
-              <w:bottom w:val="single" w:sz="4" w:color="CCCCCC"/>
-              <w:right w:val="single" w:sz="4" w:color="CCCCCC"/>
+              <w:top w:val="single" w:sz="4" w:space="0" w:color="CCCCCC"/>
+              <w:left w:val="single" w:sz="4" w:space="0" w:color="CCCCCC"/>
+              <w:bottom w:val="single" w:sz="4" w:space="0" w:color="CCCCCC"/>
+              <w:right w:val="single" w:sz="4" w:space="0" w:color="CCCCCC"/>
             </w:tcBorders>
           </w:tcPr>
           <w:p>
@@ -3193,11 +3215,12 @@
         </w:tc>
         <w:tc>
           <w:tcPr>
+            <w:tcW w:w="0" w:type="auto"/>
             <w:tcBorders>
-              <w:top w:val="single" w:sz="4" w:color="CCCCCC"/>
-              <w:left w:val="single" w:sz="4" w:color="CCCCCC"/>
-              <w:bottom w:val="single" w:sz="4" w:color="CCCCCC"/>
-              <w:right w:val="single" w:sz="4" w:color="CCCCCC"/>
+              <w:top w:val="single" w:sz="4" w:space="0" w:color="CCCCCC"/>
+              <w:left w:val="single" w:sz="4" w:space="0" w:color="CCCCCC"/>
+              <w:bottom w:val="single" w:sz="4" w:space="0" w:color="CCCCCC"/>
+              <w:right w:val="single" w:sz="4" w:space="0" w:color="CCCCCC"/>
             </w:tcBorders>
           </w:tcPr>
           <w:p>
@@ -3214,11 +3237,12 @@
         </w:tc>
         <w:tc>
           <w:tcPr>
+            <w:tcW w:w="0" w:type="auto"/>
             <w:tcBorders>
-              <w:top w:val="single" w:sz="4" w:color="CCCCCC"/>
-              <w:left w:val="single" w:sz="4" w:color="CCCCCC"/>
-              <w:bottom w:val="single" w:sz="4" w:color="CCCCCC"/>
-              <w:right w:val="single" w:sz="4" w:color="CCCCCC"/>
+              <w:top w:val="single" w:sz="4" w:space="0" w:color="CCCCCC"/>
+              <w:left w:val="single" w:sz="4" w:space="0" w:color="CCCCCC"/>
+              <w:bottom w:val="single" w:sz="4" w:space="0" w:color="CCCCCC"/>
+              <w:right w:val="single" w:sz="4" w:space="0" w:color="CCCCCC"/>
             </w:tcBorders>
           </w:tcPr>
           <w:p>
@@ -3237,11 +3261,12 @@
       <w:tr>
         <w:tc>
           <w:tcPr>
+            <w:tcW w:w="0" w:type="auto"/>
             <w:tcBorders>
-              <w:top w:val="single" w:sz="4" w:color="CCCCCC"/>
-              <w:left w:val="single" w:sz="4" w:color="CCCCCC"/>
-              <w:bottom w:val="single" w:sz="4" w:color="CCCCCC"/>
-              <w:right w:val="single" w:sz="4" w:color="CCCCCC"/>
+              <w:top w:val="single" w:sz="4" w:space="0" w:color="CCCCCC"/>
+              <w:left w:val="single" w:sz="4" w:space="0" w:color="CCCCCC"/>
+              <w:bottom w:val="single" w:sz="4" w:space="0" w:color="CCCCCC"/>
+              <w:right w:val="single" w:sz="4" w:space="0" w:color="CCCCCC"/>
             </w:tcBorders>
             <w:shd w:val="clear" w:color="auto" w:fill="F0F4FF"/>
           </w:tcPr>
@@ -3260,11 +3285,12 @@
         </w:tc>
         <w:tc>
           <w:tcPr>
+            <w:tcW w:w="0" w:type="auto"/>
             <w:tcBorders>
-              <w:top w:val="single" w:sz="4" w:color="CCCCCC"/>
-              <w:left w:val="single" w:sz="4" w:color="CCCCCC"/>
-              <w:bottom w:val="single" w:sz="4" w:color="CCCCCC"/>
-              <w:right w:val="single" w:sz="4" w:color="CCCCCC"/>
+              <w:top w:val="single" w:sz="4" w:space="0" w:color="CCCCCC"/>
+              <w:left w:val="single" w:sz="4" w:space="0" w:color="CCCCCC"/>
+              <w:bottom w:val="single" w:sz="4" w:space="0" w:color="CCCCCC"/>
+              <w:right w:val="single" w:sz="4" w:space="0" w:color="CCCCCC"/>
             </w:tcBorders>
             <w:shd w:val="clear" w:color="auto" w:fill="F0F4FF"/>
           </w:tcPr>
@@ -3282,11 +3308,12 @@
         </w:tc>
         <w:tc>
           <w:tcPr>
+            <w:tcW w:w="0" w:type="auto"/>
             <w:tcBorders>
-              <w:top w:val="single" w:sz="4" w:color="CCCCCC"/>
-              <w:left w:val="single" w:sz="4" w:color="CCCCCC"/>
-              <w:bottom w:val="single" w:sz="4" w:color="CCCCCC"/>
-              <w:right w:val="single" w:sz="4" w:color="CCCCCC"/>
+              <w:top w:val="single" w:sz="4" w:space="0" w:color="CCCCCC"/>
+              <w:left w:val="single" w:sz="4" w:space="0" w:color="CCCCCC"/>
+              <w:bottom w:val="single" w:sz="4" w:space="0" w:color="CCCCCC"/>
+              <w:right w:val="single" w:sz="4" w:space="0" w:color="CCCCCC"/>
             </w:tcBorders>
             <w:shd w:val="clear" w:color="auto" w:fill="F0F4FF"/>
           </w:tcPr>
@@ -3304,11 +3331,12 @@
         </w:tc>
         <w:tc>
           <w:tcPr>
+            <w:tcW w:w="0" w:type="auto"/>
             <w:tcBorders>
-              <w:top w:val="single" w:sz="4" w:color="CCCCCC"/>
-              <w:left w:val="single" w:sz="4" w:color="CCCCCC"/>
-              <w:bottom w:val="single" w:sz="4" w:color="CCCCCC"/>
-              <w:right w:val="single" w:sz="4" w:color="CCCCCC"/>
+              <w:top w:val="single" w:sz="4" w:space="0" w:color="CCCCCC"/>
+              <w:left w:val="single" w:sz="4" w:space="0" w:color="CCCCCC"/>
+              <w:bottom w:val="single" w:sz="4" w:space="0" w:color="CCCCCC"/>
+              <w:right w:val="single" w:sz="4" w:space="0" w:color="CCCCCC"/>
             </w:tcBorders>
             <w:shd w:val="clear" w:color="auto" w:fill="F0F4FF"/>
           </w:tcPr>
@@ -3326,11 +3354,12 @@
         </w:tc>
         <w:tc>
           <w:tcPr>
+            <w:tcW w:w="0" w:type="auto"/>
             <w:tcBorders>
-              <w:top w:val="single" w:sz="4" w:color="CCCCCC"/>
-              <w:left w:val="single" w:sz="4" w:color="CCCCCC"/>
-              <w:bottom w:val="single" w:sz="4" w:color="CCCCCC"/>
-              <w:right w:val="single" w:sz="4" w:color="CCCCCC"/>
+              <w:top w:val="single" w:sz="4" w:space="0" w:color="CCCCCC"/>
+              <w:left w:val="single" w:sz="4" w:space="0" w:color="CCCCCC"/>
+              <w:bottom w:val="single" w:sz="4" w:space="0" w:color="CCCCCC"/>
+              <w:right w:val="single" w:sz="4" w:space="0" w:color="CCCCCC"/>
             </w:tcBorders>
             <w:shd w:val="clear" w:color="auto" w:fill="F0F4FF"/>
           </w:tcPr>
@@ -3540,7 +3569,6 @@
           <w:color w:val="3C559A"/>
           <w:sz w:val="20"/>
         </w:rPr>
-        <w:lastRenderedPageBreak/>
         <w:t xml:space="preserve">Testability: </w:t>
       </w:r>
       <w:r>
@@ -3571,11 +3599,6 @@
         </w:rPr>
         <w:t>Voice samples remain on the local machine; no telemetry or cloud calls.</w:t>
       </w:r>
-    </w:p>
-    <w:p>
-      <w:pPr>
-        <w:spacing w:after="160"/>
-      </w:pPr>
     </w:p>
     <w:p>
       <w:pPr>
@@ -4543,6 +4566,7 @@
           <w:color w:val="44546E"/>
           <w:sz w:val="23"/>
         </w:rPr>
+        <w:lastRenderedPageBreak/>
         <w:t>6.1  Fundamentals of Backend: FastAPI + Uvicorn</w:t>
       </w:r>
     </w:p>
@@ -4555,48 +4579,69 @@
           <w:color w:val="1E202C"/>
           <w:sz w:val="20"/>
         </w:rPr>
-        <w:t xml:space="preserve">TTS Agent’s HTTP layer is built on two tightly coupled components: FastAPI, which defines the API contract and handles request/response logic, and Uvicorn, which serves the application to the network. Understanding both is essential to extending the system or deploying it to a new environment.</w:t>
+        <w:t>TTS Agent’s HTTP layer is built on two tightly coupled components: FastAPI, which defines the API contract and handles request/response logic, and Uvicorn, which serves the application to the network. Understanding both is essential to extending the system or deploying it to a new environment.</w:t>
       </w:r>
     </w:p>
     <w:p>
       <w:pPr>
         <w:spacing w:before="140" w:after="40"/>
-      </w:pPr>
-      <w:r>
         <w:rPr>
           <w:b/>
           <w:color w:val="2E74B5"/>
           <w:sz w:val="21"/>
         </w:rPr>
+      </w:pPr>
+    </w:p>
+    <w:p>
+      <w:pPr>
+        <w:spacing w:before="140" w:after="40"/>
+      </w:pPr>
+      <w:proofErr w:type="spellStart"/>
+      <w:r>
+        <w:rPr>
+          <w:b/>
+          <w:color w:val="2E74B5"/>
+          <w:sz w:val="21"/>
+        </w:rPr>
         <w:t>FastAPI</w:t>
       </w:r>
+      <w:proofErr w:type="spellEnd"/>
     </w:p>
     <w:p>
       <w:pPr>
         <w:spacing w:after="60"/>
-      </w:pPr>
-      <w:r>
         <w:rPr>
           <w:color w:val="1E202C"/>
           <w:sz w:val="20"/>
         </w:rPr>
-        <w:t xml:space="preserve">FastAPI is a modern Python web framework for building HTTP APIs. It is built on top of Starlette (the underlying ASGI toolkit) and Pydantic (for data validation and serialisation). Every endpoint is a plain Python function or coroutine annotated with type hints that FastAPI reads at startup to: validate incoming request bodies, coerce path and query parameters to the declared types, and generate a fully interactive OpenAPI (Swagger) specification at </w:t>
-      </w:r>
-      <w:r>
-        <w:rPr>
-          <w:rFonts w:ascii="Courier New" w:hAnsi="Courier New"/>
-          <w:color w:val="2D3A4A"/>
-          <w:sz w:val="18"/>
-        </w:rPr>
-        <w:t>/docs</w:t>
-      </w:r>
+      </w:pPr>
       <w:r>
         <w:rPr>
           <w:color w:val="1E202C"/>
           <w:sz w:val="20"/>
         </w:rPr>
+        <w:t xml:space="preserve">FastAPI is a modern Python web framework for building HTTP APIs. It is built on top of Starlette (the underlying ASGI toolkit) and Pydantic (for data validation and serialisation). Every endpoint is a plain Python function or coroutine annotated with type hints that FastAPI reads at startup to: validate incoming request bodies, coerce path and query parameters to the declared types, and generate a fully interactive OpenAPI (Swagger) specification at </w:t>
+      </w:r>
+      <w:r>
+        <w:rPr>
+          <w:rFonts w:ascii="Courier New" w:hAnsi="Courier New"/>
+          <w:color w:val="2D3A4A"/>
+          <w:sz w:val="18"/>
+        </w:rPr>
+        <w:t>/docs</w:t>
+      </w:r>
+      <w:r>
+        <w:rPr>
+          <w:color w:val="1E202C"/>
+          <w:sz w:val="20"/>
+        </w:rPr>
         <w:t xml:space="preserve"> with zero extra configuration.</w:t>
       </w:r>
+    </w:p>
+    <w:p>
+      <w:pPr>
+        <w:spacing w:after="60"/>
+      </w:pPr>
     </w:p>
     <w:tbl>
       <w:tblPr>
@@ -4616,6 +4661,7 @@
           <w:bottom w:w="80" w:type="dxa"/>
           <w:right w:w="120" w:type="dxa"/>
         </w:tblCellMar>
+        <w:tblLook w:val="04A0" w:firstRow="1" w:lastRow="0" w:firstColumn="1" w:lastColumn="0" w:noHBand="0" w:noVBand="1"/>
       </w:tblPr>
       <w:tblGrid>
         <w:gridCol w:w="1800"/>
@@ -4628,9 +4674,6 @@
             <w:shd w:val="clear" w:color="auto" w:fill="EBF3FB"/>
           </w:tcPr>
           <w:p>
-            <w:pPr>
-              <w:spacing w:after="0"/>
-            </w:pPr>
             <w:r>
               <w:rPr>
                 <w:b/>
@@ -4645,9 +4688,6 @@
             <w:tcW w:w="7272" w:type="dxa"/>
           </w:tcPr>
           <w:p>
-            <w:pPr>
-              <w:spacing w:after="0"/>
-            </w:pPr>
             <w:r>
               <w:rPr>
                 <w:sz w:val="18"/>
@@ -4664,9 +4704,6 @@
             <w:shd w:val="clear" w:color="auto" w:fill="EBF3FB"/>
           </w:tcPr>
           <w:p>
-            <w:pPr>
-              <w:spacing w:after="0"/>
-            </w:pPr>
             <w:r>
               <w:rPr>
                 <w:b/>
@@ -4681,9 +4718,6 @@
             <w:tcW w:w="7272" w:type="dxa"/>
           </w:tcPr>
           <w:p>
-            <w:pPr>
-              <w:spacing w:after="0"/>
-            </w:pPr>
             <w:r>
               <w:rPr>
                 <w:sz w:val="18"/>
@@ -4700,9 +4734,6 @@
             <w:shd w:val="clear" w:color="auto" w:fill="EBF3FB"/>
           </w:tcPr>
           <w:p>
-            <w:pPr>
-              <w:spacing w:after="0"/>
-            </w:pPr>
             <w:r>
               <w:rPr>
                 <w:b/>
@@ -4717,9 +4748,6 @@
             <w:tcW w:w="7272" w:type="dxa"/>
           </w:tcPr>
           <w:p>
-            <w:pPr>
-              <w:spacing w:after="0"/>
-            </w:pPr>
             <w:r>
               <w:rPr>
                 <w:sz w:val="18"/>
@@ -4736,9 +4764,6 @@
             <w:shd w:val="clear" w:color="auto" w:fill="EBF3FB"/>
           </w:tcPr>
           <w:p>
-            <w:pPr>
-              <w:spacing w:after="0"/>
-            </w:pPr>
             <w:r>
               <w:rPr>
                 <w:b/>
@@ -4753,14 +4778,11 @@
             <w:tcW w:w="7272" w:type="dxa"/>
           </w:tcPr>
           <w:p>
-            <w:pPr>
-              <w:spacing w:after="0"/>
-            </w:pPr>
-            <w:r>
-              <w:rPr>
-                <w:sz w:val="18"/>
-              </w:rPr>
-              <w:t xml:space="preserve">Defines five REST endpoints: POST /synthesize (text → WAV bytes), GET /voices (voice catalogue), POST /upload-voice-sample (reference audio upload), GET /voice-samples (sample listing with duration), GET /health (device status). Also mounts the browser UI as static files via app.mount("/static", ...).</w:t>
+            <w:r>
+              <w:rPr>
+                <w:sz w:val="18"/>
+              </w:rPr>
+              <w:t>Defines five REST endpoints: POST /synthesize (text → WAV bytes), GET /voices (voice catalogue), POST /upload-voice-sample (reference audio upload), GET /voice-samples (sample listing with duration), GET /health (device status). Also mounts the browser UI as static files via app.mount("/static", ...).</w:t>
             </w:r>
           </w:p>
         </w:tc>
@@ -4769,13 +4791,23 @@
     <w:p>
       <w:pPr>
         <w:spacing w:before="80" w:after="40"/>
-      </w:pPr>
-      <w:r>
         <w:rPr>
           <w:b/>
           <w:color w:val="1E202C"/>
           <w:sz w:val="18"/>
         </w:rPr>
+      </w:pPr>
+    </w:p>
+    <w:p>
+      <w:pPr>
+        <w:spacing w:before="80" w:after="40"/>
+      </w:pPr>
+      <w:r>
+        <w:rPr>
+          <w:b/>
+          <w:color w:val="1E202C"/>
+          <w:sz w:val="18"/>
+        </w:rPr>
         <w:t>Minimal working example</w:t>
       </w:r>
     </w:p>
@@ -4977,27 +5009,89 @@
     <w:p>
       <w:pPr>
         <w:spacing w:before="140" w:after="40"/>
-      </w:pPr>
-      <w:r>
         <w:rPr>
           <w:b/>
           <w:color w:val="2E74B5"/>
           <w:sz w:val="21"/>
         </w:rPr>
+      </w:pPr>
+    </w:p>
+    <w:p>
+      <w:pPr>
+        <w:spacing w:before="140" w:after="40"/>
+        <w:rPr>
+          <w:b/>
+          <w:color w:val="2E74B5"/>
+          <w:sz w:val="21"/>
+        </w:rPr>
+      </w:pPr>
+    </w:p>
+    <w:p>
+      <w:pPr>
+        <w:spacing w:before="140" w:after="40"/>
+        <w:rPr>
+          <w:b/>
+          <w:color w:val="2E74B5"/>
+          <w:sz w:val="21"/>
+        </w:rPr>
+      </w:pPr>
+    </w:p>
+    <w:p>
+      <w:pPr>
+        <w:spacing w:before="140" w:after="40"/>
+        <w:rPr>
+          <w:b/>
+          <w:color w:val="2E74B5"/>
+          <w:sz w:val="21"/>
+        </w:rPr>
+      </w:pPr>
+    </w:p>
+    <w:p>
+      <w:pPr>
+        <w:spacing w:before="140" w:after="40"/>
+        <w:rPr>
+          <w:b/>
+          <w:color w:val="2E74B5"/>
+          <w:sz w:val="21"/>
+        </w:rPr>
+      </w:pPr>
+    </w:p>
+    <w:p>
+      <w:pPr>
+        <w:spacing w:before="140" w:after="40"/>
+      </w:pPr>
+      <w:proofErr w:type="spellStart"/>
+      <w:r>
+        <w:rPr>
+          <w:b/>
+          <w:color w:val="2E74B5"/>
+          <w:sz w:val="21"/>
+        </w:rPr>
+        <w:lastRenderedPageBreak/>
         <w:t>Uvicorn</w:t>
       </w:r>
+      <w:proofErr w:type="spellEnd"/>
     </w:p>
     <w:p>
       <w:pPr>
         <w:spacing w:after="60"/>
-      </w:pPr>
-      <w:r>
         <w:rPr>
           <w:color w:val="1E202C"/>
           <w:sz w:val="20"/>
         </w:rPr>
-        <w:t xml:space="preserve">Uvicorn is a lightning-fast ASGI (Asynchronous Server Gateway Interface) server for Python. ASGI is the successor to WSGI: where WSGI handles one request at a time per worker, ASGI handles thousands of concurrent connections within a single process using Python’s async/await event loop. Uvicorn listens on a TCP port, accepts HTTP connections, and calls the FastAPI application for each request.</w:t>
-      </w:r>
+      </w:pPr>
+      <w:r>
+        <w:rPr>
+          <w:color w:val="1E202C"/>
+          <w:sz w:val="20"/>
+        </w:rPr>
+        <w:t>Uvicorn is a lightning-fast ASGI (Asynchronous Server Gateway Interface) server for Python. ASGI is the successor to WSGI: where WSGI handles one request at a time per worker, ASGI handles thousands of concurrent connections within a single process using Python’s async/await event loop. Uvicorn listens on a TCP port, accepts HTTP connections, and calls the FastAPI application for each request.</w:t>
+      </w:r>
+    </w:p>
+    <w:p>
+      <w:pPr>
+        <w:spacing w:after="60"/>
+      </w:pPr>
     </w:p>
     <w:tbl>
       <w:tblPr>
@@ -5017,6 +5111,7 @@
           <w:bottom w:w="80" w:type="dxa"/>
           <w:right w:w="120" w:type="dxa"/>
         </w:tblCellMar>
+        <w:tblLook w:val="04A0" w:firstRow="1" w:lastRow="0" w:firstColumn="1" w:lastColumn="0" w:noHBand="0" w:noVBand="1"/>
       </w:tblPr>
       <w:tblGrid>
         <w:gridCol w:w="1800"/>
@@ -5029,9 +5124,6 @@
             <w:shd w:val="clear" w:color="auto" w:fill="EBF3FB"/>
           </w:tcPr>
           <w:p>
-            <w:pPr>
-              <w:spacing w:after="0"/>
-            </w:pPr>
             <w:r>
               <w:rPr>
                 <w:b/>
@@ -5046,9 +5138,6 @@
             <w:tcW w:w="7272" w:type="dxa"/>
           </w:tcPr>
           <w:p>
-            <w:pPr>
-              <w:spacing w:after="0"/>
-            </w:pPr>
             <w:r>
               <w:rPr>
                 <w:sz w:val="18"/>
@@ -5065,9 +5154,6 @@
             <w:shd w:val="clear" w:color="auto" w:fill="EBF3FB"/>
           </w:tcPr>
           <w:p>
-            <w:pPr>
-              <w:spacing w:after="0"/>
-            </w:pPr>
             <w:r>
               <w:rPr>
                 <w:b/>
@@ -5082,14 +5168,11 @@
             <w:tcW w:w="7272" w:type="dxa"/>
           </w:tcPr>
           <w:p>
-            <w:pPr>
-              <w:spacing w:after="0"/>
-            </w:pPr>
-            <w:r>
-              <w:rPr>
-                <w:sz w:val="18"/>
-              </w:rPr>
-              <w:t xml:space="preserve">Any ASGI application (FastAPI, Starlette, Django Channels). Use --reload in development for hot-restart on code changes. Use --workers N in production to fork multiple processes and saturate all CPU cores.</w:t>
+            <w:r>
+              <w:rPr>
+                <w:sz w:val="18"/>
+              </w:rPr>
+              <w:t>Any ASGI application (FastAPI, Starlette, Django Channels). Use --reload in development for hot-restart on code changes. Use --workers N in production to fork multiple processes and saturate all CPU cores.</w:t>
             </w:r>
           </w:p>
         </w:tc>
@@ -5101,9 +5184,6 @@
             <w:shd w:val="clear" w:color="auto" w:fill="EBF3FB"/>
           </w:tcPr>
           <w:p>
-            <w:pPr>
-              <w:spacing w:after="0"/>
-            </w:pPr>
             <w:r>
               <w:rPr>
                 <w:b/>
@@ -5118,9 +5198,6 @@
             <w:tcW w:w="7272" w:type="dxa"/>
           </w:tcPr>
           <w:p>
-            <w:pPr>
-              <w:spacing w:after="0"/>
-            </w:pPr>
             <w:r>
               <w:rPr>
                 <w:rFonts w:ascii="Courier New" w:hAnsi="Courier New"/>
@@ -5183,9 +5260,6 @@
             <w:shd w:val="clear" w:color="auto" w:fill="EBF3FB"/>
           </w:tcPr>
           <w:p>
-            <w:pPr>
-              <w:spacing w:after="0"/>
-            </w:pPr>
             <w:r>
               <w:rPr>
                 <w:b/>
@@ -5200,14 +5274,11 @@
             <w:tcW w:w="7272" w:type="dxa"/>
           </w:tcPr>
           <w:p>
-            <w:pPr>
-              <w:spacing w:after="0"/>
-            </w:pPr>
-            <w:r>
-              <w:rPr>
-                <w:sz w:val="18"/>
-              </w:rPr>
-              <w:t xml:space="preserve">Started with --reload during local development. Synthesis is CPU-bound and runs in a thread-pool executor (asyncio run_in_executor) so it never blocks the event loop — Uvicorn stays responsive to concurrent requests (health checks, voice listing) while a long synthesis job runs in the background.</w:t>
+            <w:r>
+              <w:rPr>
+                <w:sz w:val="18"/>
+              </w:rPr>
+              <w:t>Started with --reload during local development. Synthesis is CPU-bound and runs in a thread-pool executor (asyncio run_in_executor) so it never blocks the event loop — Uvicorn stays responsive to concurrent requests (health checks, voice listing) while a long synthesis job runs in the background.</w:t>
             </w:r>
           </w:p>
         </w:tc>
@@ -5216,13 +5287,23 @@
     <w:p>
       <w:pPr>
         <w:spacing w:before="80" w:after="40"/>
-      </w:pPr>
-      <w:r>
         <w:rPr>
           <w:b/>
           <w:color w:val="1E202C"/>
           <w:sz w:val="18"/>
         </w:rPr>
+      </w:pPr>
+    </w:p>
+    <w:p>
+      <w:pPr>
+        <w:spacing w:before="80" w:after="40"/>
+      </w:pPr>
+      <w:r>
+        <w:rPr>
+          <w:b/>
+          <w:color w:val="1E202C"/>
+          <w:sz w:val="18"/>
+        </w:rPr>
         <w:t>How to start the server</w:t>
       </w:r>
     </w:p>
@@ -5238,7 +5319,7 @@
           <w:color w:val="2D3A4A"/>
           <w:sz w:val="17"/>
         </w:rPr>
-        <w:t xml:space="preserve"># Development (hot-reload)</w:t>
+        <w:t># Development (hot-reload)</w:t>
       </w:r>
     </w:p>
     <w:p>
@@ -5283,7 +5364,7 @@
           <w:color w:val="2D3A4A"/>
           <w:sz w:val="17"/>
         </w:rPr>
-        <w:t xml:space="preserve"># Production (4 worker processes)</w:t>
+        <w:t># Production (4 worker processes)</w:t>
       </w:r>
     </w:p>
     <w:p>
@@ -5328,7 +5409,7 @@
           <w:color w:val="2D3A4A"/>
           <w:sz w:val="17"/>
         </w:rPr>
-        <w:t xml:space="preserve"># Programmatic (embed in a Python script)</w:t>
+        <w:t># Programmatic (embed in a Python script)</w:t>
       </w:r>
     </w:p>
     <w:p>
@@ -5364,14 +5445,60 @@
     <w:p>
       <w:pPr>
         <w:spacing w:before="140" w:after="40"/>
-      </w:pPr>
-      <w:r>
         <w:rPr>
           <w:b/>
           <w:color w:val="2E74B5"/>
           <w:sz w:val="21"/>
         </w:rPr>
-        <w:t>How FastAPI and Uvicorn work together</w:t>
+      </w:pPr>
+    </w:p>
+    <w:p>
+      <w:pPr>
+        <w:spacing w:before="140" w:after="40"/>
+      </w:pPr>
+      <w:r>
+        <w:rPr>
+          <w:b/>
+          <w:color w:val="2E74B5"/>
+          <w:sz w:val="21"/>
+        </w:rPr>
+        <w:t xml:space="preserve">How </w:t>
+      </w:r>
+      <w:proofErr w:type="spellStart"/>
+      <w:r>
+        <w:rPr>
+          <w:b/>
+          <w:color w:val="2E74B5"/>
+          <w:sz w:val="21"/>
+        </w:rPr>
+        <w:t>FastAPI</w:t>
+      </w:r>
+      <w:proofErr w:type="spellEnd"/>
+      <w:r>
+        <w:rPr>
+          <w:b/>
+          <w:color w:val="2E74B5"/>
+          <w:sz w:val="21"/>
+        </w:rPr>
+        <w:t xml:space="preserve"> and </w:t>
+      </w:r>
+      <w:proofErr w:type="spellStart"/>
+      <w:r>
+        <w:rPr>
+          <w:b/>
+          <w:color w:val="2E74B5"/>
+          <w:sz w:val="21"/>
+        </w:rPr>
+        <w:t>Uvicorn</w:t>
+      </w:r>
+      <w:proofErr w:type="spellEnd"/>
+      <w:r>
+        <w:rPr>
+          <w:b/>
+          <w:color w:val="2E74B5"/>
+          <w:sz w:val="21"/>
+        </w:rPr>
+        <w:t xml:space="preserve"> work together</w:t>
       </w:r>
     </w:p>
     <w:p>
@@ -5387,20 +5514,50 @@
       </w:r>
       <w:r>
         <w:rPr>
+          <w:rFonts w:ascii="Courier New" w:hAnsi="Courier New"/>
           <w:b/>
-          <w:rFonts w:ascii="Courier New" w:hAnsi="Courier New"/>
           <w:color w:val="2D3A4A"/>
           <w:sz w:val="18"/>
         </w:rPr>
-        <w:t xml:space="preserve">TCP socket → Uvicorn HTTP parser → ASGI interface → FastAPI router → endpoint function → TTS engine → response bytes → Uvicorn → client</w:t>
+        <w:t>TCP socket → Uvicorn HTTP parser → ASGI interface → FastAPI router → endpoint function → TTS engine → response bytes → Uvicorn → client</w:t>
       </w:r>
       <w:r>
         <w:rPr>
           <w:color w:val="1E202C"/>
           <w:sz w:val="20"/>
         </w:rPr>
-        <w:t xml:space="preserve">. FastAPI never touches the socket directly; Uvicorn never interprets routes or validates payloads. This clean separation means the application can be unit-tested without a running server (using FastAPI’s built-in TestClient) and can be fronted by a reverse proxy (Nginx, Caddy) in production without any code changes.</w:t>
-      </w:r>
+        <w:t>. FastAPI never touches the socket directly; Uvicorn never interprets routes or validates payloads. This clean separation means the application can be unit-tested without a running server (using FastAPI’s built-in TestClient) and can be fronted by a reverse proxy (Nginx, Caddy) in production without any code changes.</w:t>
+      </w:r>
+    </w:p>
+    <w:p>
+      <w:pPr>
+        <w:spacing w:after="40"/>
+      </w:pPr>
+    </w:p>
+    <w:p>
+      <w:pPr>
+        <w:spacing w:after="40"/>
+      </w:pPr>
+    </w:p>
+    <w:p>
+      <w:pPr>
+        <w:spacing w:after="40"/>
+      </w:pPr>
+    </w:p>
+    <w:p>
+      <w:pPr>
+        <w:spacing w:after="40"/>
+      </w:pPr>
+    </w:p>
+    <w:p>
+      <w:pPr>
+        <w:spacing w:after="40"/>
+      </w:pPr>
+    </w:p>
+    <w:p>
+      <w:pPr>
+        <w:spacing w:after="40"/>
+      </w:pPr>
     </w:p>
     <w:p>
       <w:pPr>
@@ -5420,6 +5577,7 @@
           <w:color w:val="3C559A"/>
           <w:sz w:val="26"/>
         </w:rPr>
+        <w:lastRenderedPageBreak/>
         <w:t>7. SYSTEM ARCHITECTURE</w:t>
       </w:r>
     </w:p>
@@ -5813,7 +5971,6 @@
           <w:color w:val="2D3A4A"/>
           <w:sz w:val="17"/>
         </w:rPr>
-        <w:lastRenderedPageBreak/>
         <w:t>└──────────┬───────────────┘       └──────────────────┬───────────────────┘</w:t>
       </w:r>
     </w:p>
@@ -6179,24 +6336,25 @@
     </w:p>
     <w:p>
       <w:pPr>
-        <w:spacing w:after="40"/>
-      </w:pPr>
-    </w:p>
-    <w:p>
-      <w:pPr>
-        <w:spacing w:after="120"/>
-      </w:pPr>
-    </w:p>
-    <w:p>
-      <w:pPr>
         <w:spacing w:before="200" w:after="80"/>
-      </w:pPr>
-      <w:r>
         <w:rPr>
           <w:b/>
           <w:color w:val="44546E"/>
           <w:sz w:val="23"/>
         </w:rPr>
+      </w:pPr>
+    </w:p>
+    <w:p>
+      <w:pPr>
+        <w:spacing w:before="200" w:after="80"/>
+      </w:pPr>
+      <w:r>
+        <w:rPr>
+          <w:b/>
+          <w:color w:val="44546E"/>
+          <w:sz w:val="23"/>
+        </w:rPr>
+        <w:lastRenderedPageBreak/>
         <w:t>7.2 Batch Synthesis Flow</w:t>
       </w:r>
     </w:p>
@@ -6548,7 +6706,6 @@
           <w:color w:val="3C559A"/>
           <w:sz w:val="26"/>
         </w:rPr>
-        <w:lastRenderedPageBreak/>
         <w:br/>
         <w:t>8. AUDIO POST-PROCESSING PIPELINE DETAIL</w:t>
       </w:r>
@@ -6906,6 +7063,7 @@
           <w:color w:val="2D3A4A"/>
           <w:sz w:val="17"/>
         </w:rPr>
+        <w:lastRenderedPageBreak/>
         <w:t xml:space="preserve">  │  High-pass @ 80 Hz  — removes low rumble        │</w:t>
       </w:r>
     </w:p>
@@ -7371,7 +7529,6 @@
           <w:color w:val="2D3A4A"/>
           <w:sz w:val="17"/>
         </w:rPr>
-        <w:lastRenderedPageBreak/>
         <w:t xml:space="preserve">  │  soundfile.write(..., subtype='PCM_16')         │</w:t>
       </w:r>
     </w:p>
@@ -7416,57 +7573,191 @@
           <w:bottom w:val="single" w:sz="8" w:space="2" w:color="3C559A"/>
         </w:pBdr>
         <w:spacing w:before="320" w:after="80"/>
-      </w:pPr>
-      <w:r>
         <w:rPr>
           <w:b/>
           <w:color w:val="3C559A"/>
           <w:sz w:val="26"/>
         </w:rPr>
-        <w:t>9. SSML MARKUP REFERENCE</w:t>
+      </w:pPr>
+    </w:p>
+    <w:p>
+      <w:pPr>
+        <w:pBdr>
+          <w:bottom w:val="single" w:sz="8" w:space="2" w:color="3C559A"/>
+        </w:pBdr>
+        <w:spacing w:before="320" w:after="80"/>
+        <w:rPr>
+          <w:b/>
+          <w:color w:val="3C559A"/>
+          <w:sz w:val="26"/>
+        </w:rPr>
+      </w:pPr>
+    </w:p>
+    <w:p>
+      <w:pPr>
+        <w:pBdr>
+          <w:bottom w:val="single" w:sz="8" w:space="2" w:color="3C559A"/>
+        </w:pBdr>
+        <w:spacing w:before="320" w:after="80"/>
+        <w:rPr>
+          <w:b/>
+          <w:color w:val="3C559A"/>
+          <w:sz w:val="26"/>
+        </w:rPr>
+      </w:pPr>
+    </w:p>
+    <w:p>
+      <w:pPr>
+        <w:pBdr>
+          <w:bottom w:val="single" w:sz="8" w:space="2" w:color="3C559A"/>
+        </w:pBdr>
+        <w:spacing w:before="320" w:after="80"/>
+        <w:rPr>
+          <w:b/>
+          <w:color w:val="3C559A"/>
+          <w:sz w:val="26"/>
+        </w:rPr>
+      </w:pPr>
+    </w:p>
+    <w:p>
+      <w:pPr>
+        <w:pBdr>
+          <w:bottom w:val="single" w:sz="8" w:space="2" w:color="3C559A"/>
+        </w:pBdr>
+        <w:spacing w:before="320" w:after="80"/>
+        <w:rPr>
+          <w:b/>
+          <w:color w:val="3C559A"/>
+          <w:sz w:val="26"/>
+        </w:rPr>
+      </w:pPr>
+    </w:p>
+    <w:p>
+      <w:pPr>
+        <w:pBdr>
+          <w:bottom w:val="single" w:sz="8" w:space="2" w:color="3C559A"/>
+        </w:pBdr>
+        <w:spacing w:before="320" w:after="80"/>
+        <w:rPr>
+          <w:b/>
+          <w:color w:val="3C559A"/>
+          <w:sz w:val="26"/>
+        </w:rPr>
+      </w:pPr>
+    </w:p>
+    <w:p>
+      <w:pPr>
+        <w:pBdr>
+          <w:bottom w:val="single" w:sz="8" w:space="2" w:color="3C559A"/>
+        </w:pBdr>
+        <w:spacing w:before="320" w:after="80"/>
+        <w:rPr>
+          <w:b/>
+          <w:color w:val="3C559A"/>
+          <w:sz w:val="26"/>
+        </w:rPr>
+      </w:pPr>
+    </w:p>
+    <w:p>
+      <w:pPr>
+        <w:pBdr>
+          <w:bottom w:val="single" w:sz="8" w:space="2" w:color="3C559A"/>
+        </w:pBdr>
+        <w:spacing w:before="320" w:after="80"/>
+        <w:rPr>
+          <w:b/>
+          <w:color w:val="3C559A"/>
+          <w:sz w:val="26"/>
+          <w:lang w:val="en-AU"/>
+        </w:rPr>
+      </w:pPr>
+      <w:r>
+        <w:rPr>
+          <w:b/>
+          <w:color w:val="3C559A"/>
+          <w:sz w:val="26"/>
+        </w:rPr>
+        <w:lastRenderedPageBreak/>
+        <w:t>9. SSML</w:t>
+      </w:r>
+      <w:r>
+        <w:rPr>
+          <w:b/>
+          <w:color w:val="3C559A"/>
+          <w:sz w:val="26"/>
+        </w:rPr>
+        <w:t xml:space="preserve"> </w:t>
+      </w:r>
+      <w:r>
+        <w:rPr>
+          <w:b/>
+          <w:i/>
+          <w:iCs/>
+          <w:color w:val="3C559A"/>
+          <w:sz w:val="26"/>
+          <w:lang w:val="en-AU"/>
+        </w:rPr>
+        <w:t>[Speech Synthesis Markup Language]</w:t>
+      </w:r>
+      <w:r>
+        <w:rPr>
+          <w:b/>
+          <w:color w:val="3C559A"/>
+          <w:sz w:val="26"/>
+        </w:rPr>
+        <w:t xml:space="preserve"> MARKUP REFERENCE</w:t>
       </w:r>
     </w:p>
     <w:p>
       <w:pPr>
         <w:spacing w:after="80"/>
-      </w:pPr>
-      <w:r>
         <w:rPr>
           <w:color w:val="1E202C"/>
           <w:sz w:val="18"/>
         </w:rPr>
-        <w:t xml:space="preserve">SSML processing is opt-in via the </w:t>
-      </w:r>
-      <w:r>
-        <w:rPr>
-          <w:rFonts w:ascii="Courier New" w:hAnsi="Courier New"/>
-          <w:color w:val="2D3A4A"/>
-          <w:sz w:val="17"/>
-        </w:rPr>
-        <w:t>use_ssml</w:t>
-      </w:r>
+      </w:pPr>
       <w:r>
         <w:rPr>
           <w:color w:val="1E202C"/>
           <w:sz w:val="18"/>
         </w:rPr>
-        <w:t xml:space="preserve"> boolean field on the </w:t>
-      </w:r>
-      <w:r>
-        <w:rPr>
-          <w:rFonts w:ascii="Courier New" w:hAnsi="Courier New"/>
-          <w:color w:val="2D3A4A"/>
-          <w:sz w:val="17"/>
-        </w:rPr>
-        <w:t>SynthesizeRequest</w:t>
+        <w:t xml:space="preserve">SSML processing is opt-in via the </w:t>
+      </w:r>
+      <w:r>
+        <w:rPr>
+          <w:rFonts w:ascii="Courier New" w:hAnsi="Courier New"/>
+          <w:color w:val="2D3A4A"/>
+          <w:sz w:val="17"/>
+        </w:rPr>
+        <w:t>use_ssml</w:t>
       </w:r>
       <w:r>
         <w:rPr>
           <w:color w:val="1E202C"/>
           <w:sz w:val="18"/>
         </w:rPr>
+        <w:t xml:space="preserve"> boolean field on the </w:t>
+      </w:r>
+      <w:r>
+        <w:rPr>
+          <w:rFonts w:ascii="Courier New" w:hAnsi="Courier New"/>
+          <w:color w:val="2D3A4A"/>
+          <w:sz w:val="17"/>
+        </w:rPr>
+        <w:t>SynthesizeRequest</w:t>
+      </w:r>
+      <w:r>
+        <w:rPr>
+          <w:color w:val="1E202C"/>
+          <w:sz w:val="18"/>
+        </w:rPr>
         <w:t xml:space="preserve"> Pydantic model (default false). When false, text is passed directly to the engine without tag parsing — this prevents errors when input contains angle brackets that are not SSML. In the browser UI, an “Input Format” dropdown switches between “Plain Text” and “SSML Markup” modes; selecting SSML reveals a reference hint bar and an “Insert example” button that fills the textarea with a documentary narration sample (tests/sample_ssml.txt).</w:t>
       </w:r>
+    </w:p>
+    <w:p>
+      <w:pPr>
+        <w:spacing w:after="80"/>
+      </w:pPr>
     </w:p>
     <w:tbl>
       <w:tblPr>
@@ -8021,696 +8312,12 @@
           <w:bottom w:val="single" w:sz="8" w:space="2" w:color="3C559A"/>
         </w:pBdr>
         <w:spacing w:before="320" w:after="80"/>
-      </w:pPr>
-      <w:r>
         <w:rPr>
           <w:b/>
           <w:color w:val="3C559A"/>
           <w:sz w:val="26"/>
         </w:rPr>
-        <w:t>10. DIRECTORY STRUCTURE</w:t>
-      </w:r>
-    </w:p>
-    <w:p>
-      <w:pPr>
-        <w:spacing w:after="60"/>
-      </w:pPr>
-    </w:p>
-    <w:p>
-      <w:pPr>
-        <w:shd w:val="clear" w:color="auto" w:fill="F0F1F5"/>
-        <w:spacing w:after="0"/>
-        <w:ind w:left="288" w:right="288"/>
-      </w:pPr>
-      <w:r>
-        <w:rPr>
-          <w:rFonts w:ascii="Courier New" w:hAnsi="Courier New"/>
-          <w:color w:val="2D3A4A"/>
-          <w:sz w:val="17"/>
-        </w:rPr>
-        <w:t xml:space="preserve"> </w:t>
-      </w:r>
-    </w:p>
-    <w:p>
-      <w:pPr>
-        <w:shd w:val="clear" w:color="auto" w:fill="F0F1F5"/>
-        <w:spacing w:after="0"/>
-        <w:ind w:left="288" w:right="288"/>
-      </w:pPr>
-      <w:r>
-        <w:rPr>
-          <w:rFonts w:ascii="Courier New" w:hAnsi="Courier New"/>
-          <w:color w:val="2D3A4A"/>
-          <w:sz w:val="17"/>
-        </w:rPr>
-        <w:t>tts-agent/</w:t>
-      </w:r>
-    </w:p>
-    <w:p>
-      <w:pPr>
-        <w:shd w:val="clear" w:color="auto" w:fill="F0F1F5"/>
-        <w:spacing w:after="0"/>
-        <w:ind w:left="288" w:right="288"/>
-      </w:pPr>
-      <w:r>
-        <w:rPr>
-          <w:rFonts w:ascii="Courier New" w:hAnsi="Courier New"/>
-          <w:color w:val="2D3A4A"/>
-          <w:sz w:val="17"/>
-        </w:rPr>
-        <w:t>├── backend/</w:t>
-      </w:r>
-    </w:p>
-    <w:p>
-      <w:pPr>
-        <w:shd w:val="clear" w:color="auto" w:fill="F0F1F5"/>
-        <w:spacing w:after="0"/>
-        <w:ind w:left="288" w:right="288"/>
-      </w:pPr>
-      <w:r>
-        <w:rPr>
-          <w:rFonts w:ascii="Courier New" w:hAnsi="Courier New"/>
-          <w:color w:val="2D3A4A"/>
-          <w:sz w:val="17"/>
-        </w:rPr>
-        <w:t>│   ├── app.py                    # FastAPI application factory</w:t>
-      </w:r>
-    </w:p>
-    <w:p>
-      <w:pPr>
-        <w:shd w:val="clear" w:color="auto" w:fill="F0F1F5"/>
-        <w:spacing w:after="0"/>
-        <w:ind w:left="288" w:right="288"/>
-      </w:pPr>
-      <w:r>
-        <w:rPr>
-          <w:rFonts w:ascii="Courier New" w:hAnsi="Courier New"/>
-          <w:color w:val="2D3A4A"/>
-          <w:sz w:val="17"/>
-        </w:rPr>
-        <w:t>│   ├── api/</w:t>
-      </w:r>
-    </w:p>
-    <w:p>
-      <w:pPr>
-        <w:shd w:val="clear" w:color="auto" w:fill="F0F1F5"/>
-        <w:spacing w:after="0"/>
-        <w:ind w:left="288" w:right="288"/>
-      </w:pPr>
-      <w:r>
-        <w:rPr>
-          <w:rFonts w:ascii="Courier New" w:hAnsi="Courier New"/>
-          <w:color w:val="2D3A4A"/>
-          <w:sz w:val="17"/>
-        </w:rPr>
-        <w:t>│   │   ├── routes.py             # /health /voices /synthesize /batch-synthesize /audio</w:t>
-      </w:r>
-    </w:p>
-    <w:p>
-      <w:pPr>
-        <w:shd w:val="clear" w:color="auto" w:fill="F0F1F5"/>
-        <w:spacing w:after="0"/>
-        <w:ind w:left="288" w:right="288"/>
-      </w:pPr>
-      <w:r>
-        <w:rPr>
-          <w:rFonts w:ascii="Courier New" w:hAnsi="Courier New"/>
-          <w:color w:val="2D3A4A"/>
-          <w:sz w:val="17"/>
-        </w:rPr>
-        <w:t>│   │   └── schemas.py            # Pydantic request/response models</w:t>
-      </w:r>
-    </w:p>
-    <w:p>
-      <w:pPr>
-        <w:shd w:val="clear" w:color="auto" w:fill="F0F1F5"/>
-        <w:spacing w:after="0"/>
-        <w:ind w:left="288" w:right="288"/>
-      </w:pPr>
-      <w:r>
-        <w:rPr>
-          <w:rFonts w:ascii="Courier New" w:hAnsi="Courier New"/>
-          <w:color w:val="2D3A4A"/>
-          <w:sz w:val="17"/>
-        </w:rPr>
-        <w:t>│   ├── engines/</w:t>
-      </w:r>
-    </w:p>
-    <w:p>
-      <w:pPr>
-        <w:shd w:val="clear" w:color="auto" w:fill="F0F1F5"/>
-        <w:spacing w:after="0"/>
-        <w:ind w:left="288" w:right="288"/>
-      </w:pPr>
-      <w:r>
-        <w:rPr>
-          <w:rFonts w:ascii="Courier New" w:hAnsi="Courier New"/>
-          <w:color w:val="2D3A4A"/>
-          <w:sz w:val="17"/>
-        </w:rPr>
-        <w:t>│   │   ├── base.py               # Abstract TTSEngine contract</w:t>
-      </w:r>
-    </w:p>
-    <w:p>
-      <w:pPr>
-        <w:shd w:val="clear" w:color="auto" w:fill="F0F1F5"/>
-        <w:spacing w:after="0"/>
-        <w:ind w:left="288" w:right="288"/>
-      </w:pPr>
-      <w:r>
-        <w:rPr>
-          <w:rFonts w:ascii="Courier New" w:hAnsi="Courier New"/>
-          <w:color w:val="2D3A4A"/>
-          <w:sz w:val="17"/>
-        </w:rPr>
-        <w:t>│   │   ├── kokoro_engine.py      # Kokoro-82M wrapper (EN + HI)</w:t>
-      </w:r>
-    </w:p>
-    <w:p>
-      <w:pPr>
-        <w:shd w:val="clear" w:color="auto" w:fill="F0F1F5"/>
-        <w:spacing w:after="0"/>
-        <w:ind w:left="288" w:right="288"/>
-      </w:pPr>
-      <w:r>
-        <w:rPr>
-          <w:rFonts w:ascii="Courier New" w:hAnsi="Courier New"/>
-          <w:color w:val="2D3A4A"/>
-          <w:sz w:val="17"/>
-        </w:rPr>
-        <w:t>│   │   └── f5_engine.py          # F5-TTS wrapper (zero-shot cloning)</w:t>
-      </w:r>
-    </w:p>
-    <w:p>
-      <w:pPr>
-        <w:shd w:val="clear" w:color="auto" w:fill="F0F1F5"/>
-        <w:spacing w:after="0"/>
-        <w:ind w:left="288" w:right="288"/>
-      </w:pPr>
-      <w:r>
-        <w:rPr>
-          <w:rFonts w:ascii="Courier New" w:hAnsi="Courier New"/>
-          <w:color w:val="2D3A4A"/>
-          <w:sz w:val="17"/>
-        </w:rPr>
-        <w:t>│   └── utils/</w:t>
-      </w:r>
-    </w:p>
-    <w:p>
-      <w:pPr>
-        <w:shd w:val="clear" w:color="auto" w:fill="F0F1F5"/>
-        <w:spacing w:after="0"/>
-        <w:ind w:left="288" w:right="288"/>
-      </w:pPr>
-      <w:r>
-        <w:rPr>
-          <w:rFonts w:ascii="Courier New" w:hAnsi="Courier New"/>
-          <w:color w:val="2D3A4A"/>
-          <w:sz w:val="17"/>
-        </w:rPr>
-        <w:t>│       ├── audio.py              # Core audio: resample, normalize, trim</w:t>
-      </w:r>
-    </w:p>
-    <w:p>
-      <w:pPr>
-        <w:shd w:val="clear" w:color="auto" w:fill="F0F1F5"/>
-        <w:spacing w:after="0"/>
-        <w:ind w:left="288" w:right="288"/>
-      </w:pPr>
-      <w:r>
-        <w:rPr>
-          <w:rFonts w:ascii="Courier New" w:hAnsi="Courier New"/>
-          <w:color w:val="2D3A4A"/>
-          <w:sz w:val="17"/>
-        </w:rPr>
-        <w:t>│       ├── broadcast.py          # EBU R128, noise reduction, EQ, 44.1kHz export  ★ NEW</w:t>
-      </w:r>
-    </w:p>
-    <w:p>
-      <w:pPr>
-        <w:shd w:val="clear" w:color="auto" w:fill="F0F1F5"/>
-        <w:spacing w:after="0"/>
-        <w:ind w:left="288" w:right="288"/>
-      </w:pPr>
-      <w:r>
-        <w:rPr>
-          <w:rFonts w:ascii="Courier New" w:hAnsi="Courier New"/>
-          <w:color w:val="2D3A4A"/>
-          <w:sz w:val="17"/>
-        </w:rPr>
-        <w:t>│       ├── ssml.py               # SSML tag parser and audio assembler            ★ NEW</w:t>
-      </w:r>
-    </w:p>
-    <w:p>
-      <w:pPr>
-        <w:shd w:val="clear" w:color="auto" w:fill="F0F1F5"/>
-        <w:spacing w:after="0"/>
-        <w:ind w:left="288" w:right="288"/>
-      </w:pPr>
-      <w:r>
-        <w:rPr>
-          <w:rFonts w:ascii="Courier New" w:hAnsi="Courier New"/>
-          <w:color w:val="2D3A4A"/>
-          <w:sz w:val="17"/>
-        </w:rPr>
-        <w:t>│       ├── batch.py              # Batch job queue and executor                   ★ NEW</w:t>
-      </w:r>
-    </w:p>
-    <w:p>
-      <w:pPr>
-        <w:shd w:val="clear" w:color="auto" w:fill="F0F1F5"/>
-        <w:spacing w:after="0"/>
-        <w:ind w:left="288" w:right="288"/>
-      </w:pPr>
-      <w:r>
-        <w:rPr>
-          <w:rFonts w:ascii="Courier New" w:hAnsi="Courier New"/>
-          <w:color w:val="2D3A4A"/>
-          <w:sz w:val="17"/>
-        </w:rPr>
-        <w:lastRenderedPageBreak/>
-        <w:t>│       ├── device.py             # CUDA / MPS / CPU auto-detection</w:t>
-      </w:r>
-    </w:p>
-    <w:p>
-      <w:pPr>
-        <w:shd w:val="clear" w:color="auto" w:fill="F0F1F5"/>
-        <w:spacing w:after="0"/>
-        <w:ind w:left="288" w:right="288"/>
-      </w:pPr>
-      <w:r>
-        <w:rPr>
-          <w:rFonts w:ascii="Courier New" w:hAnsi="Courier New"/>
-          <w:color w:val="2D3A4A"/>
-          <w:sz w:val="17"/>
-        </w:rPr>
-        <w:t>│       └── logger.py             # Structured stdout logging</w:t>
-      </w:r>
-    </w:p>
-    <w:p>
-      <w:pPr>
-        <w:shd w:val="clear" w:color="auto" w:fill="F0F1F5"/>
-        <w:spacing w:after="0"/>
-        <w:ind w:left="288" w:right="288"/>
-      </w:pPr>
-      <w:r>
-        <w:rPr>
-          <w:rFonts w:ascii="Courier New" w:hAnsi="Courier New"/>
-          <w:color w:val="2D3A4A"/>
-          <w:sz w:val="17"/>
-        </w:rPr>
-        <w:t>├── frontend/</w:t>
-      </w:r>
-    </w:p>
-    <w:p>
-      <w:pPr>
-        <w:shd w:val="clear" w:color="auto" w:fill="F0F1F5"/>
-        <w:spacing w:after="0"/>
-        <w:ind w:left="288" w:right="288"/>
-      </w:pPr>
-      <w:r>
-        <w:rPr>
-          <w:rFonts w:ascii="Courier New" w:hAnsi="Courier New"/>
-          <w:color w:val="2D3A4A"/>
-          <w:sz w:val="17"/>
-        </w:rPr>
-        <w:t>│   ├── templates/index.html      # Single-page browser UI</w:t>
-      </w:r>
-    </w:p>
-    <w:p>
-      <w:pPr>
-        <w:shd w:val="clear" w:color="auto" w:fill="F0F1F5"/>
-        <w:spacing w:after="0"/>
-        <w:ind w:left="288" w:right="288"/>
-      </w:pPr>
-      <w:r>
-        <w:rPr>
-          <w:rFonts w:ascii="Courier New" w:hAnsi="Courier New"/>
-          <w:color w:val="2D3A4A"/>
-          <w:sz w:val="17"/>
-        </w:rPr>
-        <w:t>│   └── static/{css/, js/}</w:t>
-      </w:r>
-    </w:p>
-    <w:p>
-      <w:pPr>
-        <w:shd w:val="clear" w:color="auto" w:fill="F0F1F5"/>
-        <w:spacing w:after="0"/>
-        <w:ind w:left="288" w:right="288"/>
-      </w:pPr>
-      <w:r>
-        <w:rPr>
-          <w:rFonts w:ascii="Courier New" w:hAnsi="Courier New"/>
-          <w:color w:val="2D3A4A"/>
-          <w:sz w:val="17"/>
-        </w:rPr>
-        <w:t>├── configs/</w:t>
-      </w:r>
-    </w:p>
-    <w:p>
-      <w:pPr>
-        <w:shd w:val="clear" w:color="auto" w:fill="F0F1F5"/>
-        <w:spacing w:after="0"/>
-        <w:ind w:left="288" w:right="288"/>
-      </w:pPr>
-      <w:r>
-        <w:rPr>
-          <w:rFonts w:ascii="Courier New" w:hAnsi="Courier New"/>
-          <w:color w:val="2D3A4A"/>
-          <w:sz w:val="17"/>
-        </w:rPr>
-        <w:t>│   └── settings.py               # Pydantic Settings from .env</w:t>
-      </w:r>
-    </w:p>
-    <w:p>
-      <w:pPr>
-        <w:shd w:val="clear" w:color="auto" w:fill="F0F1F5"/>
-        <w:spacing w:after="0"/>
-        <w:ind w:left="288" w:right="288"/>
-      </w:pPr>
-      <w:r>
-        <w:rPr>
-          <w:rFonts w:ascii="Courier New" w:hAnsi="Courier New"/>
-          <w:color w:val="2D3A4A"/>
-          <w:sz w:val="17"/>
-        </w:rPr>
-        <w:t>├── models/                       # .gitignored — downloaded weights</w:t>
-      </w:r>
-    </w:p>
-    <w:p>
-      <w:pPr>
-        <w:shd w:val="clear" w:color="auto" w:fill="F0F1F5"/>
-        <w:spacing w:after="0"/>
-        <w:ind w:left="288" w:right="288"/>
-      </w:pPr>
-      <w:r>
-        <w:rPr>
-          <w:rFonts w:ascii="Courier New" w:hAnsi="Courier New"/>
-          <w:color w:val="2D3A4A"/>
-          <w:sz w:val="17"/>
-        </w:rPr>
-        <w:t>│   ├── kokoro/</w:t>
-      </w:r>
-    </w:p>
-    <w:p>
-      <w:pPr>
-        <w:shd w:val="clear" w:color="auto" w:fill="F0F1F5"/>
-        <w:spacing w:after="0"/>
-        <w:ind w:left="288" w:right="288"/>
-      </w:pPr>
-      <w:r>
-        <w:rPr>
-          <w:rFonts w:ascii="Courier New" w:hAnsi="Courier New"/>
-          <w:color w:val="2D3A4A"/>
-          <w:sz w:val="17"/>
-        </w:rPr>
-        <w:t>│   └── f5tts/</w:t>
-      </w:r>
-    </w:p>
-    <w:p>
-      <w:pPr>
-        <w:shd w:val="clear" w:color="auto" w:fill="F0F1F5"/>
-        <w:spacing w:after="0"/>
-        <w:ind w:left="288" w:right="288"/>
-      </w:pPr>
-      <w:r>
-        <w:rPr>
-          <w:rFonts w:ascii="Courier New" w:hAnsi="Courier New"/>
-          <w:color w:val="2D3A4A"/>
-          <w:sz w:val="17"/>
-        </w:rPr>
-        <w:t>├── voice_samples/                # .gitignored — user reference clips</w:t>
-      </w:r>
-    </w:p>
-    <w:p>
-      <w:pPr>
-        <w:shd w:val="clear" w:color="auto" w:fill="F0F1F5"/>
-        <w:spacing w:after="0"/>
-        <w:ind w:left="288" w:right="288"/>
-      </w:pPr>
-      <w:r>
-        <w:rPr>
-          <w:rFonts w:ascii="Courier New" w:hAnsi="Courier New"/>
-          <w:color w:val="2D3A4A"/>
-          <w:sz w:val="17"/>
-        </w:rPr>
-        <w:t>├── outputs/                      # .gitignored — generated WAV files</w:t>
-      </w:r>
-    </w:p>
-    <w:p>
-      <w:pPr>
-        <w:shd w:val="clear" w:color="auto" w:fill="F0F1F5"/>
-        <w:spacing w:after="0"/>
-        <w:ind w:left="288" w:right="288"/>
-      </w:pPr>
-      <w:r>
-        <w:rPr>
-          <w:rFonts w:ascii="Courier New" w:hAnsi="Courier New"/>
-          <w:color w:val="2D3A4A"/>
-          <w:sz w:val="17"/>
-        </w:rPr>
-        <w:t>├── tests/</w:t>
-      </w:r>
-    </w:p>
-    <w:p>
-      <w:pPr>
-        <w:shd w:val="clear" w:color="auto" w:fill="F0F1F5"/>
-        <w:spacing w:after="0"/>
-        <w:ind w:left="288" w:right="288"/>
-      </w:pPr>
-      <w:r>
-        <w:rPr>
-          <w:rFonts w:ascii="Courier New" w:hAnsi="Courier New"/>
-          <w:color w:val="2D3A4A"/>
-          <w:sz w:val="17"/>
-        </w:rPr>
-        <w:t>│   ├── test_api.py</w:t>
-      </w:r>
-    </w:p>
-    <w:p>
-      <w:pPr>
-        <w:shd w:val="clear" w:color="auto" w:fill="F0F1F5"/>
-        <w:spacing w:after="0"/>
-        <w:ind w:left="288" w:right="288"/>
-      </w:pPr>
-      <w:r>
-        <w:rPr>
-          <w:rFonts w:ascii="Courier New" w:hAnsi="Courier New"/>
-          <w:color w:val="2D3A4A"/>
-          <w:sz w:val="17"/>
-        </w:rPr>
-        <w:t>│   ├── test_audio_utils.py</w:t>
-      </w:r>
-    </w:p>
-    <w:p>
-      <w:pPr>
-        <w:shd w:val="clear" w:color="auto" w:fill="F0F1F5"/>
-        <w:spacing w:after="0"/>
-        <w:ind w:left="288" w:right="288"/>
-      </w:pPr>
-      <w:r>
-        <w:rPr>
-          <w:rFonts w:ascii="Courier New" w:hAnsi="Courier New"/>
-          <w:color w:val="2D3A4A"/>
-          <w:sz w:val="17"/>
-        </w:rPr>
-        <w:t>│   ├── test_broadcast.py         # EBU R128, resampler, EQ tests                 ★ NEW</w:t>
-      </w:r>
-    </w:p>
-    <w:p>
-      <w:pPr>
-        <w:shd w:val="clear" w:color="auto" w:fill="F0F1F5"/>
-        <w:spacing w:after="0"/>
-        <w:ind w:left="288" w:right="288"/>
-      </w:pPr>
-      <w:r>
-        <w:rPr>
-          <w:rFonts w:ascii="Courier New" w:hAnsi="Courier New"/>
-          <w:color w:val="2D3A4A"/>
-          <w:sz w:val="17"/>
-        </w:rPr>
-        <w:t>│   ├── test_ssml.py              # SSML parser tests                              ★ NEW</w:t>
-      </w:r>
-    </w:p>
-    <w:p>
-      <w:pPr>
-        <w:shd w:val="clear" w:color="auto" w:fill="F0F1F5"/>
-        <w:spacing w:after="0"/>
-        <w:ind w:left="288" w:right="288"/>
-      </w:pPr>
-      <w:r>
-        <w:rPr>
-          <w:rFonts w:ascii="Courier New" w:hAnsi="Courier New"/>
-          <w:color w:val="2D3A4A"/>
-          <w:sz w:val="17"/>
-        </w:rPr>
-        <w:t>│   └── test_engines.py</w:t>
-      </w:r>
-    </w:p>
-    <w:p>
-      <w:pPr>
-        <w:shd w:val="clear" w:color="auto" w:fill="F0F1F5"/>
-        <w:spacing w:after="0"/>
-        <w:ind w:left="288" w:right="288"/>
-      </w:pPr>
-      <w:r>
-        <w:rPr>
-          <w:rFonts w:ascii="Courier New" w:hAnsi="Courier New"/>
-          <w:color w:val="2D3A4A"/>
-          <w:sz w:val="17"/>
-        </w:rPr>
-        <w:t>├── docker/</w:t>
-      </w:r>
-    </w:p>
-    <w:p>
-      <w:pPr>
-        <w:shd w:val="clear" w:color="auto" w:fill="F0F1F5"/>
-        <w:spacing w:after="0"/>
-        <w:ind w:left="288" w:right="288"/>
-      </w:pPr>
-      <w:r>
-        <w:rPr>
-          <w:rFonts w:ascii="Courier New" w:hAnsi="Courier New"/>
-          <w:color w:val="2D3A4A"/>
-          <w:sz w:val="17"/>
-        </w:rPr>
-        <w:t>│   ├── Dockerfile</w:t>
-      </w:r>
-    </w:p>
-    <w:p>
-      <w:pPr>
-        <w:shd w:val="clear" w:color="auto" w:fill="F0F1F5"/>
-        <w:spacing w:after="0"/>
-        <w:ind w:left="288" w:right="288"/>
-      </w:pPr>
-      <w:r>
-        <w:rPr>
-          <w:rFonts w:ascii="Courier New" w:hAnsi="Courier New"/>
-          <w:color w:val="2D3A4A"/>
-          <w:sz w:val="17"/>
-        </w:rPr>
-        <w:t>│   └── docker-compose.yml</w:t>
-      </w:r>
-    </w:p>
-    <w:p>
-      <w:pPr>
-        <w:shd w:val="clear" w:color="auto" w:fill="F0F1F5"/>
-        <w:spacing w:after="0"/>
-        <w:ind w:left="288" w:right="288"/>
-      </w:pPr>
-      <w:r>
-        <w:rPr>
-          <w:rFonts w:ascii="Courier New" w:hAnsi="Courier New"/>
-          <w:color w:val="2D3A4A"/>
-          <w:sz w:val="17"/>
-        </w:rPr>
-        <w:t>├── scripts/</w:t>
-      </w:r>
-    </w:p>
-    <w:p>
-      <w:pPr>
-        <w:shd w:val="clear" w:color="auto" w:fill="F0F1F5"/>
-        <w:spacing w:after="0"/>
-        <w:ind w:left="288" w:right="288"/>
-      </w:pPr>
-      <w:r>
-        <w:rPr>
-          <w:rFonts w:ascii="Courier New" w:hAnsi="Courier New"/>
-          <w:color w:val="2D3A4A"/>
-          <w:sz w:val="17"/>
-        </w:rPr>
-        <w:t>│   ├── download_models.py</w:t>
-      </w:r>
-    </w:p>
-    <w:p>
-      <w:pPr>
-        <w:shd w:val="clear" w:color="auto" w:fill="F0F1F5"/>
-        <w:spacing w:after="0"/>
-        <w:ind w:left="288" w:right="288"/>
-      </w:pPr>
-      <w:r>
-        <w:rPr>
-          <w:rFonts w:ascii="Courier New" w:hAnsi="Courier New"/>
-          <w:color w:val="2D3A4A"/>
-          <w:sz w:val="17"/>
-        </w:rPr>
-        <w:t>│   └── setup.sh</w:t>
-      </w:r>
-    </w:p>
-    <w:p>
-      <w:pPr>
-        <w:shd w:val="clear" w:color="auto" w:fill="F0F1F5"/>
-        <w:spacing w:after="0"/>
-        <w:ind w:left="288" w:right="288"/>
-      </w:pPr>
-      <w:r>
-        <w:rPr>
-          <w:rFonts w:ascii="Courier New" w:hAnsi="Courier New"/>
-          <w:color w:val="2D3A4A"/>
-          <w:sz w:val="17"/>
-        </w:rPr>
-        <w:t>├── Makefile</w:t>
-      </w:r>
-    </w:p>
-    <w:p>
-      <w:pPr>
-        <w:shd w:val="clear" w:color="auto" w:fill="F0F1F5"/>
-        <w:spacing w:after="0"/>
-        <w:ind w:left="288" w:right="288"/>
-      </w:pPr>
-      <w:r>
-        <w:rPr>
-          <w:rFonts w:ascii="Courier New" w:hAnsi="Courier New"/>
-          <w:color w:val="2D3A4A"/>
-          <w:sz w:val="17"/>
-        </w:rPr>
-        <w:t>├── requirements.txt</w:t>
-      </w:r>
-    </w:p>
-    <w:p>
-      <w:pPr>
-        <w:shd w:val="clear" w:color="auto" w:fill="F0F1F5"/>
-        <w:spacing w:after="0"/>
-        <w:ind w:left="288" w:right="288"/>
-      </w:pPr>
-      <w:r>
-        <w:rPr>
-          <w:rFonts w:ascii="Courier New" w:hAnsi="Courier New"/>
-          <w:color w:val="2D3A4A"/>
-          <w:sz w:val="17"/>
-        </w:rPr>
-        <w:t>├── requirements-dev.txt</w:t>
-      </w:r>
-    </w:p>
-    <w:p>
-      <w:pPr>
-        <w:shd w:val="clear" w:color="auto" w:fill="F0F1F5"/>
-        <w:spacing w:after="0"/>
-        <w:ind w:left="288" w:right="288"/>
-      </w:pPr>
-      <w:r>
-        <w:rPr>
-          <w:rFonts w:ascii="Courier New" w:hAnsi="Courier New"/>
-          <w:color w:val="2D3A4A"/>
-          <w:sz w:val="17"/>
-        </w:rPr>
-        <w:t>├── .env.example</w:t>
-      </w:r>
-    </w:p>
-    <w:p>
-      <w:pPr>
-        <w:shd w:val="clear" w:color="auto" w:fill="F0F1F5"/>
-        <w:spacing w:after="0"/>
-        <w:ind w:left="288" w:right="288"/>
-      </w:pPr>
-      <w:r>
-        <w:rPr>
-          <w:rFonts w:ascii="Courier New" w:hAnsi="Courier New"/>
-          <w:color w:val="2D3A4A"/>
-          <w:sz w:val="17"/>
-        </w:rPr>
-        <w:t>└── README.md</w:t>
-      </w:r>
+      </w:pPr>
     </w:p>
     <w:p>
       <w:pPr>
@@ -8725,6 +8332,703 @@
           <w:color w:val="3C559A"/>
           <w:sz w:val="26"/>
         </w:rPr>
+        <w:t>10. DIRECTORY STRUCTURE</w:t>
+      </w:r>
+    </w:p>
+    <w:p>
+      <w:pPr>
+        <w:spacing w:after="60"/>
+      </w:pPr>
+    </w:p>
+    <w:p>
+      <w:pPr>
+        <w:shd w:val="clear" w:color="auto" w:fill="F0F1F5"/>
+        <w:spacing w:after="0"/>
+        <w:ind w:left="288" w:right="288"/>
+      </w:pPr>
+      <w:r>
+        <w:rPr>
+          <w:rFonts w:ascii="Courier New" w:hAnsi="Courier New"/>
+          <w:color w:val="2D3A4A"/>
+          <w:sz w:val="17"/>
+        </w:rPr>
+        <w:t xml:space="preserve"> </w:t>
+      </w:r>
+    </w:p>
+    <w:p>
+      <w:pPr>
+        <w:shd w:val="clear" w:color="auto" w:fill="F0F1F5"/>
+        <w:spacing w:after="0"/>
+        <w:ind w:left="288" w:right="288"/>
+      </w:pPr>
+      <w:r>
+        <w:rPr>
+          <w:rFonts w:ascii="Courier New" w:hAnsi="Courier New"/>
+          <w:color w:val="2D3A4A"/>
+          <w:sz w:val="17"/>
+        </w:rPr>
+        <w:t>tts-agent/</w:t>
+      </w:r>
+    </w:p>
+    <w:p>
+      <w:pPr>
+        <w:shd w:val="clear" w:color="auto" w:fill="F0F1F5"/>
+        <w:spacing w:after="0"/>
+        <w:ind w:left="288" w:right="288"/>
+      </w:pPr>
+      <w:r>
+        <w:rPr>
+          <w:rFonts w:ascii="Courier New" w:hAnsi="Courier New"/>
+          <w:color w:val="2D3A4A"/>
+          <w:sz w:val="17"/>
+        </w:rPr>
+        <w:t>├── backend/</w:t>
+      </w:r>
+    </w:p>
+    <w:p>
+      <w:pPr>
+        <w:shd w:val="clear" w:color="auto" w:fill="F0F1F5"/>
+        <w:spacing w:after="0"/>
+        <w:ind w:left="288" w:right="288"/>
+      </w:pPr>
+      <w:r>
+        <w:rPr>
+          <w:rFonts w:ascii="Courier New" w:hAnsi="Courier New"/>
+          <w:color w:val="2D3A4A"/>
+          <w:sz w:val="17"/>
+        </w:rPr>
+        <w:t>│   ├── app.py                    # FastAPI application factory</w:t>
+      </w:r>
+    </w:p>
+    <w:p>
+      <w:pPr>
+        <w:shd w:val="clear" w:color="auto" w:fill="F0F1F5"/>
+        <w:spacing w:after="0"/>
+        <w:ind w:left="288" w:right="288"/>
+      </w:pPr>
+      <w:r>
+        <w:rPr>
+          <w:rFonts w:ascii="Courier New" w:hAnsi="Courier New"/>
+          <w:color w:val="2D3A4A"/>
+          <w:sz w:val="17"/>
+        </w:rPr>
+        <w:t>│   ├── api/</w:t>
+      </w:r>
+    </w:p>
+    <w:p>
+      <w:pPr>
+        <w:shd w:val="clear" w:color="auto" w:fill="F0F1F5"/>
+        <w:spacing w:after="0"/>
+        <w:ind w:left="288" w:right="288"/>
+      </w:pPr>
+      <w:r>
+        <w:rPr>
+          <w:rFonts w:ascii="Courier New" w:hAnsi="Courier New"/>
+          <w:color w:val="2D3A4A"/>
+          <w:sz w:val="17"/>
+        </w:rPr>
+        <w:t>│   │   ├── routes.py             # /health /voices /synthesize /batch-synthesize /audio</w:t>
+      </w:r>
+    </w:p>
+    <w:p>
+      <w:pPr>
+        <w:shd w:val="clear" w:color="auto" w:fill="F0F1F5"/>
+        <w:spacing w:after="0"/>
+        <w:ind w:left="288" w:right="288"/>
+      </w:pPr>
+      <w:r>
+        <w:rPr>
+          <w:rFonts w:ascii="Courier New" w:hAnsi="Courier New"/>
+          <w:color w:val="2D3A4A"/>
+          <w:sz w:val="17"/>
+        </w:rPr>
+        <w:t>│   │   └── schemas.py            # Pydantic request/response models</w:t>
+      </w:r>
+    </w:p>
+    <w:p>
+      <w:pPr>
+        <w:shd w:val="clear" w:color="auto" w:fill="F0F1F5"/>
+        <w:spacing w:after="0"/>
+        <w:ind w:left="288" w:right="288"/>
+      </w:pPr>
+      <w:r>
+        <w:rPr>
+          <w:rFonts w:ascii="Courier New" w:hAnsi="Courier New"/>
+          <w:color w:val="2D3A4A"/>
+          <w:sz w:val="17"/>
+        </w:rPr>
+        <w:t>│   ├── engines/</w:t>
+      </w:r>
+    </w:p>
+    <w:p>
+      <w:pPr>
+        <w:shd w:val="clear" w:color="auto" w:fill="F0F1F5"/>
+        <w:spacing w:after="0"/>
+        <w:ind w:left="288" w:right="288"/>
+      </w:pPr>
+      <w:r>
+        <w:rPr>
+          <w:rFonts w:ascii="Courier New" w:hAnsi="Courier New"/>
+          <w:color w:val="2D3A4A"/>
+          <w:sz w:val="17"/>
+        </w:rPr>
+        <w:t>│   │   ├── base.py               # Abstract TTSEngine contract</w:t>
+      </w:r>
+    </w:p>
+    <w:p>
+      <w:pPr>
+        <w:shd w:val="clear" w:color="auto" w:fill="F0F1F5"/>
+        <w:spacing w:after="0"/>
+        <w:ind w:left="288" w:right="288"/>
+      </w:pPr>
+      <w:r>
+        <w:rPr>
+          <w:rFonts w:ascii="Courier New" w:hAnsi="Courier New"/>
+          <w:color w:val="2D3A4A"/>
+          <w:sz w:val="17"/>
+        </w:rPr>
+        <w:t>│   │   ├── kokoro_engine.py      # Kokoro-82M wrapper (EN + HI)</w:t>
+      </w:r>
+    </w:p>
+    <w:p>
+      <w:pPr>
+        <w:shd w:val="clear" w:color="auto" w:fill="F0F1F5"/>
+        <w:spacing w:after="0"/>
+        <w:ind w:left="288" w:right="288"/>
+      </w:pPr>
+      <w:r>
+        <w:rPr>
+          <w:rFonts w:ascii="Courier New" w:hAnsi="Courier New"/>
+          <w:color w:val="2D3A4A"/>
+          <w:sz w:val="17"/>
+        </w:rPr>
+        <w:t>│   │   └── f5_engine.py          # F5-TTS wrapper (zero-shot cloning)</w:t>
+      </w:r>
+    </w:p>
+    <w:p>
+      <w:pPr>
+        <w:shd w:val="clear" w:color="auto" w:fill="F0F1F5"/>
+        <w:spacing w:after="0"/>
+        <w:ind w:left="288" w:right="288"/>
+      </w:pPr>
+      <w:r>
+        <w:rPr>
+          <w:rFonts w:ascii="Courier New" w:hAnsi="Courier New"/>
+          <w:color w:val="2D3A4A"/>
+          <w:sz w:val="17"/>
+        </w:rPr>
+        <w:t>│   └── utils/</w:t>
+      </w:r>
+    </w:p>
+    <w:p>
+      <w:pPr>
+        <w:shd w:val="clear" w:color="auto" w:fill="F0F1F5"/>
+        <w:spacing w:after="0"/>
+        <w:ind w:left="288" w:right="288"/>
+      </w:pPr>
+      <w:r>
+        <w:rPr>
+          <w:rFonts w:ascii="Courier New" w:hAnsi="Courier New"/>
+          <w:color w:val="2D3A4A"/>
+          <w:sz w:val="17"/>
+        </w:rPr>
+        <w:t>│       ├── audio.py              # Core audio: resample, normalize, trim</w:t>
+      </w:r>
+    </w:p>
+    <w:p>
+      <w:pPr>
+        <w:shd w:val="clear" w:color="auto" w:fill="F0F1F5"/>
+        <w:spacing w:after="0"/>
+        <w:ind w:left="288" w:right="288"/>
+      </w:pPr>
+      <w:r>
+        <w:rPr>
+          <w:rFonts w:ascii="Courier New" w:hAnsi="Courier New"/>
+          <w:color w:val="2D3A4A"/>
+          <w:sz w:val="17"/>
+        </w:rPr>
+        <w:t>│       ├── broadcast.py          # EBU R128, noise reduction, EQ, 44.1kHz export  ★ NEW</w:t>
+      </w:r>
+    </w:p>
+    <w:p>
+      <w:pPr>
+        <w:shd w:val="clear" w:color="auto" w:fill="F0F1F5"/>
+        <w:spacing w:after="0"/>
+        <w:ind w:left="288" w:right="288"/>
+      </w:pPr>
+      <w:r>
+        <w:rPr>
+          <w:rFonts w:ascii="Courier New" w:hAnsi="Courier New"/>
+          <w:color w:val="2D3A4A"/>
+          <w:sz w:val="17"/>
+        </w:rPr>
+        <w:t>│       ├── ssml.py               # SSML tag parser and audio assembler            ★ NEW</w:t>
+      </w:r>
+    </w:p>
+    <w:p>
+      <w:pPr>
+        <w:shd w:val="clear" w:color="auto" w:fill="F0F1F5"/>
+        <w:spacing w:after="0"/>
+        <w:ind w:left="288" w:right="288"/>
+      </w:pPr>
+      <w:r>
+        <w:rPr>
+          <w:rFonts w:ascii="Courier New" w:hAnsi="Courier New"/>
+          <w:color w:val="2D3A4A"/>
+          <w:sz w:val="17"/>
+        </w:rPr>
+        <w:t>│       ├── batch.py              # Batch job queue and executor                   ★ NEW</w:t>
+      </w:r>
+    </w:p>
+    <w:p>
+      <w:pPr>
+        <w:shd w:val="clear" w:color="auto" w:fill="F0F1F5"/>
+        <w:spacing w:after="0"/>
+        <w:ind w:left="288" w:right="288"/>
+      </w:pPr>
+      <w:r>
+        <w:rPr>
+          <w:rFonts w:ascii="Courier New" w:hAnsi="Courier New"/>
+          <w:color w:val="2D3A4A"/>
+          <w:sz w:val="17"/>
+        </w:rPr>
+        <w:t>│       ├── device.py             # CUDA / MPS / CPU auto-detection</w:t>
+      </w:r>
+    </w:p>
+    <w:p>
+      <w:pPr>
+        <w:shd w:val="clear" w:color="auto" w:fill="F0F1F5"/>
+        <w:spacing w:after="0"/>
+        <w:ind w:left="288" w:right="288"/>
+      </w:pPr>
+      <w:r>
+        <w:rPr>
+          <w:rFonts w:ascii="Courier New" w:hAnsi="Courier New"/>
+          <w:color w:val="2D3A4A"/>
+          <w:sz w:val="17"/>
+        </w:rPr>
+        <w:lastRenderedPageBreak/>
+        <w:t>│       └── logger.py             # Structured stdout logging</w:t>
+      </w:r>
+    </w:p>
+    <w:p>
+      <w:pPr>
+        <w:shd w:val="clear" w:color="auto" w:fill="F0F1F5"/>
+        <w:spacing w:after="0"/>
+        <w:ind w:left="288" w:right="288"/>
+      </w:pPr>
+      <w:r>
+        <w:rPr>
+          <w:rFonts w:ascii="Courier New" w:hAnsi="Courier New"/>
+          <w:color w:val="2D3A4A"/>
+          <w:sz w:val="17"/>
+        </w:rPr>
+        <w:t>├── frontend/</w:t>
+      </w:r>
+    </w:p>
+    <w:p>
+      <w:pPr>
+        <w:shd w:val="clear" w:color="auto" w:fill="F0F1F5"/>
+        <w:spacing w:after="0"/>
+        <w:ind w:left="288" w:right="288"/>
+      </w:pPr>
+      <w:r>
+        <w:rPr>
+          <w:rFonts w:ascii="Courier New" w:hAnsi="Courier New"/>
+          <w:color w:val="2D3A4A"/>
+          <w:sz w:val="17"/>
+        </w:rPr>
+        <w:t>│   ├── templates/index.html      # Single-page browser UI</w:t>
+      </w:r>
+    </w:p>
+    <w:p>
+      <w:pPr>
+        <w:shd w:val="clear" w:color="auto" w:fill="F0F1F5"/>
+        <w:spacing w:after="0"/>
+        <w:ind w:left="288" w:right="288"/>
+      </w:pPr>
+      <w:r>
+        <w:rPr>
+          <w:rFonts w:ascii="Courier New" w:hAnsi="Courier New"/>
+          <w:color w:val="2D3A4A"/>
+          <w:sz w:val="17"/>
+        </w:rPr>
+        <w:t>│   └── static/{css/, js/}</w:t>
+      </w:r>
+    </w:p>
+    <w:p>
+      <w:pPr>
+        <w:shd w:val="clear" w:color="auto" w:fill="F0F1F5"/>
+        <w:spacing w:after="0"/>
+        <w:ind w:left="288" w:right="288"/>
+      </w:pPr>
+      <w:r>
+        <w:rPr>
+          <w:rFonts w:ascii="Courier New" w:hAnsi="Courier New"/>
+          <w:color w:val="2D3A4A"/>
+          <w:sz w:val="17"/>
+        </w:rPr>
+        <w:t>├── configs/</w:t>
+      </w:r>
+    </w:p>
+    <w:p>
+      <w:pPr>
+        <w:shd w:val="clear" w:color="auto" w:fill="F0F1F5"/>
+        <w:spacing w:after="0"/>
+        <w:ind w:left="288" w:right="288"/>
+      </w:pPr>
+      <w:r>
+        <w:rPr>
+          <w:rFonts w:ascii="Courier New" w:hAnsi="Courier New"/>
+          <w:color w:val="2D3A4A"/>
+          <w:sz w:val="17"/>
+        </w:rPr>
+        <w:t>│   └── settings.py               # Pydantic Settings from .env</w:t>
+      </w:r>
+    </w:p>
+    <w:p>
+      <w:pPr>
+        <w:shd w:val="clear" w:color="auto" w:fill="F0F1F5"/>
+        <w:spacing w:after="0"/>
+        <w:ind w:left="288" w:right="288"/>
+      </w:pPr>
+      <w:r>
+        <w:rPr>
+          <w:rFonts w:ascii="Courier New" w:hAnsi="Courier New"/>
+          <w:color w:val="2D3A4A"/>
+          <w:sz w:val="17"/>
+        </w:rPr>
+        <w:t>├── models/                       # .gitignored — downloaded weights</w:t>
+      </w:r>
+    </w:p>
+    <w:p>
+      <w:pPr>
+        <w:shd w:val="clear" w:color="auto" w:fill="F0F1F5"/>
+        <w:spacing w:after="0"/>
+        <w:ind w:left="288" w:right="288"/>
+      </w:pPr>
+      <w:r>
+        <w:rPr>
+          <w:rFonts w:ascii="Courier New" w:hAnsi="Courier New"/>
+          <w:color w:val="2D3A4A"/>
+          <w:sz w:val="17"/>
+        </w:rPr>
+        <w:t>│   ├── kokoro/</w:t>
+      </w:r>
+    </w:p>
+    <w:p>
+      <w:pPr>
+        <w:shd w:val="clear" w:color="auto" w:fill="F0F1F5"/>
+        <w:spacing w:after="0"/>
+        <w:ind w:left="288" w:right="288"/>
+      </w:pPr>
+      <w:r>
+        <w:rPr>
+          <w:rFonts w:ascii="Courier New" w:hAnsi="Courier New"/>
+          <w:color w:val="2D3A4A"/>
+          <w:sz w:val="17"/>
+        </w:rPr>
+        <w:t>│   └── f5tts/</w:t>
+      </w:r>
+    </w:p>
+    <w:p>
+      <w:pPr>
+        <w:shd w:val="clear" w:color="auto" w:fill="F0F1F5"/>
+        <w:spacing w:after="0"/>
+        <w:ind w:left="288" w:right="288"/>
+      </w:pPr>
+      <w:r>
+        <w:rPr>
+          <w:rFonts w:ascii="Courier New" w:hAnsi="Courier New"/>
+          <w:color w:val="2D3A4A"/>
+          <w:sz w:val="17"/>
+        </w:rPr>
+        <w:t>├── voice_samples/                # .gitignored — user reference clips</w:t>
+      </w:r>
+    </w:p>
+    <w:p>
+      <w:pPr>
+        <w:shd w:val="clear" w:color="auto" w:fill="F0F1F5"/>
+        <w:spacing w:after="0"/>
+        <w:ind w:left="288" w:right="288"/>
+      </w:pPr>
+      <w:r>
+        <w:rPr>
+          <w:rFonts w:ascii="Courier New" w:hAnsi="Courier New"/>
+          <w:color w:val="2D3A4A"/>
+          <w:sz w:val="17"/>
+        </w:rPr>
+        <w:t>├── outputs/                      # .gitignored — generated WAV files</w:t>
+      </w:r>
+    </w:p>
+    <w:p>
+      <w:pPr>
+        <w:shd w:val="clear" w:color="auto" w:fill="F0F1F5"/>
+        <w:spacing w:after="0"/>
+        <w:ind w:left="288" w:right="288"/>
+      </w:pPr>
+      <w:r>
+        <w:rPr>
+          <w:rFonts w:ascii="Courier New" w:hAnsi="Courier New"/>
+          <w:color w:val="2D3A4A"/>
+          <w:sz w:val="17"/>
+        </w:rPr>
+        <w:t>├── tests/</w:t>
+      </w:r>
+    </w:p>
+    <w:p>
+      <w:pPr>
+        <w:shd w:val="clear" w:color="auto" w:fill="F0F1F5"/>
+        <w:spacing w:after="0"/>
+        <w:ind w:left="288" w:right="288"/>
+      </w:pPr>
+      <w:r>
+        <w:rPr>
+          <w:rFonts w:ascii="Courier New" w:hAnsi="Courier New"/>
+          <w:color w:val="2D3A4A"/>
+          <w:sz w:val="17"/>
+        </w:rPr>
+        <w:t>│   ├── test_api.py</w:t>
+      </w:r>
+    </w:p>
+    <w:p>
+      <w:pPr>
+        <w:shd w:val="clear" w:color="auto" w:fill="F0F1F5"/>
+        <w:spacing w:after="0"/>
+        <w:ind w:left="288" w:right="288"/>
+      </w:pPr>
+      <w:r>
+        <w:rPr>
+          <w:rFonts w:ascii="Courier New" w:hAnsi="Courier New"/>
+          <w:color w:val="2D3A4A"/>
+          <w:sz w:val="17"/>
+        </w:rPr>
+        <w:t>│   ├── test_audio_utils.py</w:t>
+      </w:r>
+    </w:p>
+    <w:p>
+      <w:pPr>
+        <w:shd w:val="clear" w:color="auto" w:fill="F0F1F5"/>
+        <w:spacing w:after="0"/>
+        <w:ind w:left="288" w:right="288"/>
+      </w:pPr>
+      <w:r>
+        <w:rPr>
+          <w:rFonts w:ascii="Courier New" w:hAnsi="Courier New"/>
+          <w:color w:val="2D3A4A"/>
+          <w:sz w:val="17"/>
+        </w:rPr>
+        <w:t>│   ├── test_broadcast.py         # EBU R128, resampler, EQ tests                 ★ NEW</w:t>
+      </w:r>
+    </w:p>
+    <w:p>
+      <w:pPr>
+        <w:shd w:val="clear" w:color="auto" w:fill="F0F1F5"/>
+        <w:spacing w:after="0"/>
+        <w:ind w:left="288" w:right="288"/>
+      </w:pPr>
+      <w:r>
+        <w:rPr>
+          <w:rFonts w:ascii="Courier New" w:hAnsi="Courier New"/>
+          <w:color w:val="2D3A4A"/>
+          <w:sz w:val="17"/>
+        </w:rPr>
+        <w:t>│   ├── test_ssml.py              # SSML parser tests                              ★ NEW</w:t>
+      </w:r>
+    </w:p>
+    <w:p>
+      <w:pPr>
+        <w:shd w:val="clear" w:color="auto" w:fill="F0F1F5"/>
+        <w:spacing w:after="0"/>
+        <w:ind w:left="288" w:right="288"/>
+      </w:pPr>
+      <w:r>
+        <w:rPr>
+          <w:rFonts w:ascii="Courier New" w:hAnsi="Courier New"/>
+          <w:color w:val="2D3A4A"/>
+          <w:sz w:val="17"/>
+        </w:rPr>
+        <w:t>│   └── test_engines.py</w:t>
+      </w:r>
+    </w:p>
+    <w:p>
+      <w:pPr>
+        <w:shd w:val="clear" w:color="auto" w:fill="F0F1F5"/>
+        <w:spacing w:after="0"/>
+        <w:ind w:left="288" w:right="288"/>
+      </w:pPr>
+      <w:r>
+        <w:rPr>
+          <w:rFonts w:ascii="Courier New" w:hAnsi="Courier New"/>
+          <w:color w:val="2D3A4A"/>
+          <w:sz w:val="17"/>
+        </w:rPr>
+        <w:t>├── docker/</w:t>
+      </w:r>
+    </w:p>
+    <w:p>
+      <w:pPr>
+        <w:shd w:val="clear" w:color="auto" w:fill="F0F1F5"/>
+        <w:spacing w:after="0"/>
+        <w:ind w:left="288" w:right="288"/>
+      </w:pPr>
+      <w:r>
+        <w:rPr>
+          <w:rFonts w:ascii="Courier New" w:hAnsi="Courier New"/>
+          <w:color w:val="2D3A4A"/>
+          <w:sz w:val="17"/>
+        </w:rPr>
+        <w:t>│   ├── Dockerfile</w:t>
+      </w:r>
+    </w:p>
+    <w:p>
+      <w:pPr>
+        <w:shd w:val="clear" w:color="auto" w:fill="F0F1F5"/>
+        <w:spacing w:after="0"/>
+        <w:ind w:left="288" w:right="288"/>
+      </w:pPr>
+      <w:r>
+        <w:rPr>
+          <w:rFonts w:ascii="Courier New" w:hAnsi="Courier New"/>
+          <w:color w:val="2D3A4A"/>
+          <w:sz w:val="17"/>
+        </w:rPr>
+        <w:t>│   └── docker-compose.yml</w:t>
+      </w:r>
+    </w:p>
+    <w:p>
+      <w:pPr>
+        <w:shd w:val="clear" w:color="auto" w:fill="F0F1F5"/>
+        <w:spacing w:after="0"/>
+        <w:ind w:left="288" w:right="288"/>
+      </w:pPr>
+      <w:r>
+        <w:rPr>
+          <w:rFonts w:ascii="Courier New" w:hAnsi="Courier New"/>
+          <w:color w:val="2D3A4A"/>
+          <w:sz w:val="17"/>
+        </w:rPr>
+        <w:t>├── scripts/</w:t>
+      </w:r>
+    </w:p>
+    <w:p>
+      <w:pPr>
+        <w:shd w:val="clear" w:color="auto" w:fill="F0F1F5"/>
+        <w:spacing w:after="0"/>
+        <w:ind w:left="288" w:right="288"/>
+      </w:pPr>
+      <w:r>
+        <w:rPr>
+          <w:rFonts w:ascii="Courier New" w:hAnsi="Courier New"/>
+          <w:color w:val="2D3A4A"/>
+          <w:sz w:val="17"/>
+        </w:rPr>
+        <w:t>│   ├── download_models.py</w:t>
+      </w:r>
+    </w:p>
+    <w:p>
+      <w:pPr>
+        <w:shd w:val="clear" w:color="auto" w:fill="F0F1F5"/>
+        <w:spacing w:after="0"/>
+        <w:ind w:left="288" w:right="288"/>
+      </w:pPr>
+      <w:r>
+        <w:rPr>
+          <w:rFonts w:ascii="Courier New" w:hAnsi="Courier New"/>
+          <w:color w:val="2D3A4A"/>
+          <w:sz w:val="17"/>
+        </w:rPr>
+        <w:t>│   └── setup.sh</w:t>
+      </w:r>
+    </w:p>
+    <w:p>
+      <w:pPr>
+        <w:shd w:val="clear" w:color="auto" w:fill="F0F1F5"/>
+        <w:spacing w:after="0"/>
+        <w:ind w:left="288" w:right="288"/>
+      </w:pPr>
+      <w:r>
+        <w:rPr>
+          <w:rFonts w:ascii="Courier New" w:hAnsi="Courier New"/>
+          <w:color w:val="2D3A4A"/>
+          <w:sz w:val="17"/>
+        </w:rPr>
+        <w:t>├── Makefile</w:t>
+      </w:r>
+    </w:p>
+    <w:p>
+      <w:pPr>
+        <w:shd w:val="clear" w:color="auto" w:fill="F0F1F5"/>
+        <w:spacing w:after="0"/>
+        <w:ind w:left="288" w:right="288"/>
+      </w:pPr>
+      <w:r>
+        <w:rPr>
+          <w:rFonts w:ascii="Courier New" w:hAnsi="Courier New"/>
+          <w:color w:val="2D3A4A"/>
+          <w:sz w:val="17"/>
+        </w:rPr>
+        <w:t>├── requirements.txt</w:t>
+      </w:r>
+    </w:p>
+    <w:p>
+      <w:pPr>
+        <w:shd w:val="clear" w:color="auto" w:fill="F0F1F5"/>
+        <w:spacing w:after="0"/>
+        <w:ind w:left="288" w:right="288"/>
+      </w:pPr>
+      <w:r>
+        <w:rPr>
+          <w:rFonts w:ascii="Courier New" w:hAnsi="Courier New"/>
+          <w:color w:val="2D3A4A"/>
+          <w:sz w:val="17"/>
+        </w:rPr>
+        <w:t>├── requirements-dev.txt</w:t>
+      </w:r>
+    </w:p>
+    <w:p>
+      <w:pPr>
+        <w:shd w:val="clear" w:color="auto" w:fill="F0F1F5"/>
+        <w:spacing w:after="0"/>
+        <w:ind w:left="288" w:right="288"/>
+      </w:pPr>
+      <w:r>
+        <w:rPr>
+          <w:rFonts w:ascii="Courier New" w:hAnsi="Courier New"/>
+          <w:color w:val="2D3A4A"/>
+          <w:sz w:val="17"/>
+        </w:rPr>
+        <w:t>├── .env.example</w:t>
+      </w:r>
+    </w:p>
+    <w:p>
+      <w:pPr>
+        <w:shd w:val="clear" w:color="auto" w:fill="F0F1F5"/>
+        <w:spacing w:after="0"/>
+        <w:ind w:left="288" w:right="288"/>
+      </w:pPr>
+      <w:r>
+        <w:rPr>
+          <w:rFonts w:ascii="Courier New" w:hAnsi="Courier New"/>
+          <w:color w:val="2D3A4A"/>
+          <w:sz w:val="17"/>
+        </w:rPr>
+        <w:t>└── README.md</w:t>
+      </w:r>
+    </w:p>
+    <w:p>
+      <w:pPr>
+        <w:pBdr>
+          <w:bottom w:val="single" w:sz="8" w:space="2" w:color="3C559A"/>
+        </w:pBdr>
+        <w:spacing w:before="320" w:after="80"/>
+      </w:pPr>
+      <w:r>
+        <w:rPr>
+          <w:b/>
+          <w:color w:val="3C559A"/>
+          <w:sz w:val="26"/>
+        </w:rPr>
         <w:t>11. LOCAL SETUP</w:t>
       </w:r>
     </w:p>
@@ -8744,14 +9048,23 @@
     <w:p>
       <w:pPr>
         <w:spacing w:after="40"/>
-      </w:pPr>
-      <w:r>
         <w:rPr>
           <w:color w:val="1E202C"/>
           <w:sz w:val="18"/>
         </w:rPr>
+      </w:pPr>
+      <w:r>
+        <w:rPr>
+          <w:color w:val="1E202C"/>
+          <w:sz w:val="18"/>
+        </w:rPr>
         <w:t>Prerequisite: install system espeak-ng (required by Kokoro’s phonemizer backend). The bundled espeakng_loader path exceeds an internal 160-char C buffer on typical macOS project paths — system espeak-ng at /opt/homebrew avoids this entirely. setup.sh handles this automatically; if running steps manually:</w:t>
       </w:r>
+    </w:p>
+    <w:p>
+      <w:pPr>
+        <w:spacing w:after="40"/>
+      </w:pPr>
     </w:p>
     <w:p>
       <w:pPr>
@@ -8870,96 +9183,18 @@
           <w:color w:val="1E202C"/>
           <w:sz w:val="20"/>
         </w:rPr>
-        <w:t xml:space="preserve">The following eight phases take a freshly installed Windows machine from zero to a fully GPU-accelerated TTS Agent instance. All commands run inside an Ubuntu 22.04 WSL2 terminal unless noted otherwise. The NVIDIA Windows driver provides CUDA passthrough to WSL2 automatically — no separate Linux CUDA toolkit installation is needed; PyTorch bundles its own CUDA runtime.</w:t>
+        <w:t>The following eight phases take a freshly installed Windows machine from zero to a fully GPU-accelerated TTS Agent instance. All commands run inside an Ubuntu 22.04 WSL2 terminal unless noted otherwise. The NVIDIA Windows driver provides CUDA passthrough to WSL2 automatically — no separate Linux CUDA toolkit installation is needed; PyTorch bundles its own CUDA runtime.</w:t>
       </w:r>
     </w:p>
     <w:p>
       <w:pPr>
         <w:spacing w:before="120" w:after="40"/>
-      </w:pPr>
-      <w:r>
         <w:rPr>
           <w:b/>
           <w:color w:val="2E74B5"/>
           <w:sz w:val="20"/>
         </w:rPr>
-        <w:t>Phase 1 — Windows prerequisites (run in Windows PowerShell as Administrator)</w:t>
-      </w:r>
-    </w:p>
-    <w:p>
-      <w:pPr>
-        <w:shd w:val="clear" w:color="auto" w:fill="F0F1F5"/>
-        <w:spacing w:after="0"/>
-        <w:ind w:left="288" w:right="288"/>
-      </w:pPr>
-      <w:r>
-        <w:rPr>
-          <w:rFonts w:ascii="Courier New" w:hAnsi="Courier New"/>
-          <w:color w:val="2D3A4A"/>
-          <w:sz w:val="17"/>
-        </w:rPr>
-        <w:t># Install WSL2 and Ubuntu 22.04 (reboot if prompted)</w:t>
-      </w:r>
-    </w:p>
-    <w:p>
-      <w:pPr>
-        <w:shd w:val="clear" w:color="auto" w:fill="F0F1F5"/>
-        <w:spacing w:after="0"/>
-        <w:ind w:left="288" w:right="288"/>
-      </w:pPr>
-      <w:r>
-        <w:rPr>
-          <w:rFonts w:ascii="Courier New" w:hAnsi="Courier New"/>
-          <w:color w:val="2D3A4A"/>
-          <w:sz w:val="17"/>
-        </w:rPr>
-        <w:t>wsl --install -d Ubuntu-22.04</w:t>
-      </w:r>
-    </w:p>
-    <w:p>
-      <w:pPr>
-        <w:shd w:val="clear" w:color="auto" w:fill="F0F1F5"/>
-        <w:spacing w:after="0"/>
-        <w:ind w:left="288" w:right="288"/>
-      </w:pPr>
-      <w:r>
-        <w:rPr>
-          <w:rFonts w:ascii="Courier New" w:hAnsi="Courier New"/>
-          <w:color w:val="2D3A4A"/>
-          <w:sz w:val="17"/>
-        </w:rPr>
-        <w:t xml:space="preserve"># Verify WSL2 (not WSL1)</w:t>
-      </w:r>
-    </w:p>
-    <w:p>
-      <w:pPr>
-        <w:shd w:val="clear" w:color="auto" w:fill="F0F1F5"/>
-        <w:spacing w:after="0"/>
-        <w:ind w:left="288" w:right="288"/>
-      </w:pPr>
-      <w:r>
-        <w:rPr>
-          <w:rFonts w:ascii="Courier New" w:hAnsi="Courier New"/>
-          <w:color w:val="2D3A4A"/>
-          <w:sz w:val="17"/>
-        </w:rPr>
-        <w:t>wsl --list --verbose   # VERSION column must show 2</w:t>
-      </w:r>
-    </w:p>
-    <w:p>
-      <w:pPr>
-        <w:shd w:val="clear" w:color="auto" w:fill="F0F1F5"/>
-        <w:spacing w:after="8"/>
-        <w:ind w:left="288" w:right="288"/>
-      </w:pPr>
-      <w:r>
-        <w:rPr>
-          <w:rFonts w:ascii="Courier New" w:hAnsi="Courier New"/>
-          <w:color w:val="2D3A4A"/>
-          <w:sz w:val="17"/>
-        </w:rPr>
-        <w:t xml:space="preserve"># Install NVIDIA driver for Windows (560+): https://www.nvidia.com/drivers</w:t>
-      </w:r>
+      </w:pPr>
     </w:p>
     <w:p>
       <w:pPr>
@@ -8971,7 +9206,8 @@
           <w:color w:val="2E74B5"/>
           <w:sz w:val="20"/>
         </w:rPr>
-        <w:t>Phase 2 — Open Ubuntu WSL2 terminal and update system packages</w:t>
+        <w:lastRenderedPageBreak/>
+        <w:t>Phase 1 — Windows prerequisites (run in Windows PowerShell as Administrator)</w:t>
       </w:r>
     </w:p>
     <w:p>
@@ -8986,7 +9222,7 @@
           <w:color w:val="2D3A4A"/>
           <w:sz w:val="17"/>
         </w:rPr>
-        <w:t>sudo apt-get update &amp;&amp; sudo apt-get upgrade -y</w:t>
+        <w:t># Install WSL2 and Ubuntu 22.04 (reboot if prompted)</w:t>
       </w:r>
     </w:p>
     <w:p>
@@ -9001,7 +9237,37 @@
           <w:color w:val="2D3A4A"/>
           <w:sz w:val="17"/>
         </w:rPr>
-        <w:t>sudo apt-get install -y git python3 python3-pip python3-venv espeak-ng build-essential</w:t>
+        <w:t>wsl --install -d Ubuntu-22.04</w:t>
+      </w:r>
+    </w:p>
+    <w:p>
+      <w:pPr>
+        <w:shd w:val="clear" w:color="auto" w:fill="F0F1F5"/>
+        <w:spacing w:after="0"/>
+        <w:ind w:left="288" w:right="288"/>
+      </w:pPr>
+      <w:r>
+        <w:rPr>
+          <w:rFonts w:ascii="Courier New" w:hAnsi="Courier New"/>
+          <w:color w:val="2D3A4A"/>
+          <w:sz w:val="17"/>
+        </w:rPr>
+        <w:t># Verify WSL2 (not WSL1)</w:t>
+      </w:r>
+    </w:p>
+    <w:p>
+      <w:pPr>
+        <w:shd w:val="clear" w:color="auto" w:fill="F0F1F5"/>
+        <w:spacing w:after="0"/>
+        <w:ind w:left="288" w:right="288"/>
+      </w:pPr>
+      <w:r>
+        <w:rPr>
+          <w:rFonts w:ascii="Courier New" w:hAnsi="Courier New"/>
+          <w:color w:val="2D3A4A"/>
+          <w:sz w:val="17"/>
+        </w:rPr>
+        <w:t>wsl --list --verbose   # VERSION column must show 2</w:t>
       </w:r>
     </w:p>
     <w:p>
@@ -9016,22 +9282,7 @@
           <w:color w:val="2D3A4A"/>
           <w:sz w:val="17"/>
         </w:rPr>
-        <w:t xml:space="preserve"># Verify GPU passthrough — should show RTX 4080</w:t>
-      </w:r>
-    </w:p>
-    <w:p>
-      <w:pPr>
-        <w:shd w:val="clear" w:color="auto" w:fill="F0F1F5"/>
-        <w:spacing w:after="8"/>
-        <w:ind w:left="288" w:right="288"/>
-      </w:pPr>
-      <w:r>
-        <w:rPr>
-          <w:rFonts w:ascii="Courier New" w:hAnsi="Courier New"/>
-          <w:color w:val="2D3A4A"/>
-          <w:sz w:val="17"/>
-        </w:rPr>
-        <w:t>nvidia-smi</w:t>
+        <w:t># Install NVIDIA driver for Windows (560+): https://www.nvidia.com/drivers</w:t>
       </w:r>
     </w:p>
     <w:p>
@@ -9044,6 +9295,79 @@
           <w:color w:val="2E74B5"/>
           <w:sz w:val="20"/>
         </w:rPr>
+        <w:t>Phase 2 — Open Ubuntu WSL2 terminal and update system packages</w:t>
+      </w:r>
+    </w:p>
+    <w:p>
+      <w:pPr>
+        <w:shd w:val="clear" w:color="auto" w:fill="F0F1F5"/>
+        <w:spacing w:after="0"/>
+        <w:ind w:left="288" w:right="288"/>
+      </w:pPr>
+      <w:r>
+        <w:rPr>
+          <w:rFonts w:ascii="Courier New" w:hAnsi="Courier New"/>
+          <w:color w:val="2D3A4A"/>
+          <w:sz w:val="17"/>
+        </w:rPr>
+        <w:t>sudo apt-get update &amp;&amp; sudo apt-get upgrade -y</w:t>
+      </w:r>
+    </w:p>
+    <w:p>
+      <w:pPr>
+        <w:shd w:val="clear" w:color="auto" w:fill="F0F1F5"/>
+        <w:spacing w:after="0"/>
+        <w:ind w:left="288" w:right="288"/>
+      </w:pPr>
+      <w:r>
+        <w:rPr>
+          <w:rFonts w:ascii="Courier New" w:hAnsi="Courier New"/>
+          <w:color w:val="2D3A4A"/>
+          <w:sz w:val="17"/>
+        </w:rPr>
+        <w:t>sudo apt-get install -y git python3 python3-pip python3-venv espeak-ng build-essential</w:t>
+      </w:r>
+    </w:p>
+    <w:p>
+      <w:pPr>
+        <w:shd w:val="clear" w:color="auto" w:fill="F0F1F5"/>
+        <w:spacing w:after="8"/>
+        <w:ind w:left="288" w:right="288"/>
+      </w:pPr>
+      <w:r>
+        <w:rPr>
+          <w:rFonts w:ascii="Courier New" w:hAnsi="Courier New"/>
+          <w:color w:val="2D3A4A"/>
+          <w:sz w:val="17"/>
+        </w:rPr>
+        <w:t># Verify GPU passthrough — should show RTX 4080</w:t>
+      </w:r>
+    </w:p>
+    <w:p>
+      <w:pPr>
+        <w:shd w:val="clear" w:color="auto" w:fill="F0F1F5"/>
+        <w:spacing w:after="8"/>
+        <w:ind w:left="288" w:right="288"/>
+      </w:pPr>
+      <w:r>
+        <w:rPr>
+          <w:rFonts w:ascii="Courier New" w:hAnsi="Courier New"/>
+          <w:color w:val="2D3A4A"/>
+          <w:sz w:val="17"/>
+        </w:rPr>
+        <w:t>nvidia-smi</w:t>
+      </w:r>
+    </w:p>
+    <w:p>
+      <w:pPr>
+        <w:spacing w:before="120" w:after="40"/>
+      </w:pPr>
+      <w:r>
+        <w:rPr>
+          <w:b/>
+          <w:color w:val="2E74B5"/>
+          <w:sz w:val="20"/>
+        </w:rPr>
         <w:t>Phase 3 — Clone the repository into the WSL2 filesystem</w:t>
       </w:r>
     </w:p>
@@ -9057,7 +9381,7 @@
           <w:color w:val="1E202C"/>
           <w:sz w:val="20"/>
         </w:rPr>
-        <w:t xml:space="preserve">Important: clone into the WSL2 Linux filesystem (~/...) not the Windows mount (/mnt/c/...). The Windows mount uses Plan 9 filesystem protocol and delivers approximately 10× slower I/O for Python venv operations and model file reads.</w:t>
+        <w:t>Important: clone into the WSL2 Linux filesystem (~/...) not the Windows mount (/mnt/c/...). The Windows mount uses Plan 9 filesystem protocol and delivers approximately 10× slower I/O for Python venv operations and model file reads.</w:t>
       </w:r>
     </w:p>
     <w:p>
@@ -9123,14 +9447,69 @@
         <w:shd w:val="clear" w:color="auto" w:fill="F0F1F5"/>
         <w:spacing w:after="0"/>
         <w:ind w:left="288" w:right="288"/>
-      </w:pPr>
-      <w:r>
-        <w:rPr>
-          <w:rFonts w:ascii="Courier New" w:hAnsi="Courier New"/>
-          <w:color w:val="2D3A4A"/>
-          <w:sz w:val="17"/>
-        </w:rPr>
-        <w:t xml:space="preserve"># setup.sh auto-detects nvidia-smi and installs CUDA 12.1 PyTorch</w:t>
+        <w:rPr>
+          <w:rFonts w:ascii="Courier New" w:hAnsi="Courier New"/>
+          <w:color w:val="2D3A4A"/>
+          <w:sz w:val="17"/>
+        </w:rPr>
+      </w:pPr>
+      <w:r>
+        <w:rPr>
+          <w:rFonts w:ascii="Courier New" w:hAnsi="Courier New"/>
+          <w:color w:val="2D3A4A"/>
+          <w:sz w:val="17"/>
+        </w:rPr>
+        <w:t># setup.sh auto-detects nvidia-smi and installs CUDA 12.1 PyTorch</w:t>
+      </w:r>
+    </w:p>
+    <w:p>
+      <w:pPr>
+        <w:shd w:val="clear" w:color="auto" w:fill="F0F1F5"/>
+        <w:spacing w:after="0"/>
+        <w:ind w:left="288" w:right="288"/>
+        <w:rPr>
+          <w:rFonts w:ascii="Courier New" w:hAnsi="Courier New"/>
+          <w:color w:val="2D3A4A"/>
+          <w:sz w:val="17"/>
+        </w:rPr>
+      </w:pPr>
+      <w:proofErr w:type="spellStart"/>
+      <w:r>
+        <w:rPr>
+          <w:rFonts w:ascii="Courier New" w:hAnsi="Courier New"/>
+          <w:color w:val="2D3A4A"/>
+          <w:sz w:val="17"/>
+        </w:rPr>
+        <w:t>sudo</w:t>
+      </w:r>
+      <w:proofErr w:type="spellEnd"/>
+      <w:r>
+        <w:rPr>
+          <w:rFonts w:ascii="Courier New" w:hAnsi="Courier New"/>
+          <w:color w:val="2D3A4A"/>
+          <w:sz w:val="17"/>
+        </w:rPr>
+        <w:t xml:space="preserve"> apt-get install dos2unix -y</w:t>
+      </w:r>
+    </w:p>
+    <w:p>
+      <w:pPr>
+        <w:shd w:val="clear" w:color="auto" w:fill="F0F1F5"/>
+        <w:spacing w:after="0"/>
+        <w:ind w:left="288" w:right="288"/>
+        <w:rPr>
+          <w:rFonts w:ascii="Courier New" w:hAnsi="Courier New"/>
+          <w:color w:val="2D3A4A"/>
+          <w:sz w:val="17"/>
+        </w:rPr>
+      </w:pPr>
+      <w:r>
+        <w:rPr>
+          <w:rFonts w:ascii="Courier New" w:hAnsi="Courier New"/>
+          <w:color w:val="2D3A4A"/>
+          <w:sz w:val="17"/>
+        </w:rPr>
+        <w:t>dos2unix scripts/setup.sh</w:t>
       </w:r>
     </w:p>
     <w:p>
@@ -9188,7 +9567,7 @@
           <w:color w:val="2D3A4A"/>
           <w:sz w:val="17"/>
         </w:rPr>
-        <w:t xml:space="preserve">nano .env   # set HF_TOKEN=hf_... (get token from huggingface.co/settings/tokens)</w:t>
+        <w:t>nano .env   # set HF_TOKEN=hf_... (get token from huggingface.co/settings/tokens)</w:t>
       </w:r>
     </w:p>
     <w:p>
@@ -9231,7 +9610,7 @@
           <w:color w:val="2D3A4A"/>
           <w:sz w:val="17"/>
         </w:rPr>
-        <w:t xml:space="preserve"># Download Kokoro (all 9 language pipelines) and F5-TTS weights (~4 GB total)</w:t>
+        <w:t># Download Kokoro (all 9 language pipelines) and F5-TTS weights (~4 GB total)</w:t>
       </w:r>
     </w:p>
     <w:p>
@@ -9362,7 +9741,7 @@
           <w:color w:val="2D3A4A"/>
           <w:sz w:val="17"/>
         </w:rPr>
-        <w:t xml:space="preserve"># Open in Windows browser (WSL2 localhost bridges to Windows)</w:t>
+        <w:t># Open in Windows browser (WSL2 localhost bridges to Windows)</w:t>
       </w:r>
     </w:p>
     <w:p>
@@ -9395,7 +9774,6 @@
           <w:color w:val="44546E"/>
           <w:sz w:val="23"/>
         </w:rPr>
-        <w:lastRenderedPageBreak/>
         <w:t>11.3 Docker — Recommendation and Limitations</w:t>
       </w:r>
     </w:p>
@@ -9408,7 +9786,15 @@
           <w:color w:val="1E202C"/>
           <w:sz w:val="20"/>
         </w:rPr>
-        <w:t xml:space="preserve">Docker is not the recommended deployment method for local developer machines in this project. The primary reason is GPU access: Docker Desktop on macOS runs a Linux VM that cannot expose the host’s Apple Silicon GPU (MPS), so synthesis falls back to CPU and takes 10–30× longer. On Windows the RTX 4080 is accessible via the NVIDIA Container Toolkit, but this adds installation complexity with no benefit over WSL2 native Python, which already provides full CUDA passthrough with zero containerisation overhead.</w:t>
+        <w:t xml:space="preserve">Docker is not the recommended deployment method for local developer machines in this project. The primary reason is GPU access: Docker Desktop on macOS runs a Linux VM that cannot expose the host’s Apple Silicon GPU (MPS), so synthesis falls back to CPU and takes 10–30× longer. On Windows the RTX 4080 is accessible via the NVIDIA Container Toolkit, but this adds installation complexity with no benefit </w:t>
+      </w:r>
+      <w:r>
+        <w:rPr>
+          <w:color w:val="1E202C"/>
+          <w:sz w:val="20"/>
+        </w:rPr>
+        <w:lastRenderedPageBreak/>
+        <w:t>over WSL2 native Python, which already provides full CUDA passthrough with zero containerisation overhead.</w:t>
       </w:r>
     </w:p>
     <w:p>
@@ -9449,6 +9835,7 @@
           <w:bottom w:w="80" w:type="dxa"/>
           <w:right w:w="120" w:type="dxa"/>
         </w:tblCellMar>
+        <w:tblLook w:val="04A0" w:firstRow="1" w:lastRow="0" w:firstColumn="1" w:lastColumn="0" w:noHBand="0" w:noVBand="1"/>
       </w:tblPr>
       <w:tblGrid>
         <w:gridCol w:w="2268"/>
@@ -9465,9 +9852,6 @@
             <w:shd w:val="clear" w:color="auto" w:fill="2E74B5"/>
           </w:tcPr>
           <w:p>
-            <w:pPr>
-              <w:spacing w:after="0"/>
-            </w:pPr>
             <w:r>
               <w:rPr>
                 <w:b/>
@@ -9484,9 +9868,6 @@
             <w:shd w:val="clear" w:color="auto" w:fill="2E74B5"/>
           </w:tcPr>
           <w:p>
-            <w:pPr>
-              <w:spacing w:after="0"/>
-            </w:pPr>
             <w:r>
               <w:rPr>
                 <w:b/>
@@ -9503,9 +9884,6 @@
             <w:shd w:val="clear" w:color="auto" w:fill="2E74B5"/>
           </w:tcPr>
           <w:p>
-            <w:pPr>
-              <w:spacing w:after="0"/>
-            </w:pPr>
             <w:r>
               <w:rPr>
                 <w:b/>
@@ -9524,9 +9902,6 @@
             <w:shd w:val="clear" w:color="auto" w:fill="EBF3FB"/>
           </w:tcPr>
           <w:p>
-            <w:pPr>
-              <w:spacing w:after="0"/>
-            </w:pPr>
             <w:r>
               <w:rPr>
                 <w:b/>
@@ -9542,14 +9917,11 @@
             <w:shd w:val="clear" w:color="auto" w:fill="EBF3FB"/>
           </w:tcPr>
           <w:p>
-            <w:pPr>
-              <w:spacing w:after="0"/>
-            </w:pPr>
-            <w:r>
-              <w:rPr>
-                <w:sz w:val="18"/>
-              </w:rPr>
-              <w:t xml:space="preserve">Full MPS GPU ✓ · brew espeak-ng ✓ · setup.sh</w:t>
+            <w:r>
+              <w:rPr>
+                <w:sz w:val="18"/>
+              </w:rPr>
+              <w:t>Full MPS GPU ✓ · brew espeak-ng ✓ · setup.sh</w:t>
             </w:r>
           </w:p>
         </w:tc>
@@ -9559,14 +9931,11 @@
             <w:shd w:val="clear" w:color="auto" w:fill="EBF3FB"/>
           </w:tcPr>
           <w:p>
-            <w:pPr>
-              <w:spacing w:after="0"/>
-            </w:pPr>
-            <w:r>
-              <w:rPr>
-                <w:sz w:val="18"/>
-              </w:rPr>
-              <w:t xml:space="preserve">Full CUDA ✓ · WSL2 Ubuntu · setup.sh</w:t>
+            <w:r>
+              <w:rPr>
+                <w:sz w:val="18"/>
+              </w:rPr>
+              <w:t>Full CUDA ✓ · WSL2 Ubuntu · setup.sh</w:t>
             </w:r>
           </w:p>
         </w:tc>
@@ -9577,9 +9946,6 @@
             <w:tcW w:w="2268" w:type="dxa"/>
           </w:tcPr>
           <w:p>
-            <w:pPr>
-              <w:spacing w:after="0"/>
-            </w:pPr>
             <w:r>
               <w:rPr>
                 <w:b/>
@@ -9594,9 +9960,6 @@
             <w:tcW w:w="3402" w:type="dxa"/>
           </w:tcPr>
           <w:p>
-            <w:pPr>
-              <w:spacing w:after="0"/>
-            </w:pPr>
             <w:r>
               <w:rPr>
                 <w:color w:val="C00000"/>
@@ -9611,9 +9974,6 @@
             <w:tcW w:w="3402" w:type="dxa"/>
           </w:tcPr>
           <w:p>
-            <w:pPr>
-              <w:spacing w:after="0"/>
-            </w:pPr>
             <w:r>
               <w:rPr>
                 <w:sz w:val="18"/>
@@ -9630,9 +9990,6 @@
             <w:shd w:val="clear" w:color="auto" w:fill="EBF3FB"/>
           </w:tcPr>
           <w:p>
-            <w:pPr>
-              <w:spacing w:after="0"/>
-            </w:pPr>
             <w:r>
               <w:rPr>
                 <w:b/>
@@ -9648,9 +10005,6 @@
             <w:shd w:val="clear" w:color="auto" w:fill="EBF3FB"/>
           </w:tcPr>
           <w:p>
-            <w:pPr>
-              <w:spacing w:after="0"/>
-            </w:pPr>
             <w:r>
               <w:rPr>
                 <w:sz w:val="18"/>
@@ -9665,9 +10019,6 @@
             <w:shd w:val="clear" w:color="auto" w:fill="EBF3FB"/>
           </w:tcPr>
           <w:p>
-            <w:pPr>
-              <w:spacing w:after="0"/>
-            </w:pPr>
             <w:r>
               <w:rPr>
                 <w:sz w:val="18"/>
@@ -10011,6 +10362,7 @@
           <w:color w:val="2D3A4A"/>
           <w:sz w:val="17"/>
         </w:rPr>
+        <w:lastRenderedPageBreak/>
         <w:t>brew install espeak-ng</w:t>
       </w:r>
     </w:p>
@@ -10074,6 +10426,7 @@
           <w:bottom w:w="80" w:type="dxa"/>
           <w:right w:w="120" w:type="dxa"/>
         </w:tblCellMar>
+        <w:tblLook w:val="04A0" w:firstRow="1" w:lastRow="0" w:firstColumn="1" w:lastColumn="0" w:noHBand="0" w:noVBand="1"/>
       </w:tblPr>
       <w:tblGrid>
         <w:gridCol w:w="2016"/>
@@ -10092,9 +10445,6 @@
             <w:shd w:val="clear" w:color="auto" w:fill="2E74B5"/>
           </w:tcPr>
           <w:p>
-            <w:pPr>
-              <w:spacing w:after="0"/>
-            </w:pPr>
             <w:r>
               <w:rPr>
                 <w:b/>
@@ -10111,9 +10461,6 @@
             <w:shd w:val="clear" w:color="auto" w:fill="2E74B5"/>
           </w:tcPr>
           <w:p>
-            <w:pPr>
-              <w:spacing w:after="0"/>
-            </w:pPr>
             <w:r>
               <w:rPr>
                 <w:b/>
@@ -10130,9 +10477,6 @@
             <w:shd w:val="clear" w:color="auto" w:fill="2E74B5"/>
           </w:tcPr>
           <w:p>
-            <w:pPr>
-              <w:spacing w:after="0"/>
-            </w:pPr>
             <w:r>
               <w:rPr>
                 <w:b/>
@@ -10149,9 +10493,6 @@
             <w:shd w:val="clear" w:color="auto" w:fill="2E74B5"/>
           </w:tcPr>
           <w:p>
-            <w:pPr>
-              <w:spacing w:after="0"/>
-            </w:pPr>
             <w:r>
               <w:rPr>
                 <w:b/>
@@ -10168,9 +10509,6 @@
             <w:shd w:val="clear" w:color="auto" w:fill="2E74B5"/>
           </w:tcPr>
           <w:p>
-            <w:pPr>
-              <w:spacing w:after="0"/>
-            </w:pPr>
             <w:r>
               <w:rPr>
                 <w:b/>
@@ -10189,9 +10527,6 @@
             <w:shd w:val="clear" w:color="auto" w:fill="EBF3FB"/>
           </w:tcPr>
           <w:p>
-            <w:pPr>
-              <w:spacing w:after="0"/>
-            </w:pPr>
             <w:r>
               <w:rPr>
                 <w:sz w:val="18"/>
@@ -10206,9 +10541,6 @@
             <w:shd w:val="clear" w:color="auto" w:fill="EBF3FB"/>
           </w:tcPr>
           <w:p>
-            <w:pPr>
-              <w:spacing w:after="0"/>
-            </w:pPr>
             <w:r>
               <w:rPr>
                 <w:sz w:val="18"/>
@@ -10223,9 +10555,6 @@
             <w:shd w:val="clear" w:color="auto" w:fill="EBF3FB"/>
           </w:tcPr>
           <w:p>
-            <w:pPr>
-              <w:spacing w:after="0"/>
-            </w:pPr>
             <w:r>
               <w:rPr>
                 <w:sz w:val="18"/>
@@ -10240,9 +10569,6 @@
             <w:shd w:val="clear" w:color="auto" w:fill="EBF3FB"/>
           </w:tcPr>
           <w:p>
-            <w:pPr>
-              <w:spacing w:after="0"/>
-            </w:pPr>
             <w:r>
               <w:rPr>
                 <w:sz w:val="18"/>
@@ -10257,9 +10583,6 @@
             <w:shd w:val="clear" w:color="auto" w:fill="EBF3FB"/>
           </w:tcPr>
           <w:p>
-            <w:pPr>
-              <w:spacing w:after="0"/>
-            </w:pPr>
             <w:r>
               <w:rPr>
                 <w:rFonts w:ascii="Courier New" w:hAnsi="Courier New"/>
@@ -10276,9 +10599,6 @@
             <w:tcW w:w="2016" w:type="dxa"/>
           </w:tcPr>
           <w:p>
-            <w:pPr>
-              <w:spacing w:after="0"/>
-            </w:pPr>
             <w:r>
               <w:rPr>
                 <w:sz w:val="18"/>
@@ -10292,9 +10612,6 @@
             <w:tcW w:w="1512" w:type="dxa"/>
           </w:tcPr>
           <w:p>
-            <w:pPr>
-              <w:spacing w:after="0"/>
-            </w:pPr>
             <w:r>
               <w:rPr>
                 <w:sz w:val="18"/>
@@ -10308,9 +10625,6 @@
             <w:tcW w:w="1512" w:type="dxa"/>
           </w:tcPr>
           <w:p>
-            <w:pPr>
-              <w:spacing w:after="0"/>
-            </w:pPr>
             <w:r>
               <w:rPr>
                 <w:sz w:val="18"/>
@@ -10324,9 +10638,6 @@
             <w:tcW w:w="1512" w:type="dxa"/>
           </w:tcPr>
           <w:p>
-            <w:pPr>
-              <w:spacing w:after="0"/>
-            </w:pPr>
             <w:r>
               <w:rPr>
                 <w:sz w:val="18"/>
@@ -10340,9 +10651,6 @@
             <w:tcW w:w="2520" w:type="dxa"/>
           </w:tcPr>
           <w:p>
-            <w:pPr>
-              <w:spacing w:after="0"/>
-            </w:pPr>
             <w:r>
               <w:rPr>
                 <w:rFonts w:ascii="Courier New" w:hAnsi="Courier New"/>
@@ -10360,9 +10668,6 @@
             <w:shd w:val="clear" w:color="auto" w:fill="EBF3FB"/>
           </w:tcPr>
           <w:p>
-            <w:pPr>
-              <w:spacing w:after="0"/>
-            </w:pPr>
             <w:r>
               <w:rPr>
                 <w:sz w:val="18"/>
@@ -10377,9 +10682,6 @@
             <w:shd w:val="clear" w:color="auto" w:fill="EBF3FB"/>
           </w:tcPr>
           <w:p>
-            <w:pPr>
-              <w:spacing w:after="0"/>
-            </w:pPr>
             <w:r>
               <w:rPr>
                 <w:sz w:val="18"/>
@@ -10394,9 +10696,6 @@
             <w:shd w:val="clear" w:color="auto" w:fill="EBF3FB"/>
           </w:tcPr>
           <w:p>
-            <w:pPr>
-              <w:spacing w:after="0"/>
-            </w:pPr>
             <w:r>
               <w:rPr>
                 <w:sz w:val="18"/>
@@ -10411,9 +10710,6 @@
             <w:shd w:val="clear" w:color="auto" w:fill="EBF3FB"/>
           </w:tcPr>
           <w:p>
-            <w:pPr>
-              <w:spacing w:after="0"/>
-            </w:pPr>
             <w:r>
               <w:rPr>
                 <w:sz w:val="18"/>
@@ -10428,9 +10724,6 @@
             <w:shd w:val="clear" w:color="auto" w:fill="EBF3FB"/>
           </w:tcPr>
           <w:p>
-            <w:pPr>
-              <w:spacing w:after="0"/>
-            </w:pPr>
             <w:r>
               <w:rPr>
                 <w:rFonts w:ascii="Courier New" w:hAnsi="Courier New"/>
@@ -10447,9 +10740,6 @@
             <w:tcW w:w="2016" w:type="dxa"/>
           </w:tcPr>
           <w:p>
-            <w:pPr>
-              <w:spacing w:after="0"/>
-            </w:pPr>
             <w:r>
               <w:rPr>
                 <w:sz w:val="18"/>
@@ -10463,9 +10753,6 @@
             <w:tcW w:w="1512" w:type="dxa"/>
           </w:tcPr>
           <w:p>
-            <w:pPr>
-              <w:spacing w:after="0"/>
-            </w:pPr>
             <w:r>
               <w:rPr>
                 <w:sz w:val="18"/>
@@ -10479,9 +10766,6 @@
             <w:tcW w:w="1512" w:type="dxa"/>
           </w:tcPr>
           <w:p>
-            <w:pPr>
-              <w:spacing w:after="0"/>
-            </w:pPr>
             <w:r>
               <w:rPr>
                 <w:sz w:val="18"/>
@@ -10495,9 +10779,6 @@
             <w:tcW w:w="1512" w:type="dxa"/>
           </w:tcPr>
           <w:p>
-            <w:pPr>
-              <w:spacing w:after="0"/>
-            </w:pPr>
             <w:r>
               <w:rPr>
                 <w:sz w:val="18"/>
@@ -10511,9 +10792,6 @@
             <w:tcW w:w="2520" w:type="dxa"/>
           </w:tcPr>
           <w:p>
-            <w:pPr>
-              <w:spacing w:after="0"/>
-            </w:pPr>
             <w:r>
               <w:rPr>
                 <w:rFonts w:ascii="Courier New" w:hAnsi="Courier New"/>
@@ -10564,7 +10842,6 @@
           <w:color w:val="3C559A"/>
           <w:sz w:val="26"/>
         </w:rPr>
-        <w:lastRenderedPageBreak/>
         <w:t>12. TESTING</w:t>
       </w:r>
     </w:p>
@@ -10941,6 +11218,7 @@
                 <w:color w:val="1E202C"/>
                 <w:sz w:val="18"/>
               </w:rPr>
+              <w:lastRenderedPageBreak/>
               <w:t>GET</w:t>
             </w:r>
           </w:p>
@@ -11562,7 +11840,6 @@
           <w:color w:val="3C559A"/>
           <w:sz w:val="26"/>
         </w:rPr>
-        <w:lastRenderedPageBreak/>
         <w:t>15. CONCLUSION</w:t>
       </w:r>
     </w:p>
@@ -11606,7 +11883,7 @@
 </file>
 
 <file path=word/numbering.xml><?xml version="1.0" encoding="utf-8"?>
-<w:numbering xmlns:wpc="http://schemas.microsoft.com/office/word/2010/wordprocessingCanvas" xmlns:cx="http://schemas.microsoft.com/office/drawing/2014/chartex" xmlns:cx1="http://schemas.microsoft.com/office/drawing/2015/9/8/chartex" xmlns:cx2="http://schemas.microsoft.com/office/drawing/2015/10/21/chartex" xmlns:cx3="http://schemas.microsoft.com/office/drawing/2016/5/9/chartex" xmlns:cx4="http://schemas.microsoft.com/office/drawing/2016/5/10/chartex" xmlns:cx5="http://schemas.microsoft.com/office/drawing/2016/5/11/chartex" xmlns:cx6="http://schemas.microsoft.com/office/drawing/2016/5/12/chartex" xmlns:cx7="http://schemas.microsoft.com/office/drawing/2016/5/13/chartex" xmlns:cx8="http://schemas.microsoft.com/office/drawing/2016/5/14/chartex" xmlns:mc="http://schemas.openxmlformats.org/markup-compatibility/2006" xmlns:aink="http://schemas.microsoft.com/office/drawing/2016/ink" xmlns:am3d="http://schemas.microsoft.com/office/drawing/2017/model3d" xmlns:o="urn:schemas-microsoft-com:office:office" xmlns:oel="http://schemas.microsoft.com/office/2019/extlst" xmlns:r="http://schemas.openxmlformats.org/officeDocument/2006/relationships" xmlns:m="http://schemas.openxmlformats.org/officeDocument/2006/math" xmlns:v="urn:schemas-microsoft-com:vml" xmlns:wp14="http://schemas.microsoft.com/office/word/2010/wordprocessingDrawing" xmlns:wp="http://schemas.openxmlformats.org/drawingml/2006/wordprocessingDrawing" xmlns:w10="urn:schemas-microsoft-com:office:word" xmlns:w="http://schemas.openxmlformats.org/wordprocessingml/2006/main" xmlns:w14="http://schemas.microsoft.com/office/word/2010/wordml" xmlns:w15="http://schemas.microsoft.com/office/word/2012/wordml" xmlns:w16cex="http://schemas.microsoft.com/office/word/2018/wordml/cex" xmlns:w16cid="http://schemas.microsoft.com/office/word/2016/wordml/cid" xmlns:w16="http://schemas.microsoft.com/office/word/2018/wordml" xmlns:w16du="http://schemas.microsoft.com/office/word/2023/wordml/word16du" xmlns:w16sdtdh="http://schemas.microsoft.com/office/word/2020/wordml/sdtdatahash" xmlns:w16sdtfl="http://schemas.microsoft.com/office/word/2024/wordml/sdtformatlock" xmlns:w16se="http://schemas.microsoft.com/office/word/2015/wordml/symex" xmlns:wpg="http://schemas.microsoft.com/office/word/2010/wordprocessingGroup" xmlns:wpi="http://schemas.microsoft.com/office/word/2010/wordprocessingInk" xmlns:wne="http://schemas.microsoft.com/office/word/2006/wordml" xmlns:wps="http://schemas.microsoft.com/office/word/2010/wordprocessingShape" mc:Ignorable="w14 w15 w16se w16cid w16 w16cex w16sdtdh w16sdtfl w16du wp14">
+<w:numbering xmlns:wpc="http://schemas.microsoft.com/office/word/2010/wordprocessingCanvas" xmlns:cx="http://schemas.microsoft.com/office/drawing/2014/chartex" xmlns:cx1="http://schemas.microsoft.com/office/drawing/2015/9/8/chartex" xmlns:cx2="http://schemas.microsoft.com/office/drawing/2015/10/21/chartex" xmlns:cx3="http://schemas.microsoft.com/office/drawing/2016/5/9/chartex" xmlns:cx4="http://schemas.microsoft.com/office/drawing/2016/5/10/chartex" xmlns:cx5="http://schemas.microsoft.com/office/drawing/2016/5/11/chartex" xmlns:cx6="http://schemas.microsoft.com/office/drawing/2016/5/12/chartex" xmlns:cx7="http://schemas.microsoft.com/office/drawing/2016/5/13/chartex" xmlns:cx8="http://schemas.microsoft.com/office/drawing/2016/5/14/chartex" xmlns:mc="http://schemas.openxmlformats.org/markup-compatibility/2006" xmlns:aink="http://schemas.microsoft.com/office/drawing/2016/ink" xmlns:am3d="http://schemas.microsoft.com/office/drawing/2017/model3d" xmlns:o="urn:schemas-microsoft-com:office:office" xmlns:oel="http://schemas.microsoft.com/office/2019/extlst" xmlns:r="http://schemas.openxmlformats.org/officeDocument/2006/relationships" xmlns:m="http://schemas.openxmlformats.org/officeDocument/2006/math" xmlns:v="urn:schemas-microsoft-com:vml" xmlns:wp14="http://schemas.microsoft.com/office/word/2010/wordprocessingDrawing" xmlns:wp="http://schemas.openxmlformats.org/drawingml/2006/wordprocessingDrawing" xmlns:w10="urn:schemas-microsoft-com:office:word" xmlns:w="http://schemas.openxmlformats.org/wordprocessingml/2006/main" xmlns:w14="http://schemas.microsoft.com/office/word/2010/wordml" xmlns:w15="http://schemas.microsoft.com/office/word/2012/wordml" xmlns:w16cex="http://schemas.microsoft.com/office/word/2018/wordml/cex" xmlns:w16cid="http://schemas.microsoft.com/office/word/2016/wordml/cid" xmlns:w16="http://schemas.microsoft.com/office/word/2018/wordml" xmlns:w16sdtdh="http://schemas.microsoft.com/office/word/2020/wordml/sdtdatahash" xmlns:w16se="http://schemas.microsoft.com/office/word/2015/wordml/symex" xmlns:wpg="http://schemas.microsoft.com/office/word/2010/wordprocessingGroup" xmlns:wpi="http://schemas.microsoft.com/office/word/2010/wordprocessingInk" xmlns:wne="http://schemas.microsoft.com/office/word/2006/wordml" xmlns:wps="http://schemas.microsoft.com/office/word/2010/wordprocessingShape" mc:Ignorable="w14 w15 w16se w16cid w16 w16cex w16sdtdh wp14">
   <w:abstractNum w:abstractNumId="0" w15:restartNumberingAfterBreak="0">
     <w:nsid w:val="FFFFFF7C"/>
     <w:multiLevelType w:val="singleLevel"/>
@@ -11809,7 +12086,7 @@
 </file>
 
 <file path=word/styles.xml><?xml version="1.0" encoding="utf-8"?>
-<w:styles xmlns:mc="http://schemas.openxmlformats.org/markup-compatibility/2006" xmlns:r="http://schemas.openxmlformats.org/officeDocument/2006/relationships" xmlns:w="http://schemas.openxmlformats.org/wordprocessingml/2006/main" xmlns:w14="http://schemas.microsoft.com/office/word/2010/wordml" xmlns:w15="http://schemas.microsoft.com/office/word/2012/wordml" xmlns:w16cex="http://schemas.microsoft.com/office/word/2018/wordml/cex" xmlns:w16cid="http://schemas.microsoft.com/office/word/2016/wordml/cid" xmlns:w16="http://schemas.microsoft.com/office/word/2018/wordml" xmlns:w16du="http://schemas.microsoft.com/office/word/2023/wordml/word16du" xmlns:w16sdtdh="http://schemas.microsoft.com/office/word/2020/wordml/sdtdatahash" xmlns:w16sdtfl="http://schemas.microsoft.com/office/word/2024/wordml/sdtformatlock" xmlns:w16se="http://schemas.microsoft.com/office/word/2015/wordml/symex" mc:Ignorable="w14 w15 w16se w16cid w16 w16cex w16sdtdh w16sdtfl w16du">
+<w:styles xmlns:mc="http://schemas.openxmlformats.org/markup-compatibility/2006" xmlns:r="http://schemas.openxmlformats.org/officeDocument/2006/relationships" xmlns:w="http://schemas.openxmlformats.org/wordprocessingml/2006/main" xmlns:w14="http://schemas.microsoft.com/office/word/2010/wordml" xmlns:w15="http://schemas.microsoft.com/office/word/2012/wordml" xmlns:w16cex="http://schemas.microsoft.com/office/word/2018/wordml/cex" xmlns:w16cid="http://schemas.microsoft.com/office/word/2016/wordml/cid" xmlns:w16="http://schemas.microsoft.com/office/word/2018/wordml" xmlns:w16sdtdh="http://schemas.microsoft.com/office/word/2020/wordml/sdtdatahash" xmlns:w16se="http://schemas.microsoft.com/office/word/2015/wordml/symex" mc:Ignorable="w14 w15 w16se w16cid w16 w16cex w16sdtdh">
   <w:docDefaults>
     <w:rPrDefault>
       <w:rPr>
@@ -12411,7 +12688,6 @@
   <w:style w:type="character" w:default="1" w:styleId="DefaultParagraphFont">
     <w:name w:val="Default Paragraph Font"/>
     <w:uiPriority w:val="1"/>
-    <w:semiHidden/>
     <w:unhideWhenUsed/>
   </w:style>
   <w:style w:type="table" w:default="1" w:styleId="TableNormal">
@@ -21329,7 +21605,7 @@
       </w:tcPr>
     </w:tblStylePr>
   </w:style>
-  <w:style w:type="table" w:styleId="ColourfulShading">
+  <w:style w:type="table" w:styleId="ColorfulShading">
     <w:name w:val="Colorful Shading"/>
     <w:basedOn w:val="TableNormal"/>
     <w:uiPriority w:val="71"/>
@@ -21444,7 +21720,7 @@
       </w:rPr>
     </w:tblStylePr>
   </w:style>
-  <w:style w:type="table" w:styleId="ColourfulShadingAccent1">
+  <w:style w:type="table" w:styleId="ColorfulShading-Accent1">
     <w:name w:val="Colorful Shading Accent 1"/>
     <w:basedOn w:val="TableNormal"/>
     <w:uiPriority w:val="71"/>
@@ -21559,7 +21835,7 @@
       </w:rPr>
     </w:tblStylePr>
   </w:style>
-  <w:style w:type="table" w:styleId="ColourfulShadingAccent2">
+  <w:style w:type="table" w:styleId="ColorfulShading-Accent2">
     <w:name w:val="Colorful Shading Accent 2"/>
     <w:basedOn w:val="TableNormal"/>
     <w:uiPriority w:val="71"/>
@@ -21674,7 +21950,7 @@
       </w:rPr>
     </w:tblStylePr>
   </w:style>
-  <w:style w:type="table" w:styleId="ColourfulShadingAccent3">
+  <w:style w:type="table" w:styleId="ColorfulShading-Accent3">
     <w:name w:val="Colorful Shading Accent 3"/>
     <w:basedOn w:val="TableNormal"/>
     <w:uiPriority w:val="71"/>
@@ -21779,7 +22055,7 @@
       </w:tcPr>
     </w:tblStylePr>
   </w:style>
-  <w:style w:type="table" w:styleId="ColourfulShadingAccent4">
+  <w:style w:type="table" w:styleId="ColorfulShading-Accent4">
     <w:name w:val="Colorful Shading Accent 4"/>
     <w:basedOn w:val="TableNormal"/>
     <w:uiPriority w:val="71"/>
@@ -21894,7 +22170,7 @@
       </w:rPr>
     </w:tblStylePr>
   </w:style>
-  <w:style w:type="table" w:styleId="ColourfulShadingAccent5">
+  <w:style w:type="table" w:styleId="ColorfulShading-Accent5">
     <w:name w:val="Colorful Shading Accent 5"/>
     <w:basedOn w:val="TableNormal"/>
     <w:uiPriority w:val="71"/>
@@ -22009,7 +22285,7 @@
       </w:rPr>
     </w:tblStylePr>
   </w:style>
-  <w:style w:type="table" w:styleId="ColourfulShadingAccent6">
+  <w:style w:type="table" w:styleId="ColorfulShading-Accent6">
     <w:name w:val="Colorful Shading Accent 6"/>
     <w:basedOn w:val="TableNormal"/>
     <w:uiPriority w:val="71"/>
@@ -22124,7 +22400,7 @@
       </w:rPr>
     </w:tblStylePr>
   </w:style>
-  <w:style w:type="table" w:styleId="ColourfulList">
+  <w:style w:type="table" w:styleId="ColorfulList">
     <w:name w:val="Colorful List"/>
     <w:basedOn w:val="TableNormal"/>
     <w:uiPriority w:val="72"/>
@@ -22203,7 +22479,7 @@
       </w:tcPr>
     </w:tblStylePr>
   </w:style>
-  <w:style w:type="table" w:styleId="ColourfulListAccent1">
+  <w:style w:type="table" w:styleId="ColorfulList-Accent1">
     <w:name w:val="Colorful List Accent 1"/>
     <w:basedOn w:val="TableNormal"/>
     <w:uiPriority w:val="72"/>
@@ -22282,7 +22558,7 @@
       </w:tcPr>
     </w:tblStylePr>
   </w:style>
-  <w:style w:type="table" w:styleId="ColourfulListAccent2">
+  <w:style w:type="table" w:styleId="ColorfulList-Accent2">
     <w:name w:val="Colorful List Accent 2"/>
     <w:basedOn w:val="TableNormal"/>
     <w:uiPriority w:val="72"/>
@@ -22361,7 +22637,7 @@
       </w:tcPr>
     </w:tblStylePr>
   </w:style>
-  <w:style w:type="table" w:styleId="ColourfulListAccent3">
+  <w:style w:type="table" w:styleId="ColorfulList-Accent3">
     <w:name w:val="Colorful List Accent 3"/>
     <w:basedOn w:val="TableNormal"/>
     <w:uiPriority w:val="72"/>
@@ -22440,7 +22716,7 @@
       </w:tcPr>
     </w:tblStylePr>
   </w:style>
-  <w:style w:type="table" w:styleId="ColourfulListAccent4">
+  <w:style w:type="table" w:styleId="ColorfulList-Accent4">
     <w:name w:val="Colorful List Accent 4"/>
     <w:basedOn w:val="TableNormal"/>
     <w:uiPriority w:val="72"/>
@@ -22519,7 +22795,7 @@
       </w:tcPr>
     </w:tblStylePr>
   </w:style>
-  <w:style w:type="table" w:styleId="ColourfulListAccent5">
+  <w:style w:type="table" w:styleId="ColorfulList-Accent5">
     <w:name w:val="Colorful List Accent 5"/>
     <w:basedOn w:val="TableNormal"/>
     <w:uiPriority w:val="72"/>
@@ -22598,7 +22874,7 @@
       </w:tcPr>
     </w:tblStylePr>
   </w:style>
-  <w:style w:type="table" w:styleId="ColourfulListAccent6">
+  <w:style w:type="table" w:styleId="ColorfulList-Accent6">
     <w:name w:val="Colorful List Accent 6"/>
     <w:basedOn w:val="TableNormal"/>
     <w:uiPriority w:val="72"/>
@@ -22677,7 +22953,7 @@
       </w:tcPr>
     </w:tblStylePr>
   </w:style>
-  <w:style w:type="table" w:styleId="ColourfulGrid">
+  <w:style w:type="table" w:styleId="ColorfulGrid">
     <w:name w:val="Colorful Grid"/>
     <w:basedOn w:val="TableNormal"/>
     <w:uiPriority w:val="73"/>
@@ -22750,7 +23026,7 @@
       </w:tcPr>
     </w:tblStylePr>
   </w:style>
-  <w:style w:type="table" w:styleId="ColourfulGridAccent1">
+  <w:style w:type="table" w:styleId="ColorfulGrid-Accent1">
     <w:name w:val="Colorful Grid Accent 1"/>
     <w:basedOn w:val="TableNormal"/>
     <w:uiPriority w:val="73"/>
@@ -22823,7 +23099,7 @@
       </w:tcPr>
     </w:tblStylePr>
   </w:style>
-  <w:style w:type="table" w:styleId="ColourfulGridAccent2">
+  <w:style w:type="table" w:styleId="ColorfulGrid-Accent2">
     <w:name w:val="Colorful Grid Accent 2"/>
     <w:basedOn w:val="TableNormal"/>
     <w:uiPriority w:val="73"/>
@@ -22896,7 +23172,7 @@
       </w:tcPr>
     </w:tblStylePr>
   </w:style>
-  <w:style w:type="table" w:styleId="ColourfulGridAccent3">
+  <w:style w:type="table" w:styleId="ColorfulGrid-Accent3">
     <w:name w:val="Colorful Grid Accent 3"/>
     <w:basedOn w:val="TableNormal"/>
     <w:uiPriority w:val="73"/>
@@ -22969,7 +23245,7 @@
       </w:tcPr>
     </w:tblStylePr>
   </w:style>
-  <w:style w:type="table" w:styleId="ColourfulGridAccent4">
+  <w:style w:type="table" w:styleId="ColorfulGrid-Accent4">
     <w:name w:val="Colorful Grid Accent 4"/>
     <w:basedOn w:val="TableNormal"/>
     <w:uiPriority w:val="73"/>
@@ -23042,7 +23318,7 @@
       </w:tcPr>
     </w:tblStylePr>
   </w:style>
-  <w:style w:type="table" w:styleId="ColourfulGridAccent5">
+  <w:style w:type="table" w:styleId="ColorfulGrid-Accent5">
     <w:name w:val="Colorful Grid Accent 5"/>
     <w:basedOn w:val="TableNormal"/>
     <w:uiPriority w:val="73"/>
@@ -23115,7 +23391,7 @@
       </w:tcPr>
     </w:tblStylePr>
   </w:style>
-  <w:style w:type="table" w:styleId="ColourfulGridAccent6">
+  <w:style w:type="table" w:styleId="ColorfulGrid-Accent6">
     <w:name w:val="Colorful Grid Accent 6"/>
     <w:basedOn w:val="TableNormal"/>
     <w:uiPriority w:val="73"/>
@@ -23187,6 +23463,36 @@
         <w:shd w:val="clear" w:color="auto" w:fill="FBCAA2" w:themeFill="accent6" w:themeFillTint="7F"/>
       </w:tcPr>
     </w:tblStylePr>
+  </w:style>
+  <w:style w:type="paragraph" w:styleId="HTMLPreformatted">
+    <w:name w:val="HTML Preformatted"/>
+    <w:basedOn w:val="Normal"/>
+    <w:link w:val="HTMLPreformattedChar"/>
+    <w:uiPriority w:val="99"/>
+    <w:semiHidden/>
+    <w:unhideWhenUsed/>
+    <w:rsid w:val="002715F1"/>
+    <w:pPr>
+      <w:spacing w:after="0" w:line="240" w:lineRule="auto"/>
+    </w:pPr>
+    <w:rPr>
+      <w:rFonts w:ascii="Consolas" w:hAnsi="Consolas"/>
+      <w:sz w:val="20"/>
+      <w:szCs w:val="20"/>
+    </w:rPr>
+  </w:style>
+  <w:style w:type="character" w:customStyle="1" w:styleId="HTMLPreformattedChar">
+    <w:name w:val="HTML Preformatted Char"/>
+    <w:basedOn w:val="DefaultParagraphFont"/>
+    <w:link w:val="HTMLPreformatted"/>
+    <w:uiPriority w:val="99"/>
+    <w:semiHidden/>
+    <w:rsid w:val="002715F1"/>
+    <w:rPr>
+      <w:rFonts w:ascii="Consolas" w:hAnsi="Consolas"/>
+      <w:sz w:val="20"/>
+      <w:szCs w:val="20"/>
+    </w:rPr>
   </w:style>
 </w:styles>
 </file>

</xml_diff>

<commit_message>
Updated windows installation instructions
</commit_message>
<xml_diff>
--- a/audio-ML/Custom_TTS_Model/docs/TTS_Agent_Solution_Design.docx
+++ b/audio-ML/Custom_TTS_Model/docs/TTS_Agent_Solution_Design.docx
@@ -9459,7 +9459,45 @@
           <w:color w:val="2D3A4A"/>
           <w:sz w:val="17"/>
         </w:rPr>
-        <w:t># setup.sh auto-detects nvidia-smi and installs CUDA 12.1 PyTorch</w:t>
+        <w:t>pip install -r requirements.txt</w:t>
+      </w:r>
+    </w:p>
+    <w:p>
+      <w:pPr>
+        <w:shd w:val="clear" w:color="auto" w:fill="F0F1F5"/>
+        <w:spacing w:after="0"/>
+        <w:ind w:left="288" w:right="288"/>
+        <w:rPr>
+          <w:rFonts w:ascii="Courier New" w:hAnsi="Courier New"/>
+          <w:color w:val="2D3A4A"/>
+          <w:sz w:val="17"/>
+        </w:rPr>
+      </w:pPr>
+      <w:r>
+        <w:rPr>
+          <w:rFonts w:ascii="Courier New" w:hAnsi="Courier New"/>
+          <w:color w:val="2D3A4A"/>
+          <w:sz w:val="17"/>
+        </w:rPr>
+        <w:t xml:space="preserve"># setup.sh auto-detects </w:t>
+      </w:r>
+      <w:proofErr w:type="spellStart"/>
+      <w:r>
+        <w:rPr>
+          <w:rFonts w:ascii="Courier New" w:hAnsi="Courier New"/>
+          <w:color w:val="2D3A4A"/>
+          <w:sz w:val="17"/>
+        </w:rPr>
+        <w:t>nvidia-smi</w:t>
+      </w:r>
+      <w:proofErr w:type="spellEnd"/>
+      <w:r>
+        <w:rPr>
+          <w:rFonts w:ascii="Courier New" w:hAnsi="Courier New"/>
+          <w:color w:val="2D3A4A"/>
+          <w:sz w:val="17"/>
+        </w:rPr>
+        <w:t xml:space="preserve"> and installs CUDA 12.1 PyTorch</w:t>
       </w:r>
     </w:p>
     <w:p>

</xml_diff>

<commit_message>
Updated windows deployment steps
</commit_message>
<xml_diff>
--- a/audio-ML/Custom_TTS_Model/docs/TTS_Agent_Solution_Design.docx
+++ b/audio-ML/Custom_TTS_Model/docs/TTS_Agent_Solution_Design.docx
@@ -4596,7 +4596,6 @@
       <w:pPr>
         <w:spacing w:before="140" w:after="40"/>
       </w:pPr>
-      <w:proofErr w:type="spellStart"/>
       <w:r>
         <w:rPr>
           <w:b/>
@@ -4605,7 +4604,6 @@
         </w:rPr>
         <w:t>FastAPI</w:t>
       </w:r>
-      <w:proofErr w:type="spellEnd"/>
     </w:p>
     <w:p>
       <w:pPr>
@@ -5060,7 +5058,6 @@
       <w:pPr>
         <w:spacing w:before="140" w:after="40"/>
       </w:pPr>
-      <w:proofErr w:type="spellStart"/>
       <w:r>
         <w:rPr>
           <w:b/>
@@ -5070,7 +5067,6 @@
         <w:lastRenderedPageBreak/>
         <w:t>Uvicorn</w:t>
       </w:r>
-      <w:proofErr w:type="spellEnd"/>
     </w:p>
     <w:p>
       <w:pPr>
@@ -5462,43 +5458,7 @@
           <w:color w:val="2E74B5"/>
           <w:sz w:val="21"/>
         </w:rPr>
-        <w:t xml:space="preserve">How </w:t>
-      </w:r>
-      <w:proofErr w:type="spellStart"/>
-      <w:r>
-        <w:rPr>
-          <w:b/>
-          <w:color w:val="2E74B5"/>
-          <w:sz w:val="21"/>
-        </w:rPr>
-        <w:t>FastAPI</w:t>
-      </w:r>
-      <w:proofErr w:type="spellEnd"/>
-      <w:r>
-        <w:rPr>
-          <w:b/>
-          <w:color w:val="2E74B5"/>
-          <w:sz w:val="21"/>
-        </w:rPr>
-        <w:t xml:space="preserve"> and </w:t>
-      </w:r>
-      <w:proofErr w:type="spellStart"/>
-      <w:r>
-        <w:rPr>
-          <w:b/>
-          <w:color w:val="2E74B5"/>
-          <w:sz w:val="21"/>
-        </w:rPr>
-        <w:t>Uvicorn</w:t>
-      </w:r>
-      <w:proofErr w:type="spellEnd"/>
-      <w:r>
-        <w:rPr>
-          <w:b/>
-          <w:color w:val="2E74B5"/>
-          <w:sz w:val="21"/>
-        </w:rPr>
-        <w:t xml:space="preserve"> work together</w:t>
+        <w:t>How FastAPI and Uvicorn work together</w:t>
       </w:r>
     </w:p>
     <w:p>
@@ -9164,13 +9124,54 @@
     <w:p>
       <w:pPr>
         <w:spacing w:before="200" w:after="80"/>
-      </w:pPr>
-      <w:r>
         <w:rPr>
           <w:b/>
           <w:color w:val="44546E"/>
           <w:sz w:val="23"/>
         </w:rPr>
+      </w:pPr>
+    </w:p>
+    <w:p>
+      <w:pPr>
+        <w:spacing w:before="200" w:after="80"/>
+        <w:rPr>
+          <w:b/>
+          <w:color w:val="44546E"/>
+          <w:sz w:val="23"/>
+        </w:rPr>
+      </w:pPr>
+    </w:p>
+    <w:p>
+      <w:pPr>
+        <w:spacing w:before="200" w:after="80"/>
+        <w:rPr>
+          <w:b/>
+          <w:color w:val="44546E"/>
+          <w:sz w:val="23"/>
+        </w:rPr>
+      </w:pPr>
+    </w:p>
+    <w:p>
+      <w:pPr>
+        <w:spacing w:before="200" w:after="80"/>
+        <w:rPr>
+          <w:b/>
+          <w:color w:val="44546E"/>
+          <w:sz w:val="23"/>
+        </w:rPr>
+      </w:pPr>
+    </w:p>
+    <w:p>
+      <w:pPr>
+        <w:spacing w:before="200" w:after="80"/>
+      </w:pPr>
+      <w:r>
+        <w:rPr>
+          <w:b/>
+          <w:color w:val="44546E"/>
+          <w:sz w:val="23"/>
+        </w:rPr>
+        <w:lastRenderedPageBreak/>
         <w:t>11.2 Windows WSL2 (CUDA)</w:t>
       </w:r>
     </w:p>
@@ -9206,7 +9207,6 @@
           <w:color w:val="2E74B5"/>
           <w:sz w:val="20"/>
         </w:rPr>
-        <w:lastRenderedPageBreak/>
         <w:t>Phase 1 — Windows prerequisites (run in Windows PowerShell as Administrator)</w:t>
       </w:r>
     </w:p>
@@ -9479,25 +9479,7 @@
           <w:color w:val="2D3A4A"/>
           <w:sz w:val="17"/>
         </w:rPr>
-        <w:t xml:space="preserve"># setup.sh auto-detects </w:t>
-      </w:r>
-      <w:proofErr w:type="spellStart"/>
-      <w:r>
-        <w:rPr>
-          <w:rFonts w:ascii="Courier New" w:hAnsi="Courier New"/>
-          <w:color w:val="2D3A4A"/>
-          <w:sz w:val="17"/>
-        </w:rPr>
-        <w:t>nvidia-smi</w:t>
-      </w:r>
-      <w:proofErr w:type="spellEnd"/>
-      <w:r>
-        <w:rPr>
-          <w:rFonts w:ascii="Courier New" w:hAnsi="Courier New"/>
-          <w:color w:val="2D3A4A"/>
-          <w:sz w:val="17"/>
-        </w:rPr>
-        <w:t xml:space="preserve"> and installs CUDA 12.1 PyTorch</w:t>
+        <w:t># setup.sh auto-detects nvidia-smi and installs CUDA 12.1 PyTorch</w:t>
       </w:r>
     </w:p>
     <w:p>
@@ -9511,23 +9493,13 @@
           <w:sz w:val="17"/>
         </w:rPr>
       </w:pPr>
-      <w:proofErr w:type="spellStart"/>
-      <w:r>
-        <w:rPr>
-          <w:rFonts w:ascii="Courier New" w:hAnsi="Courier New"/>
-          <w:color w:val="2D3A4A"/>
-          <w:sz w:val="17"/>
-        </w:rPr>
-        <w:t>sudo</w:t>
-      </w:r>
-      <w:proofErr w:type="spellEnd"/>
-      <w:r>
-        <w:rPr>
-          <w:rFonts w:ascii="Courier New" w:hAnsi="Courier New"/>
-          <w:color w:val="2D3A4A"/>
-          <w:sz w:val="17"/>
-        </w:rPr>
-        <w:t xml:space="preserve"> apt-get install dos2unix -y</w:t>
+      <w:r>
+        <w:rPr>
+          <w:rFonts w:ascii="Courier New" w:hAnsi="Courier New"/>
+          <w:color w:val="2D3A4A"/>
+          <w:sz w:val="17"/>
+        </w:rPr>
+        <w:t>sudo apt-get install dos2unix -y</w:t>
       </w:r>
     </w:p>
     <w:p>
@@ -9824,15 +9796,7 @@
           <w:color w:val="1E202C"/>
           <w:sz w:val="20"/>
         </w:rPr>
-        <w:t xml:space="preserve">Docker is not the recommended deployment method for local developer machines in this project. The primary reason is GPU access: Docker Desktop on macOS runs a Linux VM that cannot expose the host’s Apple Silicon GPU (MPS), so synthesis falls back to CPU and takes 10–30× longer. On Windows the RTX 4080 is accessible via the NVIDIA Container Toolkit, but this adds installation complexity with no benefit </w:t>
-      </w:r>
-      <w:r>
-        <w:rPr>
-          <w:color w:val="1E202C"/>
-          <w:sz w:val="20"/>
-        </w:rPr>
-        <w:lastRenderedPageBreak/>
-        <w:t>over WSL2 native Python, which already provides full CUDA passthrough with zero containerisation overhead.</w:t>
+        <w:t>Docker is not the recommended deployment method for local developer machines in this project. The primary reason is GPU access: Docker Desktop on macOS runs a Linux VM that cannot expose the host’s Apple Silicon GPU (MPS), so synthesis falls back to CPU and takes 10–30× longer. On Windows the RTX 4080 is accessible via the NVIDIA Container Toolkit, but this adds installation complexity with no benefit over WSL2 native Python, which already provides full CUDA passthrough with zero containerisation overhead.</w:t>
       </w:r>
     </w:p>
     <w:p>
@@ -10312,13 +10276,40 @@
           <w:bottom w:val="single" w:sz="8" w:space="2" w:color="3C559A"/>
         </w:pBdr>
         <w:spacing w:before="320" w:after="80"/>
-      </w:pPr>
-      <w:r>
         <w:rPr>
           <w:b/>
           <w:color w:val="3C559A"/>
           <w:sz w:val="26"/>
         </w:rPr>
+      </w:pPr>
+    </w:p>
+    <w:p>
+      <w:pPr>
+        <w:pBdr>
+          <w:bottom w:val="single" w:sz="8" w:space="2" w:color="3C559A"/>
+        </w:pBdr>
+        <w:spacing w:before="320" w:after="80"/>
+        <w:rPr>
+          <w:b/>
+          <w:color w:val="3C559A"/>
+          <w:sz w:val="26"/>
+        </w:rPr>
+      </w:pPr>
+    </w:p>
+    <w:p>
+      <w:pPr>
+        <w:pBdr>
+          <w:bottom w:val="single" w:sz="8" w:space="2" w:color="3C559A"/>
+        </w:pBdr>
+        <w:spacing w:before="320" w:after="80"/>
+      </w:pPr>
+      <w:r>
+        <w:rPr>
+          <w:b/>
+          <w:color w:val="3C559A"/>
+          <w:sz w:val="26"/>
+        </w:rPr>
+        <w:lastRenderedPageBreak/>
         <w:t>11.5 TROUBLESHOOTING: espeak-ng on macOS</w:t>
       </w:r>
     </w:p>
@@ -10400,7 +10391,6 @@
           <w:color w:val="2D3A4A"/>
           <w:sz w:val="17"/>
         </w:rPr>
-        <w:lastRenderedPageBreak/>
         <w:t>brew install espeak-ng</w:t>
       </w:r>
     </w:p>
@@ -10415,11 +10405,6 @@
         </w:rPr>
         <w:t>This installs espeak-ng data to /opt/homebrew/lib/espeak-ng-data (34 chars — well within the 160-char limit). The updated _configure_espeak() in kokoro_engine.py checks this location first before falling back to espeakng_loader. setup.sh runs brew install espeak-ng automatically on macOS.</w:t>
       </w:r>
-    </w:p>
-    <w:p>
-      <w:pPr>
-        <w:spacing w:after="60"/>
-      </w:pPr>
     </w:p>
     <w:p>
       <w:pPr>
@@ -10860,11 +10845,169 @@
           <w:bottom w:val="single" w:sz="8" w:space="2" w:color="3C559A"/>
         </w:pBdr>
         <w:spacing w:before="320" w:after="80"/>
+      </w:pPr>
+      <w:r>
         <w:rPr>
           <w:b/>
           <w:color w:val="3C559A"/>
           <w:sz w:val="26"/>
         </w:rPr>
+        <w:t>12. TESTING</w:t>
+      </w:r>
+    </w:p>
+    <w:p>
+      <w:pPr>
+        <w:shd w:val="clear" w:color="auto" w:fill="F0F1F5"/>
+        <w:spacing w:after="0"/>
+        <w:ind w:left="288" w:right="288"/>
+      </w:pPr>
+      <w:r>
+        <w:rPr>
+          <w:rFonts w:ascii="Courier New" w:hAnsi="Courier New"/>
+          <w:color w:val="2D3A4A"/>
+          <w:sz w:val="17"/>
+        </w:rPr>
+        <w:t># Run all tests</w:t>
+      </w:r>
+    </w:p>
+    <w:p>
+      <w:pPr>
+        <w:shd w:val="clear" w:color="auto" w:fill="F0F1F5"/>
+        <w:spacing w:after="0"/>
+        <w:ind w:left="288" w:right="288"/>
+      </w:pPr>
+      <w:r>
+        <w:rPr>
+          <w:rFonts w:ascii="Courier New" w:hAnsi="Courier New"/>
+          <w:color w:val="2D3A4A"/>
+          <w:sz w:val="17"/>
+        </w:rPr>
+        <w:t>pytest tests/ -v</w:t>
+      </w:r>
+    </w:p>
+    <w:p>
+      <w:pPr>
+        <w:shd w:val="clear" w:color="auto" w:fill="F0F1F5"/>
+        <w:spacing w:after="0"/>
+        <w:ind w:left="288" w:right="288"/>
+      </w:pPr>
+      <w:r>
+        <w:rPr>
+          <w:rFonts w:ascii="Courier New" w:hAnsi="Courier New"/>
+          <w:color w:val="2D3A4A"/>
+          <w:sz w:val="17"/>
+        </w:rPr>
+        <w:t xml:space="preserve"> </w:t>
+      </w:r>
+    </w:p>
+    <w:p>
+      <w:pPr>
+        <w:shd w:val="clear" w:color="auto" w:fill="F0F1F5"/>
+        <w:spacing w:after="0"/>
+        <w:ind w:left="288" w:right="288"/>
+      </w:pPr>
+      <w:r>
+        <w:rPr>
+          <w:rFonts w:ascii="Courier New" w:hAnsi="Courier New"/>
+          <w:color w:val="2D3A4A"/>
+          <w:sz w:val="17"/>
+        </w:rPr>
+        <w:t># With coverage report</w:t>
+      </w:r>
+    </w:p>
+    <w:p>
+      <w:pPr>
+        <w:shd w:val="clear" w:color="auto" w:fill="F0F1F5"/>
+        <w:spacing w:after="0"/>
+        <w:ind w:left="288" w:right="288"/>
+      </w:pPr>
+      <w:r>
+        <w:rPr>
+          <w:rFonts w:ascii="Courier New" w:hAnsi="Courier New"/>
+          <w:color w:val="2D3A4A"/>
+          <w:sz w:val="17"/>
+        </w:rPr>
+        <w:t>pytest tests/ -v --cov=backend --cov=configs --cov-report=term-missing</w:t>
+      </w:r>
+    </w:p>
+    <w:p>
+      <w:pPr>
+        <w:shd w:val="clear" w:color="auto" w:fill="F0F1F5"/>
+        <w:spacing w:after="0"/>
+        <w:ind w:left="288" w:right="288"/>
+      </w:pPr>
+      <w:r>
+        <w:rPr>
+          <w:rFonts w:ascii="Courier New" w:hAnsi="Courier New"/>
+          <w:color w:val="2D3A4A"/>
+          <w:sz w:val="17"/>
+        </w:rPr>
+        <w:t xml:space="preserve"> </w:t>
+      </w:r>
+    </w:p>
+    <w:p>
+      <w:pPr>
+        <w:shd w:val="clear" w:color="auto" w:fill="F0F1F5"/>
+        <w:spacing w:after="0"/>
+        <w:ind w:left="288" w:right="288"/>
+      </w:pPr>
+      <w:r>
+        <w:rPr>
+          <w:rFonts w:ascii="Courier New" w:hAnsi="Courier New"/>
+          <w:color w:val="2D3A4A"/>
+          <w:sz w:val="17"/>
+        </w:rPr>
+        <w:t># Specific suites</w:t>
+      </w:r>
+    </w:p>
+    <w:p>
+      <w:pPr>
+        <w:shd w:val="clear" w:color="auto" w:fill="F0F1F5"/>
+        <w:spacing w:after="0"/>
+        <w:ind w:left="288" w:right="288"/>
+      </w:pPr>
+      <w:r>
+        <w:rPr>
+          <w:rFonts w:ascii="Courier New" w:hAnsi="Courier New"/>
+          <w:color w:val="2D3A4A"/>
+          <w:sz w:val="17"/>
+        </w:rPr>
+        <w:t>pytest tests/test_broadcast.py -v   # EBU R128 + audio pipeline</w:t>
+      </w:r>
+    </w:p>
+    <w:p>
+      <w:pPr>
+        <w:shd w:val="clear" w:color="auto" w:fill="F0F1F5"/>
+        <w:spacing w:after="0"/>
+        <w:ind w:left="288" w:right="288"/>
+      </w:pPr>
+      <w:r>
+        <w:rPr>
+          <w:rFonts w:ascii="Courier New" w:hAnsi="Courier New"/>
+          <w:color w:val="2D3A4A"/>
+          <w:sz w:val="17"/>
+        </w:rPr>
+        <w:t>pytest tests/test_ssml.py -v        # SSML parser</w:t>
+      </w:r>
+    </w:p>
+    <w:p>
+      <w:pPr>
+        <w:shd w:val="clear" w:color="auto" w:fill="F0F1F5"/>
+        <w:spacing w:after="0"/>
+        <w:ind w:left="288" w:right="288"/>
+      </w:pPr>
+      <w:r>
+        <w:rPr>
+          <w:rFonts w:ascii="Courier New" w:hAnsi="Courier New"/>
+          <w:color w:val="2D3A4A"/>
+          <w:sz w:val="17"/>
+        </w:rPr>
+        <w:t>pytest tests/test_api.py -v         # API integration</w:t>
+      </w:r>
+    </w:p>
+    <w:p>
+      <w:pPr>
+        <w:spacing w:after="40"/>
       </w:pPr>
     </w:p>
     <w:p>
@@ -10880,177 +11023,7 @@
           <w:color w:val="3C559A"/>
           <w:sz w:val="26"/>
         </w:rPr>
-        <w:t>12. TESTING</w:t>
-      </w:r>
-    </w:p>
-    <w:p>
-      <w:pPr>
-        <w:shd w:val="clear" w:color="auto" w:fill="F0F1F5"/>
-        <w:spacing w:after="0"/>
-        <w:ind w:left="288" w:right="288"/>
-      </w:pPr>
-      <w:r>
-        <w:rPr>
-          <w:rFonts w:ascii="Courier New" w:hAnsi="Courier New"/>
-          <w:color w:val="2D3A4A"/>
-          <w:sz w:val="17"/>
-        </w:rPr>
-        <w:t># Run all tests</w:t>
-      </w:r>
-    </w:p>
-    <w:p>
-      <w:pPr>
-        <w:shd w:val="clear" w:color="auto" w:fill="F0F1F5"/>
-        <w:spacing w:after="0"/>
-        <w:ind w:left="288" w:right="288"/>
-      </w:pPr>
-      <w:r>
-        <w:rPr>
-          <w:rFonts w:ascii="Courier New" w:hAnsi="Courier New"/>
-          <w:color w:val="2D3A4A"/>
-          <w:sz w:val="17"/>
-        </w:rPr>
-        <w:t>pytest tests/ -v</w:t>
-      </w:r>
-    </w:p>
-    <w:p>
-      <w:pPr>
-        <w:shd w:val="clear" w:color="auto" w:fill="F0F1F5"/>
-        <w:spacing w:after="0"/>
-        <w:ind w:left="288" w:right="288"/>
-      </w:pPr>
-      <w:r>
-        <w:rPr>
-          <w:rFonts w:ascii="Courier New" w:hAnsi="Courier New"/>
-          <w:color w:val="2D3A4A"/>
-          <w:sz w:val="17"/>
-        </w:rPr>
-        <w:t xml:space="preserve"> </w:t>
-      </w:r>
-    </w:p>
-    <w:p>
-      <w:pPr>
-        <w:shd w:val="clear" w:color="auto" w:fill="F0F1F5"/>
-        <w:spacing w:after="0"/>
-        <w:ind w:left="288" w:right="288"/>
-      </w:pPr>
-      <w:r>
-        <w:rPr>
-          <w:rFonts w:ascii="Courier New" w:hAnsi="Courier New"/>
-          <w:color w:val="2D3A4A"/>
-          <w:sz w:val="17"/>
-        </w:rPr>
-        <w:t># With coverage report</w:t>
-      </w:r>
-    </w:p>
-    <w:p>
-      <w:pPr>
-        <w:shd w:val="clear" w:color="auto" w:fill="F0F1F5"/>
-        <w:spacing w:after="0"/>
-        <w:ind w:left="288" w:right="288"/>
-      </w:pPr>
-      <w:r>
-        <w:rPr>
-          <w:rFonts w:ascii="Courier New" w:hAnsi="Courier New"/>
-          <w:color w:val="2D3A4A"/>
-          <w:sz w:val="17"/>
-        </w:rPr>
-        <w:t>pytest tests/ -v --cov=backend --cov=configs --cov-report=term-missing</w:t>
-      </w:r>
-    </w:p>
-    <w:p>
-      <w:pPr>
-        <w:shd w:val="clear" w:color="auto" w:fill="F0F1F5"/>
-        <w:spacing w:after="0"/>
-        <w:ind w:left="288" w:right="288"/>
-      </w:pPr>
-      <w:r>
-        <w:rPr>
-          <w:rFonts w:ascii="Courier New" w:hAnsi="Courier New"/>
-          <w:color w:val="2D3A4A"/>
-          <w:sz w:val="17"/>
-        </w:rPr>
-        <w:t xml:space="preserve"> </w:t>
-      </w:r>
-    </w:p>
-    <w:p>
-      <w:pPr>
-        <w:shd w:val="clear" w:color="auto" w:fill="F0F1F5"/>
-        <w:spacing w:after="0"/>
-        <w:ind w:left="288" w:right="288"/>
-      </w:pPr>
-      <w:r>
-        <w:rPr>
-          <w:rFonts w:ascii="Courier New" w:hAnsi="Courier New"/>
-          <w:color w:val="2D3A4A"/>
-          <w:sz w:val="17"/>
-        </w:rPr>
-        <w:t># Specific suites</w:t>
-      </w:r>
-    </w:p>
-    <w:p>
-      <w:pPr>
-        <w:shd w:val="clear" w:color="auto" w:fill="F0F1F5"/>
-        <w:spacing w:after="0"/>
-        <w:ind w:left="288" w:right="288"/>
-      </w:pPr>
-      <w:r>
-        <w:rPr>
-          <w:rFonts w:ascii="Courier New" w:hAnsi="Courier New"/>
-          <w:color w:val="2D3A4A"/>
-          <w:sz w:val="17"/>
-        </w:rPr>
-        <w:t>pytest tests/test_broadcast.py -v   # EBU R128 + audio pipeline</w:t>
-      </w:r>
-    </w:p>
-    <w:p>
-      <w:pPr>
-        <w:shd w:val="clear" w:color="auto" w:fill="F0F1F5"/>
-        <w:spacing w:after="0"/>
-        <w:ind w:left="288" w:right="288"/>
-      </w:pPr>
-      <w:r>
-        <w:rPr>
-          <w:rFonts w:ascii="Courier New" w:hAnsi="Courier New"/>
-          <w:color w:val="2D3A4A"/>
-          <w:sz w:val="17"/>
-        </w:rPr>
-        <w:t>pytest tests/test_ssml.py -v        # SSML parser</w:t>
-      </w:r>
-    </w:p>
-    <w:p>
-      <w:pPr>
-        <w:shd w:val="clear" w:color="auto" w:fill="F0F1F5"/>
-        <w:spacing w:after="0"/>
-        <w:ind w:left="288" w:right="288"/>
-      </w:pPr>
-      <w:r>
-        <w:rPr>
-          <w:rFonts w:ascii="Courier New" w:hAnsi="Courier New"/>
-          <w:color w:val="2D3A4A"/>
-          <w:sz w:val="17"/>
-        </w:rPr>
-        <w:t>pytest tests/test_api.py -v         # API integration</w:t>
-      </w:r>
-    </w:p>
-    <w:p>
-      <w:pPr>
-        <w:spacing w:after="40"/>
-      </w:pPr>
-    </w:p>
-    <w:p>
-      <w:pPr>
-        <w:pBdr>
-          <w:bottom w:val="single" w:sz="8" w:space="2" w:color="3C559A"/>
-        </w:pBdr>
-        <w:spacing w:before="320" w:after="80"/>
-      </w:pPr>
-      <w:r>
-        <w:rPr>
-          <w:b/>
-          <w:color w:val="3C559A"/>
-          <w:sz w:val="26"/>
-        </w:rPr>
+        <w:lastRenderedPageBreak/>
         <w:t>13. API QUICK REFERENCE</w:t>
       </w:r>
     </w:p>
@@ -11256,7 +11229,6 @@
                 <w:color w:val="1E202C"/>
                 <w:sz w:val="18"/>
               </w:rPr>
-              <w:lastRenderedPageBreak/>
               <w:t>GET</w:t>
             </w:r>
           </w:p>
@@ -11844,26 +11816,6 @@
         </w:rPr>
         <w:t>Coqui XTTS-v2 was explicitly excluded from this design because its license restricts revenue-generating usage and is not appropriate for monetisable documentary work.</w:t>
       </w:r>
-    </w:p>
-    <w:p>
-      <w:pPr>
-        <w:spacing w:after="160"/>
-      </w:pPr>
-    </w:p>
-    <w:p>
-      <w:pPr>
-        <w:spacing w:after="160"/>
-      </w:pPr>
-    </w:p>
-    <w:p>
-      <w:pPr>
-        <w:spacing w:after="160"/>
-      </w:pPr>
-    </w:p>
-    <w:p>
-      <w:pPr>
-        <w:spacing w:after="160"/>
-      </w:pPr>
     </w:p>
     <w:p>
       <w:pPr>

</xml_diff>

<commit_message>
changing model from F5-TTS to Coqui TTS
</commit_message>
<xml_diff>
--- a/audio-ML/Custom_TTS_Model/docs/TTS_Agent_Solution_Design.docx
+++ b/audio-ML/Custom_TTS_Model/docs/TTS_Agent_Solution_Design.docx
@@ -554,6 +554,100 @@
           </w:p>
         </w:tc>
       </w:tr>
+      <w:tr>
+        <w:tc>
+          <w:tcPr>
+            <w:tcW w:w="0" w:type="auto"/>
+            <w:tcBorders>
+              <w:top w:val="single" w:sz="4" w:space="0" w:color="CCCCCC"/>
+              <w:left w:val="single" w:sz="4" w:space="0" w:color="CCCCCC"/>
+              <w:bottom w:val="single" w:sz="4" w:space="0" w:color="CCCCCC"/>
+              <w:right w:val="single" w:sz="4" w:space="0" w:color="CCCCCC"/>
+            </w:tcBorders>
+            <w:shd w:val="clear" w:color="auto" w:fill="F8F9FA"/>
+          </w:tcPr>
+          <w:p>
+            <w:pPr>
+              <w:spacing w:after="60"/>
+            </w:pPr>
+            <w:r>
+              <w:rPr>
+                <w:sz w:val="18"/>
+              </w:rPr>
+              <w:t>3.0</w:t>
+            </w:r>
+          </w:p>
+        </w:tc>
+        <w:tc>
+          <w:tcPr>
+            <w:tcW w:w="0" w:type="auto"/>
+            <w:tcBorders>
+              <w:top w:val="single" w:sz="4" w:space="0" w:color="CCCCCC"/>
+              <w:left w:val="single" w:sz="4" w:space="0" w:color="CCCCCC"/>
+              <w:bottom w:val="single" w:sz="4" w:space="0" w:color="CCCCCC"/>
+              <w:right w:val="single" w:sz="4" w:space="0" w:color="CCCCCC"/>
+            </w:tcBorders>
+            <w:shd w:val="clear" w:color="auto" w:fill="F8F9FA"/>
+          </w:tcPr>
+          <w:p>
+            <w:pPr>
+              <w:spacing w:after="60"/>
+            </w:pPr>
+            <w:r>
+              <w:rPr>
+                <w:sz w:val="18"/>
+              </w:rPr>
+              <w:t>2026-05-24</w:t>
+            </w:r>
+          </w:p>
+        </w:tc>
+        <w:tc>
+          <w:tcPr>
+            <w:tcW w:w="0" w:type="auto"/>
+            <w:tcBorders>
+              <w:top w:val="single" w:sz="4" w:space="0" w:color="CCCCCC"/>
+              <w:left w:val="single" w:sz="4" w:space="0" w:color="CCCCCC"/>
+              <w:bottom w:val="single" w:sz="4" w:space="0" w:color="CCCCCC"/>
+              <w:right w:val="single" w:sz="4" w:space="0" w:color="CCCCCC"/>
+            </w:tcBorders>
+            <w:shd w:val="clear" w:color="auto" w:fill="F8F9FA"/>
+          </w:tcPr>
+          <w:p>
+            <w:pPr>
+              <w:spacing w:after="60"/>
+            </w:pPr>
+            <w:r>
+              <w:rPr>
+                <w:sz w:val="18"/>
+              </w:rPr>
+              <w:t>Engineering</w:t>
+            </w:r>
+          </w:p>
+        </w:tc>
+        <w:tc>
+          <w:tcPr>
+            <w:tcW w:w="0" w:type="auto"/>
+            <w:tcBorders>
+              <w:top w:val="single" w:sz="4" w:space="0" w:color="CCCCCC"/>
+              <w:left w:val="single" w:sz="4" w:space="0" w:color="CCCCCC"/>
+              <w:bottom w:val="single" w:sz="4" w:space="0" w:color="CCCCCC"/>
+              <w:right w:val="single" w:sz="4" w:space="0" w:color="CCCCCC"/>
+            </w:tcBorders>
+            <w:shd w:val="clear" w:color="auto" w:fill="F8F9FA"/>
+          </w:tcPr>
+          <w:p>
+            <w:pPr>
+              <w:spacing w:after="60"/>
+            </w:pPr>
+            <w:r>
+              <w:rPr>
+                <w:sz w:val="18"/>
+              </w:rPr>
+              <w:t>F5-TTS replaced with XTTS v2 (Coqui TTS); Test Results tab; Windows native deployment guide</w:t>
+            </w:r>
+          </w:p>
+        </w:tc>
+      </w:tr>
     </w:tbl>
     <w:p/>
     <w:p>
@@ -767,7 +861,7 @@
           <w:color w:val="1E202C"/>
           <w:sz w:val="20"/>
         </w:rPr>
-        <w:t>This document describes the architecture and implementation of TTS Agent — a production-oriented, locally deployed text-to-speech system designed for documentary narration, training material, and professional media workflows. The system combines two commercially licensed open-source models: Kokoro-82M for high-quality built-in voices spanning 9 languages (54 voices covering American English, British English, Hindi, Spanish, French, Italian, Brazilian Portuguese, Japanese, and Mandarin Chinese), and F5-TTS for zero-shot voice cloning. Both operate behind a FastAPI service with a lightweight browser UI and are packaged for GPU-accelerated local deployment, with native support for macOS Apple Silicon (MPS) and Windows WSL2 (CUDA).</w:t>
+        <w:t>This document describes the architecture and implementation of TTS Agent — a production-oriented, locally deployed text-to-speech system designed for documentary narration, training material, and professional media workflows. The system combines two commercially licensed open-source models: Kokoro-82M for high-quality built-in voices spanning 9 languages (54 voices covering American English, British English, Hindi, Spanish, French, Italian, Brazilian Portuguese, Japanese, and Mandarin Chinese), and XTTS v2 (Coqui TTS) for zero-shot voice cloning across 17 languages including Hindi and Japanese. Both operate behind a FastAPI service with a lightweight browser UI featuring three tabs: Built-in Voices, Cloned Voice Synthesis, and Test Results. The system is packaged for GPU-accelerated local deployment with native support for macOS Apple Silicon (MPS), Windows native (CUDA/CPU), and Windows WSL2 (CUDA).</w:t>
       </w:r>
     </w:p>
     <w:p>
@@ -1620,7 +1714,7 @@
                 <w:color w:val="1E202C"/>
                 <w:sz w:val="19"/>
               </w:rPr>
-              <w:t>Professional audio delivery formats require 44.1 kHz stereo WAV (CD-quality, standard for broadcast ingest). The synthesis engines produce audio at 24 kHz (Kokoro) or 22.05 kHz (F5-TTS). A high-quality resampling stage using sinc interpolation upsamples to 44.1 kHz, converts to stereo, and optionally exports as 24-bit WAV for archival fidelity. This format is accepted directly by non-linear editing systems (DaVinci Resolve, Adobe Premiere, Avid) without additional conversion.</w:t>
+              <w:t>Professional audio delivery formats require 44.1 kHz stereo WAV (CD-quality, standard for broadcast ingest). The synthesis engines produce audio at 24 kHz (Kokoro) or 24 kHz (XTTS v2). A high-quality resampling stage using sinc interpolation upsamples to 44.1 kHz, converts to stereo, and optionally exports as 24-bit WAV for archival fidelity. This format is accepted directly by non-linear editing systems (DaVinci Resolve, Adobe Premiere, Avid) without additional conversion.</w:t>
             </w:r>
           </w:p>
         </w:tc>
@@ -3403,7 +3497,7 @@
           <w:color w:val="1E202C"/>
           <w:sz w:val="20"/>
         </w:rPr>
-        <w:t>Apache 2.0 (Kokoro) and MIT (F5-TTS) licenses permit commercial output usage.</w:t>
+        <w:t>Apache 2.0 (Kokoro) and Coqui Public Model License v1.0 (XTTS v2) permit commercial output usage (CPML: revenue ≤ $1M/yr).</w:t>
       </w:r>
     </w:p>
     <w:p>
@@ -3846,7 +3940,7 @@
                 <w:color w:val="1E202C"/>
                 <w:sz w:val="18"/>
               </w:rPr>
-              <w:t>F5-TTS</w:t>
+              <w:t>XTTS v2 (Coqui TTS)</w:t>
             </w:r>
           </w:p>
         </w:tc>
@@ -3882,7 +3976,7 @@
                 <w:color w:val="1E202C"/>
                 <w:sz w:val="18"/>
               </w:rPr>
-              <w:t>Zero-shot voice cloning</w:t>
+              <w:t>Zero-shot voice cloning, 17 languages (en/hi/ja/es/fr/de/it/pt/ko/ar/zh-cn/ru/nl/cs/pl/tr/hu), ~1.8 GB model</w:t>
             </w:r>
           </w:p>
         </w:tc>

</xml_diff>

<commit_message>
updated windows specific instructions
</commit_message>
<xml_diff>
--- a/audio-ML/Custom_TTS_Model/docs/TTS_Agent_Solution_Design.docx
+++ b/audio-ML/Custom_TTS_Model/docs/TTS_Agent_Solution_Design.docx
@@ -620,7 +620,7 @@
               <w:rPr>
                 <w:sz w:val="18"/>
               </w:rPr>
-              <w:t>Engineering</w:t>
+              <w:t>Rommel Sharma</w:t>
             </w:r>
           </w:p>
         </w:tc>
@@ -873,7 +873,15 @@
           <w:color w:val="1E202C"/>
           <w:sz w:val="20"/>
         </w:rPr>
-        <w:t>Version 2.0 extends the system with four broadcast-grade capabilities: 44.1 kHz stereo export for professional delivery, SSML-style pause and emphasis controls for narration scripting, batch synthesis for full documentary scripts, and EBU R128 loudness normalization with noise reduction for broadcast-compliant audio post-processing.</w:t>
+        <w:t xml:space="preserve">Version 2.0 extends the system with four broadcast-grade capabilities: 44.1 kHz stereo export for professional delivery, SSML-style pause and emphasis controls for narration scripting, batch synthesis for </w:t>
+      </w:r>
+      <w:r>
+        <w:rPr>
+          <w:color w:val="1E202C"/>
+          <w:sz w:val="20"/>
+        </w:rPr>
+        <w:lastRenderedPageBreak/>
+        <w:t>full documentary scripts, and EBU R128 loudness normalization with noise reduction for broadcast-compliant audio post-processing.</w:t>
       </w:r>
     </w:p>
     <w:p>
@@ -889,7 +897,6 @@
           <w:color w:val="3C559A"/>
           <w:sz w:val="26"/>
         </w:rPr>
-        <w:lastRenderedPageBreak/>
         <w:t>2. INTRODUCTION</w:t>
       </w:r>
     </w:p>
@@ -1649,7 +1656,6 @@
           <w:color w:val="3C559A"/>
           <w:sz w:val="26"/>
         </w:rPr>
-        <w:lastRenderedPageBreak/>
         <w:t>4. SYSTEM CAPABILITIES (V2.0)</w:t>
       </w:r>
     </w:p>
@@ -2021,7 +2027,6 @@
           <w:color w:val="1E202C"/>
           <w:sz w:val="20"/>
         </w:rPr>
-        <w:lastRenderedPageBreak/>
         <w:t>Key implementation details:</w:t>
       </w:r>
     </w:p>
@@ -2995,7 +3000,14 @@
               <w:rPr>
                 <w:sz w:val="18"/>
               </w:rPr>
-              <w:t>Best non-English quality. SIWIS dataset (&lt;11 h training). Strong for professional French narration.</w:t>
+              <w:t xml:space="preserve">Best non-English quality. SIWIS dataset (&lt;11 </w:t>
+            </w:r>
+            <w:r>
+              <w:rPr>
+                <w:sz w:val="18"/>
+              </w:rPr>
+              <w:lastRenderedPageBreak/>
+              <w:t>h training). Strong for professional French narration.</w:t>
             </w:r>
           </w:p>
         </w:tc>
@@ -3020,6 +3032,7 @@
                 <w:b/>
                 <w:sz w:val="18"/>
               </w:rPr>
+              <w:lastRenderedPageBreak/>
               <w:t>Italian</w:t>
             </w:r>
           </w:p>
@@ -3042,9 +3055,7 @@
               <w:rPr>
                 <w:sz w:val="18"/>
               </w:rPr>
-              <w:t xml:space="preserve">2 (1F + </w:t>
-              <w:lastRenderedPageBreak/>
-              <w:t>1M)</w:t>
+              <w:t>2 (1F + 1M)</w:t>
             </w:r>
           </w:p>
         </w:tc>
@@ -3066,7 +3077,6 @@
               <w:rPr>
                 <w:sz w:val="18"/>
               </w:rPr>
-              <w:lastRenderedPageBreak/>
               <w:t>C</w:t>
             </w:r>
           </w:p>
@@ -3712,11 +3722,11 @@
         <w:tblLook w:val="04A0" w:firstRow="1" w:lastRow="0" w:firstColumn="1" w:lastColumn="0" w:noHBand="0" w:noVBand="1"/>
       </w:tblPr>
       <w:tblGrid>
-        <w:gridCol w:w="1579"/>
-        <w:gridCol w:w="1792"/>
-        <w:gridCol w:w="1520"/>
-        <w:gridCol w:w="2884"/>
-        <w:gridCol w:w="1513"/>
+        <w:gridCol w:w="1478"/>
+        <w:gridCol w:w="1698"/>
+        <w:gridCol w:w="1395"/>
+        <w:gridCol w:w="3331"/>
+        <w:gridCol w:w="1386"/>
       </w:tblGrid>
       <w:tr>
         <w:tc>
@@ -4290,6 +4300,7 @@
                 <w:color w:val="1E202C"/>
                 <w:sz w:val="18"/>
               </w:rPr>
+              <w:lastRenderedPageBreak/>
               <w:t>Audio Processing</w:t>
             </w:r>
           </w:p>
@@ -4655,7 +4666,6 @@
           <w:color w:val="44546E"/>
           <w:sz w:val="23"/>
         </w:rPr>
-        <w:lastRenderedPageBreak/>
         <w:t>6.1  Fundamentals of Backend: FastAPI + Uvicorn</w:t>
       </w:r>
     </w:p>
@@ -5153,7 +5163,6 @@
           <w:color w:val="2E74B5"/>
           <w:sz w:val="21"/>
         </w:rPr>
-        <w:lastRenderedPageBreak/>
         <w:t>Uvicorn</w:t>
       </w:r>
     </w:p>
@@ -5626,7 +5635,6 @@
           <w:color w:val="3C559A"/>
           <w:sz w:val="26"/>
         </w:rPr>
-        <w:lastRenderedPageBreak/>
         <w:t>7. SYSTEM ARCHITECTURE</w:t>
       </w:r>
     </w:p>
@@ -6305,6 +6313,7 @@
           <w:color w:val="2D3A4A"/>
           <w:sz w:val="17"/>
         </w:rPr>
+        <w:lastRenderedPageBreak/>
         <w:t xml:space="preserve">                 ┌────────────────────┐</w:t>
       </w:r>
     </w:p>
@@ -6403,7 +6412,6 @@
           <w:color w:val="44546E"/>
           <w:sz w:val="23"/>
         </w:rPr>
-        <w:lastRenderedPageBreak/>
         <w:t>7.2 Batch Synthesis Flow</w:t>
       </w:r>
     </w:p>
@@ -6977,6 +6985,7 @@
           <w:color w:val="2D3A4A"/>
           <w:sz w:val="17"/>
         </w:rPr>
+        <w:lastRenderedPageBreak/>
         <w:t xml:space="preserve">  │  NOISE REDUCTION                                │</w:t>
       </w:r>
     </w:p>
@@ -7112,7 +7121,6 @@
           <w:color w:val="2D3A4A"/>
           <w:sz w:val="17"/>
         </w:rPr>
-        <w:lastRenderedPageBreak/>
         <w:t xml:space="preserve">  │  High-pass @ 80 Hz  — removes low rumble        │</w:t>
       </w:r>
     </w:p>
@@ -7726,7 +7734,6 @@
           <w:color w:val="3C559A"/>
           <w:sz w:val="26"/>
         </w:rPr>
-        <w:lastRenderedPageBreak/>
         <w:t xml:space="preserve">9. SSML </w:t>
       </w:r>
       <w:r>
@@ -8573,6 +8580,7 @@
           <w:color w:val="2D3A4A"/>
           <w:sz w:val="17"/>
         </w:rPr>
+        <w:lastRenderedPageBreak/>
         <w:t>│       ├── audio.py              # Core audio: resample, normalize, trim</w:t>
       </w:r>
     </w:p>
@@ -8648,7 +8656,6 @@
           <w:color w:val="2D3A4A"/>
           <w:sz w:val="17"/>
         </w:rPr>
-        <w:lastRenderedPageBreak/>
         <w:t>│       └── logger.py             # Structured stdout logging</w:t>
       </w:r>
     </w:p>
@@ -9252,7 +9259,6 @@
           <w:color w:val="44546E"/>
           <w:sz w:val="23"/>
         </w:rPr>
-        <w:lastRenderedPageBreak/>
         <w:t>11.2 Windows WSL2 (CUDA)</w:t>
       </w:r>
     </w:p>
@@ -9280,6 +9286,14 @@
     </w:p>
     <w:p>
       <w:pPr>
+        <w:pStyle w:val="Heading3"/>
+      </w:pPr>
+      <w:r>
+        <w:t>For Setup, the first time</w:t>
+      </w:r>
+    </w:p>
+    <w:p>
+      <w:pPr>
         <w:spacing w:before="120" w:after="40"/>
       </w:pPr>
       <w:r>
@@ -9535,7 +9549,7 @@
           <w:color w:val="2D3A4A"/>
           <w:sz w:val="17"/>
         </w:rPr>
-        <w:t xml:space="preserve"># Git on Windows uses CRLF line endings; convert to LF before running</w:t>
+        <w:t># Git on Windows uses CRLF line endings; convert to LF before running</w:t>
       </w:r>
     </w:p>
     <w:p>
@@ -9580,7 +9594,7 @@
           <w:color w:val="2D3A4A"/>
           <w:sz w:val="17"/>
         </w:rPr>
-        <w:t xml:space="preserve"># setup.sh creates the venv, installs all deps, and selects CUDA 12.1 PyTorch</w:t>
+        <w:t># setup.sh creates the venv, installs all deps, and selects CUDA 12.1 PyTorch</w:t>
       </w:r>
     </w:p>
     <w:p>
@@ -9709,6 +9723,7 @@
           <w:color w:val="2E74B5"/>
           <w:sz w:val="20"/>
         </w:rPr>
+        <w:lastRenderedPageBreak/>
         <w:t>Phase 7 — Verify CUDA is active inside Python</w:t>
       </w:r>
     </w:p>
@@ -9829,6 +9844,186 @@
         </w:rPr>
         <w:t>explorer.exe http://localhost:8000</w:t>
       </w:r>
+    </w:p>
+    <w:p>
+      <w:pPr>
+        <w:spacing w:after="40"/>
+      </w:pPr>
+    </w:p>
+    <w:p>
+      <w:pPr>
+        <w:spacing w:after="40"/>
+      </w:pPr>
+    </w:p>
+    <w:p>
+      <w:pPr>
+        <w:pStyle w:val="Heading3"/>
+      </w:pPr>
+      <w:r>
+        <w:t>Once set up is done</w:t>
+      </w:r>
+      <w:r>
+        <w:br/>
+      </w:r>
+    </w:p>
+    <w:p>
+      <w:pPr>
+        <w:pStyle w:val="ListParagraph"/>
+        <w:numPr>
+          <w:ilvl w:val="0"/>
+          <w:numId w:val="13"/>
+        </w:numPr>
+        <w:ind w:left="426" w:firstLine="0"/>
+      </w:pPr>
+      <w:r>
+        <w:t>Open windows terminal</w:t>
+      </w:r>
+      <w:r>
+        <w:t xml:space="preserve"> and type:</w:t>
+      </w:r>
+      <w:r>
+        <w:br/>
+      </w:r>
+      <w:proofErr w:type="spellStart"/>
+      <w:r>
+        <w:t>wsl</w:t>
+      </w:r>
+      <w:proofErr w:type="spellEnd"/>
+    </w:p>
+    <w:p>
+      <w:pPr>
+        <w:pStyle w:val="ListParagraph"/>
+        <w:numPr>
+          <w:ilvl w:val="0"/>
+          <w:numId w:val="13"/>
+        </w:numPr>
+        <w:ind w:left="426" w:firstLine="0"/>
+      </w:pPr>
+      <w:r>
+        <w:t>Once in windows systems for Linux (ubuntu), go to home directory where git repository is already cloned</w:t>
+      </w:r>
+      <w:r>
+        <w:br/>
+        <w:t>cd ~</w:t>
+      </w:r>
+    </w:p>
+    <w:p>
+      <w:pPr>
+        <w:pStyle w:val="ListParagraph"/>
+        <w:numPr>
+          <w:ilvl w:val="0"/>
+          <w:numId w:val="13"/>
+        </w:numPr>
+        <w:ind w:left="426" w:firstLine="0"/>
+      </w:pPr>
+      <w:r>
+        <w:t>dos2unix scripts/setup.sh</w:t>
+      </w:r>
+    </w:p>
+    <w:p>
+      <w:pPr>
+        <w:pStyle w:val="ListParagraph"/>
+        <w:numPr>
+          <w:ilvl w:val="0"/>
+          <w:numId w:val="13"/>
+        </w:numPr>
+        <w:ind w:left="426" w:firstLine="0"/>
+      </w:pPr>
+      <w:r>
+        <w:t>bash scripts/setup.sh</w:t>
+      </w:r>
+    </w:p>
+    <w:p>
+      <w:pPr>
+        <w:pStyle w:val="ListParagraph"/>
+        <w:numPr>
+          <w:ilvl w:val="0"/>
+          <w:numId w:val="13"/>
+        </w:numPr>
+        <w:ind w:left="426" w:firstLine="0"/>
+      </w:pPr>
+      <w:r>
+        <w:t xml:space="preserve">source </w:t>
+      </w:r>
+      <w:proofErr w:type="spellStart"/>
+      <w:r>
+        <w:t>venv</w:t>
+      </w:r>
+      <w:proofErr w:type="spellEnd"/>
+      <w:r>
+        <w:t>/bin/activate</w:t>
+      </w:r>
+    </w:p>
+    <w:p>
+      <w:pPr>
+        <w:pStyle w:val="ListParagraph"/>
+        <w:numPr>
+          <w:ilvl w:val="0"/>
+          <w:numId w:val="13"/>
+        </w:numPr>
+        <w:ind w:left="426" w:firstLine="0"/>
+      </w:pPr>
+      <w:r>
+        <w:t>python scripts/download_models.py</w:t>
+      </w:r>
+    </w:p>
+    <w:p>
+      <w:pPr>
+        <w:pStyle w:val="ListParagraph"/>
+        <w:numPr>
+          <w:ilvl w:val="0"/>
+          <w:numId w:val="13"/>
+        </w:numPr>
+        <w:ind w:left="426" w:firstLine="0"/>
+      </w:pPr>
+      <w:proofErr w:type="spellStart"/>
+      <w:r>
+        <w:rPr>
+          <w:rFonts w:ascii="Courier New" w:hAnsi="Courier New"/>
+          <w:color w:val="2D3A4A"/>
+          <w:sz w:val="17"/>
+        </w:rPr>
+        <w:t>uvicorn</w:t>
+      </w:r>
+      <w:proofErr w:type="spellEnd"/>
+      <w:r>
+        <w:rPr>
+          <w:rFonts w:ascii="Courier New" w:hAnsi="Courier New"/>
+          <w:color w:val="2D3A4A"/>
+          <w:sz w:val="17"/>
+        </w:rPr>
+        <w:t xml:space="preserve"> </w:t>
+      </w:r>
+      <w:proofErr w:type="spellStart"/>
+      <w:r>
+        <w:rPr>
+          <w:rFonts w:ascii="Courier New" w:hAnsi="Courier New"/>
+          <w:color w:val="2D3A4A"/>
+          <w:sz w:val="17"/>
+        </w:rPr>
+        <w:t>backend.app:app</w:t>
+      </w:r>
+      <w:proofErr w:type="spellEnd"/>
+      <w:r>
+        <w:rPr>
+          <w:rFonts w:ascii="Courier New" w:hAnsi="Courier New"/>
+          <w:color w:val="2D3A4A"/>
+          <w:sz w:val="17"/>
+        </w:rPr>
+        <w:t xml:space="preserve"> --host 0.0.0.0 --port 8000 --reload</w:t>
+      </w:r>
+    </w:p>
+    <w:p>
+      <w:pPr>
+        <w:pStyle w:val="ListParagraph"/>
+        <w:ind w:left="426"/>
+      </w:pPr>
+    </w:p>
+    <w:p>
+      <w:pPr>
+        <w:pStyle w:val="ListParagraph"/>
+        <w:ind w:left="426"/>
+      </w:pPr>
     </w:p>
     <w:p>
       <w:pPr>
@@ -10058,6 +10253,7 @@
                 <w:b/>
                 <w:sz w:val="18"/>
               </w:rPr>
+              <w:lastRenderedPageBreak/>
               <w:t>Docker (Linux server)</w:t>
             </w:r>
           </w:p>
@@ -10370,7 +10566,6 @@
           <w:color w:val="3C559A"/>
           <w:sz w:val="26"/>
         </w:rPr>
-        <w:lastRenderedPageBreak/>
         <w:t>11.5 TROUBLESHOOTING: espeak-ng on macOS</w:t>
       </w:r>
     </w:p>
@@ -10489,6 +10684,7 @@
           <w:color w:val="1E202C"/>
           <w:sz w:val="20"/>
         </w:rPr>
+        <w:lastRenderedPageBreak/>
         <w:t>TTS Agent is designed to run natively on any GPU-equipped machine using a single shared codebase. The same Git repository is cloned on each machine; platform differences are handled entirely by setup.sh and PyTorch’s device auto-detection. No cross-platform container layer is required. The table below summarises the recommended approach for each machine type currently in use.</w:t>
       </w:r>
     </w:p>
@@ -11084,7 +11280,6 @@
           <w:color w:val="3C559A"/>
           <w:sz w:val="26"/>
         </w:rPr>
-        <w:lastRenderedPageBreak/>
         <w:t>13. API QUICK REFERENCE</w:t>
       </w:r>
     </w:p>
@@ -11754,6 +11949,7 @@
                 <w:color w:val="1E202C"/>
                 <w:sz w:val="18"/>
               </w:rPr>
+              <w:lastRenderedPageBreak/>
               <w:t>GET</w:t>
             </w:r>
           </w:p>
@@ -11957,7 +12153,6 @@
         <w:rPr>
           <w:b/>
           <w:color w:val="3C559A"/>
-          <w:sz w:val="22"/>
         </w:rPr>
         <w:t>16.1 Project Directory Structure</w:t>
       </w:r>
@@ -11968,11 +12163,11 @@
       </w:pPr>
       <w:r>
         <w:rPr>
+          <w:rFonts w:ascii="Courier New" w:hAnsi="Courier New"/>
           <w:color w:val="1E202C"/>
           <w:sz w:val="18"/>
-          <w:rFonts w:ascii="Courier New" w:hAnsi="Courier New"/>
-        </w:rPr>
-        <w:t xml:space="preserve">tts-agent/</w:t>
+        </w:rPr>
+        <w:t>tts-agent/</w:t>
       </w:r>
     </w:p>
     <w:p>
@@ -11981,9 +12176,9 @@
       </w:pPr>
       <w:r>
         <w:rPr>
+          <w:rFonts w:ascii="Courier New" w:hAnsi="Courier New"/>
           <w:color w:val="1E202C"/>
           <w:sz w:val="18"/>
-          <w:rFonts w:ascii="Courier New" w:hAnsi="Courier New"/>
         </w:rPr>
         <w:t xml:space="preserve">  backend/</w:t>
       </w:r>
@@ -11994,9 +12189,9 @@
       </w:pPr>
       <w:r>
         <w:rPr>
+          <w:rFonts w:ascii="Courier New" w:hAnsi="Courier New"/>
           <w:color w:val="1E202C"/>
           <w:sz w:val="18"/>
-          <w:rFonts w:ascii="Courier New" w:hAnsi="Courier New"/>
         </w:rPr>
         <w:t xml:space="preserve">    app.py                  # FastAPI app factory, lifespan handler, static mounts</w:t>
       </w:r>
@@ -12007,9 +12202,9 @@
       </w:pPr>
       <w:r>
         <w:rPr>
+          <w:rFonts w:ascii="Courier New" w:hAnsi="Courier New"/>
           <w:color w:val="1E202C"/>
           <w:sz w:val="18"/>
-          <w:rFonts w:ascii="Courier New" w:hAnsi="Courier New"/>
         </w:rPr>
         <w:t xml:space="preserve">    api/</w:t>
       </w:r>
@@ -12020,9 +12215,9 @@
       </w:pPr>
       <w:r>
         <w:rPr>
+          <w:rFonts w:ascii="Courier New" w:hAnsi="Courier New"/>
           <w:color w:val="1E202C"/>
           <w:sz w:val="18"/>
-          <w:rFonts w:ascii="Courier New" w:hAnsi="Courier New"/>
         </w:rPr>
         <w:t xml:space="preserve">      routes.py             # All API endpoints (synthesize, batch, upload, voices, health)</w:t>
       </w:r>
@@ -12033,9 +12228,9 @@
       </w:pPr>
       <w:r>
         <w:rPr>
+          <w:rFonts w:ascii="Courier New" w:hAnsi="Courier New"/>
           <w:color w:val="1E202C"/>
           <w:sz w:val="18"/>
-          <w:rFonts w:ascii="Courier New" w:hAnsi="Courier New"/>
         </w:rPr>
         <w:t xml:space="preserve">      schemas.py            # Pydantic request/response models</w:t>
       </w:r>
@@ -12046,9 +12241,9 @@
       </w:pPr>
       <w:r>
         <w:rPr>
+          <w:rFonts w:ascii="Courier New" w:hAnsi="Courier New"/>
           <w:color w:val="1E202C"/>
           <w:sz w:val="18"/>
-          <w:rFonts w:ascii="Courier New" w:hAnsi="Courier New"/>
         </w:rPr>
         <w:t xml:space="preserve">    engines/</w:t>
       </w:r>
@@ -12059,9 +12254,9 @@
       </w:pPr>
       <w:r>
         <w:rPr>
+          <w:rFonts w:ascii="Courier New" w:hAnsi="Courier New"/>
           <w:color w:val="1E202C"/>
           <w:sz w:val="18"/>
-          <w:rFonts w:ascii="Courier New" w:hAnsi="Courier New"/>
         </w:rPr>
         <w:t xml:space="preserve">      base.py               # TTSEngine abstract base class</w:t>
       </w:r>
@@ -12072,10 +12267,11 @@
       </w:pPr>
       <w:r>
         <w:rPr>
+          <w:rFonts w:ascii="Courier New" w:hAnsi="Courier New"/>
           <w:color w:val="1E202C"/>
           <w:sz w:val="18"/>
-          <w:rFonts w:ascii="Courier New" w:hAnsi="Courier New"/>
-        </w:rPr>
+        </w:rPr>
+        <w:lastRenderedPageBreak/>
         <w:t xml:space="preserve">      kokoro_engine.py      # Kokoro-82M wrapper: 54 voices, 9 languages, lazy pipeline per lang_code</w:t>
       </w:r>
     </w:p>
@@ -12085,9 +12281,9 @@
       </w:pPr>
       <w:r>
         <w:rPr>
+          <w:rFonts w:ascii="Courier New" w:hAnsi="Courier New"/>
           <w:color w:val="1E202C"/>
           <w:sz w:val="18"/>
-          <w:rFonts w:ascii="Courier New" w:hAnsi="Courier New"/>
         </w:rPr>
         <w:t xml:space="preserve">      f5_engine.py          # F5-TTS wrapper: zero-shot voice cloning from reference audio</w:t>
       </w:r>
@@ -12098,9 +12294,9 @@
       </w:pPr>
       <w:r>
         <w:rPr>
+          <w:rFonts w:ascii="Courier New" w:hAnsi="Courier New"/>
           <w:color w:val="1E202C"/>
           <w:sz w:val="18"/>
-          <w:rFonts w:ascii="Courier New" w:hAnsi="Courier New"/>
         </w:rPr>
         <w:t xml:space="preserve">    utils/</w:t>
       </w:r>
@@ -12111,9 +12307,9 @@
       </w:pPr>
       <w:r>
         <w:rPr>
+          <w:rFonts w:ascii="Courier New" w:hAnsi="Courier New"/>
           <w:color w:val="1E202C"/>
           <w:sz w:val="18"/>
-          <w:rFonts w:ascii="Courier New" w:hAnsi="Courier New"/>
         </w:rPr>
         <w:t xml:space="preserve">      audio.py              # postprocess(): resample → loudness normalise → trim silence</w:t>
       </w:r>
@@ -12124,9 +12320,9 @@
       </w:pPr>
       <w:r>
         <w:rPr>
+          <w:rFonts w:ascii="Courier New" w:hAnsi="Courier New"/>
           <w:color w:val="1E202C"/>
           <w:sz w:val="18"/>
-          <w:rFonts w:ascii="Courier New" w:hAnsi="Courier New"/>
         </w:rPr>
         <w:t xml:space="preserve">      broadcast.py          # 7-step EBU R128 broadcast chain (44.1 kHz stereo, 24-bit)</w:t>
       </w:r>
@@ -12137,9 +12333,9 @@
       </w:pPr>
       <w:r>
         <w:rPr>
+          <w:rFonts w:ascii="Courier New" w:hAnsi="Courier New"/>
           <w:color w:val="1E202C"/>
           <w:sz w:val="18"/>
-          <w:rFonts w:ascii="Courier New" w:hAnsi="Courier New"/>
         </w:rPr>
         <w:t xml:space="preserve">      ssml.py               # Custom SSML parser: pause, break, emphasis, say-as tags</w:t>
       </w:r>
@@ -12150,9 +12346,9 @@
       </w:pPr>
       <w:r>
         <w:rPr>
+          <w:rFonts w:ascii="Courier New" w:hAnsi="Courier New"/>
           <w:color w:val="1E202C"/>
           <w:sz w:val="18"/>
-          <w:rFonts w:ascii="Courier New" w:hAnsi="Courier New"/>
         </w:rPr>
         <w:t xml:space="preserve">      batch.py              # In-memory BatchJob state machine, run_batch() sequential processor</w:t>
       </w:r>
@@ -12163,9 +12359,9 @@
       </w:pPr>
       <w:r>
         <w:rPr>
+          <w:rFonts w:ascii="Courier New" w:hAnsi="Courier New"/>
           <w:color w:val="1E202C"/>
           <w:sz w:val="18"/>
-          <w:rFonts w:ascii="Courier New" w:hAnsi="Courier New"/>
         </w:rPr>
         <w:t xml:space="preserve">      device.py             # DEVICE constant: auto-selects cuda / mps / cpu</w:t>
       </w:r>
@@ -12176,9 +12372,9 @@
       </w:pPr>
       <w:r>
         <w:rPr>
+          <w:rFonts w:ascii="Courier New" w:hAnsi="Courier New"/>
           <w:color w:val="1E202C"/>
           <w:sz w:val="18"/>
-          <w:rFonts w:ascii="Courier New" w:hAnsi="Courier New"/>
         </w:rPr>
         <w:t xml:space="preserve">      logger.py             # Structured logger factory (get_logger(__name__))</w:t>
       </w:r>
@@ -12189,9 +12385,9 @@
       </w:pPr>
       <w:r>
         <w:rPr>
+          <w:rFonts w:ascii="Courier New" w:hAnsi="Courier New"/>
           <w:color w:val="1E202C"/>
           <w:sz w:val="18"/>
-          <w:rFonts w:ascii="Courier New" w:hAnsi="Courier New"/>
         </w:rPr>
         <w:t xml:space="preserve">      broadcast.py          # EBU R128 broadcast post-processing pipeline</w:t>
       </w:r>
@@ -12202,9 +12398,9 @@
       </w:pPr>
       <w:r>
         <w:rPr>
+          <w:rFonts w:ascii="Courier New" w:hAnsi="Courier New"/>
           <w:color w:val="1E202C"/>
           <w:sz w:val="18"/>
-          <w:rFonts w:ascii="Courier New" w:hAnsi="Courier New"/>
         </w:rPr>
         <w:t xml:space="preserve">  frontend/</w:t>
       </w:r>
@@ -12215,9 +12411,9 @@
       </w:pPr>
       <w:r>
         <w:rPr>
+          <w:rFonts w:ascii="Courier New" w:hAnsi="Courier New"/>
           <w:color w:val="1E202C"/>
           <w:sz w:val="18"/>
-          <w:rFonts w:ascii="Courier New" w:hAnsi="Courier New"/>
         </w:rPr>
         <w:t xml:space="preserve">    templates/index.html    # Single-page Jinja2 template: two tabs (built-in / clone)</w:t>
       </w:r>
@@ -12228,9 +12424,9 @@
       </w:pPr>
       <w:r>
         <w:rPr>
+          <w:rFonts w:ascii="Courier New" w:hAnsi="Courier New"/>
           <w:color w:val="1E202C"/>
           <w:sz w:val="18"/>
-          <w:rFonts w:ascii="Courier New" w:hAnsi="Courier New"/>
         </w:rPr>
         <w:t xml:space="preserve">    static/js/app.js        # Frontend controller: voice select, SSML toggle, upload, synthesize</w:t>
       </w:r>
@@ -12241,9 +12437,9 @@
       </w:pPr>
       <w:r>
         <w:rPr>
+          <w:rFonts w:ascii="Courier New" w:hAnsi="Courier New"/>
           <w:color w:val="1E202C"/>
           <w:sz w:val="18"/>
-          <w:rFonts w:ascii="Courier New" w:hAnsi="Courier New"/>
         </w:rPr>
         <w:t xml:space="preserve">    static/css/style.css    # UI styles</w:t>
       </w:r>
@@ -12254,9 +12450,9 @@
       </w:pPr>
       <w:r>
         <w:rPr>
+          <w:rFonts w:ascii="Courier New" w:hAnsi="Courier New"/>
           <w:color w:val="1E202C"/>
           <w:sz w:val="18"/>
-          <w:rFonts w:ascii="Courier New" w:hAnsi="Courier New"/>
         </w:rPr>
         <w:t xml:space="preserve">  configs/</w:t>
       </w:r>
@@ -12267,9 +12463,9 @@
       </w:pPr>
       <w:r>
         <w:rPr>
+          <w:rFonts w:ascii="Courier New" w:hAnsi="Courier New"/>
           <w:color w:val="1E202C"/>
           <w:sz w:val="18"/>
-          <w:rFonts w:ascii="Courier New" w:hAnsi="Courier New"/>
         </w:rPr>
         <w:t xml:space="preserve">    settings.py             # Pydantic BaseSettings: HF_TOKEN, DEVICE, paths, audio constants</w:t>
       </w:r>
@@ -12280,9 +12476,9 @@
       </w:pPr>
       <w:r>
         <w:rPr>
+          <w:rFonts w:ascii="Courier New" w:hAnsi="Courier New"/>
           <w:color w:val="1E202C"/>
           <w:sz w:val="18"/>
-          <w:rFonts w:ascii="Courier New" w:hAnsi="Courier New"/>
         </w:rPr>
         <w:t xml:space="preserve">  scripts/</w:t>
       </w:r>
@@ -12293,9 +12489,9 @@
       </w:pPr>
       <w:r>
         <w:rPr>
+          <w:rFonts w:ascii="Courier New" w:hAnsi="Courier New"/>
           <w:color w:val="1E202C"/>
           <w:sz w:val="18"/>
-          <w:rFonts w:ascii="Courier New" w:hAnsi="Courier New"/>
         </w:rPr>
         <w:t xml:space="preserve">    setup.sh                # One-shot env setup: detects platform, installs PyTorch + deps</w:t>
       </w:r>
@@ -12306,9 +12502,9 @@
       </w:pPr>
       <w:r>
         <w:rPr>
+          <w:rFonts w:ascii="Courier New" w:hAnsi="Courier New"/>
           <w:color w:val="1E202C"/>
           <w:sz w:val="18"/>
-          <w:rFonts w:ascii="Courier New" w:hAnsi="Courier New"/>
         </w:rPr>
         <w:t xml:space="preserve">    download_models.py      # Downloads Kokoro pipelines for all supported lang_codes</w:t>
       </w:r>
@@ -12319,9 +12515,9 @@
       </w:pPr>
       <w:r>
         <w:rPr>
+          <w:rFonts w:ascii="Courier New" w:hAnsi="Courier New"/>
           <w:color w:val="1E202C"/>
           <w:sz w:val="18"/>
-          <w:rFonts w:ascii="Courier New" w:hAnsi="Courier New"/>
         </w:rPr>
         <w:t xml:space="preserve">  requirements.txt          # Python deps (PyTorch installed separately via setup.sh)</w:t>
       </w:r>
@@ -12332,9 +12528,9 @@
       </w:pPr>
       <w:r>
         <w:rPr>
+          <w:rFonts w:ascii="Courier New" w:hAnsi="Courier New"/>
           <w:color w:val="1E202C"/>
           <w:sz w:val="18"/>
-          <w:rFonts w:ascii="Courier New" w:hAnsi="Courier New"/>
         </w:rPr>
         <w:t xml:space="preserve">  .env                      # Optional: HF_TOKEN=hf_xxx DEVICE=cuda LOG_LEVEL=debug</w:t>
       </w:r>
@@ -12345,9 +12541,9 @@
       </w:pPr>
       <w:r>
         <w:rPr>
+          <w:rFonts w:ascii="Courier New" w:hAnsi="Courier New"/>
           <w:color w:val="1E202C"/>
           <w:sz w:val="18"/>
-          <w:rFonts w:ascii="Courier New" w:hAnsi="Courier New"/>
         </w:rPr>
         <w:t xml:space="preserve">  models/                   # Downloaded model weights (gitignored)</w:t>
       </w:r>
@@ -12358,9 +12554,9 @@
       </w:pPr>
       <w:r>
         <w:rPr>
+          <w:rFonts w:ascii="Courier New" w:hAnsi="Courier New"/>
           <w:color w:val="1E202C"/>
           <w:sz w:val="18"/>
-          <w:rFonts w:ascii="Courier New" w:hAnsi="Courier New"/>
         </w:rPr>
         <w:t xml:space="preserve">  voice_samples/            # Uploaded reference audio clips for F5-TTS voice cloning</w:t>
       </w:r>
@@ -12371,9 +12567,9 @@
       </w:pPr>
       <w:r>
         <w:rPr>
+          <w:rFonts w:ascii="Courier New" w:hAnsi="Courier New"/>
           <w:color w:val="1E202C"/>
           <w:sz w:val="18"/>
-          <w:rFonts w:ascii="Courier New" w:hAnsi="Courier New"/>
         </w:rPr>
         <w:t xml:space="preserve">  outputs/                  # Generated WAV files (served via /audio/{filename})</w:t>
       </w:r>
@@ -12386,7 +12582,6 @@
         <w:rPr>
           <w:b/>
           <w:color w:val="3C559A"/>
-          <w:sz w:val="22"/>
         </w:rPr>
         <w:t>16.2 First-Run Development Workflow</w:t>
       </w:r>
@@ -12410,11 +12605,11 @@
       </w:pPr>
       <w:r>
         <w:rPr>
+          <w:rFonts w:ascii="Courier New" w:hAnsi="Courier New"/>
           <w:color w:val="1E202C"/>
           <w:sz w:val="18"/>
-          <w:rFonts w:ascii="Courier New" w:hAnsi="Courier New"/>
-        </w:rPr>
-        <w:t xml:space="preserve">brew install espeak-ng          # Required phonemizer C library for Kokoro</w:t>
+        </w:rPr>
+        <w:t>brew install espeak-ng          # Required phonemizer C library for Kokoro</w:t>
       </w:r>
     </w:p>
     <w:p>
@@ -12423,11 +12618,11 @@
       </w:pPr>
       <w:r>
         <w:rPr>
+          <w:rFonts w:ascii="Courier New" w:hAnsi="Courier New"/>
           <w:color w:val="1E202C"/>
           <w:sz w:val="18"/>
-          <w:rFonts w:ascii="Courier New" w:hAnsi="Courier New"/>
-        </w:rPr>
-        <w:t xml:space="preserve">bash scripts/setup.sh           # Creates venv, installs PyTorch (MPS) + all deps</w:t>
+        </w:rPr>
+        <w:t>bash scripts/setup.sh           # Creates venv, installs PyTorch (MPS) + all deps</w:t>
       </w:r>
     </w:p>
     <w:p>
@@ -12436,11 +12631,11 @@
       </w:pPr>
       <w:r>
         <w:rPr>
+          <w:rFonts w:ascii="Courier New" w:hAnsi="Courier New"/>
           <w:color w:val="1E202C"/>
           <w:sz w:val="18"/>
-          <w:rFonts w:ascii="Courier New" w:hAnsi="Courier New"/>
-        </w:rPr>
-        <w:t xml:space="preserve">source .venv/bin/activate</w:t>
+        </w:rPr>
+        <w:t>source .venv/bin/activate</w:t>
       </w:r>
     </w:p>
     <w:p>
@@ -12449,11 +12644,11 @@
       </w:pPr>
       <w:r>
         <w:rPr>
+          <w:rFonts w:ascii="Courier New" w:hAnsi="Courier New"/>
           <w:color w:val="1E202C"/>
           <w:sz w:val="18"/>
-          <w:rFonts w:ascii="Courier New" w:hAnsi="Courier New"/>
-        </w:rPr>
-        <w:t xml:space="preserve">python scripts/download_models.py   # Downloads Kokoro weights from HF Hub</w:t>
+        </w:rPr>
+        <w:t>python scripts/download_models.py   # Downloads Kokoro weights from HF Hub</w:t>
       </w:r>
     </w:p>
     <w:p>
@@ -12462,11 +12657,11 @@
       </w:pPr>
       <w:r>
         <w:rPr>
+          <w:rFonts w:ascii="Courier New" w:hAnsi="Courier New"/>
           <w:color w:val="1E202C"/>
           <w:sz w:val="18"/>
-          <w:rFonts w:ascii="Courier New" w:hAnsi="Courier New"/>
-        </w:rPr>
-        <w:t xml:space="preserve">uvicorn backend.app:app --reload --host 0.0.0.0 --port 8000</w:t>
+        </w:rPr>
+        <w:t>uvicorn backend.app:app --reload --host 0.0.0.0 --port 8000</w:t>
       </w:r>
     </w:p>
     <w:p>
@@ -12488,11 +12683,11 @@
       </w:pPr>
       <w:r>
         <w:rPr>
+          <w:rFonts w:ascii="Courier New" w:hAnsi="Courier New"/>
           <w:color w:val="1E202C"/>
           <w:sz w:val="18"/>
-          <w:rFonts w:ascii="Courier New" w:hAnsi="Courier New"/>
-        </w:rPr>
-        <w:t xml:space="preserve">wsl --install -d Ubuntu-22.04   # One-time WSL2 setup (PowerShell, admin)</w:t>
+        </w:rPr>
+        <w:t>wsl --install -d Ubuntu-22.04   # One-time WSL2 setup (PowerShell, admin)</w:t>
       </w:r>
     </w:p>
     <w:p>
@@ -12501,11 +12696,11 @@
       </w:pPr>
       <w:r>
         <w:rPr>
+          <w:rFonts w:ascii="Courier New" w:hAnsi="Courier New"/>
           <w:color w:val="1E202C"/>
           <w:sz w:val="18"/>
-          <w:rFonts w:ascii="Courier New" w:hAnsi="Courier New"/>
-        </w:rPr>
-        <w:t xml:space="preserve">sudo apt-get install -y espeak-ng dos2unix git python3.11</w:t>
+        </w:rPr>
+        <w:t>sudo apt-get install -y espeak-ng dos2unix git python3.11</w:t>
       </w:r>
     </w:p>
     <w:p>
@@ -12514,11 +12709,11 @@
       </w:pPr>
       <w:r>
         <w:rPr>
+          <w:rFonts w:ascii="Courier New" w:hAnsi="Courier New"/>
           <w:color w:val="1E202C"/>
           <w:sz w:val="18"/>
-          <w:rFonts w:ascii="Courier New" w:hAnsi="Courier New"/>
-        </w:rPr>
-        <w:t xml:space="preserve">git clone &lt;repo-url&gt; &amp;&amp; cd tts-agent</w:t>
+        </w:rPr>
+        <w:t>git clone &lt;repo-url&gt; &amp;&amp; cd tts-agent</w:t>
       </w:r>
     </w:p>
     <w:p>
@@ -12527,11 +12722,12 @@
       </w:pPr>
       <w:r>
         <w:rPr>
+          <w:rFonts w:ascii="Courier New" w:hAnsi="Courier New"/>
           <w:color w:val="1E202C"/>
           <w:sz w:val="18"/>
-          <w:rFonts w:ascii="Courier New" w:hAnsi="Courier New"/>
-        </w:rPr>
-        <w:t xml:space="preserve">dos2unix scripts/setup.sh &amp;&amp; bash scripts/setup.sh   # CUDA 12.1 PyTorch auto-selected</w:t>
+        </w:rPr>
+        <w:lastRenderedPageBreak/>
+        <w:t>dos2unix scripts/setup.sh &amp;&amp; bash scripts/setup.sh   # CUDA 12.1 PyTorch auto-selected</w:t>
       </w:r>
     </w:p>
     <w:p>
@@ -12542,7 +12738,6 @@
         <w:rPr>
           <w:b/>
           <w:color w:val="3C559A"/>
-          <w:sz w:val="22"/>
         </w:rPr>
         <w:t>16.3 Engine Architecture</w:t>
       </w:r>
@@ -12627,7 +12822,6 @@
         <w:rPr>
           <w:b/>
           <w:color w:val="3C559A"/>
-          <w:sz w:val="22"/>
         </w:rPr>
         <w:t>16.4 API Endpoints Reference</w:t>
       </w:r>
@@ -12820,7 +13014,6 @@
         <w:rPr>
           <w:b/>
           <w:color w:val="3C559A"/>
-          <w:sz w:val="22"/>
         </w:rPr>
         <w:t>16.5 Key Configuration (configs/settings.py)</w:t>
       </w:r>
@@ -12843,11 +13036,11 @@
       </w:pPr>
       <w:r>
         <w:rPr>
+          <w:rFonts w:ascii="Courier New" w:hAnsi="Courier New"/>
           <w:color w:val="1E202C"/>
           <w:sz w:val="18"/>
-          <w:rFonts w:ascii="Courier New" w:hAnsi="Courier New"/>
-        </w:rPr>
-        <w:t xml:space="preserve">HF_TOKEN=hf_xxx         # HuggingFace token (removes download rate limits)</w:t>
+        </w:rPr>
+        <w:t>HF_TOKEN=hf_xxx         # HuggingFace token (removes download rate limits)</w:t>
       </w:r>
     </w:p>
     <w:p>
@@ -12856,11 +13049,11 @@
       </w:pPr>
       <w:r>
         <w:rPr>
+          <w:rFonts w:ascii="Courier New" w:hAnsi="Courier New"/>
           <w:color w:val="1E202C"/>
           <w:sz w:val="18"/>
-          <w:rFonts w:ascii="Courier New" w:hAnsi="Courier New"/>
-        </w:rPr>
-        <w:t xml:space="preserve">DEVICE=auto             # auto | cuda | mps | cpu (auto-detected at startup)</w:t>
+        </w:rPr>
+        <w:t>DEVICE=auto             # auto | cuda | mps | cpu (auto-detected at startup)</w:t>
       </w:r>
     </w:p>
     <w:p>
@@ -12869,11 +13062,12 @@
       </w:pPr>
       <w:r>
         <w:rPr>
+          <w:rFonts w:ascii="Courier New" w:hAnsi="Courier New"/>
           <w:color w:val="1E202C"/>
           <w:sz w:val="18"/>
-          <w:rFonts w:ascii="Courier New" w:hAnsi="Courier New"/>
-        </w:rPr>
-        <w:t xml:space="preserve">TARGET_SAMPLE_RATE=24000 # Kokoro native output rate</w:t>
+        </w:rPr>
+        <w:lastRenderedPageBreak/>
+        <w:t>TARGET_SAMPLE_RATE=24000 # Kokoro native output rate</w:t>
       </w:r>
     </w:p>
     <w:p>
@@ -12882,11 +13076,11 @@
       </w:pPr>
       <w:r>
         <w:rPr>
+          <w:rFonts w:ascii="Courier New" w:hAnsi="Courier New"/>
           <w:color w:val="1E202C"/>
           <w:sz w:val="18"/>
-          <w:rFonts w:ascii="Courier New" w:hAnsi="Courier New"/>
-        </w:rPr>
-        <w:t xml:space="preserve">TARGET_LOUDNESS_DB=-20.0 # LUFS target for basic postprocess</w:t>
+        </w:rPr>
+        <w:t>TARGET_LOUDNESS_DB=-20.0 # LUFS target for basic postprocess</w:t>
       </w:r>
     </w:p>
     <w:p>
@@ -12895,11 +13089,11 @@
       </w:pPr>
       <w:r>
         <w:rPr>
+          <w:rFonts w:ascii="Courier New" w:hAnsi="Courier New"/>
           <w:color w:val="1E202C"/>
           <w:sz w:val="18"/>
-          <w:rFonts w:ascii="Courier New" w:hAnsi="Courier New"/>
-        </w:rPr>
-        <w:t xml:space="preserve">F5_MODEL_NAME=F5TTS_v1_Base  # F5-TTS model variant</w:t>
+        </w:rPr>
+        <w:t>F5_MODEL_NAME=F5TTS_v1_Base  # F5-TTS model variant</w:t>
       </w:r>
     </w:p>
     <w:p>
@@ -12908,11 +13102,11 @@
       </w:pPr>
       <w:r>
         <w:rPr>
+          <w:rFonts w:ascii="Courier New" w:hAnsi="Courier New"/>
           <w:color w:val="1E202C"/>
           <w:sz w:val="18"/>
-          <w:rFonts w:ascii="Courier New" w:hAnsi="Courier New"/>
-        </w:rPr>
-        <w:t xml:space="preserve">HOST=0.0.0.0 PORT=8000 LOG_LEVEL=info</w:t>
+        </w:rPr>
+        <w:t>HOST=0.0.0.0 PORT=8000 LOG_LEVEL=info</w:t>
       </w:r>
     </w:p>
     <w:p>
@@ -12923,7 +13117,6 @@
         <w:rPr>
           <w:b/>
           <w:color w:val="3C559A"/>
-          <w:sz w:val="22"/>
         </w:rPr>
         <w:t>16.6 Security Fixes Applied in v2.2.0</w:t>
       </w:r>
@@ -13048,7 +13241,6 @@
         <w:rPr>
           <w:b/>
           <w:color w:val="3C559A"/>
-          <w:sz w:val="22"/>
         </w:rPr>
         <w:t>16.7 SSML Support Reference</w:t>
       </w:r>
@@ -13071,11 +13263,11 @@
       </w:pPr>
       <w:r>
         <w:rPr>
+          <w:rFonts w:ascii="Courier New" w:hAnsi="Courier New"/>
           <w:color w:val="1E202C"/>
           <w:sz w:val="18"/>
-          <w:rFonts w:ascii="Courier New" w:hAnsi="Courier New"/>
-        </w:rPr>
-        <w:t xml:space="preserve">&lt;pause ms="500"/&gt;                                 # Insert N ms of silence</w:t>
+        </w:rPr>
+        <w:t>&lt;pause ms="500"/&gt;                                 # Insert N ms of silence</w:t>
       </w:r>
     </w:p>
     <w:p>
@@ -13084,11 +13276,11 @@
       </w:pPr>
       <w:r>
         <w:rPr>
+          <w:rFonts w:ascii="Courier New" w:hAnsi="Courier New"/>
           <w:color w:val="1E202C"/>
           <w:sz w:val="18"/>
-          <w:rFonts w:ascii="Courier New" w:hAnsi="Courier New"/>
-        </w:rPr>
-        <w:t xml:space="preserve">&lt;break strength="paragraph"/&gt;                     # 800ms (paragraph) or 400ms (sentence)</w:t>
+        </w:rPr>
+        <w:t>&lt;break strength="paragraph"/&gt;                     # 800ms (paragraph) or 400ms (sentence)</w:t>
       </w:r>
     </w:p>
     <w:p>
@@ -13097,11 +13289,11 @@
       </w:pPr>
       <w:r>
         <w:rPr>
+          <w:rFonts w:ascii="Courier New" w:hAnsi="Courier New"/>
           <w:color w:val="1E202C"/>
           <w:sz w:val="18"/>
-          <w:rFonts w:ascii="Courier New" w:hAnsi="Courier New"/>
-        </w:rPr>
-        <w:t xml:space="preserve">&lt;emphasis level="strong"&gt;text&lt;/emphasis&gt;           # strong=0.7x speed, moderate=0.85x, reduced=1.15x</w:t>
+        </w:rPr>
+        <w:t>&lt;emphasis level="strong"&gt;text&lt;/emphasis&gt;           # strong=0.7x speed, moderate=0.85x, reduced=1.15x</w:t>
       </w:r>
     </w:p>
     <w:p>
@@ -13110,11 +13302,11 @@
       </w:pPr>
       <w:r>
         <w:rPr>
+          <w:rFonts w:ascii="Courier New" w:hAnsi="Courier New"/>
           <w:color w:val="1E202C"/>
           <w:sz w:val="18"/>
-          <w:rFonts w:ascii="Courier New" w:hAnsi="Courier New"/>
-        </w:rPr>
-        <w:t xml:space="preserve">&lt;say-as interpret-as="characters"&gt;IPCC&lt;/say-as&gt;    # Spell out letter-by-letter</w:t>
+        </w:rPr>
+        <w:t>&lt;say-as interpret-as="characters"&gt;IPCC&lt;/say-as&gt;    # Spell out letter-by-letter</w:t>
       </w:r>
     </w:p>
     <w:p>
@@ -13310,6 +13502,353 @@
       <w:rPr>
         <w:rFonts w:ascii="Symbol" w:hAnsi="Symbol" w:hint="default"/>
       </w:rPr>
+    </w:lvl>
+  </w:abstractNum>
+  <w:abstractNum w:abstractNumId="9" w15:restartNumberingAfterBreak="0">
+    <w:nsid w:val="099E36AD"/>
+    <w:multiLevelType w:val="hybridMultilevel"/>
+    <w:tmpl w:val="8B1073E8"/>
+    <w:lvl w:ilvl="0" w:tplc="0C09000F">
+      <w:start w:val="1"/>
+      <w:numFmt w:val="decimal"/>
+      <w:lvlText w:val="%1."/>
+      <w:lvlJc w:val="left"/>
+      <w:pPr>
+        <w:ind w:left="720" w:hanging="360"/>
+      </w:pPr>
+    </w:lvl>
+    <w:lvl w:ilvl="1" w:tplc="0C090019" w:tentative="1">
+      <w:start w:val="1"/>
+      <w:numFmt w:val="lowerLetter"/>
+      <w:lvlText w:val="%2."/>
+      <w:lvlJc w:val="left"/>
+      <w:pPr>
+        <w:ind w:left="1440" w:hanging="360"/>
+      </w:pPr>
+    </w:lvl>
+    <w:lvl w:ilvl="2" w:tplc="0C09001B" w:tentative="1">
+      <w:start w:val="1"/>
+      <w:numFmt w:val="lowerRoman"/>
+      <w:lvlText w:val="%3."/>
+      <w:lvlJc w:val="right"/>
+      <w:pPr>
+        <w:ind w:left="2160" w:hanging="180"/>
+      </w:pPr>
+    </w:lvl>
+    <w:lvl w:ilvl="3" w:tplc="0C09000F" w:tentative="1">
+      <w:start w:val="1"/>
+      <w:numFmt w:val="decimal"/>
+      <w:lvlText w:val="%4."/>
+      <w:lvlJc w:val="left"/>
+      <w:pPr>
+        <w:ind w:left="2880" w:hanging="360"/>
+      </w:pPr>
+    </w:lvl>
+    <w:lvl w:ilvl="4" w:tplc="0C090019" w:tentative="1">
+      <w:start w:val="1"/>
+      <w:numFmt w:val="lowerLetter"/>
+      <w:lvlText w:val="%5."/>
+      <w:lvlJc w:val="left"/>
+      <w:pPr>
+        <w:ind w:left="3600" w:hanging="360"/>
+      </w:pPr>
+    </w:lvl>
+    <w:lvl w:ilvl="5" w:tplc="0C09001B" w:tentative="1">
+      <w:start w:val="1"/>
+      <w:numFmt w:val="lowerRoman"/>
+      <w:lvlText w:val="%6."/>
+      <w:lvlJc w:val="right"/>
+      <w:pPr>
+        <w:ind w:left="4320" w:hanging="180"/>
+      </w:pPr>
+    </w:lvl>
+    <w:lvl w:ilvl="6" w:tplc="0C09000F" w:tentative="1">
+      <w:start w:val="1"/>
+      <w:numFmt w:val="decimal"/>
+      <w:lvlText w:val="%7."/>
+      <w:lvlJc w:val="left"/>
+      <w:pPr>
+        <w:ind w:left="5040" w:hanging="360"/>
+      </w:pPr>
+    </w:lvl>
+    <w:lvl w:ilvl="7" w:tplc="0C090019" w:tentative="1">
+      <w:start w:val="1"/>
+      <w:numFmt w:val="lowerLetter"/>
+      <w:lvlText w:val="%8."/>
+      <w:lvlJc w:val="left"/>
+      <w:pPr>
+        <w:ind w:left="5760" w:hanging="360"/>
+      </w:pPr>
+    </w:lvl>
+    <w:lvl w:ilvl="8" w:tplc="0C09001B" w:tentative="1">
+      <w:start w:val="1"/>
+      <w:numFmt w:val="lowerRoman"/>
+      <w:lvlText w:val="%9."/>
+      <w:lvlJc w:val="right"/>
+      <w:pPr>
+        <w:ind w:left="6480" w:hanging="180"/>
+      </w:pPr>
+    </w:lvl>
+  </w:abstractNum>
+  <w:abstractNum w:abstractNumId="10" w15:restartNumberingAfterBreak="0">
+    <w:nsid w:val="561828F5"/>
+    <w:multiLevelType w:val="hybridMultilevel"/>
+    <w:tmpl w:val="799A7FF4"/>
+    <w:lvl w:ilvl="0" w:tplc="0C09000F">
+      <w:start w:val="1"/>
+      <w:numFmt w:val="decimal"/>
+      <w:lvlText w:val="%1."/>
+      <w:lvlJc w:val="left"/>
+      <w:pPr>
+        <w:ind w:left="720" w:hanging="360"/>
+      </w:pPr>
+      <w:rPr>
+        <w:rFonts w:hint="default"/>
+      </w:rPr>
+    </w:lvl>
+    <w:lvl w:ilvl="1" w:tplc="0C090019" w:tentative="1">
+      <w:start w:val="1"/>
+      <w:numFmt w:val="lowerLetter"/>
+      <w:lvlText w:val="%2."/>
+      <w:lvlJc w:val="left"/>
+      <w:pPr>
+        <w:ind w:left="1440" w:hanging="360"/>
+      </w:pPr>
+    </w:lvl>
+    <w:lvl w:ilvl="2" w:tplc="0C09001B" w:tentative="1">
+      <w:start w:val="1"/>
+      <w:numFmt w:val="lowerRoman"/>
+      <w:lvlText w:val="%3."/>
+      <w:lvlJc w:val="right"/>
+      <w:pPr>
+        <w:ind w:left="2160" w:hanging="180"/>
+      </w:pPr>
+    </w:lvl>
+    <w:lvl w:ilvl="3" w:tplc="0C09000F" w:tentative="1">
+      <w:start w:val="1"/>
+      <w:numFmt w:val="decimal"/>
+      <w:lvlText w:val="%4."/>
+      <w:lvlJc w:val="left"/>
+      <w:pPr>
+        <w:ind w:left="2880" w:hanging="360"/>
+      </w:pPr>
+    </w:lvl>
+    <w:lvl w:ilvl="4" w:tplc="0C090019" w:tentative="1">
+      <w:start w:val="1"/>
+      <w:numFmt w:val="lowerLetter"/>
+      <w:lvlText w:val="%5."/>
+      <w:lvlJc w:val="left"/>
+      <w:pPr>
+        <w:ind w:left="3600" w:hanging="360"/>
+      </w:pPr>
+    </w:lvl>
+    <w:lvl w:ilvl="5" w:tplc="0C09001B" w:tentative="1">
+      <w:start w:val="1"/>
+      <w:numFmt w:val="lowerRoman"/>
+      <w:lvlText w:val="%6."/>
+      <w:lvlJc w:val="right"/>
+      <w:pPr>
+        <w:ind w:left="4320" w:hanging="180"/>
+      </w:pPr>
+    </w:lvl>
+    <w:lvl w:ilvl="6" w:tplc="0C09000F" w:tentative="1">
+      <w:start w:val="1"/>
+      <w:numFmt w:val="decimal"/>
+      <w:lvlText w:val="%7."/>
+      <w:lvlJc w:val="left"/>
+      <w:pPr>
+        <w:ind w:left="5040" w:hanging="360"/>
+      </w:pPr>
+    </w:lvl>
+    <w:lvl w:ilvl="7" w:tplc="0C090019" w:tentative="1">
+      <w:start w:val="1"/>
+      <w:numFmt w:val="lowerLetter"/>
+      <w:lvlText w:val="%8."/>
+      <w:lvlJc w:val="left"/>
+      <w:pPr>
+        <w:ind w:left="5760" w:hanging="360"/>
+      </w:pPr>
+    </w:lvl>
+    <w:lvl w:ilvl="8" w:tplc="0C09001B" w:tentative="1">
+      <w:start w:val="1"/>
+      <w:numFmt w:val="lowerRoman"/>
+      <w:lvlText w:val="%9."/>
+      <w:lvlJc w:val="right"/>
+      <w:pPr>
+        <w:ind w:left="6480" w:hanging="180"/>
+      </w:pPr>
+    </w:lvl>
+  </w:abstractNum>
+  <w:abstractNum w:abstractNumId="11" w15:restartNumberingAfterBreak="0">
+    <w:nsid w:val="6A3C54EE"/>
+    <w:multiLevelType w:val="hybridMultilevel"/>
+    <w:tmpl w:val="E92E442C"/>
+    <w:lvl w:ilvl="0" w:tplc="0C09000F">
+      <w:start w:val="1"/>
+      <w:numFmt w:val="decimal"/>
+      <w:lvlText w:val="%1."/>
+      <w:lvlJc w:val="left"/>
+      <w:pPr>
+        <w:ind w:left="1080" w:hanging="360"/>
+      </w:pPr>
+    </w:lvl>
+    <w:lvl w:ilvl="1" w:tplc="0C090019" w:tentative="1">
+      <w:start w:val="1"/>
+      <w:numFmt w:val="lowerLetter"/>
+      <w:lvlText w:val="%2."/>
+      <w:lvlJc w:val="left"/>
+      <w:pPr>
+        <w:ind w:left="1800" w:hanging="360"/>
+      </w:pPr>
+    </w:lvl>
+    <w:lvl w:ilvl="2" w:tplc="0C09001B" w:tentative="1">
+      <w:start w:val="1"/>
+      <w:numFmt w:val="lowerRoman"/>
+      <w:lvlText w:val="%3."/>
+      <w:lvlJc w:val="right"/>
+      <w:pPr>
+        <w:ind w:left="2520" w:hanging="180"/>
+      </w:pPr>
+    </w:lvl>
+    <w:lvl w:ilvl="3" w:tplc="0C09000F" w:tentative="1">
+      <w:start w:val="1"/>
+      <w:numFmt w:val="decimal"/>
+      <w:lvlText w:val="%4."/>
+      <w:lvlJc w:val="left"/>
+      <w:pPr>
+        <w:ind w:left="3240" w:hanging="360"/>
+      </w:pPr>
+    </w:lvl>
+    <w:lvl w:ilvl="4" w:tplc="0C090019" w:tentative="1">
+      <w:start w:val="1"/>
+      <w:numFmt w:val="lowerLetter"/>
+      <w:lvlText w:val="%5."/>
+      <w:lvlJc w:val="left"/>
+      <w:pPr>
+        <w:ind w:left="3960" w:hanging="360"/>
+      </w:pPr>
+    </w:lvl>
+    <w:lvl w:ilvl="5" w:tplc="0C09001B" w:tentative="1">
+      <w:start w:val="1"/>
+      <w:numFmt w:val="lowerRoman"/>
+      <w:lvlText w:val="%6."/>
+      <w:lvlJc w:val="right"/>
+      <w:pPr>
+        <w:ind w:left="4680" w:hanging="180"/>
+      </w:pPr>
+    </w:lvl>
+    <w:lvl w:ilvl="6" w:tplc="0C09000F" w:tentative="1">
+      <w:start w:val="1"/>
+      <w:numFmt w:val="decimal"/>
+      <w:lvlText w:val="%7."/>
+      <w:lvlJc w:val="left"/>
+      <w:pPr>
+        <w:ind w:left="5400" w:hanging="360"/>
+      </w:pPr>
+    </w:lvl>
+    <w:lvl w:ilvl="7" w:tplc="0C090019" w:tentative="1">
+      <w:start w:val="1"/>
+      <w:numFmt w:val="lowerLetter"/>
+      <w:lvlText w:val="%8."/>
+      <w:lvlJc w:val="left"/>
+      <w:pPr>
+        <w:ind w:left="6120" w:hanging="360"/>
+      </w:pPr>
+    </w:lvl>
+    <w:lvl w:ilvl="8" w:tplc="0C09001B" w:tentative="1">
+      <w:start w:val="1"/>
+      <w:numFmt w:val="lowerRoman"/>
+      <w:lvlText w:val="%9."/>
+      <w:lvlJc w:val="right"/>
+      <w:pPr>
+        <w:ind w:left="6840" w:hanging="180"/>
+      </w:pPr>
+    </w:lvl>
+  </w:abstractNum>
+  <w:abstractNum w:abstractNumId="12" w15:restartNumberingAfterBreak="0">
+    <w:nsid w:val="6BCF260D"/>
+    <w:multiLevelType w:val="hybridMultilevel"/>
+    <w:tmpl w:val="09D0C942"/>
+    <w:lvl w:ilvl="0" w:tplc="0C09000F">
+      <w:start w:val="1"/>
+      <w:numFmt w:val="decimal"/>
+      <w:lvlText w:val="%1."/>
+      <w:lvlJc w:val="left"/>
+      <w:pPr>
+        <w:ind w:left="720" w:hanging="360"/>
+      </w:pPr>
+    </w:lvl>
+    <w:lvl w:ilvl="1" w:tplc="0C090019" w:tentative="1">
+      <w:start w:val="1"/>
+      <w:numFmt w:val="lowerLetter"/>
+      <w:lvlText w:val="%2."/>
+      <w:lvlJc w:val="left"/>
+      <w:pPr>
+        <w:ind w:left="1440" w:hanging="360"/>
+      </w:pPr>
+    </w:lvl>
+    <w:lvl w:ilvl="2" w:tplc="0C09001B" w:tentative="1">
+      <w:start w:val="1"/>
+      <w:numFmt w:val="lowerRoman"/>
+      <w:lvlText w:val="%3."/>
+      <w:lvlJc w:val="right"/>
+      <w:pPr>
+        <w:ind w:left="2160" w:hanging="180"/>
+      </w:pPr>
+    </w:lvl>
+    <w:lvl w:ilvl="3" w:tplc="0C09000F" w:tentative="1">
+      <w:start w:val="1"/>
+      <w:numFmt w:val="decimal"/>
+      <w:lvlText w:val="%4."/>
+      <w:lvlJc w:val="left"/>
+      <w:pPr>
+        <w:ind w:left="2880" w:hanging="360"/>
+      </w:pPr>
+    </w:lvl>
+    <w:lvl w:ilvl="4" w:tplc="0C090019" w:tentative="1">
+      <w:start w:val="1"/>
+      <w:numFmt w:val="lowerLetter"/>
+      <w:lvlText w:val="%5."/>
+      <w:lvlJc w:val="left"/>
+      <w:pPr>
+        <w:ind w:left="3600" w:hanging="360"/>
+      </w:pPr>
+    </w:lvl>
+    <w:lvl w:ilvl="5" w:tplc="0C09001B" w:tentative="1">
+      <w:start w:val="1"/>
+      <w:numFmt w:val="lowerRoman"/>
+      <w:lvlText w:val="%6."/>
+      <w:lvlJc w:val="right"/>
+      <w:pPr>
+        <w:ind w:left="4320" w:hanging="180"/>
+      </w:pPr>
+    </w:lvl>
+    <w:lvl w:ilvl="6" w:tplc="0C09000F" w:tentative="1">
+      <w:start w:val="1"/>
+      <w:numFmt w:val="decimal"/>
+      <w:lvlText w:val="%7."/>
+      <w:lvlJc w:val="left"/>
+      <w:pPr>
+        <w:ind w:left="5040" w:hanging="360"/>
+      </w:pPr>
+    </w:lvl>
+    <w:lvl w:ilvl="7" w:tplc="0C090019" w:tentative="1">
+      <w:start w:val="1"/>
+      <w:numFmt w:val="lowerLetter"/>
+      <w:lvlText w:val="%8."/>
+      <w:lvlJc w:val="left"/>
+      <w:pPr>
+        <w:ind w:left="5760" w:hanging="360"/>
+      </w:pPr>
+    </w:lvl>
+    <w:lvl w:ilvl="8" w:tplc="0C09001B" w:tentative="1">
+      <w:start w:val="1"/>
+      <w:numFmt w:val="lowerRoman"/>
+      <w:lvlText w:val="%9."/>
+      <w:lvlJc w:val="right"/>
+      <w:pPr>
+        <w:ind w:left="6480" w:hanging="180"/>
+      </w:pPr>
     </w:lvl>
   </w:abstractNum>
   <w:num w:numId="1" w16cid:durableId="1088769378">
@@ -13338,6 +13877,18 @@
   </w:num>
   <w:num w:numId="9" w16cid:durableId="1058555250">
     <w:abstractNumId w:val="0"/>
+  </w:num>
+  <w:num w:numId="10" w16cid:durableId="632180810">
+    <w:abstractNumId w:val="12"/>
+  </w:num>
+  <w:num w:numId="11" w16cid:durableId="737677799">
+    <w:abstractNumId w:val="9"/>
+  </w:num>
+  <w:num w:numId="12" w16cid:durableId="1867524339">
+    <w:abstractNumId w:val="10"/>
+  </w:num>
+  <w:num w:numId="13" w16cid:durableId="222451630">
+    <w:abstractNumId w:val="11"/>
   </w:num>
 </w:numbering>
 </file>
@@ -13731,7 +14282,7 @@
   <w:style w:type="paragraph" w:default="1" w:styleId="Normal">
     <w:name w:val="Normal"/>
     <w:qFormat/>
-    <w:rsid w:val="00FC693F"/>
+    <w:rsid w:val="007227BF"/>
   </w:style>
   <w:style w:type="paragraph" w:styleId="Heading1">
     <w:name w:val="heading 1"/>
@@ -13945,7 +14496,6 @@
   <w:style w:type="character" w:default="1" w:styleId="DefaultParagraphFont">
     <w:name w:val="Default Paragraph Font"/>
     <w:uiPriority w:val="1"/>
-    <w:semiHidden/>
     <w:unhideWhenUsed/>
   </w:style>
   <w:style w:type="table" w:default="1" w:styleId="TableNormal">

</xml_diff>